<commit_message>
Updates to the interview and DOCX/PDFs
</commit_message>
<xml_diff>
--- a/docassemble/USCISApplications/data/templates/Court_Accompaniment_Intake.docx
+++ b/docassemble/USCISApplications/data/templates/Court_Accompaniment_Intake.docx
@@ -109,7 +109,6 @@
         </w:rPr>
         <w:t xml:space="preserve">{{ </w:t>
       </w:r>
-      <w:proofErr w:type="spellStart"/>
       <w:r>
         <w:rPr>
           <w:rFonts w:ascii="Calibri" w:eastAsia="Arial" w:hAnsi="Calibri" w:cs="Calibri"/>
@@ -118,18 +117,7 @@
           <w:sz w:val="22"/>
           <w:szCs w:val="22"/>
         </w:rPr>
-        <w:t>screener.name_full</w:t>
-      </w:r>
-      <w:proofErr w:type="spellEnd"/>
-      <w:r>
-        <w:rPr>
-          <w:rFonts w:ascii="Calibri" w:eastAsia="Arial" w:hAnsi="Calibri" w:cs="Calibri"/>
-          <w:b/>
-          <w:bCs/>
-          <w:sz w:val="22"/>
-          <w:szCs w:val="22"/>
-        </w:rPr>
-        <w:t>()</w:t>
+        <w:t>screener.name_full()</w:t>
       </w:r>
       <w:r>
         <w:rPr>
@@ -200,51 +188,7 @@
           <w:sz w:val="22"/>
           <w:szCs w:val="22"/>
         </w:rPr>
-        <w:t>{{ users[0].</w:t>
-      </w:r>
-      <w:proofErr w:type="spellStart"/>
-      <w:r>
-        <w:rPr>
-          <w:rFonts w:ascii="Calibri" w:eastAsia="Calibri" w:hAnsi="Calibri" w:cs="Calibri"/>
-          <w:b/>
-          <w:bCs/>
-          <w:sz w:val="22"/>
-          <w:szCs w:val="22"/>
-        </w:rPr>
-        <w:t>hearing_date.format</w:t>
-      </w:r>
-      <w:proofErr w:type="spellEnd"/>
-      <w:r>
-        <w:rPr>
-          <w:rFonts w:ascii="Calibri" w:eastAsia="Calibri" w:hAnsi="Calibri" w:cs="Calibri"/>
-          <w:b/>
-          <w:bCs/>
-          <w:sz w:val="22"/>
-          <w:szCs w:val="22"/>
-        </w:rPr>
-        <w:t>('MM/dd/</w:t>
-      </w:r>
-      <w:proofErr w:type="spellStart"/>
-      <w:r>
-        <w:rPr>
-          <w:rFonts w:ascii="Calibri" w:eastAsia="Calibri" w:hAnsi="Calibri" w:cs="Calibri"/>
-          <w:b/>
-          <w:bCs/>
-          <w:sz w:val="22"/>
-          <w:szCs w:val="22"/>
-        </w:rPr>
-        <w:t>yyyy</w:t>
-      </w:r>
-      <w:proofErr w:type="spellEnd"/>
-      <w:r>
-        <w:rPr>
-          <w:rFonts w:ascii="Calibri" w:eastAsia="Calibri" w:hAnsi="Calibri" w:cs="Calibri"/>
-          <w:b/>
-          <w:bCs/>
-          <w:sz w:val="22"/>
-          <w:szCs w:val="22"/>
-        </w:rPr>
-        <w:t>') }}</w:t>
+        <w:t>{{ users[0].hearing_date.format('MM/dd/yyyy') }}</w:t>
       </w:r>
       <w:r>
         <w:rPr>
@@ -277,7 +221,6 @@
         </w:rPr>
         <w:t xml:space="preserve">{{ </w:t>
       </w:r>
-      <w:proofErr w:type="spellStart"/>
       <w:r>
         <w:rPr>
           <w:rFonts w:ascii="Calibri" w:eastAsia="Calibri" w:hAnsi="Calibri" w:cs="Calibri"/>
@@ -286,18 +229,7 @@
           <w:sz w:val="22"/>
           <w:szCs w:val="22"/>
         </w:rPr>
-        <w:t>format_time</w:t>
-      </w:r>
-      <w:proofErr w:type="spellEnd"/>
-      <w:r>
-        <w:rPr>
-          <w:rFonts w:ascii="Calibri" w:eastAsia="Calibri" w:hAnsi="Calibri" w:cs="Calibri"/>
-          <w:b/>
-          <w:bCs/>
-          <w:sz w:val="22"/>
-          <w:szCs w:val="22"/>
-        </w:rPr>
-        <w:t>(</w:t>
+        <w:t>format_time(</w:t>
       </w:r>
       <w:r>
         <w:rPr>
@@ -307,9 +239,8 @@
           <w:sz w:val="22"/>
           <w:szCs w:val="22"/>
         </w:rPr>
-        <w:t>users[0].</w:t>
+        <w:t>users[0].hearing_time</w:t>
       </w:r>
-      <w:proofErr w:type="spellStart"/>
       <w:r>
         <w:rPr>
           <w:rFonts w:ascii="Calibri" w:eastAsia="Calibri" w:hAnsi="Calibri" w:cs="Calibri"/>
@@ -318,40 +249,7 @@
           <w:sz w:val="22"/>
           <w:szCs w:val="22"/>
         </w:rPr>
-        <w:t>hearing_time</w:t>
-      </w:r>
-      <w:proofErr w:type="spellEnd"/>
-      <w:r>
-        <w:rPr>
-          <w:rFonts w:ascii="Calibri" w:eastAsia="Calibri" w:hAnsi="Calibri" w:cs="Calibri"/>
-          <w:b/>
-          <w:bCs/>
-          <w:sz w:val="22"/>
-          <w:szCs w:val="22"/>
-        </w:rPr>
-        <w:t>, format='</w:t>
-      </w:r>
-      <w:proofErr w:type="spellStart"/>
-      <w:r>
-        <w:rPr>
-          <w:rFonts w:ascii="Calibri" w:eastAsia="Calibri" w:hAnsi="Calibri" w:cs="Calibri"/>
-          <w:b/>
-          <w:bCs/>
-          <w:sz w:val="22"/>
-          <w:szCs w:val="22"/>
-        </w:rPr>
-        <w:t>h:mm</w:t>
-      </w:r>
-      <w:proofErr w:type="spellEnd"/>
-      <w:r>
-        <w:rPr>
-          <w:rFonts w:ascii="Calibri" w:eastAsia="Calibri" w:hAnsi="Calibri" w:cs="Calibri"/>
-          <w:b/>
-          <w:bCs/>
-          <w:sz w:val="22"/>
-          <w:szCs w:val="22"/>
-        </w:rPr>
-        <w:t xml:space="preserve"> a')</w:t>
+        <w:t>, format='h:mm a')</w:t>
       </w:r>
       <w:r>
         <w:rPr>
@@ -412,29 +310,7 @@
           <w:sz w:val="22"/>
           <w:szCs w:val="22"/>
         </w:rPr>
-        <w:t xml:space="preserve">{{ </w:t>
-      </w:r>
-      <w:proofErr w:type="spellStart"/>
-      <w:r>
-        <w:rPr>
-          <w:rFonts w:ascii="Calibri" w:eastAsia="Calibri" w:hAnsi="Calibri" w:cs="Calibri"/>
-          <w:b/>
-          <w:bCs/>
-          <w:sz w:val="22"/>
-          <w:szCs w:val="22"/>
-        </w:rPr>
-        <w:t>immigration_judge.name_full</w:t>
-      </w:r>
-      <w:proofErr w:type="spellEnd"/>
-      <w:r>
-        <w:rPr>
-          <w:rFonts w:ascii="Calibri" w:eastAsia="Calibri" w:hAnsi="Calibri" w:cs="Calibri"/>
-          <w:b/>
-          <w:bCs/>
-          <w:sz w:val="22"/>
-          <w:szCs w:val="22"/>
-        </w:rPr>
-        <w:t>() }}</w:t>
+        <w:t>{{ immigration_judge.name_full() }}</w:t>
       </w:r>
     </w:p>
     <w:p>
@@ -475,29 +351,7 @@
           <w:sz w:val="22"/>
           <w:szCs w:val="22"/>
         </w:rPr>
-        <w:t>{% if not users[0].</w:t>
-      </w:r>
-      <w:proofErr w:type="spellStart"/>
-      <w:r>
-        <w:rPr>
-          <w:rFonts w:ascii="Calibri" w:eastAsia="Calibri" w:hAnsi="Calibri" w:cs="Calibri"/>
-          <w:b/>
-          <w:bCs/>
-          <w:sz w:val="22"/>
-          <w:szCs w:val="22"/>
-        </w:rPr>
-        <w:t>has_riders</w:t>
-      </w:r>
-      <w:proofErr w:type="spellEnd"/>
-      <w:r>
-        <w:rPr>
-          <w:rFonts w:ascii="Calibri" w:eastAsia="Calibri" w:hAnsi="Calibri" w:cs="Calibri"/>
-          <w:b/>
-          <w:bCs/>
-          <w:sz w:val="22"/>
-          <w:szCs w:val="22"/>
-        </w:rPr>
-        <w:t xml:space="preserve"> %}N/A{% endif %}</w:t>
+        <w:t>{% if not users[0].has_riders %}N/A{% endif %}</w:t>
       </w:r>
     </w:p>
     <w:p>
@@ -530,7 +384,6 @@
         </w:rPr>
         <w:t>users[0].</w:t>
       </w:r>
-      <w:proofErr w:type="spellStart"/>
       <w:r>
         <w:rPr>
           <w:rFonts w:ascii="Calibri" w:eastAsia="Calibri" w:hAnsi="Calibri" w:cs="Calibri"/>
@@ -539,18 +392,7 @@
           <w:sz w:val="22"/>
           <w:szCs w:val="22"/>
         </w:rPr>
-        <w:t>has_riders</w:t>
-      </w:r>
-      <w:proofErr w:type="spellEnd"/>
-      <w:r>
-        <w:rPr>
-          <w:rFonts w:ascii="Calibri" w:eastAsia="Calibri" w:hAnsi="Calibri" w:cs="Calibri"/>
-          <w:b/>
-          <w:bCs/>
-          <w:sz w:val="22"/>
-          <w:szCs w:val="22"/>
-        </w:rPr>
-        <w:t xml:space="preserve"> %}</w:t>
+        <w:t>has_riders %}</w:t>
       </w:r>
     </w:p>
     <w:tbl>
@@ -584,23 +426,13 @@
                 <w:bCs/>
               </w:rPr>
             </w:pPr>
-            <w:proofErr w:type="spellStart"/>
             <w:r>
               <w:rPr>
                 <w:rFonts w:ascii="Calibri" w:eastAsia="Calibri" w:hAnsi="Calibri" w:cs="Calibri"/>
                 <w:b/>
                 <w:bCs/>
               </w:rPr>
-              <w:t>Additonal</w:t>
-            </w:r>
-            <w:proofErr w:type="spellEnd"/>
-            <w:r>
-              <w:rPr>
-                <w:rFonts w:ascii="Calibri" w:eastAsia="Calibri" w:hAnsi="Calibri" w:cs="Calibri"/>
-                <w:b/>
-                <w:bCs/>
-              </w:rPr>
-              <w:t xml:space="preserve"> Riders</w:t>
+              <w:t>Additonal Riders</w:t>
             </w:r>
           </w:p>
         </w:tc>
@@ -682,21 +514,7 @@
               <w:rPr>
                 <w:rFonts w:ascii="Calibri" w:eastAsia="Calibri" w:hAnsi="Calibri" w:cs="Calibri"/>
               </w:rPr>
-              <w:t xml:space="preserve">{%tr for rider in </w:t>
-            </w:r>
-            <w:proofErr w:type="spellStart"/>
-            <w:r>
-              <w:rPr>
-                <w:rFonts w:ascii="Calibri" w:eastAsia="Calibri" w:hAnsi="Calibri" w:cs="Calibri"/>
-              </w:rPr>
-              <w:t>additional_riders</w:t>
-            </w:r>
-            <w:proofErr w:type="spellEnd"/>
-            <w:r>
-              <w:rPr>
-                <w:rFonts w:ascii="Calibri" w:eastAsia="Calibri" w:hAnsi="Calibri" w:cs="Calibri"/>
-              </w:rPr>
-              <w:t xml:space="preserve"> %}</w:t>
+              <w:t>{%tr for rider in additional_riders %}</w:t>
             </w:r>
           </w:p>
         </w:tc>
@@ -743,21 +561,7 @@
               <w:rPr>
                 <w:rFonts w:ascii="Calibri" w:eastAsia="Calibri" w:hAnsi="Calibri" w:cs="Calibri"/>
               </w:rPr>
-              <w:t xml:space="preserve">{{ </w:t>
-            </w:r>
-            <w:proofErr w:type="spellStart"/>
-            <w:r>
-              <w:rPr>
-                <w:rFonts w:ascii="Calibri" w:eastAsia="Calibri" w:hAnsi="Calibri" w:cs="Calibri"/>
-              </w:rPr>
-              <w:t>rider.name_full</w:t>
-            </w:r>
-            <w:proofErr w:type="spellEnd"/>
-            <w:r>
-              <w:rPr>
-                <w:rFonts w:ascii="Calibri" w:eastAsia="Calibri" w:hAnsi="Calibri" w:cs="Calibri"/>
-              </w:rPr>
-              <w:t>() }}</w:t>
+              <w:t>{{ rider.name_full() }}</w:t>
             </w:r>
           </w:p>
         </w:tc>
@@ -775,21 +579,7 @@
               <w:rPr>
                 <w:rFonts w:ascii="Calibri" w:eastAsia="Calibri" w:hAnsi="Calibri" w:cs="Calibri"/>
               </w:rPr>
-              <w:t xml:space="preserve">{{ </w:t>
-            </w:r>
-            <w:proofErr w:type="spellStart"/>
-            <w:r>
-              <w:rPr>
-                <w:rFonts w:ascii="Calibri" w:eastAsia="Calibri" w:hAnsi="Calibri" w:cs="Calibri"/>
-              </w:rPr>
-              <w:t>rider.relationship</w:t>
-            </w:r>
-            <w:proofErr w:type="spellEnd"/>
-            <w:r>
-              <w:rPr>
-                <w:rFonts w:ascii="Calibri" w:eastAsia="Calibri" w:hAnsi="Calibri" w:cs="Calibri"/>
-              </w:rPr>
-              <w:t xml:space="preserve"> }}</w:t>
+              <w:t>{{ rider.relationship }}</w:t>
             </w:r>
           </w:p>
         </w:tc>
@@ -800,28 +590,14 @@
           <w:p>
             <w:pPr>
               <w:rPr>
-                <w:rFonts w:eastAsia="Arial" w:cstheme="minorHAnsi"/>
-              </w:rPr>
-            </w:pPr>
-            <w:r>
-              <w:rPr>
-                <w:rFonts w:ascii="Calibri" w:eastAsia="Calibri" w:hAnsi="Calibri" w:cs="Calibri"/>
-              </w:rPr>
-              <w:t xml:space="preserve">{{ </w:t>
-            </w:r>
-            <w:proofErr w:type="spellStart"/>
-            <w:r>
-              <w:rPr>
-                <w:rFonts w:ascii="Calibri" w:eastAsia="Calibri" w:hAnsi="Calibri" w:cs="Calibri"/>
-              </w:rPr>
-              <w:t>rider.a_number</w:t>
-            </w:r>
-            <w:proofErr w:type="spellEnd"/>
-            <w:r>
-              <w:rPr>
-                <w:rFonts w:ascii="Calibri" w:eastAsia="Calibri" w:hAnsi="Calibri" w:cs="Calibri"/>
-              </w:rPr>
-              <w:t xml:space="preserve"> }}</w:t>
+                <w:rFonts w:ascii="Calibri" w:eastAsia="Arial" w:hAnsi="Calibri" w:cs="Calibri"/>
+              </w:rPr>
+            </w:pPr>
+            <w:r>
+              <w:rPr>
+                <w:rFonts w:ascii="Calibri" w:eastAsia="Calibri" w:hAnsi="Calibri" w:cs="Calibri"/>
+              </w:rPr>
+              <w:t>{{ rider.a_number }}</w:t>
             </w:r>
           </w:p>
         </w:tc>
@@ -844,29 +620,8 @@
               <w:rPr>
                 <w:rFonts w:ascii="Calibri" w:eastAsia="Calibri" w:hAnsi="Calibri" w:cs="Calibri"/>
               </w:rPr>
-              <w:t xml:space="preserve">{%tr </w:t>
-            </w:r>
-            <w:proofErr w:type="spellStart"/>
-            <w:r>
-              <w:rPr>
-                <w:rFonts w:ascii="Calibri" w:eastAsia="Calibri" w:hAnsi="Calibri" w:cs="Calibri"/>
-              </w:rPr>
-              <w:t>endfor</w:t>
-            </w:r>
-            <w:proofErr w:type="spellEnd"/>
-            <w:r>
-              <w:rPr>
-                <w:rFonts w:ascii="Calibri" w:eastAsia="Calibri" w:hAnsi="Calibri" w:cs="Calibri"/>
-              </w:rPr>
-              <w:t xml:space="preserve"> %}</w:t>
-            </w:r>
-          </w:p>
-          <w:p>
-            <w:pPr>
-              <w:rPr>
-                <w:rFonts w:ascii="Calibri" w:eastAsia="Calibri" w:hAnsi="Calibri" w:cs="Calibri"/>
-              </w:rPr>
-            </w:pPr>
+              <w:t>{%tr endfor %}</w:t>
+            </w:r>
           </w:p>
         </w:tc>
         <w:tc>
@@ -914,6 +669,16 @@
           <w:szCs w:val="22"/>
         </w:rPr>
         <w:t>{%p endif %}</w:t>
+      </w:r>
+      <w:r>
+        <w:rPr>
+          <w:rFonts w:ascii="Calibri" w:eastAsia="Calibri" w:hAnsi="Calibri" w:cs="Calibri"/>
+          <w:b/>
+          <w:bCs/>
+          <w:sz w:val="22"/>
+          <w:szCs w:val="22"/>
+        </w:rPr>
+        <w:br/>
       </w:r>
     </w:p>
     <w:tbl>
@@ -1015,21 +780,7 @@
               <w:rPr>
                 <w:rFonts w:ascii="Calibri" w:eastAsia="Calibri" w:hAnsi="Calibri" w:cs="Calibri"/>
               </w:rPr>
-              <w:t>].</w:t>
-            </w:r>
-            <w:proofErr w:type="spellStart"/>
-            <w:r>
-              <w:rPr>
-                <w:rFonts w:ascii="Calibri" w:eastAsia="Calibri" w:hAnsi="Calibri" w:cs="Calibri"/>
-              </w:rPr>
-              <w:t>name_full</w:t>
-            </w:r>
-            <w:proofErr w:type="spellEnd"/>
-            <w:r>
-              <w:rPr>
-                <w:rFonts w:ascii="Calibri" w:eastAsia="Calibri" w:hAnsi="Calibri" w:cs="Calibri"/>
-              </w:rPr>
-              <w:t>() }}</w:t>
+              <w:t>].name_full() }}</w:t>
             </w:r>
           </w:p>
         </w:tc>
@@ -1086,35 +837,7 @@
               <w:rPr>
                 <w:rFonts w:ascii="Calibri" w:eastAsia="Calibri" w:hAnsi="Calibri" w:cs="Calibri"/>
               </w:rPr>
-              <w:t>].</w:t>
-            </w:r>
-            <w:proofErr w:type="spellStart"/>
-            <w:r>
-              <w:rPr>
-                <w:rFonts w:ascii="Calibri" w:eastAsia="Calibri" w:hAnsi="Calibri" w:cs="Calibri"/>
-              </w:rPr>
-              <w:t>birthdate.format</w:t>
-            </w:r>
-            <w:proofErr w:type="spellEnd"/>
-            <w:r>
-              <w:rPr>
-                <w:rFonts w:ascii="Calibri" w:eastAsia="Calibri" w:hAnsi="Calibri" w:cs="Calibri"/>
-              </w:rPr>
-              <w:t>('MM/dd/</w:t>
-            </w:r>
-            <w:proofErr w:type="spellStart"/>
-            <w:r>
-              <w:rPr>
-                <w:rFonts w:ascii="Calibri" w:eastAsia="Calibri" w:hAnsi="Calibri" w:cs="Calibri"/>
-              </w:rPr>
-              <w:t>yyyy</w:t>
-            </w:r>
-            <w:proofErr w:type="spellEnd"/>
-            <w:r>
-              <w:rPr>
-                <w:rFonts w:ascii="Calibri" w:eastAsia="Calibri" w:hAnsi="Calibri" w:cs="Calibri"/>
-              </w:rPr>
-              <w:t>') }}</w:t>
+              <w:t>].birthdate.format('MM/dd/yyyy') }}</w:t>
             </w:r>
           </w:p>
         </w:tc>
@@ -1159,35 +882,21 @@
             </w:pPr>
             <w:r>
               <w:rPr>
-                <w:rFonts w:eastAsia="Arial" w:cstheme="minorHAnsi"/>
+                <w:rFonts w:ascii="Calibri" w:eastAsia="Arial" w:hAnsi="Calibri" w:cs="Calibri"/>
               </w:rPr>
               <w:t>{{ users[</w:t>
             </w:r>
             <w:r>
               <w:rPr>
-                <w:rFonts w:eastAsia="Arial" w:cstheme="minorHAnsi"/>
+                <w:rFonts w:ascii="Calibri" w:eastAsia="Arial" w:hAnsi="Calibri" w:cs="Calibri"/>
               </w:rPr>
               <w:t>0</w:t>
             </w:r>
             <w:r>
               <w:rPr>
-                <w:rFonts w:eastAsia="Arial" w:cstheme="minorHAnsi"/>
-              </w:rPr>
-              <w:t>].</w:t>
-            </w:r>
-            <w:proofErr w:type="spellStart"/>
-            <w:r>
-              <w:rPr>
-                <w:rFonts w:eastAsia="Arial" w:cstheme="minorHAnsi"/>
-              </w:rPr>
-              <w:t>a_number</w:t>
-            </w:r>
-            <w:proofErr w:type="spellEnd"/>
-            <w:r>
-              <w:rPr>
-                <w:rFonts w:eastAsia="Arial" w:cstheme="minorHAnsi"/>
-              </w:rPr>
-              <w:t xml:space="preserve"> }}</w:t>
+                <w:rFonts w:ascii="Calibri" w:eastAsia="Arial" w:hAnsi="Calibri" w:cs="Calibri"/>
+              </w:rPr>
+              <w:t>].a_number }}</w:t>
             </w:r>
           </w:p>
         </w:tc>
@@ -1234,19 +943,11 @@
               </w:rPr>
               <w:t xml:space="preserve">{{ </w:t>
             </w:r>
-            <w:proofErr w:type="spellStart"/>
-            <w:r>
-              <w:rPr>
-                <w:rFonts w:ascii="Calibri" w:eastAsia="Calibri" w:hAnsi="Calibri" w:cs="Calibri"/>
-              </w:rPr>
-              <w:t>phone_number_formatted</w:t>
-            </w:r>
-            <w:proofErr w:type="spellEnd"/>
-            <w:r>
-              <w:rPr>
-                <w:rFonts w:ascii="Calibri" w:eastAsia="Calibri" w:hAnsi="Calibri" w:cs="Calibri"/>
-              </w:rPr>
-              <w:t>(</w:t>
+            <w:r>
+              <w:rPr>
+                <w:rFonts w:ascii="Calibri" w:eastAsia="Calibri" w:hAnsi="Calibri" w:cs="Calibri"/>
+              </w:rPr>
+              <w:t>phone_number_formatted(</w:t>
             </w:r>
             <w:r>
               <w:rPr>
@@ -1264,16 +965,8 @@
               <w:rPr>
                 <w:rFonts w:ascii="Calibri" w:eastAsia="Calibri" w:hAnsi="Calibri" w:cs="Calibri"/>
               </w:rPr>
-              <w:t>].</w:t>
-            </w:r>
-            <w:proofErr w:type="spellStart"/>
-            <w:r>
-              <w:rPr>
-                <w:rFonts w:ascii="Calibri" w:eastAsia="Calibri" w:hAnsi="Calibri" w:cs="Calibri"/>
-              </w:rPr>
-              <w:t>phone_number</w:t>
-            </w:r>
-            <w:proofErr w:type="spellEnd"/>
+              <w:t>].phone_number</w:t>
+            </w:r>
             <w:r>
               <w:rPr>
                 <w:rFonts w:ascii="Calibri" w:eastAsia="Calibri" w:hAnsi="Calibri" w:cs="Calibri"/>
@@ -1284,13 +977,7 @@
               <w:rPr>
                 <w:rFonts w:ascii="Calibri" w:eastAsia="Calibri" w:hAnsi="Calibri" w:cs="Calibri"/>
               </w:rPr>
-              <w:t xml:space="preserve"> </w:t>
-            </w:r>
-            <w:r>
-              <w:rPr>
-                <w:rFonts w:ascii="Calibri" w:eastAsia="Calibri" w:hAnsi="Calibri" w:cs="Calibri"/>
-              </w:rPr>
-              <w:t>}}</w:t>
+              <w:t xml:space="preserve"> }}</w:t>
             </w:r>
           </w:p>
         </w:tc>
@@ -1404,21 +1091,7 @@
               <w:rPr>
                 <w:rFonts w:ascii="Calibri" w:eastAsia="Calibri" w:hAnsi="Calibri" w:cs="Calibri"/>
               </w:rPr>
-              <w:t>].</w:t>
-            </w:r>
-            <w:proofErr w:type="spellStart"/>
-            <w:r>
-              <w:rPr>
-                <w:rFonts w:ascii="Calibri" w:eastAsia="Calibri" w:hAnsi="Calibri" w:cs="Calibri"/>
-              </w:rPr>
-              <w:t>country_of_birth</w:t>
-            </w:r>
-            <w:proofErr w:type="spellEnd"/>
-            <w:r>
-              <w:rPr>
-                <w:rFonts w:ascii="Calibri" w:eastAsia="Calibri" w:hAnsi="Calibri" w:cs="Calibri"/>
-              </w:rPr>
-              <w:t xml:space="preserve"> }}</w:t>
+              <w:t>].country_of_birth }}</w:t>
             </w:r>
           </w:p>
         </w:tc>
@@ -1463,21 +1136,7 @@
               <w:rPr>
                 <w:rFonts w:ascii="Calibri" w:eastAsia="Calibri" w:hAnsi="Calibri" w:cs="Calibri"/>
               </w:rPr>
-              <w:t xml:space="preserve">{{ </w:t>
-            </w:r>
-            <w:proofErr w:type="spellStart"/>
-            <w:r>
-              <w:rPr>
-                <w:rFonts w:ascii="Calibri" w:eastAsia="Calibri" w:hAnsi="Calibri" w:cs="Calibri"/>
-              </w:rPr>
-              <w:t>comma_list</w:t>
-            </w:r>
-            <w:proofErr w:type="spellEnd"/>
-            <w:r>
-              <w:rPr>
-                <w:rFonts w:ascii="Calibri" w:eastAsia="Calibri" w:hAnsi="Calibri" w:cs="Calibri"/>
-              </w:rPr>
-              <w:t>(</w:t>
+              <w:t>{{ comma_list(</w:t>
             </w:r>
             <w:r>
               <w:rPr>
@@ -1503,7 +1162,6 @@
               </w:rPr>
               <w:t>].</w:t>
             </w:r>
-            <w:proofErr w:type="spellStart"/>
             <w:r>
               <w:rPr>
                 <w:rFonts w:ascii="Calibri" w:eastAsia="Calibri" w:hAnsi="Calibri" w:cs="Calibri"/>
@@ -1516,50 +1174,11 @@
               </w:rPr>
               <w:t>_of_citizenship</w:t>
             </w:r>
-            <w:proofErr w:type="spellEnd"/>
-            <w:r>
-              <w:rPr>
-                <w:rFonts w:ascii="Calibri" w:eastAsia="Calibri" w:hAnsi="Calibri" w:cs="Calibri"/>
-              </w:rPr>
-              <w:t>,</w:t>
-            </w:r>
-            <w:r>
-              <w:rPr>
-                <w:rFonts w:ascii="Calibri" w:eastAsia="Calibri" w:hAnsi="Calibri" w:cs="Calibri"/>
-              </w:rPr>
-              <w:t xml:space="preserve"> users[</w:t>
-            </w:r>
-            <w:r>
-              <w:rPr>
-                <w:rFonts w:ascii="Calibri" w:eastAsia="Calibri" w:hAnsi="Calibri" w:cs="Calibri"/>
-              </w:rPr>
-              <w:t>0</w:t>
-            </w:r>
-            <w:r>
-              <w:rPr>
-                <w:rFonts w:ascii="Calibri" w:eastAsia="Calibri" w:hAnsi="Calibri" w:cs="Calibri"/>
-              </w:rPr>
-              <w:t>]</w:t>
-            </w:r>
-            <w:r>
-              <w:rPr>
-                <w:rFonts w:ascii="Calibri" w:eastAsia="Calibri" w:hAnsi="Calibri" w:cs="Calibri"/>
-              </w:rPr>
-              <w:t>.</w:t>
-            </w:r>
-            <w:proofErr w:type="spellStart"/>
-            <w:r>
-              <w:rPr>
-                <w:rFonts w:ascii="Calibri" w:eastAsia="Calibri" w:hAnsi="Calibri" w:cs="Calibri"/>
-              </w:rPr>
-              <w:t>additional_citizenship</w:t>
-            </w:r>
-            <w:proofErr w:type="spellEnd"/>
-            <w:r>
-              <w:rPr>
-                <w:rFonts w:ascii="Calibri" w:eastAsia="Calibri" w:hAnsi="Calibri" w:cs="Calibri"/>
-              </w:rPr>
-              <w:t>]</w:t>
+            <w:r>
+              <w:rPr>
+                <w:rFonts w:ascii="Calibri" w:eastAsia="Calibri" w:hAnsi="Calibri" w:cs="Calibri"/>
+              </w:rPr>
+              <w:t>, users[0].additional_citizenship]</w:t>
             </w:r>
           </w:p>
           <w:p>
@@ -1599,19 +1218,7 @@
               <w:rPr>
                 <w:rFonts w:ascii="Calibri" w:eastAsia="Calibri" w:hAnsi="Calibri" w:cs="Calibri"/>
               </w:rPr>
-              <w:t xml:space="preserve">Is this your first </w:t>
-            </w:r>
-            <w:r>
-              <w:rPr>
-                <w:rFonts w:ascii="Calibri" w:eastAsia="Calibri" w:hAnsi="Calibri" w:cs="Calibri"/>
-              </w:rPr>
-              <w:t>hearing</w:t>
-            </w:r>
-            <w:r>
-              <w:rPr>
-                <w:rFonts w:ascii="Calibri" w:eastAsia="Calibri" w:hAnsi="Calibri" w:cs="Calibri"/>
-              </w:rPr>
-              <w:t>?</w:t>
+              <w:t>Is this your first hearing?</w:t>
             </w:r>
           </w:p>
         </w:tc>
@@ -1627,105 +1234,114 @@
               </w:rPr>
             </w:pPr>
             <w:r>
+              <w:rPr>
+                <w:rFonts w:ascii="Calibri" w:hAnsi="Calibri" w:cs="Calibri"/>
+              </w:rPr>
+              <w:t>{{ output_checkbox(users[</w:t>
+            </w:r>
+            <w:r>
+              <w:rPr>
+                <w:rFonts w:ascii="Calibri" w:hAnsi="Calibri" w:cs="Calibri"/>
+              </w:rPr>
+              <w:t>0</w:t>
+            </w:r>
+            <w:r>
+              <w:rPr>
+                <w:rFonts w:ascii="Calibri" w:hAnsi="Calibri" w:cs="Calibri"/>
+              </w:rPr>
+              <w:t>].</w:t>
+            </w:r>
+            <w:r>
+              <w:rPr>
+                <w:rFonts w:ascii="Calibri" w:hAnsi="Calibri" w:cs="Calibri"/>
+              </w:rPr>
+              <w:t>fotc_first_hearing</w:t>
+            </w:r>
+            <w:r>
+              <w:rPr>
+                <w:rFonts w:ascii="Calibri" w:hAnsi="Calibri" w:cs="Calibri"/>
+              </w:rPr>
+              <w:t xml:space="preserve">)  }} </w:t>
+            </w:r>
+            <w:r>
+              <w:rPr>
+                <w:rFonts w:ascii="Calibri" w:eastAsia="Calibri" w:hAnsi="Calibri" w:cs="Calibri"/>
+              </w:rPr>
+              <w:t xml:space="preserve">Yes   </w:t>
+            </w:r>
+          </w:p>
+          <w:p>
+            <w:pPr>
+              <w:pStyle w:val="NoSpacing"/>
+              <w:rPr>
+                <w:rFonts w:ascii="Calibri" w:hAnsi="Calibri" w:cs="Calibri"/>
+              </w:rPr>
+            </w:pPr>
+            <w:r>
+              <w:rPr>
+                <w:rFonts w:ascii="Calibri" w:hAnsi="Calibri" w:cs="Calibri"/>
+              </w:rPr>
+              <w:t>{{ output_checkbox(not users[</w:t>
+            </w:r>
+            <w:r>
+              <w:rPr>
+                <w:rFonts w:ascii="Calibri" w:hAnsi="Calibri" w:cs="Calibri"/>
+              </w:rPr>
+              <w:t>0</w:t>
+            </w:r>
+            <w:r>
+              <w:rPr>
+                <w:rFonts w:ascii="Calibri" w:hAnsi="Calibri" w:cs="Calibri"/>
+              </w:rPr>
+              <w:t>].</w:t>
+            </w:r>
+            <w:r>
+              <w:rPr>
+                <w:rFonts w:ascii="Calibri" w:hAnsi="Calibri" w:cs="Calibri"/>
+              </w:rPr>
+              <w:t>fotc_first_hearing</w:t>
+            </w:r>
+            <w:r>
+              <w:rPr>
+                <w:rFonts w:ascii="Calibri" w:hAnsi="Calibri" w:cs="Calibri"/>
+              </w:rPr>
+              <w:t xml:space="preserve">)  }} </w:t>
+            </w:r>
+            <w:r>
+              <w:rPr>
+                <w:rFonts w:ascii="Calibri" w:eastAsia="Calibri" w:hAnsi="Calibri" w:cs="Calibri"/>
+              </w:rPr>
+              <w:t xml:space="preserve">No – Prior Hearing date: </w:t>
+            </w:r>
+            <w:r>
+              <w:rPr>
+                <w:rFonts w:ascii="Calibri" w:hAnsi="Calibri" w:cs="Calibri"/>
+              </w:rPr>
               <w:t xml:space="preserve">{{ </w:t>
             </w:r>
-            <w:proofErr w:type="spellStart"/>
-            <w:r>
-              <w:t>output_checkbox</w:t>
-            </w:r>
-            <w:proofErr w:type="spellEnd"/>
-            <w:r>
-              <w:t>(users[</w:t>
-            </w:r>
-            <w:r>
-              <w:t>0</w:t>
-            </w:r>
-            <w:r>
-              <w:t>].</w:t>
-            </w:r>
-            <w:proofErr w:type="spellStart"/>
-            <w:r>
-              <w:t>fotc_first_hearing</w:t>
-            </w:r>
-            <w:proofErr w:type="spellEnd"/>
-            <w:r>
-              <w:t xml:space="preserve">)  }} </w:t>
-            </w:r>
-            <w:r>
-              <w:rPr>
-                <w:rFonts w:ascii="Calibri" w:eastAsia="Calibri" w:hAnsi="Calibri" w:cs="Calibri"/>
-              </w:rPr>
-              <w:t xml:space="preserve">Yes   </w:t>
-            </w:r>
-          </w:p>
-          <w:p>
-            <w:pPr>
-              <w:pStyle w:val="NoSpacing"/>
-            </w:pPr>
-            <w:r>
-              <w:t xml:space="preserve">{{ </w:t>
-            </w:r>
-            <w:proofErr w:type="spellStart"/>
-            <w:r>
-              <w:t>output_checkbox</w:t>
-            </w:r>
-            <w:proofErr w:type="spellEnd"/>
-            <w:r>
-              <w:t xml:space="preserve">(not </w:t>
-            </w:r>
-            <w:r>
-              <w:t>users[</w:t>
-            </w:r>
-            <w:r>
-              <w:t>0</w:t>
-            </w:r>
-            <w:r>
-              <w:t>].</w:t>
-            </w:r>
-            <w:proofErr w:type="spellStart"/>
-            <w:r>
-              <w:t>fotc_first_hearing</w:t>
-            </w:r>
-            <w:proofErr w:type="spellEnd"/>
-            <w:r>
-              <w:t xml:space="preserve">)  }} </w:t>
-            </w:r>
-            <w:r>
-              <w:rPr>
-                <w:rFonts w:ascii="Calibri" w:eastAsia="Calibri" w:hAnsi="Calibri" w:cs="Calibri"/>
-              </w:rPr>
-              <w:t xml:space="preserve">No – Prior Hearing date: </w:t>
-            </w:r>
-            <w:r>
-              <w:t>{{</w:t>
-            </w:r>
-            <w:r>
-              <w:t xml:space="preserve"> </w:t>
-            </w:r>
-            <w:r>
+            <w:r>
+              <w:rPr>
+                <w:rFonts w:ascii="Calibri" w:hAnsi="Calibri" w:cs="Calibri"/>
+              </w:rPr>
               <w:t>users[0]</w:t>
             </w:r>
             <w:r>
+              <w:rPr>
+                <w:rFonts w:ascii="Calibri" w:hAnsi="Calibri" w:cs="Calibri"/>
+              </w:rPr>
               <w:t>.</w:t>
             </w:r>
-            <w:proofErr w:type="spellStart"/>
-            <w:r>
+            <w:r>
+              <w:rPr>
+                <w:rFonts w:ascii="Calibri" w:hAnsi="Calibri" w:cs="Calibri"/>
+              </w:rPr>
               <w:t>fotc_prior_hearing_date</w:t>
             </w:r>
             <w:r>
-              <w:t>.format</w:t>
-            </w:r>
-            <w:proofErr w:type="spellEnd"/>
-            <w:r>
-              <w:t>(“MM/dd/</w:t>
-            </w:r>
-            <w:proofErr w:type="spellStart"/>
-            <w:r>
-              <w:t>yyyy</w:t>
-            </w:r>
-            <w:proofErr w:type="spellEnd"/>
-            <w:r>
-              <w:t>”) }}</w:t>
+              <w:rPr>
+                <w:rFonts w:ascii="Calibri" w:hAnsi="Calibri" w:cs="Calibri"/>
+              </w:rPr>
+              <w:t>.format(“MM/dd/yyyy”) }}</w:t>
             </w:r>
           </w:p>
         </w:tc>
@@ -1752,19 +1368,7 @@
               <w:rPr>
                 <w:rFonts w:ascii="Calibri" w:eastAsia="Calibri" w:hAnsi="Calibri" w:cs="Calibri"/>
               </w:rPr>
-              <w:t>What happened at your prior hearing</w:t>
-            </w:r>
-            <w:r>
-              <w:rPr>
-                <w:rFonts w:ascii="Calibri" w:eastAsia="Calibri" w:hAnsi="Calibri" w:cs="Calibri"/>
-              </w:rPr>
-              <w:t>?</w:t>
-            </w:r>
-            <w:r>
-              <w:rPr>
-                <w:rFonts w:ascii="Calibri" w:eastAsia="Calibri" w:hAnsi="Calibri" w:cs="Calibri"/>
-              </w:rPr>
-              <w:t xml:space="preserve"> (if applicable)</w:t>
+              <w:t>What happened at your prior hearing? (if applicable)</w:t>
             </w:r>
           </w:p>
         </w:tc>
@@ -1775,39 +1379,52 @@
           <w:p>
             <w:pPr>
               <w:pStyle w:val="NoSpacing"/>
-            </w:pPr>
-            <w:r>
+              <w:rPr>
+                <w:rFonts w:ascii="Calibri" w:hAnsi="Calibri" w:cs="Calibri"/>
+              </w:rPr>
+            </w:pPr>
+            <w:r>
+              <w:rPr>
+                <w:rFonts w:ascii="Calibri" w:hAnsi="Calibri" w:cs="Calibri"/>
+              </w:rPr>
               <w:t>Details:</w:t>
             </w:r>
           </w:p>
           <w:p>
             <w:pPr>
               <w:pStyle w:val="NoSpacing"/>
-            </w:pPr>
-            <w:r>
-              <w:t>{{</w:t>
-            </w:r>
-            <w:r>
-              <w:t xml:space="preserve"> users[</w:t>
-            </w:r>
-            <w:r>
+              <w:rPr>
+                <w:rFonts w:ascii="Calibri" w:hAnsi="Calibri" w:cs="Calibri"/>
+              </w:rPr>
+            </w:pPr>
+            <w:r>
+              <w:rPr>
+                <w:rFonts w:ascii="Calibri" w:hAnsi="Calibri" w:cs="Calibri"/>
+              </w:rPr>
+              <w:t>{{ users[</w:t>
+            </w:r>
+            <w:r>
+              <w:rPr>
+                <w:rFonts w:ascii="Calibri" w:hAnsi="Calibri" w:cs="Calibri"/>
+              </w:rPr>
               <w:t>0</w:t>
             </w:r>
             <w:r>
+              <w:rPr>
+                <w:rFonts w:ascii="Calibri" w:hAnsi="Calibri" w:cs="Calibri"/>
+              </w:rPr>
               <w:t>].</w:t>
             </w:r>
-            <w:proofErr w:type="spellStart"/>
-            <w:r>
-              <w:t>f</w:t>
-            </w:r>
-            <w:r>
-              <w:t>otc_prior_hearing_details</w:t>
-            </w:r>
-            <w:proofErr w:type="spellEnd"/>
-            <w:r>
-              <w:t xml:space="preserve"> </w:t>
-            </w:r>
-            <w:r>
+            <w:r>
+              <w:rPr>
+                <w:rFonts w:ascii="Calibri" w:hAnsi="Calibri" w:cs="Calibri"/>
+              </w:rPr>
+              <w:t xml:space="preserve">fotc_prior_hearing_details </w:t>
+            </w:r>
+            <w:r>
+              <w:rPr>
+                <w:rFonts w:ascii="Calibri" w:hAnsi="Calibri" w:cs="Calibri"/>
+              </w:rPr>
               <w:t>}}</w:t>
             </w:r>
           </w:p>
@@ -1907,72 +1524,64 @@
           <w:p>
             <w:pPr>
               <w:pStyle w:val="NoSpacing"/>
-            </w:pPr>
-            <w:r>
-              <w:t xml:space="preserve">{{ </w:t>
-            </w:r>
-            <w:proofErr w:type="spellStart"/>
-            <w:r>
-              <w:t>output_checkbox</w:t>
-            </w:r>
-            <w:proofErr w:type="spellEnd"/>
-            <w:r>
-              <w:t>(</w:t>
-            </w:r>
-            <w:r>
+              <w:rPr>
+                <w:rFonts w:ascii="Calibri" w:hAnsi="Calibri" w:cs="Calibri"/>
+              </w:rPr>
+            </w:pPr>
+            <w:r>
+              <w:rPr>
+                <w:rFonts w:ascii="Calibri" w:hAnsi="Calibri" w:cs="Calibri"/>
+              </w:rPr>
+              <w:t>{{ output_checkbox(</w:t>
+            </w:r>
+            <w:r>
+              <w:rPr>
+                <w:rFonts w:ascii="Calibri" w:hAnsi="Calibri" w:cs="Calibri"/>
+              </w:rPr>
               <w:t>users[0]</w:t>
             </w:r>
             <w:r>
-              <w:t>.</w:t>
-            </w:r>
-            <w:proofErr w:type="spellStart"/>
-            <w:r>
-              <w:t>notice_to_appear</w:t>
-            </w:r>
-            <w:proofErr w:type="spellEnd"/>
-            <w:r>
-              <w:t xml:space="preserve">) }} </w:t>
-            </w:r>
-            <w:r>
+              <w:rPr>
+                <w:rFonts w:ascii="Calibri" w:hAnsi="Calibri" w:cs="Calibri"/>
+              </w:rPr>
+              <w:t xml:space="preserve">.notice_to_appear) }} </w:t>
+            </w:r>
+            <w:r>
+              <w:rPr>
+                <w:rFonts w:ascii="Calibri" w:hAnsi="Calibri" w:cs="Calibri"/>
+              </w:rPr>
               <w:t xml:space="preserve">Yes   </w:t>
             </w:r>
           </w:p>
           <w:p>
             <w:pPr>
               <w:pStyle w:val="NoSpacing"/>
-            </w:pPr>
-            <w:r>
-              <w:t xml:space="preserve">{{ </w:t>
-            </w:r>
-            <w:proofErr w:type="spellStart"/>
-            <w:r>
-              <w:t>output_checkbox</w:t>
-            </w:r>
-            <w:proofErr w:type="spellEnd"/>
-            <w:r>
-              <w:t>(</w:t>
-            </w:r>
-            <w:r>
-              <w:t xml:space="preserve">not </w:t>
-            </w:r>
-            <w:r>
+              <w:rPr>
+                <w:rFonts w:ascii="Calibri" w:hAnsi="Calibri" w:cs="Calibri"/>
+              </w:rPr>
+            </w:pPr>
+            <w:r>
+              <w:rPr>
+                <w:rFonts w:ascii="Calibri" w:hAnsi="Calibri" w:cs="Calibri"/>
+              </w:rPr>
+              <w:t xml:space="preserve">{{ output_checkbox(not </w:t>
+            </w:r>
+            <w:r>
+              <w:rPr>
+                <w:rFonts w:ascii="Calibri" w:hAnsi="Calibri" w:cs="Calibri"/>
+              </w:rPr>
               <w:t>users[0]</w:t>
             </w:r>
             <w:r>
-              <w:t>.</w:t>
-            </w:r>
-            <w:proofErr w:type="spellStart"/>
-            <w:r>
-              <w:t>notice_to_appear</w:t>
-            </w:r>
-            <w:proofErr w:type="spellEnd"/>
-            <w:r>
-              <w:t>) }}</w:t>
-            </w:r>
-            <w:r>
-              <w:t xml:space="preserve"> </w:t>
-            </w:r>
-            <w:r>
+              <w:rPr>
+                <w:rFonts w:ascii="Calibri" w:hAnsi="Calibri" w:cs="Calibri"/>
+              </w:rPr>
+              <w:t xml:space="preserve">.notice_to_appear) }} </w:t>
+            </w:r>
+            <w:r>
+              <w:rPr>
+                <w:rFonts w:ascii="Calibri" w:hAnsi="Calibri" w:cs="Calibri"/>
+              </w:rPr>
               <w:t xml:space="preserve">No </w:t>
             </w:r>
           </w:p>
@@ -2011,75 +1620,89 @@
           <w:p>
             <w:pPr>
               <w:pStyle w:val="NoSpacing"/>
-            </w:pPr>
-            <w:r>
-              <w:t xml:space="preserve">{{ </w:t>
-            </w:r>
-            <w:proofErr w:type="spellStart"/>
-            <w:r>
-              <w:t>output_checkbox</w:t>
-            </w:r>
-            <w:proofErr w:type="spellEnd"/>
-            <w:r>
-              <w:t>(</w:t>
-            </w:r>
-            <w:r>
+              <w:rPr>
+                <w:rFonts w:ascii="Calibri" w:hAnsi="Calibri" w:cs="Calibri"/>
+              </w:rPr>
+            </w:pPr>
+            <w:r>
+              <w:rPr>
+                <w:rFonts w:ascii="Calibri" w:hAnsi="Calibri" w:cs="Calibri"/>
+              </w:rPr>
+              <w:t>{{ output_checkbox(</w:t>
+            </w:r>
+            <w:r>
+              <w:rPr>
+                <w:rFonts w:ascii="Calibri" w:hAnsi="Calibri" w:cs="Calibri"/>
+              </w:rPr>
               <w:t>users[0]</w:t>
             </w:r>
             <w:r>
+              <w:rPr>
+                <w:rFonts w:ascii="Calibri" w:hAnsi="Calibri" w:cs="Calibri"/>
+              </w:rPr>
               <w:t>.</w:t>
             </w:r>
-            <w:proofErr w:type="spellStart"/>
-            <w:r>
+            <w:r>
+              <w:rPr>
+                <w:rFonts w:ascii="Calibri" w:hAnsi="Calibri" w:cs="Calibri"/>
+              </w:rPr>
               <w:t>notice_name</w:t>
             </w:r>
-            <w:proofErr w:type="spellEnd"/>
-            <w:r>
-              <w:t>) }}</w:t>
-            </w:r>
-            <w:r>
-              <w:t xml:space="preserve"> </w:t>
-            </w:r>
-            <w:r>
+            <w:r>
+              <w:rPr>
+                <w:rFonts w:ascii="Calibri" w:hAnsi="Calibri" w:cs="Calibri"/>
+              </w:rPr>
+              <w:t xml:space="preserve">) }} </w:t>
+            </w:r>
+            <w:r>
+              <w:rPr>
+                <w:rFonts w:ascii="Calibri" w:hAnsi="Calibri" w:cs="Calibri"/>
+              </w:rPr>
               <w:t xml:space="preserve">Yes   </w:t>
             </w:r>
           </w:p>
           <w:p>
             <w:pPr>
               <w:pStyle w:val="NoSpacing"/>
-            </w:pPr>
-            <w:r>
-              <w:t xml:space="preserve">{{ </w:t>
-            </w:r>
-            <w:proofErr w:type="spellStart"/>
-            <w:r>
-              <w:t>output_checkbox</w:t>
-            </w:r>
-            <w:proofErr w:type="spellEnd"/>
-            <w:r>
-              <w:t>(</w:t>
-            </w:r>
-            <w:r>
-              <w:t xml:space="preserve">not </w:t>
-            </w:r>
-            <w:r>
+              <w:rPr>
+                <w:rFonts w:ascii="Calibri" w:hAnsi="Calibri" w:cs="Calibri"/>
+              </w:rPr>
+            </w:pPr>
+            <w:r>
+              <w:rPr>
+                <w:rFonts w:ascii="Calibri" w:hAnsi="Calibri" w:cs="Calibri"/>
+              </w:rPr>
+              <w:lastRenderedPageBreak/>
+              <w:t xml:space="preserve">{{ output_checkbox(not </w:t>
+            </w:r>
+            <w:r>
+              <w:rPr>
+                <w:rFonts w:ascii="Calibri" w:hAnsi="Calibri" w:cs="Calibri"/>
+              </w:rPr>
               <w:t>users[0]</w:t>
             </w:r>
             <w:r>
+              <w:rPr>
+                <w:rFonts w:ascii="Calibri" w:hAnsi="Calibri" w:cs="Calibri"/>
+              </w:rPr>
               <w:t>.</w:t>
             </w:r>
-            <w:proofErr w:type="spellStart"/>
-            <w:r>
+            <w:r>
+              <w:rPr>
+                <w:rFonts w:ascii="Calibri" w:hAnsi="Calibri" w:cs="Calibri"/>
+              </w:rPr>
               <w:t>notice_name</w:t>
             </w:r>
-            <w:proofErr w:type="spellEnd"/>
-            <w:r>
-              <w:t>) }}</w:t>
-            </w:r>
-            <w:r>
-              <w:t xml:space="preserve"> </w:t>
-            </w:r>
-            <w:r>
+            <w:r>
+              <w:rPr>
+                <w:rFonts w:ascii="Calibri" w:hAnsi="Calibri" w:cs="Calibri"/>
+              </w:rPr>
+              <w:t xml:space="preserve">) }} </w:t>
+            </w:r>
+            <w:r>
+              <w:rPr>
+                <w:rFonts w:ascii="Calibri" w:hAnsi="Calibri" w:cs="Calibri"/>
+              </w:rPr>
               <w:t>No</w:t>
             </w:r>
           </w:p>
@@ -2119,75 +1742,64 @@
           <w:p>
             <w:pPr>
               <w:pStyle w:val="NoSpacing"/>
-            </w:pPr>
-            <w:r>
-              <w:t xml:space="preserve">{{ </w:t>
-            </w:r>
-            <w:proofErr w:type="spellStart"/>
-            <w:r>
-              <w:t>output_checkbox</w:t>
-            </w:r>
-            <w:proofErr w:type="spellEnd"/>
-            <w:r>
-              <w:t>(</w:t>
-            </w:r>
-            <w:r>
+              <w:rPr>
+                <w:rFonts w:ascii="Calibri" w:hAnsi="Calibri" w:cs="Calibri"/>
+              </w:rPr>
+            </w:pPr>
+            <w:r>
+              <w:rPr>
+                <w:rFonts w:ascii="Calibri" w:hAnsi="Calibri" w:cs="Calibri"/>
+              </w:rPr>
+              <w:t>{{ output_checkbox(</w:t>
+            </w:r>
+            <w:r>
+              <w:rPr>
+                <w:rFonts w:ascii="Calibri" w:hAnsi="Calibri" w:cs="Calibri"/>
+              </w:rPr>
               <w:t>users[0]</w:t>
             </w:r>
             <w:r>
-              <w:t>.</w:t>
-            </w:r>
-            <w:proofErr w:type="spellStart"/>
-            <w:r>
-              <w:t>notice_dob</w:t>
-            </w:r>
-            <w:proofErr w:type="spellEnd"/>
-            <w:r>
-              <w:t>) }}</w:t>
-            </w:r>
-            <w:r>
-              <w:t xml:space="preserve"> </w:t>
-            </w:r>
-            <w:r>
+              <w:rPr>
+                <w:rFonts w:ascii="Calibri" w:hAnsi="Calibri" w:cs="Calibri"/>
+              </w:rPr>
+              <w:t xml:space="preserve">.notice_dob) }} </w:t>
+            </w:r>
+            <w:r>
+              <w:rPr>
+                <w:rFonts w:ascii="Calibri" w:hAnsi="Calibri" w:cs="Calibri"/>
+              </w:rPr>
               <w:t xml:space="preserve">Yes   </w:t>
             </w:r>
           </w:p>
           <w:p>
             <w:pPr>
               <w:pStyle w:val="NoSpacing"/>
-            </w:pPr>
-            <w:r>
-              <w:t xml:space="preserve">{{ </w:t>
-            </w:r>
-            <w:proofErr w:type="spellStart"/>
-            <w:r>
-              <w:t>output_checkbox</w:t>
-            </w:r>
-            <w:proofErr w:type="spellEnd"/>
-            <w:r>
-              <w:t>(</w:t>
-            </w:r>
-            <w:r>
-              <w:t xml:space="preserve">not </w:t>
-            </w:r>
-            <w:r>
+              <w:rPr>
+                <w:rFonts w:ascii="Calibri" w:hAnsi="Calibri" w:cs="Calibri"/>
+              </w:rPr>
+            </w:pPr>
+            <w:r>
+              <w:rPr>
+                <w:rFonts w:ascii="Calibri" w:hAnsi="Calibri" w:cs="Calibri"/>
+              </w:rPr>
+              <w:t xml:space="preserve">{{ output_checkbox(not </w:t>
+            </w:r>
+            <w:r>
+              <w:rPr>
+                <w:rFonts w:ascii="Calibri" w:hAnsi="Calibri" w:cs="Calibri"/>
+              </w:rPr>
               <w:t>users[0]</w:t>
             </w:r>
             <w:r>
-              <w:t>.</w:t>
-            </w:r>
-            <w:proofErr w:type="spellStart"/>
-            <w:r>
-              <w:t>notice_dob</w:t>
-            </w:r>
-            <w:proofErr w:type="spellEnd"/>
-            <w:r>
-              <w:t>) }}</w:t>
-            </w:r>
-            <w:r>
-              <w:t xml:space="preserve"> </w:t>
-            </w:r>
-            <w:r>
+              <w:rPr>
+                <w:rFonts w:ascii="Calibri" w:hAnsi="Calibri" w:cs="Calibri"/>
+              </w:rPr>
+              <w:t xml:space="preserve">.notice_dob) }} </w:t>
+            </w:r>
+            <w:r>
+              <w:rPr>
+                <w:rFonts w:ascii="Calibri" w:hAnsi="Calibri" w:cs="Calibri"/>
+              </w:rPr>
               <w:t>No</w:t>
             </w:r>
           </w:p>
@@ -2226,121 +1838,139 @@
           <w:p>
             <w:pPr>
               <w:pStyle w:val="NoSpacing"/>
-            </w:pPr>
-            <w:r>
-              <w:t xml:space="preserve">{{ </w:t>
-            </w:r>
-            <w:proofErr w:type="spellStart"/>
-            <w:r>
-              <w:t>output_checkbox</w:t>
-            </w:r>
-            <w:proofErr w:type="spellEnd"/>
-            <w:r>
-              <w:t>(</w:t>
-            </w:r>
-            <w:r>
+              <w:rPr>
+                <w:rFonts w:ascii="Calibri" w:hAnsi="Calibri" w:cs="Calibri"/>
+              </w:rPr>
+            </w:pPr>
+            <w:r>
+              <w:rPr>
+                <w:rFonts w:ascii="Calibri" w:hAnsi="Calibri" w:cs="Calibri"/>
+              </w:rPr>
+              <w:t>{{ output_checkbox(</w:t>
+            </w:r>
+            <w:r>
+              <w:rPr>
+                <w:rFonts w:ascii="Calibri" w:hAnsi="Calibri" w:cs="Calibri"/>
+              </w:rPr>
               <w:t>users[0]</w:t>
             </w:r>
             <w:r>
-              <w:t>.</w:t>
-            </w:r>
-            <w:proofErr w:type="spellStart"/>
-            <w:r>
-              <w:t>notice_</w:t>
-            </w:r>
-            <w:r>
+              <w:rPr>
+                <w:rFonts w:ascii="Calibri" w:hAnsi="Calibri" w:cs="Calibri"/>
+              </w:rPr>
+              <w:t>.notice_</w:t>
+            </w:r>
+            <w:r>
+              <w:rPr>
+                <w:rFonts w:ascii="Calibri" w:hAnsi="Calibri" w:cs="Calibri"/>
+              </w:rPr>
               <w:t>allegations</w:t>
             </w:r>
-            <w:proofErr w:type="spellEnd"/>
-            <w:r>
+            <w:r>
+              <w:rPr>
+                <w:rFonts w:ascii="Calibri" w:hAnsi="Calibri" w:cs="Calibri"/>
+              </w:rPr>
               <w:t xml:space="preserve">) }} </w:t>
             </w:r>
             <w:r>
+              <w:rPr>
+                <w:rFonts w:ascii="Calibri" w:hAnsi="Calibri" w:cs="Calibri"/>
+              </w:rPr>
               <w:t xml:space="preserve">Yes </w:t>
             </w:r>
           </w:p>
           <w:p>
             <w:pPr>
               <w:pStyle w:val="NoSpacing"/>
-            </w:pPr>
-            <w:r>
-              <w:t xml:space="preserve">{{ </w:t>
-            </w:r>
-            <w:proofErr w:type="spellStart"/>
-            <w:r>
-              <w:t>output_checkbox</w:t>
-            </w:r>
-            <w:proofErr w:type="spellEnd"/>
-            <w:r>
-              <w:t>(</w:t>
-            </w:r>
-            <w:r>
+              <w:rPr>
+                <w:rFonts w:ascii="Calibri" w:hAnsi="Calibri" w:cs="Calibri"/>
+              </w:rPr>
+            </w:pPr>
+            <w:r>
+              <w:rPr>
+                <w:rFonts w:ascii="Calibri" w:hAnsi="Calibri" w:cs="Calibri"/>
+              </w:rPr>
+              <w:t>{{ output_checkbox(</w:t>
+            </w:r>
+            <w:r>
+              <w:rPr>
+                <w:rFonts w:ascii="Calibri" w:hAnsi="Calibri" w:cs="Calibri"/>
+              </w:rPr>
               <w:t xml:space="preserve">not </w:t>
             </w:r>
             <w:r>
+              <w:rPr>
+                <w:rFonts w:ascii="Calibri" w:hAnsi="Calibri" w:cs="Calibri"/>
+              </w:rPr>
               <w:t>users[0]</w:t>
             </w:r>
             <w:r>
-              <w:t>.</w:t>
-            </w:r>
-            <w:proofErr w:type="spellStart"/>
-            <w:r>
-              <w:t>notice_</w:t>
-            </w:r>
-            <w:r>
+              <w:rPr>
+                <w:rFonts w:ascii="Calibri" w:hAnsi="Calibri" w:cs="Calibri"/>
+              </w:rPr>
+              <w:t>.notice_</w:t>
+            </w:r>
+            <w:r>
+              <w:rPr>
+                <w:rFonts w:ascii="Calibri" w:hAnsi="Calibri" w:cs="Calibri"/>
+              </w:rPr>
               <w:t>allegations</w:t>
             </w:r>
-            <w:proofErr w:type="spellEnd"/>
-            <w:r>
+            <w:r>
+              <w:rPr>
+                <w:rFonts w:ascii="Calibri" w:hAnsi="Calibri" w:cs="Calibri"/>
+              </w:rPr>
               <w:t xml:space="preserve">) }} </w:t>
             </w:r>
             <w:r>
+              <w:rPr>
+                <w:rFonts w:ascii="Calibri" w:hAnsi="Calibri" w:cs="Calibri"/>
+              </w:rPr>
               <w:t>No</w:t>
             </w:r>
             <w:r>
+              <w:rPr>
+                <w:rFonts w:ascii="Calibri" w:hAnsi="Calibri" w:cs="Calibri"/>
+              </w:rPr>
               <w:t xml:space="preserve"> (details) </w:t>
             </w:r>
           </w:p>
           <w:p>
             <w:pPr>
               <w:pStyle w:val="NoSpacing"/>
-            </w:pPr>
-            <w:r>
+              <w:rPr>
+                <w:rFonts w:ascii="Calibri" w:hAnsi="Calibri" w:cs="Calibri"/>
+              </w:rPr>
+            </w:pPr>
+            <w:r>
+              <w:rPr>
+                <w:rFonts w:ascii="Calibri" w:hAnsi="Calibri" w:cs="Calibri"/>
+              </w:rPr>
               <w:t xml:space="preserve">{% if not </w:t>
             </w:r>
             <w:r>
+              <w:rPr>
+                <w:rFonts w:ascii="Calibri" w:hAnsi="Calibri" w:cs="Calibri"/>
+              </w:rPr>
               <w:t>users[0]</w:t>
             </w:r>
             <w:r>
-              <w:t>.</w:t>
-            </w:r>
-            <w:proofErr w:type="spellStart"/>
-            <w:r>
-              <w:t>notice_</w:t>
-            </w:r>
-            <w:r>
-              <w:t>allegations</w:t>
-            </w:r>
-            <w:proofErr w:type="spellEnd"/>
-            <w:r>
-              <w:t xml:space="preserve"> %}{{ </w:t>
-            </w:r>
-            <w:r>
+              <w:rPr>
+                <w:rFonts w:ascii="Calibri" w:hAnsi="Calibri" w:cs="Calibri"/>
+              </w:rPr>
+              <w:t xml:space="preserve">.notice_allegations %}{{ </w:t>
+            </w:r>
+            <w:r>
+              <w:rPr>
+                <w:rFonts w:ascii="Calibri" w:hAnsi="Calibri" w:cs="Calibri"/>
+              </w:rPr>
               <w:t>users[0]</w:t>
             </w:r>
             <w:r>
-              <w:t>.</w:t>
-            </w:r>
-            <w:proofErr w:type="spellStart"/>
-            <w:r>
-              <w:t>notice_</w:t>
-            </w:r>
-            <w:r>
-              <w:t>allegations_details</w:t>
-            </w:r>
-            <w:proofErr w:type="spellEnd"/>
-            <w:r>
-              <w:t xml:space="preserve"> }}{% endif %}</w:t>
+              <w:rPr>
+                <w:rFonts w:ascii="Calibri" w:hAnsi="Calibri" w:cs="Calibri"/>
+              </w:rPr>
+              <w:t>.notice_allegations_details }}{% endif %}</w:t>
             </w:r>
           </w:p>
         </w:tc>
@@ -2378,75 +2008,94 @@
           <w:p>
             <w:pPr>
               <w:pStyle w:val="NoSpacing"/>
-            </w:pPr>
-            <w:r>
-              <w:t xml:space="preserve">{{ </w:t>
-            </w:r>
-            <w:proofErr w:type="spellStart"/>
-            <w:r>
-              <w:t>output_checkbox</w:t>
-            </w:r>
-            <w:proofErr w:type="spellEnd"/>
-            <w:r>
-              <w:t>(</w:t>
-            </w:r>
-            <w:r>
+              <w:rPr>
+                <w:rFonts w:ascii="Calibri" w:hAnsi="Calibri" w:cs="Calibri"/>
+              </w:rPr>
+            </w:pPr>
+            <w:r>
+              <w:rPr>
+                <w:rFonts w:ascii="Calibri" w:hAnsi="Calibri" w:cs="Calibri"/>
+              </w:rPr>
+              <w:t>{{ output_checkbox(</w:t>
+            </w:r>
+            <w:r>
+              <w:rPr>
+                <w:rFonts w:ascii="Calibri" w:hAnsi="Calibri" w:cs="Calibri"/>
+              </w:rPr>
               <w:t>users[0]</w:t>
             </w:r>
             <w:r>
-              <w:t>.</w:t>
-            </w:r>
-            <w:proofErr w:type="spellStart"/>
-            <w:r>
-              <w:t>notice_</w:t>
-            </w:r>
-            <w:r>
+              <w:rPr>
+                <w:rFonts w:ascii="Calibri" w:hAnsi="Calibri" w:cs="Calibri"/>
+              </w:rPr>
+              <w:t>.notice_</w:t>
+            </w:r>
+            <w:r>
+              <w:rPr>
+                <w:rFonts w:ascii="Calibri" w:hAnsi="Calibri" w:cs="Calibri"/>
+              </w:rPr>
               <w:t>hearing</w:t>
             </w:r>
-            <w:proofErr w:type="spellEnd"/>
-            <w:r>
+            <w:r>
+              <w:rPr>
+                <w:rFonts w:ascii="Calibri" w:hAnsi="Calibri" w:cs="Calibri"/>
+              </w:rPr>
               <w:t xml:space="preserve">) }} </w:t>
             </w:r>
             <w:r>
+              <w:rPr>
+                <w:rFonts w:ascii="Calibri" w:hAnsi="Calibri" w:cs="Calibri"/>
+              </w:rPr>
               <w:t>Yes</w:t>
             </w:r>
           </w:p>
           <w:p>
             <w:pPr>
               <w:pStyle w:val="NoSpacing"/>
-            </w:pPr>
-            <w:r>
-              <w:t xml:space="preserve">{{ </w:t>
-            </w:r>
-            <w:proofErr w:type="spellStart"/>
-            <w:r>
-              <w:t>output_checkbox</w:t>
-            </w:r>
-            <w:proofErr w:type="spellEnd"/>
-            <w:r>
-              <w:t>(</w:t>
-            </w:r>
-            <w:r>
+              <w:rPr>
+                <w:rFonts w:ascii="Calibri" w:hAnsi="Calibri" w:cs="Calibri"/>
+              </w:rPr>
+            </w:pPr>
+            <w:r>
+              <w:rPr>
+                <w:rFonts w:ascii="Calibri" w:hAnsi="Calibri" w:cs="Calibri"/>
+              </w:rPr>
+              <w:t>{{ output_checkbox(</w:t>
+            </w:r>
+            <w:r>
+              <w:rPr>
+                <w:rFonts w:ascii="Calibri" w:hAnsi="Calibri" w:cs="Calibri"/>
+              </w:rPr>
               <w:t xml:space="preserve">not </w:t>
             </w:r>
             <w:r>
+              <w:rPr>
+                <w:rFonts w:ascii="Calibri" w:hAnsi="Calibri" w:cs="Calibri"/>
+              </w:rPr>
               <w:t>users[0]</w:t>
             </w:r>
             <w:r>
-              <w:t>.</w:t>
-            </w:r>
-            <w:proofErr w:type="spellStart"/>
-            <w:r>
-              <w:t>notice_</w:t>
-            </w:r>
-            <w:r>
+              <w:rPr>
+                <w:rFonts w:ascii="Calibri" w:hAnsi="Calibri" w:cs="Calibri"/>
+              </w:rPr>
+              <w:t>.notice_</w:t>
+            </w:r>
+            <w:r>
+              <w:rPr>
+                <w:rFonts w:ascii="Calibri" w:hAnsi="Calibri" w:cs="Calibri"/>
+              </w:rPr>
               <w:t>hearing</w:t>
             </w:r>
-            <w:proofErr w:type="spellEnd"/>
-            <w:r>
+            <w:r>
+              <w:rPr>
+                <w:rFonts w:ascii="Calibri" w:hAnsi="Calibri" w:cs="Calibri"/>
+              </w:rPr>
               <w:t xml:space="preserve">) }} </w:t>
             </w:r>
             <w:r>
+              <w:rPr>
+                <w:rFonts w:ascii="Calibri" w:hAnsi="Calibri" w:cs="Calibri"/>
+              </w:rPr>
               <w:t>No</w:t>
             </w:r>
           </w:p>
@@ -2526,33 +2175,7 @@
               <w:rPr>
                 <w:rFonts w:ascii="Calibri" w:eastAsia="Calibri" w:hAnsi="Calibri" w:cs="Calibri"/>
               </w:rPr>
-              <w:t>{{ users[</w:t>
-            </w:r>
-            <w:r>
-              <w:rPr>
-                <w:rFonts w:ascii="Calibri" w:eastAsia="Calibri" w:hAnsi="Calibri" w:cs="Calibri"/>
-              </w:rPr>
-              <w:t>0</w:t>
-            </w:r>
-            <w:r>
-              <w:rPr>
-                <w:rFonts w:ascii="Calibri" w:eastAsia="Calibri" w:hAnsi="Calibri" w:cs="Calibri"/>
-              </w:rPr>
-              <w:t>].</w:t>
-            </w:r>
-            <w:proofErr w:type="spellStart"/>
-            <w:r>
-              <w:rPr>
-                <w:rFonts w:ascii="Calibri" w:eastAsia="Calibri" w:hAnsi="Calibri" w:cs="Calibri"/>
-              </w:rPr>
-              <w:t>address_block</w:t>
-            </w:r>
-            <w:proofErr w:type="spellEnd"/>
-            <w:r>
-              <w:rPr>
-                <w:rFonts w:ascii="Calibri" w:eastAsia="Calibri" w:hAnsi="Calibri" w:cs="Calibri"/>
-              </w:rPr>
-              <w:t>() }}</w:t>
+              <w:t>{{ users[0].address_block() }}</w:t>
             </w:r>
           </w:p>
         </w:tc>
@@ -2588,69 +2211,94 @@
           <w:p>
             <w:pPr>
               <w:pStyle w:val="NoSpacing"/>
-            </w:pPr>
-            <w:r>
-              <w:t xml:space="preserve">{{ </w:t>
-            </w:r>
-            <w:proofErr w:type="spellStart"/>
-            <w:r>
-              <w:t>output_checkbox</w:t>
-            </w:r>
-            <w:proofErr w:type="spellEnd"/>
-            <w:r>
-              <w:t>(</w:t>
-            </w:r>
-            <w:r>
+              <w:rPr>
+                <w:rFonts w:ascii="Calibri" w:hAnsi="Calibri" w:cs="Calibri"/>
+              </w:rPr>
+            </w:pPr>
+            <w:r>
+              <w:rPr>
+                <w:rFonts w:ascii="Calibri" w:hAnsi="Calibri" w:cs="Calibri"/>
+              </w:rPr>
+              <w:t>{{ output_checkbox(</w:t>
+            </w:r>
+            <w:r>
+              <w:rPr>
+                <w:rFonts w:ascii="Calibri" w:hAnsi="Calibri" w:cs="Calibri"/>
+              </w:rPr>
               <w:t>users[0]</w:t>
             </w:r>
             <w:r>
+              <w:rPr>
+                <w:rFonts w:ascii="Calibri" w:hAnsi="Calibri" w:cs="Calibri"/>
+              </w:rPr>
               <w:t>.</w:t>
             </w:r>
-            <w:proofErr w:type="spellStart"/>
-            <w:r>
+            <w:r>
+              <w:rPr>
+                <w:rFonts w:ascii="Calibri" w:hAnsi="Calibri" w:cs="Calibri"/>
+              </w:rPr>
               <w:t>moved_since</w:t>
             </w:r>
-            <w:proofErr w:type="spellEnd"/>
-            <w:r>
+            <w:r>
+              <w:rPr>
+                <w:rFonts w:ascii="Calibri" w:hAnsi="Calibri" w:cs="Calibri"/>
+              </w:rPr>
               <w:t xml:space="preserve">) }} </w:t>
             </w:r>
             <w:r>
+              <w:rPr>
+                <w:rFonts w:ascii="Calibri" w:hAnsi="Calibri" w:cs="Calibri"/>
+              </w:rPr>
               <w:t xml:space="preserve">Yes   </w:t>
             </w:r>
           </w:p>
           <w:p>
             <w:pPr>
               <w:pStyle w:val="NoSpacing"/>
-            </w:pPr>
-            <w:r>
-              <w:t xml:space="preserve">{{ </w:t>
-            </w:r>
-            <w:proofErr w:type="spellStart"/>
-            <w:r>
-              <w:t>output_checkbox</w:t>
-            </w:r>
-            <w:proofErr w:type="spellEnd"/>
-            <w:r>
-              <w:t>(</w:t>
-            </w:r>
-            <w:r>
+              <w:rPr>
+                <w:rFonts w:ascii="Calibri" w:hAnsi="Calibri" w:cs="Calibri"/>
+              </w:rPr>
+            </w:pPr>
+            <w:r>
+              <w:rPr>
+                <w:rFonts w:ascii="Calibri" w:hAnsi="Calibri" w:cs="Calibri"/>
+              </w:rPr>
+              <w:t>{{ output_checkbox(</w:t>
+            </w:r>
+            <w:r>
+              <w:rPr>
+                <w:rFonts w:ascii="Calibri" w:hAnsi="Calibri" w:cs="Calibri"/>
+              </w:rPr>
               <w:t xml:space="preserve">not </w:t>
             </w:r>
             <w:r>
+              <w:rPr>
+                <w:rFonts w:ascii="Calibri" w:hAnsi="Calibri" w:cs="Calibri"/>
+              </w:rPr>
               <w:t>users[0]</w:t>
             </w:r>
             <w:r>
+              <w:rPr>
+                <w:rFonts w:ascii="Calibri" w:hAnsi="Calibri" w:cs="Calibri"/>
+              </w:rPr>
               <w:t>.</w:t>
             </w:r>
-            <w:proofErr w:type="spellStart"/>
-            <w:r>
+            <w:r>
+              <w:rPr>
+                <w:rFonts w:ascii="Calibri" w:hAnsi="Calibri" w:cs="Calibri"/>
+              </w:rPr>
               <w:t>moved_since</w:t>
             </w:r>
-            <w:proofErr w:type="spellEnd"/>
-            <w:r>
+            <w:r>
+              <w:rPr>
+                <w:rFonts w:ascii="Calibri" w:hAnsi="Calibri" w:cs="Calibri"/>
+              </w:rPr>
               <w:t xml:space="preserve">) }} </w:t>
             </w:r>
             <w:r>
+              <w:rPr>
+                <w:rFonts w:ascii="Calibri" w:hAnsi="Calibri" w:cs="Calibri"/>
+              </w:rPr>
               <w:t>No</w:t>
             </w:r>
           </w:p>
@@ -2687,84 +2335,101 @@
           <w:p>
             <w:pPr>
               <w:pStyle w:val="NoSpacing"/>
-            </w:pPr>
-            <w:r>
-              <w:t xml:space="preserve">{{ </w:t>
-            </w:r>
-            <w:proofErr w:type="spellStart"/>
-            <w:r>
-              <w:t>output_checkbox</w:t>
-            </w:r>
-            <w:proofErr w:type="spellEnd"/>
-            <w:r>
-              <w:t>(</w:t>
-            </w:r>
-            <w:r>
+              <w:rPr>
+                <w:rFonts w:ascii="Calibri" w:hAnsi="Calibri" w:cs="Calibri"/>
+              </w:rPr>
+            </w:pPr>
+            <w:r>
+              <w:rPr>
+                <w:rFonts w:ascii="Calibri" w:hAnsi="Calibri" w:cs="Calibri"/>
+              </w:rPr>
+              <w:t>{{ output_checkbox(</w:t>
+            </w:r>
+            <w:r>
+              <w:rPr>
+                <w:rFonts w:ascii="Calibri" w:hAnsi="Calibri" w:cs="Calibri"/>
+              </w:rPr>
               <w:t>users[0]</w:t>
             </w:r>
             <w:r>
+              <w:rPr>
+                <w:rFonts w:ascii="Calibri" w:hAnsi="Calibri" w:cs="Calibri"/>
+              </w:rPr>
               <w:t>.</w:t>
             </w:r>
-            <w:proofErr w:type="spellStart"/>
-            <w:r>
+            <w:r>
+              <w:rPr>
+                <w:rFonts w:ascii="Calibri" w:hAnsi="Calibri" w:cs="Calibri"/>
+              </w:rPr>
               <w:t>immigration_application</w:t>
             </w:r>
-            <w:proofErr w:type="spellEnd"/>
-            <w:r>
+            <w:r>
+              <w:rPr>
+                <w:rFonts w:ascii="Calibri" w:hAnsi="Calibri" w:cs="Calibri"/>
+              </w:rPr>
               <w:t xml:space="preserve">) }} </w:t>
             </w:r>
             <w:r>
+              <w:rPr>
+                <w:rFonts w:ascii="Calibri" w:hAnsi="Calibri" w:cs="Calibri"/>
+              </w:rPr>
               <w:t xml:space="preserve">Yes – For what and when? </w:t>
             </w:r>
             <w:r>
+              <w:rPr>
+                <w:rFonts w:ascii="Calibri" w:hAnsi="Calibri" w:cs="Calibri"/>
+              </w:rPr>
               <w:br/>
-              <w:t>{{ users[0].</w:t>
-            </w:r>
-            <w:proofErr w:type="spellStart"/>
-            <w:r>
-              <w:t>other_immigration_applications</w:t>
-            </w:r>
-            <w:proofErr w:type="spellEnd"/>
-            <w:r>
-              <w:t xml:space="preserve"> }}</w:t>
+              <w:t>{{ users[0].other_immigration_applications }}</w:t>
             </w:r>
           </w:p>
           <w:p>
             <w:pPr>
               <w:pStyle w:val="NoSpacing"/>
-            </w:pPr>
-            <w:r>
-              <w:t xml:space="preserve">{{ </w:t>
-            </w:r>
-            <w:proofErr w:type="spellStart"/>
-            <w:r>
-              <w:t>output_checkbox</w:t>
-            </w:r>
-            <w:proofErr w:type="spellEnd"/>
-            <w:r>
-              <w:t>(</w:t>
-            </w:r>
-            <w:r>
+              <w:rPr>
+                <w:rFonts w:ascii="Calibri" w:hAnsi="Calibri" w:cs="Calibri"/>
+              </w:rPr>
+            </w:pPr>
+            <w:r>
+              <w:rPr>
+                <w:rFonts w:ascii="Calibri" w:hAnsi="Calibri" w:cs="Calibri"/>
+              </w:rPr>
+              <w:t>{{ output_checkbox(</w:t>
+            </w:r>
+            <w:r>
+              <w:rPr>
+                <w:rFonts w:ascii="Calibri" w:hAnsi="Calibri" w:cs="Calibri"/>
+              </w:rPr>
               <w:t xml:space="preserve">not </w:t>
             </w:r>
             <w:r>
+              <w:rPr>
+                <w:rFonts w:ascii="Calibri" w:hAnsi="Calibri" w:cs="Calibri"/>
+              </w:rPr>
               <w:t>users[0]</w:t>
             </w:r>
             <w:r>
+              <w:rPr>
+                <w:rFonts w:ascii="Calibri" w:hAnsi="Calibri" w:cs="Calibri"/>
+              </w:rPr>
               <w:t>.</w:t>
             </w:r>
             <w:r>
-              <w:t xml:space="preserve"> </w:t>
-            </w:r>
-            <w:proofErr w:type="spellStart"/>
-            <w:r>
-              <w:t>immigration_application</w:t>
-            </w:r>
-            <w:proofErr w:type="spellEnd"/>
-            <w:r>
+              <w:rPr>
+                <w:rFonts w:ascii="Calibri" w:hAnsi="Calibri" w:cs="Calibri"/>
+              </w:rPr>
+              <w:t xml:space="preserve"> immigration_application</w:t>
+            </w:r>
+            <w:r>
+              <w:rPr>
+                <w:rFonts w:ascii="Calibri" w:hAnsi="Calibri" w:cs="Calibri"/>
+              </w:rPr>
               <w:t xml:space="preserve">) }} </w:t>
             </w:r>
             <w:r>
+              <w:rPr>
+                <w:rFonts w:ascii="Calibri" w:hAnsi="Calibri" w:cs="Calibri"/>
+              </w:rPr>
               <w:t>No</w:t>
             </w:r>
           </w:p>
@@ -2801,69 +2466,94 @@
           <w:p>
             <w:pPr>
               <w:pStyle w:val="NoSpacing"/>
-            </w:pPr>
-            <w:r>
-              <w:t xml:space="preserve">{{ </w:t>
-            </w:r>
-            <w:proofErr w:type="spellStart"/>
-            <w:r>
-              <w:t>output_checkbox</w:t>
-            </w:r>
-            <w:proofErr w:type="spellEnd"/>
-            <w:r>
-              <w:t>(</w:t>
-            </w:r>
-            <w:r>
+              <w:rPr>
+                <w:rFonts w:ascii="Calibri" w:hAnsi="Calibri" w:cs="Calibri"/>
+              </w:rPr>
+            </w:pPr>
+            <w:r>
+              <w:rPr>
+                <w:rFonts w:ascii="Calibri" w:hAnsi="Calibri" w:cs="Calibri"/>
+              </w:rPr>
+              <w:t>{{ output_checkbox(</w:t>
+            </w:r>
+            <w:r>
+              <w:rPr>
+                <w:rFonts w:ascii="Calibri" w:hAnsi="Calibri" w:cs="Calibri"/>
+              </w:rPr>
               <w:t>users[0]</w:t>
             </w:r>
             <w:r>
+              <w:rPr>
+                <w:rFonts w:ascii="Calibri" w:hAnsi="Calibri" w:cs="Calibri"/>
+              </w:rPr>
               <w:t>.</w:t>
             </w:r>
-            <w:proofErr w:type="spellStart"/>
-            <w:r>
+            <w:r>
+              <w:rPr>
+                <w:rFonts w:ascii="Calibri" w:hAnsi="Calibri" w:cs="Calibri"/>
+              </w:rPr>
               <w:t>screened_for_relief</w:t>
             </w:r>
-            <w:proofErr w:type="spellEnd"/>
-            <w:r>
+            <w:r>
+              <w:rPr>
+                <w:rFonts w:ascii="Calibri" w:hAnsi="Calibri" w:cs="Calibri"/>
+              </w:rPr>
               <w:t xml:space="preserve">) }} </w:t>
             </w:r>
             <w:r>
+              <w:rPr>
+                <w:rFonts w:ascii="Calibri" w:hAnsi="Calibri" w:cs="Calibri"/>
+              </w:rPr>
               <w:t>Yes</w:t>
             </w:r>
           </w:p>
           <w:p>
             <w:pPr>
               <w:pStyle w:val="NoSpacing"/>
-            </w:pPr>
-            <w:r>
-              <w:t xml:space="preserve">{{ </w:t>
-            </w:r>
-            <w:proofErr w:type="spellStart"/>
-            <w:r>
-              <w:t>output_checkbox</w:t>
-            </w:r>
-            <w:proofErr w:type="spellEnd"/>
-            <w:r>
-              <w:t>(</w:t>
-            </w:r>
-            <w:r>
+              <w:rPr>
+                <w:rFonts w:ascii="Calibri" w:hAnsi="Calibri" w:cs="Calibri"/>
+              </w:rPr>
+            </w:pPr>
+            <w:r>
+              <w:rPr>
+                <w:rFonts w:ascii="Calibri" w:hAnsi="Calibri" w:cs="Calibri"/>
+              </w:rPr>
+              <w:t>{{ output_checkbox(</w:t>
+            </w:r>
+            <w:r>
+              <w:rPr>
+                <w:rFonts w:ascii="Calibri" w:hAnsi="Calibri" w:cs="Calibri"/>
+              </w:rPr>
               <w:t xml:space="preserve">not </w:t>
             </w:r>
             <w:r>
+              <w:rPr>
+                <w:rFonts w:ascii="Calibri" w:hAnsi="Calibri" w:cs="Calibri"/>
+              </w:rPr>
               <w:t>users[0]</w:t>
             </w:r>
             <w:r>
+              <w:rPr>
+                <w:rFonts w:ascii="Calibri" w:hAnsi="Calibri" w:cs="Calibri"/>
+              </w:rPr>
               <w:t>.</w:t>
             </w:r>
-            <w:proofErr w:type="spellStart"/>
-            <w:r>
+            <w:r>
+              <w:rPr>
+                <w:rFonts w:ascii="Calibri" w:hAnsi="Calibri" w:cs="Calibri"/>
+              </w:rPr>
               <w:t>screened_for_relief</w:t>
             </w:r>
-            <w:proofErr w:type="spellEnd"/>
-            <w:r>
+            <w:r>
+              <w:rPr>
+                <w:rFonts w:ascii="Calibri" w:hAnsi="Calibri" w:cs="Calibri"/>
+              </w:rPr>
               <w:t xml:space="preserve">) }} </w:t>
             </w:r>
             <w:r>
+              <w:rPr>
+                <w:rFonts w:ascii="Calibri" w:hAnsi="Calibri" w:cs="Calibri"/>
+              </w:rPr>
               <w:t>No</w:t>
             </w:r>
           </w:p>
@@ -2900,82 +2590,102 @@
           <w:p>
             <w:pPr>
               <w:pStyle w:val="NoSpacing"/>
-            </w:pPr>
-            <w:r>
-              <w:t xml:space="preserve">{{ </w:t>
-            </w:r>
-            <w:proofErr w:type="spellStart"/>
-            <w:r>
-              <w:t>output_checkbox</w:t>
-            </w:r>
-            <w:proofErr w:type="spellEnd"/>
-            <w:r>
-              <w:t>(</w:t>
-            </w:r>
-            <w:r>
+              <w:rPr>
+                <w:rFonts w:ascii="Calibri" w:hAnsi="Calibri" w:cs="Calibri"/>
+              </w:rPr>
+            </w:pPr>
+            <w:r>
+              <w:rPr>
+                <w:rFonts w:ascii="Calibri" w:hAnsi="Calibri" w:cs="Calibri"/>
+              </w:rPr>
+              <w:t>{{ output_checkbox(</w:t>
+            </w:r>
+            <w:r>
+              <w:rPr>
+                <w:rFonts w:ascii="Calibri" w:hAnsi="Calibri" w:cs="Calibri"/>
+              </w:rPr>
               <w:t>users[0]</w:t>
             </w:r>
             <w:r>
+              <w:rPr>
+                <w:rFonts w:ascii="Calibri" w:hAnsi="Calibri" w:cs="Calibri"/>
+              </w:rPr>
               <w:t>.</w:t>
             </w:r>
-            <w:proofErr w:type="spellStart"/>
-            <w:r>
+            <w:r>
+              <w:rPr>
+                <w:rFonts w:ascii="Calibri" w:hAnsi="Calibri" w:cs="Calibri"/>
+              </w:rPr>
               <w:t>application_processing</w:t>
             </w:r>
-            <w:proofErr w:type="spellEnd"/>
-            <w:r>
+            <w:r>
+              <w:rPr>
+                <w:rFonts w:ascii="Calibri" w:hAnsi="Calibri" w:cs="Calibri"/>
+              </w:rPr>
               <w:t xml:space="preserve">) }} </w:t>
             </w:r>
             <w:r>
+              <w:rPr>
+                <w:rFonts w:ascii="Calibri" w:hAnsi="Calibri" w:cs="Calibri"/>
+              </w:rPr>
               <w:t xml:space="preserve">Yes – Status of application </w:t>
             </w:r>
           </w:p>
           <w:p>
             <w:pPr>
               <w:pStyle w:val="NoSpacing"/>
-            </w:pPr>
-            <w:r>
-              <w:t>{{ users[0].</w:t>
-            </w:r>
-            <w:proofErr w:type="spellStart"/>
-            <w:r>
-              <w:t>application_status</w:t>
-            </w:r>
-            <w:proofErr w:type="spellEnd"/>
-            <w:r>
-              <w:t xml:space="preserve"> }}</w:t>
+              <w:rPr>
+                <w:rFonts w:ascii="Calibri" w:hAnsi="Calibri" w:cs="Calibri"/>
+              </w:rPr>
+            </w:pPr>
+            <w:r>
+              <w:rPr>
+                <w:rFonts w:ascii="Calibri" w:hAnsi="Calibri" w:cs="Calibri"/>
+              </w:rPr>
+              <w:t>{{ users[0].application_status }}</w:t>
             </w:r>
           </w:p>
           <w:p>
             <w:pPr>
               <w:pStyle w:val="NoSpacing"/>
-            </w:pPr>
-            <w:r>
-              <w:t xml:space="preserve">{{ </w:t>
-            </w:r>
-            <w:proofErr w:type="spellStart"/>
-            <w:r>
-              <w:t>output_checkbox</w:t>
-            </w:r>
-            <w:proofErr w:type="spellEnd"/>
-            <w:r>
-              <w:t>(</w:t>
-            </w:r>
-            <w:r>
+              <w:rPr>
+                <w:rFonts w:ascii="Calibri" w:hAnsi="Calibri" w:cs="Calibri"/>
+              </w:rPr>
+            </w:pPr>
+            <w:r>
+              <w:rPr>
+                <w:rFonts w:ascii="Calibri" w:hAnsi="Calibri" w:cs="Calibri"/>
+              </w:rPr>
+              <w:t>{{ output_checkbox(</w:t>
+            </w:r>
+            <w:r>
+              <w:rPr>
+                <w:rFonts w:ascii="Calibri" w:hAnsi="Calibri" w:cs="Calibri"/>
+              </w:rPr>
               <w:t>users[0]</w:t>
             </w:r>
             <w:r>
+              <w:rPr>
+                <w:rFonts w:ascii="Calibri" w:hAnsi="Calibri" w:cs="Calibri"/>
+              </w:rPr>
               <w:t>.</w:t>
             </w:r>
-            <w:proofErr w:type="spellStart"/>
-            <w:r>
+            <w:r>
+              <w:rPr>
+                <w:rFonts w:ascii="Calibri" w:hAnsi="Calibri" w:cs="Calibri"/>
+              </w:rPr>
               <w:t>application_processing</w:t>
             </w:r>
-            <w:proofErr w:type="spellEnd"/>
-            <w:r>
+            <w:r>
+              <w:rPr>
+                <w:rFonts w:ascii="Calibri" w:hAnsi="Calibri" w:cs="Calibri"/>
+              </w:rPr>
               <w:t xml:space="preserve">) }} </w:t>
             </w:r>
             <w:r>
+              <w:rPr>
+                <w:rFonts w:ascii="Calibri" w:hAnsi="Calibri" w:cs="Calibri"/>
+              </w:rPr>
               <w:t>No</w:t>
             </w:r>
           </w:p>
@@ -3012,92 +2722,94 @@
           <w:p>
             <w:pPr>
               <w:pStyle w:val="NoSpacing"/>
-            </w:pPr>
-            <w:r>
-              <w:t xml:space="preserve">{{ </w:t>
-            </w:r>
-            <w:proofErr w:type="spellStart"/>
-            <w:r>
-              <w:t>output_checkbox</w:t>
-            </w:r>
-            <w:proofErr w:type="spellEnd"/>
-            <w:r>
-              <w:t>(</w:t>
-            </w:r>
-            <w:r>
+              <w:rPr>
+                <w:rFonts w:ascii="Calibri" w:eastAsia="Calibri" w:hAnsi="Calibri" w:cs="Calibri"/>
+              </w:rPr>
+            </w:pPr>
+            <w:r>
+              <w:rPr>
+                <w:rFonts w:ascii="Calibri" w:hAnsi="Calibri" w:cs="Calibri"/>
+              </w:rPr>
+              <w:t>{{ output_checkbox(</w:t>
+            </w:r>
+            <w:r>
+              <w:rPr>
+                <w:rFonts w:ascii="Calibri" w:hAnsi="Calibri" w:cs="Calibri"/>
+              </w:rPr>
               <w:t>users[0]</w:t>
             </w:r>
             <w:r>
+              <w:rPr>
+                <w:rFonts w:ascii="Calibri" w:hAnsi="Calibri" w:cs="Calibri"/>
+              </w:rPr>
               <w:t>.</w:t>
             </w:r>
-            <w:proofErr w:type="spellStart"/>
-            <w:r>
+            <w:r>
+              <w:rPr>
+                <w:rFonts w:ascii="Calibri" w:hAnsi="Calibri" w:cs="Calibri"/>
+              </w:rPr>
               <w:t>asylum_clock_running</w:t>
             </w:r>
-            <w:proofErr w:type="spellEnd"/>
-            <w:r>
+            <w:r>
+              <w:rPr>
+                <w:rFonts w:ascii="Calibri" w:hAnsi="Calibri" w:cs="Calibri"/>
+              </w:rPr>
               <w:t xml:space="preserve">) }} </w:t>
             </w:r>
             <w:r>
               <w:rPr>
                 <w:rFonts w:ascii="Calibri" w:eastAsia="Calibri" w:hAnsi="Calibri" w:cs="Calibri"/>
               </w:rPr>
-              <w:t xml:space="preserve"> </w:t>
-            </w:r>
-            <w:r>
-              <w:rPr>
-                <w:rFonts w:ascii="Calibri" w:eastAsia="Calibri" w:hAnsi="Calibri" w:cs="Calibri"/>
-              </w:rPr>
-              <w:t xml:space="preserve">Yes         No. of Days </w:t>
-            </w:r>
-            <w:r>
-              <w:t>{{ users[0].</w:t>
-            </w:r>
-            <w:proofErr w:type="spellStart"/>
-            <w:r>
-              <w:t>asylum_clock_days</w:t>
-            </w:r>
-            <w:proofErr w:type="spellEnd"/>
-            <w:r>
-              <w:t xml:space="preserve"> }}</w:t>
+              <w:t xml:space="preserve"> Yes</w:t>
             </w:r>
           </w:p>
           <w:p>
             <w:pPr>
               <w:pStyle w:val="NoSpacing"/>
-            </w:pPr>
-            <w:r>
-              <w:t xml:space="preserve">{{ </w:t>
-            </w:r>
-            <w:proofErr w:type="spellStart"/>
-            <w:r>
-              <w:t>output_checkbox</w:t>
-            </w:r>
-            <w:proofErr w:type="spellEnd"/>
-            <w:r>
-              <w:t>(</w:t>
-            </w:r>
-            <w:r>
+              <w:rPr>
+                <w:rFonts w:ascii="Calibri" w:hAnsi="Calibri" w:cs="Calibri"/>
+              </w:rPr>
+            </w:pPr>
+            <w:r>
+              <w:rPr>
+                <w:rFonts w:ascii="Calibri" w:hAnsi="Calibri" w:cs="Calibri"/>
+              </w:rPr>
+              <w:t>{{ output_checkbox(</w:t>
+            </w:r>
+            <w:r>
+              <w:rPr>
+                <w:rFonts w:ascii="Calibri" w:hAnsi="Calibri" w:cs="Calibri"/>
+              </w:rPr>
               <w:t xml:space="preserve">not </w:t>
             </w:r>
             <w:r>
+              <w:rPr>
+                <w:rFonts w:ascii="Calibri" w:hAnsi="Calibri" w:cs="Calibri"/>
+              </w:rPr>
               <w:t>users[0]</w:t>
             </w:r>
             <w:r>
+              <w:rPr>
+                <w:rFonts w:ascii="Calibri" w:hAnsi="Calibri" w:cs="Calibri"/>
+              </w:rPr>
               <w:t>.</w:t>
             </w:r>
             <w:r>
-              <w:t xml:space="preserve"> </w:t>
-            </w:r>
-            <w:proofErr w:type="spellStart"/>
-            <w:r>
-              <w:t>asylum_clock_running</w:t>
-            </w:r>
-            <w:proofErr w:type="spellEnd"/>
-            <w:r>
+              <w:rPr>
+                <w:rFonts w:ascii="Calibri" w:hAnsi="Calibri" w:cs="Calibri"/>
+              </w:rPr>
+              <w:t xml:space="preserve"> asylum_clock_running</w:t>
+            </w:r>
+            <w:r>
+              <w:rPr>
+                <w:rFonts w:ascii="Calibri" w:hAnsi="Calibri" w:cs="Calibri"/>
+              </w:rPr>
               <w:t xml:space="preserve">) }} </w:t>
             </w:r>
             <w:r>
+              <w:rPr>
+                <w:rFonts w:ascii="Calibri" w:hAnsi="Calibri" w:cs="Calibri"/>
+              </w:rPr>
               <w:t>No</w:t>
             </w:r>
           </w:p>
@@ -3134,91 +2846,117 @@
           <w:p>
             <w:pPr>
               <w:pStyle w:val="NoSpacing"/>
-            </w:pPr>
-            <w:r>
-              <w:t xml:space="preserve">{{ </w:t>
-            </w:r>
-            <w:proofErr w:type="spellStart"/>
-            <w:r>
-              <w:t>output_checkbox</w:t>
-            </w:r>
-            <w:proofErr w:type="spellEnd"/>
-            <w:r>
-              <w:t>(</w:t>
-            </w:r>
-            <w:r>
+              <w:rPr>
+                <w:rFonts w:ascii="Calibri" w:hAnsi="Calibri" w:cs="Calibri"/>
+              </w:rPr>
+            </w:pPr>
+            <w:r>
+              <w:rPr>
+                <w:rFonts w:ascii="Calibri" w:hAnsi="Calibri" w:cs="Calibri"/>
+              </w:rPr>
+              <w:t>{{ output_checkbox(</w:t>
+            </w:r>
+            <w:r>
+              <w:rPr>
+                <w:rFonts w:ascii="Calibri" w:hAnsi="Calibri" w:cs="Calibri"/>
+              </w:rPr>
               <w:t>users[0]</w:t>
             </w:r>
             <w:r>
+              <w:rPr>
+                <w:rFonts w:ascii="Calibri" w:hAnsi="Calibri" w:cs="Calibri"/>
+              </w:rPr>
               <w:t>.</w:t>
             </w:r>
-            <w:proofErr w:type="spellStart"/>
-            <w:r>
+            <w:r>
+              <w:rPr>
+                <w:rFonts w:ascii="Calibri" w:hAnsi="Calibri" w:cs="Calibri"/>
+              </w:rPr>
               <w:t>derivative_clock_running</w:t>
             </w:r>
-            <w:proofErr w:type="spellEnd"/>
           </w:p>
           <w:p>
             <w:pPr>
               <w:pStyle w:val="NoSpacing"/>
-            </w:pPr>
-            <w:r>
+              <w:rPr>
+                <w:rFonts w:ascii="Calibri" w:hAnsi="Calibri" w:cs="Calibri"/>
+              </w:rPr>
+            </w:pPr>
+            <w:r>
+              <w:rPr>
+                <w:rFonts w:ascii="Calibri" w:hAnsi="Calibri" w:cs="Calibri"/>
+              </w:rPr>
               <w:t xml:space="preserve">) }} </w:t>
             </w:r>
             <w:r>
+              <w:rPr>
+                <w:rFonts w:ascii="Calibri" w:hAnsi="Calibri" w:cs="Calibri"/>
+              </w:rPr>
               <w:t>Yes</w:t>
             </w:r>
           </w:p>
           <w:p>
             <w:pPr>
               <w:pStyle w:val="NoSpacing"/>
-            </w:pPr>
-            <w:r>
-              <w:t xml:space="preserve">{{ </w:t>
-            </w:r>
-            <w:proofErr w:type="spellStart"/>
-            <w:r>
-              <w:t>output_checkbox</w:t>
-            </w:r>
-            <w:proofErr w:type="spellEnd"/>
-            <w:r>
-              <w:t>(</w:t>
-            </w:r>
-            <w:r>
+              <w:rPr>
+                <w:rFonts w:ascii="Calibri" w:hAnsi="Calibri" w:cs="Calibri"/>
+              </w:rPr>
+            </w:pPr>
+            <w:r>
+              <w:rPr>
+                <w:rFonts w:ascii="Calibri" w:hAnsi="Calibri" w:cs="Calibri"/>
+              </w:rPr>
+              <w:t>{{ output_checkbox(</w:t>
+            </w:r>
+            <w:r>
+              <w:rPr>
+                <w:rFonts w:ascii="Calibri" w:hAnsi="Calibri" w:cs="Calibri"/>
+              </w:rPr>
               <w:t xml:space="preserve">not </w:t>
             </w:r>
             <w:r>
+              <w:rPr>
+                <w:rFonts w:ascii="Calibri" w:hAnsi="Calibri" w:cs="Calibri"/>
+              </w:rPr>
               <w:t>users[0]</w:t>
             </w:r>
             <w:r>
+              <w:rPr>
+                <w:rFonts w:ascii="Calibri" w:hAnsi="Calibri" w:cs="Calibri"/>
+              </w:rPr>
               <w:t>.</w:t>
             </w:r>
-            <w:proofErr w:type="spellStart"/>
-            <w:r>
+            <w:r>
+              <w:rPr>
+                <w:rFonts w:ascii="Calibri" w:hAnsi="Calibri" w:cs="Calibri"/>
+              </w:rPr>
               <w:t>derivative_clock_running</w:t>
             </w:r>
-            <w:proofErr w:type="spellEnd"/>
           </w:p>
           <w:p>
             <w:pPr>
               <w:pStyle w:val="NoSpacing"/>
-            </w:pPr>
-            <w:r>
+              <w:rPr>
+                <w:rFonts w:ascii="Calibri" w:hAnsi="Calibri" w:cs="Calibri"/>
+              </w:rPr>
+            </w:pPr>
+            <w:r>
+              <w:rPr>
+                <w:rFonts w:ascii="Calibri" w:hAnsi="Calibri" w:cs="Calibri"/>
+              </w:rPr>
               <w:t xml:space="preserve">) }} </w:t>
             </w:r>
             <w:r>
+              <w:rPr>
+                <w:rFonts w:ascii="Calibri" w:hAnsi="Calibri" w:cs="Calibri"/>
+              </w:rPr>
               <w:t xml:space="preserve">No – Who? </w:t>
             </w:r>
             <w:r>
-              <w:t>{{ users[0].</w:t>
-            </w:r>
-            <w:proofErr w:type="spellStart"/>
-            <w:r>
-              <w:t>derivative_clock_who</w:t>
-            </w:r>
-            <w:proofErr w:type="spellEnd"/>
-            <w:r>
-              <w:t xml:space="preserve"> }}</w:t>
+              <w:rPr>
+                <w:rFonts w:ascii="Calibri" w:hAnsi="Calibri" w:cs="Calibri"/>
+              </w:rPr>
+              <w:t>{{ users[0].derivative_clock_who }}</w:t>
             </w:r>
           </w:p>
         </w:tc>
@@ -3278,162 +3016,218 @@
           <w:p>
             <w:pPr>
               <w:pStyle w:val="NoSpacing"/>
-            </w:pPr>
-            <w:r>
-              <w:t xml:space="preserve">{{ </w:t>
-            </w:r>
-            <w:proofErr w:type="spellStart"/>
-            <w:r>
-              <w:t>output_checkbox</w:t>
-            </w:r>
-            <w:proofErr w:type="spellEnd"/>
-            <w:r>
-              <w:t>(</w:t>
-            </w:r>
-            <w:r>
+              <w:rPr>
+                <w:rFonts w:ascii="Calibri" w:hAnsi="Calibri" w:cs="Calibri"/>
+              </w:rPr>
+            </w:pPr>
+            <w:r>
+              <w:rPr>
+                <w:rFonts w:ascii="Calibri" w:hAnsi="Calibri" w:cs="Calibri"/>
+              </w:rPr>
+              <w:t>{{ output_checkbox(</w:t>
+            </w:r>
+            <w:r>
+              <w:rPr>
+                <w:rFonts w:ascii="Calibri" w:hAnsi="Calibri" w:cs="Calibri"/>
+              </w:rPr>
               <w:t>users[0]</w:t>
             </w:r>
             <w:r>
+              <w:rPr>
+                <w:rFonts w:ascii="Calibri" w:hAnsi="Calibri" w:cs="Calibri"/>
+              </w:rPr>
               <w:t>.</w:t>
             </w:r>
-            <w:proofErr w:type="spellStart"/>
-            <w:r>
+            <w:r>
+              <w:rPr>
+                <w:rFonts w:ascii="Calibri" w:hAnsi="Calibri" w:cs="Calibri"/>
+              </w:rPr>
               <w:t>family_has_separate_case</w:t>
             </w:r>
-            <w:proofErr w:type="spellEnd"/>
-            <w:r>
+            <w:r>
+              <w:rPr>
+                <w:rFonts w:ascii="Calibri" w:hAnsi="Calibri" w:cs="Calibri"/>
+              </w:rPr>
               <w:t xml:space="preserve">) }} </w:t>
             </w:r>
             <w:r>
+              <w:rPr>
+                <w:rFonts w:ascii="Calibri" w:hAnsi="Calibri" w:cs="Calibri"/>
+              </w:rPr>
               <w:t>Yes</w:t>
             </w:r>
           </w:p>
           <w:p>
             <w:pPr>
               <w:pStyle w:val="NoSpacing"/>
-            </w:pPr>
-            <w:r>
-              <w:t xml:space="preserve">         </w:t>
-            </w:r>
-            <w:r>
+              <w:rPr>
+                <w:rFonts w:ascii="Calibri" w:hAnsi="Calibri" w:cs="Calibri"/>
+              </w:rPr>
+            </w:pPr>
+            <w:r>
+              <w:rPr>
+                <w:rFonts w:ascii="Calibri" w:hAnsi="Calibri" w:cs="Calibri"/>
+              </w:rPr>
+              <w:t xml:space="preserve">          </w:t>
+            </w:r>
+            <w:r>
+              <w:rPr>
+                <w:rFonts w:ascii="Calibri" w:hAnsi="Calibri" w:cs="Calibri"/>
+              </w:rPr>
+              <w:t>Consolidate?</w:t>
+            </w:r>
+          </w:p>
+          <w:p>
+            <w:pPr>
+              <w:pStyle w:val="NoSpacing"/>
+              <w:rPr>
+                <w:rFonts w:ascii="Calibri" w:hAnsi="Calibri" w:cs="Calibri"/>
+              </w:rPr>
+            </w:pPr>
+            <w:r>
+              <w:rPr>
+                <w:rFonts w:ascii="Calibri" w:hAnsi="Calibri" w:cs="Calibri"/>
+              </w:rPr>
+              <w:t xml:space="preserve">          </w:t>
+            </w:r>
+            <w:r>
+              <w:rPr>
+                <w:rFonts w:ascii="Calibri" w:hAnsi="Calibri" w:cs="Calibri"/>
+              </w:rPr>
+              <w:t>{{ output_checkbox(</w:t>
+            </w:r>
+            <w:r>
+              <w:rPr>
+                <w:rFonts w:ascii="Calibri" w:hAnsi="Calibri" w:cs="Calibri"/>
+              </w:rPr>
+              <w:t>users[0]</w:t>
+            </w:r>
+            <w:r>
+              <w:rPr>
+                <w:rFonts w:ascii="Calibri" w:hAnsi="Calibri" w:cs="Calibri"/>
+              </w:rPr>
+              <w:t>.</w:t>
+            </w:r>
+            <w:r>
+              <w:rPr>
+                <w:rFonts w:ascii="Calibri" w:hAnsi="Calibri" w:cs="Calibri"/>
+              </w:rPr>
+              <w:t>wants_consolidation</w:t>
+            </w:r>
+            <w:r>
+              <w:rPr>
+                <w:rFonts w:ascii="Calibri" w:hAnsi="Calibri" w:cs="Calibri"/>
+              </w:rPr>
+              <w:t>)</w:t>
+            </w:r>
+            <w:r>
+              <w:rPr>
+                <w:rFonts w:ascii="Calibri" w:hAnsi="Calibri" w:cs="Calibri"/>
+              </w:rPr>
+              <w:t xml:space="preserve"> }}</w:t>
+            </w:r>
+            <w:r>
+              <w:rPr>
+                <w:rFonts w:ascii="Calibri" w:hAnsi="Calibri" w:cs="Calibri"/>
+              </w:rPr>
               <w:t xml:space="preserve"> </w:t>
             </w:r>
             <w:r>
-              <w:t>Consolidate?</w:t>
+              <w:rPr>
+                <w:rFonts w:ascii="Calibri" w:hAnsi="Calibri" w:cs="Calibri"/>
+              </w:rPr>
+              <w:t xml:space="preserve">Yes         </w:t>
+            </w:r>
+            <w:r>
+              <w:rPr>
+                <w:rFonts w:ascii="Calibri" w:hAnsi="Calibri" w:cs="Calibri"/>
+              </w:rPr>
+              <w:t>{{ output_checkbox(</w:t>
+            </w:r>
+            <w:r>
+              <w:rPr>
+                <w:rFonts w:ascii="Calibri" w:hAnsi="Calibri" w:cs="Calibri"/>
+              </w:rPr>
+              <w:t xml:space="preserve">not </w:t>
+            </w:r>
+            <w:r>
+              <w:rPr>
+                <w:rFonts w:ascii="Calibri" w:hAnsi="Calibri" w:cs="Calibri"/>
+              </w:rPr>
+              <w:t>users[0]</w:t>
+            </w:r>
+            <w:r>
+              <w:rPr>
+                <w:rFonts w:ascii="Calibri" w:hAnsi="Calibri" w:cs="Calibri"/>
+              </w:rPr>
+              <w:t>.</w:t>
+            </w:r>
+            <w:r>
+              <w:rPr>
+                <w:rFonts w:ascii="Calibri" w:hAnsi="Calibri" w:cs="Calibri"/>
+              </w:rPr>
+              <w:t xml:space="preserve"> wants_consolidation</w:t>
+            </w:r>
+            <w:r>
+              <w:rPr>
+                <w:rFonts w:ascii="Calibri" w:hAnsi="Calibri" w:cs="Calibri"/>
+              </w:rPr>
+              <w:t xml:space="preserve">) }} </w:t>
+            </w:r>
+            <w:r>
+              <w:rPr>
+                <w:rFonts w:ascii="Calibri" w:hAnsi="Calibri" w:cs="Calibri"/>
+              </w:rPr>
+              <w:t>No</w:t>
             </w:r>
           </w:p>
           <w:p>
             <w:pPr>
               <w:pStyle w:val="NoSpacing"/>
-            </w:pPr>
-            <w:r>
-              <w:t xml:space="preserve">         </w:t>
-            </w:r>
-            <w:r>
-              <w:t xml:space="preserve"> </w:t>
-            </w:r>
-            <w:r>
-              <w:t xml:space="preserve">{{ </w:t>
-            </w:r>
-            <w:proofErr w:type="spellStart"/>
-            <w:r>
-              <w:t>output_checkbox</w:t>
-            </w:r>
-            <w:proofErr w:type="spellEnd"/>
-            <w:r>
-              <w:t>(</w:t>
-            </w:r>
-            <w:r>
+              <w:rPr>
+                <w:rFonts w:ascii="Calibri" w:hAnsi="Calibri" w:cs="Calibri"/>
+              </w:rPr>
+            </w:pPr>
+            <w:r>
+              <w:rPr>
+                <w:rFonts w:ascii="Calibri" w:hAnsi="Calibri" w:cs="Calibri"/>
+              </w:rPr>
+              <w:t>{{ output_checkbox(</w:t>
+            </w:r>
+            <w:r>
+              <w:rPr>
+                <w:rFonts w:ascii="Calibri" w:hAnsi="Calibri" w:cs="Calibri"/>
+              </w:rPr>
+              <w:t xml:space="preserve">not </w:t>
+            </w:r>
+            <w:r>
+              <w:rPr>
+                <w:rFonts w:ascii="Calibri" w:hAnsi="Calibri" w:cs="Calibri"/>
+              </w:rPr>
               <w:t>users[0]</w:t>
             </w:r>
             <w:r>
+              <w:rPr>
+                <w:rFonts w:ascii="Calibri" w:hAnsi="Calibri" w:cs="Calibri"/>
+              </w:rPr>
               <w:t>.</w:t>
             </w:r>
-            <w:proofErr w:type="spellStart"/>
-            <w:r>
-              <w:t>wants_consolidation</w:t>
-            </w:r>
-            <w:proofErr w:type="spellEnd"/>
-            <w:r>
-              <w:t>)</w:t>
-            </w:r>
-            <w:r>
-              <w:t xml:space="preserve"> }}</w:t>
-            </w:r>
-            <w:r>
-              <w:t xml:space="preserve"> </w:t>
-            </w:r>
-            <w:r>
-              <w:t xml:space="preserve">Yes         </w:t>
-            </w:r>
-            <w:r>
-              <w:t xml:space="preserve">{{ </w:t>
-            </w:r>
-            <w:proofErr w:type="spellStart"/>
-            <w:r>
-              <w:t>output_checkbox</w:t>
-            </w:r>
-            <w:proofErr w:type="spellEnd"/>
-            <w:r>
-              <w:t>(</w:t>
-            </w:r>
-            <w:r>
-              <w:t xml:space="preserve">not </w:t>
-            </w:r>
-            <w:r>
-              <w:t>users[0]</w:t>
-            </w:r>
-            <w:r>
-              <w:t>.</w:t>
-            </w:r>
-            <w:r>
-              <w:t xml:space="preserve"> </w:t>
-            </w:r>
-            <w:proofErr w:type="spellStart"/>
-            <w:r>
-              <w:t>wants_consolidation</w:t>
-            </w:r>
-            <w:proofErr w:type="spellEnd"/>
-            <w:r>
+            <w:r>
+              <w:rPr>
+                <w:rFonts w:ascii="Calibri" w:hAnsi="Calibri" w:cs="Calibri"/>
+              </w:rPr>
+              <w:t>family_has_separate_case</w:t>
+            </w:r>
+            <w:r>
+              <w:rPr>
+                <w:rFonts w:ascii="Calibri" w:hAnsi="Calibri" w:cs="Calibri"/>
+              </w:rPr>
               <w:t xml:space="preserve">) }} </w:t>
             </w:r>
             <w:r>
-              <w:t>No</w:t>
-            </w:r>
-          </w:p>
-          <w:p>
-            <w:pPr>
-              <w:pStyle w:val="NoSpacing"/>
-            </w:pPr>
-            <w:r>
-              <w:t xml:space="preserve">{{ </w:t>
-            </w:r>
-            <w:proofErr w:type="spellStart"/>
-            <w:r>
-              <w:t>output_checkbox</w:t>
-            </w:r>
-            <w:proofErr w:type="spellEnd"/>
-            <w:r>
-              <w:t>(</w:t>
-            </w:r>
-            <w:r>
-              <w:t xml:space="preserve">not </w:t>
-            </w:r>
-            <w:r>
-              <w:t>users[0]</w:t>
-            </w:r>
-            <w:r>
-              <w:t>.</w:t>
-            </w:r>
-            <w:proofErr w:type="spellStart"/>
-            <w:r>
-              <w:t>family_has_separate_case</w:t>
-            </w:r>
-            <w:proofErr w:type="spellEnd"/>
-            <w:r>
-              <w:t xml:space="preserve">) }} </w:t>
-            </w:r>
-            <w:r>
+              <w:rPr>
+                <w:rFonts w:ascii="Calibri" w:hAnsi="Calibri" w:cs="Calibri"/>
+              </w:rPr>
               <w:t>No</w:t>
             </w:r>
           </w:p>
@@ -3482,94 +3276,162 @@
           <w:p>
             <w:pPr>
               <w:pStyle w:val="NoSpacing"/>
-            </w:pPr>
-            <w:r>
+              <w:rPr>
+                <w:rFonts w:ascii="Calibri" w:hAnsi="Calibri" w:cs="Calibri"/>
+              </w:rPr>
+            </w:pPr>
+            <w:r>
+              <w:rPr>
+                <w:rFonts w:ascii="Calibri" w:hAnsi="Calibri" w:cs="Calibri"/>
+              </w:rPr>
+              <w:t>{{ output_checkbox(</w:t>
+            </w:r>
+            <w:r>
+              <w:rPr>
+                <w:rFonts w:ascii="Calibri" w:hAnsi="Calibri" w:cs="Calibri"/>
+              </w:rPr>
+              <w:t>users[0]</w:t>
+            </w:r>
+            <w:r>
+              <w:rPr>
+                <w:rFonts w:ascii="Calibri" w:hAnsi="Calibri" w:cs="Calibri"/>
+              </w:rPr>
+              <w:t>.</w:t>
+            </w:r>
+            <w:r>
+              <w:rPr>
+                <w:rFonts w:ascii="Calibri" w:hAnsi="Calibri" w:cs="Calibri"/>
+              </w:rPr>
+              <w:t>wants_separate_case</w:t>
+            </w:r>
+            <w:r>
+              <w:rPr>
+                <w:rFonts w:ascii="Calibri" w:hAnsi="Calibri" w:cs="Calibri"/>
+              </w:rPr>
+              <w:t xml:space="preserve">) }} </w:t>
+            </w:r>
+            <w:r>
+              <w:rPr>
+                <w:rFonts w:ascii="Calibri" w:hAnsi="Calibri" w:cs="Calibri"/>
+              </w:rPr>
+              <w:t xml:space="preserve">Yes: </w:t>
+            </w:r>
+            <w:r>
+              <w:rPr>
+                <w:rFonts w:ascii="Calibri" w:hAnsi="Calibri" w:cs="Calibri"/>
+              </w:rPr>
+              <w:t xml:space="preserve"> Who? </w:t>
+            </w:r>
+          </w:p>
+          <w:p>
+            <w:pPr>
+              <w:pStyle w:val="NoSpacing"/>
+              <w:rPr>
+                <w:rFonts w:ascii="Calibri" w:hAnsi="Calibri" w:cs="Calibri"/>
+              </w:rPr>
+            </w:pPr>
+            <w:r>
+              <w:rPr>
+                <w:rFonts w:ascii="Calibri" w:hAnsi="Calibri" w:cs="Calibri"/>
+              </w:rPr>
               <w:t xml:space="preserve">{{ </w:t>
             </w:r>
-            <w:proofErr w:type="spellStart"/>
-            <w:r>
-              <w:t>output_checkbox</w:t>
-            </w:r>
-            <w:proofErr w:type="spellEnd"/>
-            <w:r>
-              <w:t>(</w:t>
-            </w:r>
-            <w:r>
+            <w:r>
+              <w:rPr>
+                <w:rFonts w:ascii="Calibri" w:hAnsi="Calibri" w:cs="Calibri"/>
+              </w:rPr>
+              <w:t>comma_list(</w:t>
+            </w:r>
+            <w:r>
+              <w:rPr>
+                <w:rFonts w:ascii="Calibri" w:hAnsi="Calibri" w:cs="Calibri"/>
+              </w:rPr>
               <w:t>users[0]</w:t>
             </w:r>
             <w:r>
+              <w:rPr>
+                <w:rFonts w:ascii="Calibri" w:hAnsi="Calibri" w:cs="Calibri"/>
+              </w:rPr>
               <w:t>.</w:t>
             </w:r>
-            <w:proofErr w:type="spellStart"/>
-            <w:r>
+            <w:r>
+              <w:rPr>
+                <w:rFonts w:ascii="Calibri" w:hAnsi="Calibri" w:cs="Calibri"/>
+              </w:rPr>
+              <w:t>separate_case_name_list</w:t>
+            </w:r>
+            <w:r>
+              <w:rPr>
+                <w:rFonts w:ascii="Calibri" w:hAnsi="Calibri" w:cs="Calibri"/>
+              </w:rPr>
+              <w:t>)</w:t>
+            </w:r>
+            <w:r>
+              <w:rPr>
+                <w:rFonts w:ascii="Calibri" w:hAnsi="Calibri" w:cs="Calibri"/>
+              </w:rPr>
+              <w:t xml:space="preserve"> }}</w:t>
+            </w:r>
+          </w:p>
+          <w:p>
+            <w:pPr>
+              <w:pStyle w:val="NoSpacing"/>
+              <w:rPr>
+                <w:rFonts w:ascii="Calibri" w:hAnsi="Calibri" w:cs="Calibri"/>
+              </w:rPr>
+            </w:pPr>
+            <w:r>
+              <w:rPr>
+                <w:rFonts w:ascii="Calibri" w:hAnsi="Calibri" w:cs="Calibri"/>
+              </w:rPr>
+              <w:t>{{ output_checkbox(</w:t>
+            </w:r>
+            <w:r>
+              <w:rPr>
+                <w:rFonts w:ascii="Calibri" w:hAnsi="Calibri" w:cs="Calibri"/>
+              </w:rPr>
+              <w:t>no</w:t>
+            </w:r>
+            <w:r>
+              <w:rPr>
+                <w:rFonts w:ascii="Calibri" w:hAnsi="Calibri" w:cs="Calibri"/>
+              </w:rPr>
+              <w:t>t</w:t>
+            </w:r>
+            <w:r>
+              <w:rPr>
+                <w:rFonts w:ascii="Calibri" w:hAnsi="Calibri" w:cs="Calibri"/>
+              </w:rPr>
+              <w:t xml:space="preserve"> </w:t>
+            </w:r>
+            <w:r>
+              <w:rPr>
+                <w:rFonts w:ascii="Calibri" w:hAnsi="Calibri" w:cs="Calibri"/>
+              </w:rPr>
+              <w:t>users[0]</w:t>
+            </w:r>
+            <w:r>
+              <w:rPr>
+                <w:rFonts w:ascii="Calibri" w:hAnsi="Calibri" w:cs="Calibri"/>
+              </w:rPr>
+              <w:t>.</w:t>
+            </w:r>
+            <w:r>
+              <w:rPr>
+                <w:rFonts w:ascii="Calibri" w:hAnsi="Calibri" w:cs="Calibri"/>
+              </w:rPr>
               <w:t>wants_separate_case</w:t>
             </w:r>
-            <w:proofErr w:type="spellEnd"/>
-            <w:r>
+            <w:r>
+              <w:rPr>
+                <w:rFonts w:ascii="Calibri" w:hAnsi="Calibri" w:cs="Calibri"/>
+              </w:rPr>
               <w:t xml:space="preserve">) }} </w:t>
             </w:r>
             <w:r>
-              <w:t xml:space="preserve">Yes: </w:t>
-            </w:r>
-            <w:r>
-              <w:t xml:space="preserve"> Who? </w:t>
-            </w:r>
-          </w:p>
-          <w:p>
-            <w:pPr>
-              <w:pStyle w:val="NoSpacing"/>
-            </w:pPr>
-            <w:r>
-              <w:t>{{ users[0].</w:t>
-            </w:r>
-            <w:proofErr w:type="spellStart"/>
-            <w:r>
-              <w:t>separate_case_who</w:t>
-            </w:r>
-            <w:proofErr w:type="spellEnd"/>
-            <w:r>
-              <w:t xml:space="preserve"> }}</w:t>
-            </w:r>
-          </w:p>
-          <w:p>
-            <w:pPr>
-              <w:pStyle w:val="NoSpacing"/>
-            </w:pPr>
-            <w:r>
-              <w:t xml:space="preserve">{{ </w:t>
-            </w:r>
-            <w:proofErr w:type="spellStart"/>
-            <w:r>
-              <w:t>output_checkbox</w:t>
-            </w:r>
-            <w:proofErr w:type="spellEnd"/>
-            <w:r>
-              <w:t>(</w:t>
-            </w:r>
-            <w:r>
-              <w:t>no</w:t>
-            </w:r>
-            <w:r>
-              <w:t>t</w:t>
-            </w:r>
-            <w:r>
-              <w:t xml:space="preserve"> </w:t>
-            </w:r>
-            <w:r>
-              <w:t>users[0]</w:t>
-            </w:r>
-            <w:r>
-              <w:t>.</w:t>
-            </w:r>
-            <w:proofErr w:type="spellStart"/>
-            <w:r>
-              <w:t>wants_separate_case</w:t>
-            </w:r>
-            <w:proofErr w:type="spellEnd"/>
-            <w:r>
-              <w:t xml:space="preserve">) }} </w:t>
-            </w:r>
-            <w:r>
+              <w:rPr>
+                <w:rFonts w:ascii="Calibri" w:hAnsi="Calibri" w:cs="Calibri"/>
+              </w:rPr>
               <w:t>No</w:t>
             </w:r>
           </w:p>
@@ -3618,85 +3480,108 @@
           <w:p>
             <w:pPr>
               <w:pStyle w:val="NoSpacing"/>
-            </w:pPr>
-            <w:r>
-              <w:t xml:space="preserve">{{ </w:t>
-            </w:r>
-            <w:proofErr w:type="spellStart"/>
-            <w:r>
-              <w:t>output_checkbox</w:t>
-            </w:r>
-            <w:proofErr w:type="spellEnd"/>
-            <w:r>
-              <w:t>(</w:t>
-            </w:r>
-            <w:r>
+              <w:rPr>
+                <w:rFonts w:ascii="Calibri" w:hAnsi="Calibri" w:cs="Calibri"/>
+              </w:rPr>
+            </w:pPr>
+            <w:r>
+              <w:rPr>
+                <w:rFonts w:ascii="Calibri" w:hAnsi="Calibri" w:cs="Calibri"/>
+              </w:rPr>
+              <w:t>{{ output_checkbox(</w:t>
+            </w:r>
+            <w:r>
+              <w:rPr>
+                <w:rFonts w:ascii="Calibri" w:hAnsi="Calibri" w:cs="Calibri"/>
+              </w:rPr>
               <w:t>users[0]</w:t>
             </w:r>
             <w:r>
+              <w:rPr>
+                <w:rFonts w:ascii="Calibri" w:hAnsi="Calibri" w:cs="Calibri"/>
+              </w:rPr>
               <w:t>.</w:t>
             </w:r>
-            <w:proofErr w:type="spellStart"/>
-            <w:r>
+            <w:r>
+              <w:rPr>
+                <w:rFonts w:ascii="Calibri" w:hAnsi="Calibri" w:cs="Calibri"/>
+              </w:rPr>
               <w:t>looked_for_attorney</w:t>
             </w:r>
-            <w:proofErr w:type="spellEnd"/>
-            <w:r>
+            <w:r>
+              <w:rPr>
+                <w:rFonts w:ascii="Calibri" w:hAnsi="Calibri" w:cs="Calibri"/>
+              </w:rPr>
               <w:t xml:space="preserve">) }} </w:t>
             </w:r>
             <w:r>
+              <w:rPr>
+                <w:rFonts w:ascii="Calibri" w:hAnsi="Calibri" w:cs="Calibri"/>
+              </w:rPr>
               <w:t>Yes</w:t>
             </w:r>
           </w:p>
           <w:p>
             <w:pPr>
               <w:pStyle w:val="NoSpacing"/>
-            </w:pPr>
-            <w:r>
-              <w:t>{{ users[0].</w:t>
-            </w:r>
-            <w:proofErr w:type="spellStart"/>
-            <w:r>
-              <w:t>looked_for_attorney_details</w:t>
-            </w:r>
-            <w:proofErr w:type="spellEnd"/>
-            <w:r>
-              <w:t>}}</w:t>
+              <w:rPr>
+                <w:rFonts w:ascii="Calibri" w:hAnsi="Calibri" w:cs="Calibri"/>
+              </w:rPr>
+            </w:pPr>
+            <w:r>
+              <w:rPr>
+                <w:rFonts w:ascii="Calibri" w:hAnsi="Calibri" w:cs="Calibri"/>
+              </w:rPr>
+              <w:t>{{ users[0].looked_for_attorney_details}}</w:t>
             </w:r>
           </w:p>
           <w:p>
             <w:pPr>
               <w:pStyle w:val="NoSpacing"/>
-            </w:pPr>
-            <w:r>
-              <w:t xml:space="preserve">{{ </w:t>
-            </w:r>
-            <w:proofErr w:type="spellStart"/>
-            <w:r>
-              <w:t>output_checkbox</w:t>
-            </w:r>
-            <w:proofErr w:type="spellEnd"/>
-            <w:r>
-              <w:t>(</w:t>
-            </w:r>
-            <w:r>
+              <w:rPr>
+                <w:rFonts w:ascii="Calibri" w:hAnsi="Calibri" w:cs="Calibri"/>
+              </w:rPr>
+            </w:pPr>
+            <w:r>
+              <w:rPr>
+                <w:rFonts w:ascii="Calibri" w:hAnsi="Calibri" w:cs="Calibri"/>
+              </w:rPr>
+              <w:t>{{ output_checkbox(</w:t>
+            </w:r>
+            <w:r>
+              <w:rPr>
+                <w:rFonts w:ascii="Calibri" w:hAnsi="Calibri" w:cs="Calibri"/>
+              </w:rPr>
               <w:t xml:space="preserve">not </w:t>
             </w:r>
             <w:r>
+              <w:rPr>
+                <w:rFonts w:ascii="Calibri" w:hAnsi="Calibri" w:cs="Calibri"/>
+              </w:rPr>
               <w:t>users[0]</w:t>
             </w:r>
             <w:r>
+              <w:rPr>
+                <w:rFonts w:ascii="Calibri" w:hAnsi="Calibri" w:cs="Calibri"/>
+              </w:rPr>
               <w:t>.</w:t>
             </w:r>
-            <w:proofErr w:type="spellStart"/>
-            <w:r>
+            <w:r>
+              <w:rPr>
+                <w:rFonts w:ascii="Calibri" w:hAnsi="Calibri" w:cs="Calibri"/>
+              </w:rPr>
               <w:t>looked_for_attorney</w:t>
             </w:r>
-            <w:proofErr w:type="spellEnd"/>
-            <w:r>
+            <w:r>
+              <w:rPr>
+                <w:rFonts w:ascii="Calibri" w:hAnsi="Calibri" w:cs="Calibri"/>
+              </w:rPr>
               <w:t xml:space="preserve">) }} </w:t>
             </w:r>
             <w:r>
+              <w:rPr>
+                <w:rFonts w:ascii="Calibri" w:hAnsi="Calibri" w:cs="Calibri"/>
+              </w:rPr>
               <w:t>No</w:t>
             </w:r>
           </w:p>
@@ -3704,7 +3589,7 @@
       </w:tr>
       <w:tr>
         <w:trPr>
-          <w:trHeight w:val="576"/>
+          <w:trHeight w:val="1142"/>
         </w:trPr>
         <w:tc>
           <w:tcPr>
@@ -3733,17 +3618,15 @@
           <w:p>
             <w:pPr>
               <w:pStyle w:val="NoSpacing"/>
-            </w:pPr>
-            <w:r>
-              <w:t>{{ users[0].</w:t>
-            </w:r>
-            <w:proofErr w:type="spellStart"/>
-            <w:r>
-              <w:t>additional_notes</w:t>
-            </w:r>
-            <w:proofErr w:type="spellEnd"/>
-            <w:r>
-              <w:t>}}</w:t>
+              <w:rPr>
+                <w:rFonts w:ascii="Calibri" w:hAnsi="Calibri" w:cs="Calibri"/>
+              </w:rPr>
+            </w:pPr>
+            <w:r>
+              <w:rPr>
+                <w:rFonts w:ascii="Calibri" w:hAnsi="Calibri" w:cs="Calibri"/>
+              </w:rPr>
+              <w:t>{{ users[0].additional_notes}}</w:t>
             </w:r>
           </w:p>
         </w:tc>
@@ -3751,6 +3634,11 @@
     </w:tbl>
     <w:p>
       <w:pPr>
+        <w:rPr>
+          <w:rFonts w:ascii="Calibri" w:hAnsi="Calibri" w:cs="Calibri"/>
+          <w:sz w:val="22"/>
+          <w:szCs w:val="22"/>
+        </w:rPr>
         <w:sectPr>
           <w:headerReference w:type="default" r:id="rId11"/>
           <w:footerReference w:type="default" r:id="rId12"/>
@@ -3764,6 +3652,11 @@
     <w:p>
       <w:pPr>
         <w:spacing w:after="0"/>
+        <w:rPr>
+          <w:rFonts w:ascii="Calibri" w:hAnsi="Calibri" w:cs="Calibri"/>
+          <w:sz w:val="22"/>
+          <w:szCs w:val="22"/>
+        </w:rPr>
       </w:pPr>
     </w:p>
     <w:sectPr>
@@ -6441,7 +6334,6 @@
   <w:style w:type="character" w:default="1" w:styleId="DefaultParagraphFont">
     <w:name w:val="Default Paragraph Font"/>
     <w:uiPriority w:val="1"/>
-    <w:semiHidden/>
     <w:unhideWhenUsed/>
   </w:style>
   <w:style w:type="table" w:default="1" w:styleId="TableNormal">

</xml_diff>

<commit_message>
Applied more fixes after review and updated DOCX/PDF
</commit_message>
<xml_diff>
--- a/docassemble/USCISApplications/data/templates/Court_Accompaniment_Intake.docx
+++ b/docassemble/USCISApplications/data/templates/Court_Accompaniment_Intake.docx
@@ -99,6 +99,7 @@
         </w:rPr>
         <w:t xml:space="preserve">Name of volunteer/staff: </w:t>
       </w:r>
+      <w:proofErr w:type="gramStart"/>
       <w:r>
         <w:rPr>
           <w:rFonts w:ascii="Calibri" w:eastAsia="Arial" w:hAnsi="Calibri" w:cs="Calibri"/>
@@ -109,6 +110,7 @@
         </w:rPr>
         <w:t xml:space="preserve">{{ </w:t>
       </w:r>
+      <w:proofErr w:type="spellStart"/>
       <w:r>
         <w:rPr>
           <w:rFonts w:ascii="Calibri" w:eastAsia="Arial" w:hAnsi="Calibri" w:cs="Calibri"/>
@@ -117,7 +119,29 @@
           <w:sz w:val="22"/>
           <w:szCs w:val="22"/>
         </w:rPr>
-        <w:t>screener.name_full()</w:t>
+        <w:t>screener.name</w:t>
+      </w:r>
+      <w:proofErr w:type="gramEnd"/>
+      <w:r>
+        <w:rPr>
+          <w:rFonts w:ascii="Calibri" w:eastAsia="Arial" w:hAnsi="Calibri" w:cs="Calibri"/>
+          <w:b/>
+          <w:bCs/>
+          <w:sz w:val="22"/>
+          <w:szCs w:val="22"/>
+        </w:rPr>
+        <w:t>_full</w:t>
+      </w:r>
+      <w:proofErr w:type="spellEnd"/>
+      <w:r>
+        <w:rPr>
+          <w:rFonts w:ascii="Calibri" w:eastAsia="Arial" w:hAnsi="Calibri" w:cs="Calibri"/>
+          <w:b/>
+          <w:bCs/>
+          <w:sz w:val="22"/>
+          <w:szCs w:val="22"/>
+        </w:rPr>
+        <w:t>()</w:t>
       </w:r>
       <w:r>
         <w:rPr>
@@ -180,6 +204,7 @@
         </w:rPr>
         <w:t xml:space="preserve">Hearing Date: </w:t>
       </w:r>
+      <w:proofErr w:type="gramStart"/>
       <w:r>
         <w:rPr>
           <w:rFonts w:ascii="Calibri" w:eastAsia="Calibri" w:hAnsi="Calibri" w:cs="Calibri"/>
@@ -188,7 +213,62 @@
           <w:sz w:val="22"/>
           <w:szCs w:val="22"/>
         </w:rPr>
-        <w:t>{{ users[0].hearing_date.format('MM/dd/yyyy') }}</w:t>
+        <w:t>{{ users</w:t>
+      </w:r>
+      <w:proofErr w:type="gramEnd"/>
+      <w:r>
+        <w:rPr>
+          <w:rFonts w:ascii="Calibri" w:eastAsia="Calibri" w:hAnsi="Calibri" w:cs="Calibri"/>
+          <w:b/>
+          <w:bCs/>
+          <w:sz w:val="22"/>
+          <w:szCs w:val="22"/>
+        </w:rPr>
+        <w:t>[0].</w:t>
+      </w:r>
+      <w:proofErr w:type="spellStart"/>
+      <w:r>
+        <w:rPr>
+          <w:rFonts w:ascii="Calibri" w:eastAsia="Calibri" w:hAnsi="Calibri" w:cs="Calibri"/>
+          <w:b/>
+          <w:bCs/>
+          <w:sz w:val="22"/>
+          <w:szCs w:val="22"/>
+        </w:rPr>
+        <w:t>hearing_date.format</w:t>
+      </w:r>
+      <w:proofErr w:type="spellEnd"/>
+      <w:r>
+        <w:rPr>
+          <w:rFonts w:ascii="Calibri" w:eastAsia="Calibri" w:hAnsi="Calibri" w:cs="Calibri"/>
+          <w:b/>
+          <w:bCs/>
+          <w:sz w:val="22"/>
+          <w:szCs w:val="22"/>
+        </w:rPr>
+        <w:t>('MM/dd/</w:t>
+      </w:r>
+      <w:proofErr w:type="spellStart"/>
+      <w:r>
+        <w:rPr>
+          <w:rFonts w:ascii="Calibri" w:eastAsia="Calibri" w:hAnsi="Calibri" w:cs="Calibri"/>
+          <w:b/>
+          <w:bCs/>
+          <w:sz w:val="22"/>
+          <w:szCs w:val="22"/>
+        </w:rPr>
+        <w:t>yyyy</w:t>
+      </w:r>
+      <w:proofErr w:type="spellEnd"/>
+      <w:r>
+        <w:rPr>
+          <w:rFonts w:ascii="Calibri" w:eastAsia="Calibri" w:hAnsi="Calibri" w:cs="Calibri"/>
+          <w:b/>
+          <w:bCs/>
+          <w:sz w:val="22"/>
+          <w:szCs w:val="22"/>
+        </w:rPr>
+        <w:t>') }}</w:t>
       </w:r>
       <w:r>
         <w:rPr>
@@ -221,6 +301,7 @@
         </w:rPr>
         <w:t xml:space="preserve">{{ </w:t>
       </w:r>
+      <w:proofErr w:type="spellStart"/>
       <w:r>
         <w:rPr>
           <w:rFonts w:ascii="Calibri" w:eastAsia="Calibri" w:hAnsi="Calibri" w:cs="Calibri"/>
@@ -229,7 +310,18 @@
           <w:sz w:val="22"/>
           <w:szCs w:val="22"/>
         </w:rPr>
-        <w:t>format_time(</w:t>
+        <w:t>format_time</w:t>
+      </w:r>
+      <w:proofErr w:type="spellEnd"/>
+      <w:r>
+        <w:rPr>
+          <w:rFonts w:ascii="Calibri" w:eastAsia="Calibri" w:hAnsi="Calibri" w:cs="Calibri"/>
+          <w:b/>
+          <w:bCs/>
+          <w:sz w:val="22"/>
+          <w:szCs w:val="22"/>
+        </w:rPr>
+        <w:t>(</w:t>
       </w:r>
       <w:r>
         <w:rPr>
@@ -239,8 +331,9 @@
           <w:sz w:val="22"/>
           <w:szCs w:val="22"/>
         </w:rPr>
-        <w:t>users[0].hearing_time</w:t>
+        <w:t>users[0].</w:t>
       </w:r>
+      <w:proofErr w:type="spellStart"/>
       <w:r>
         <w:rPr>
           <w:rFonts w:ascii="Calibri" w:eastAsia="Calibri" w:hAnsi="Calibri" w:cs="Calibri"/>
@@ -249,7 +342,40 @@
           <w:sz w:val="22"/>
           <w:szCs w:val="22"/>
         </w:rPr>
-        <w:t>, format='h:mm a')</w:t>
+        <w:t>hearing_time</w:t>
+      </w:r>
+      <w:proofErr w:type="spellEnd"/>
+      <w:r>
+        <w:rPr>
+          <w:rFonts w:ascii="Calibri" w:eastAsia="Calibri" w:hAnsi="Calibri" w:cs="Calibri"/>
+          <w:b/>
+          <w:bCs/>
+          <w:sz w:val="22"/>
+          <w:szCs w:val="22"/>
+        </w:rPr>
+        <w:t>, format='</w:t>
+      </w:r>
+      <w:proofErr w:type="spellStart"/>
+      <w:r>
+        <w:rPr>
+          <w:rFonts w:ascii="Calibri" w:eastAsia="Calibri" w:hAnsi="Calibri" w:cs="Calibri"/>
+          <w:b/>
+          <w:bCs/>
+          <w:sz w:val="22"/>
+          <w:szCs w:val="22"/>
+        </w:rPr>
+        <w:t>h:mm</w:t>
+      </w:r>
+      <w:proofErr w:type="spellEnd"/>
+      <w:r>
+        <w:rPr>
+          <w:rFonts w:ascii="Calibri" w:eastAsia="Calibri" w:hAnsi="Calibri" w:cs="Calibri"/>
+          <w:b/>
+          <w:bCs/>
+          <w:sz w:val="22"/>
+          <w:szCs w:val="22"/>
+        </w:rPr>
+        <w:t xml:space="preserve"> a')</w:t>
       </w:r>
       <w:r>
         <w:rPr>
@@ -302,6 +428,7 @@
         </w:rPr>
         <w:t xml:space="preserve">Immigration Judge: </w:t>
       </w:r>
+      <w:proofErr w:type="gramStart"/>
       <w:r>
         <w:rPr>
           <w:rFonts w:ascii="Calibri" w:eastAsia="Calibri" w:hAnsi="Calibri" w:cs="Calibri"/>
@@ -310,7 +437,40 @@
           <w:sz w:val="22"/>
           <w:szCs w:val="22"/>
         </w:rPr>
-        <w:t>{{ immigration_judge.name_full() }}</w:t>
+        <w:t xml:space="preserve">{{ </w:t>
+      </w:r>
+      <w:proofErr w:type="spellStart"/>
+      <w:r>
+        <w:rPr>
+          <w:rFonts w:ascii="Calibri" w:eastAsia="Calibri" w:hAnsi="Calibri" w:cs="Calibri"/>
+          <w:b/>
+          <w:bCs/>
+          <w:sz w:val="22"/>
+          <w:szCs w:val="22"/>
+        </w:rPr>
+        <w:t>immigration_judge.name</w:t>
+      </w:r>
+      <w:proofErr w:type="gramEnd"/>
+      <w:r>
+        <w:rPr>
+          <w:rFonts w:ascii="Calibri" w:eastAsia="Calibri" w:hAnsi="Calibri" w:cs="Calibri"/>
+          <w:b/>
+          <w:bCs/>
+          <w:sz w:val="22"/>
+          <w:szCs w:val="22"/>
+        </w:rPr>
+        <w:t>_full</w:t>
+      </w:r>
+      <w:proofErr w:type="spellEnd"/>
+      <w:r>
+        <w:rPr>
+          <w:rFonts w:ascii="Calibri" w:eastAsia="Calibri" w:hAnsi="Calibri" w:cs="Calibri"/>
+          <w:b/>
+          <w:bCs/>
+          <w:sz w:val="22"/>
+          <w:szCs w:val="22"/>
+        </w:rPr>
+        <w:t>() }}</w:t>
       </w:r>
     </w:p>
     <w:p>
@@ -351,7 +511,51 @@
           <w:sz w:val="22"/>
           <w:szCs w:val="22"/>
         </w:rPr>
-        <w:t>{% if not users[0].has_riders %}N/A{% endif %}</w:t>
+        <w:t xml:space="preserve">{% if not </w:t>
+      </w:r>
+      <w:proofErr w:type="gramStart"/>
+      <w:r>
+        <w:rPr>
+          <w:rFonts w:ascii="Calibri" w:eastAsia="Calibri" w:hAnsi="Calibri" w:cs="Calibri"/>
+          <w:b/>
+          <w:bCs/>
+          <w:sz w:val="22"/>
+          <w:szCs w:val="22"/>
+        </w:rPr>
+        <w:t>users[</w:t>
+      </w:r>
+      <w:proofErr w:type="gramEnd"/>
+      <w:r>
+        <w:rPr>
+          <w:rFonts w:ascii="Calibri" w:eastAsia="Calibri" w:hAnsi="Calibri" w:cs="Calibri"/>
+          <w:b/>
+          <w:bCs/>
+          <w:sz w:val="22"/>
+          <w:szCs w:val="22"/>
+        </w:rPr>
+        <w:t>0].</w:t>
+      </w:r>
+      <w:proofErr w:type="spellStart"/>
+      <w:r>
+        <w:rPr>
+          <w:rFonts w:ascii="Calibri" w:eastAsia="Calibri" w:hAnsi="Calibri" w:cs="Calibri"/>
+          <w:b/>
+          <w:bCs/>
+          <w:sz w:val="22"/>
+          <w:szCs w:val="22"/>
+        </w:rPr>
+        <w:t>has_riders</w:t>
+      </w:r>
+      <w:proofErr w:type="spellEnd"/>
+      <w:r>
+        <w:rPr>
+          <w:rFonts w:ascii="Calibri" w:eastAsia="Calibri" w:hAnsi="Calibri" w:cs="Calibri"/>
+          <w:b/>
+          <w:bCs/>
+          <w:sz w:val="22"/>
+          <w:szCs w:val="22"/>
+        </w:rPr>
+        <w:t xml:space="preserve"> %}N/A{% endif %}</w:t>
       </w:r>
     </w:p>
     <w:p>
@@ -374,6 +578,7 @@
         </w:rPr>
         <w:t xml:space="preserve">{%p if </w:t>
       </w:r>
+      <w:proofErr w:type="gramStart"/>
       <w:r>
         <w:rPr>
           <w:rFonts w:ascii="Calibri" w:eastAsia="Calibri" w:hAnsi="Calibri" w:cs="Calibri"/>
@@ -382,8 +587,9 @@
           <w:sz w:val="22"/>
           <w:szCs w:val="22"/>
         </w:rPr>
-        <w:t>users[0].</w:t>
+        <w:t>users[</w:t>
       </w:r>
+      <w:proofErr w:type="gramEnd"/>
       <w:r>
         <w:rPr>
           <w:rFonts w:ascii="Calibri" w:eastAsia="Calibri" w:hAnsi="Calibri" w:cs="Calibri"/>
@@ -392,7 +598,29 @@
           <w:sz w:val="22"/>
           <w:szCs w:val="22"/>
         </w:rPr>
-        <w:t>has_riders %}</w:t>
+        <w:t>0].</w:t>
+      </w:r>
+      <w:proofErr w:type="spellStart"/>
+      <w:r>
+        <w:rPr>
+          <w:rFonts w:ascii="Calibri" w:eastAsia="Calibri" w:hAnsi="Calibri" w:cs="Calibri"/>
+          <w:b/>
+          <w:bCs/>
+          <w:sz w:val="22"/>
+          <w:szCs w:val="22"/>
+        </w:rPr>
+        <w:t>has_riders</w:t>
+      </w:r>
+      <w:proofErr w:type="spellEnd"/>
+      <w:r>
+        <w:rPr>
+          <w:rFonts w:ascii="Calibri" w:eastAsia="Calibri" w:hAnsi="Calibri" w:cs="Calibri"/>
+          <w:b/>
+          <w:bCs/>
+          <w:sz w:val="22"/>
+          <w:szCs w:val="22"/>
+        </w:rPr>
+        <w:t xml:space="preserve"> %}</w:t>
       </w:r>
     </w:p>
     <w:tbl>
@@ -426,13 +654,23 @@
                 <w:bCs/>
               </w:rPr>
             </w:pPr>
+            <w:proofErr w:type="spellStart"/>
             <w:r>
               <w:rPr>
                 <w:rFonts w:ascii="Calibri" w:eastAsia="Calibri" w:hAnsi="Calibri" w:cs="Calibri"/>
                 <w:b/>
                 <w:bCs/>
               </w:rPr>
-              <w:t>Additonal Riders</w:t>
+              <w:t>Additonal</w:t>
+            </w:r>
+            <w:proofErr w:type="spellEnd"/>
+            <w:r>
+              <w:rPr>
+                <w:rFonts w:ascii="Calibri" w:eastAsia="Calibri" w:hAnsi="Calibri" w:cs="Calibri"/>
+                <w:b/>
+                <w:bCs/>
+              </w:rPr>
+              <w:t xml:space="preserve"> Riders</w:t>
             </w:r>
           </w:p>
         </w:tc>
@@ -514,7 +752,21 @@
               <w:rPr>
                 <w:rFonts w:ascii="Calibri" w:eastAsia="Calibri" w:hAnsi="Calibri" w:cs="Calibri"/>
               </w:rPr>
-              <w:t>{%tr for rider in additional_riders %}</w:t>
+              <w:t xml:space="preserve">{%tr for rider in </w:t>
+            </w:r>
+            <w:proofErr w:type="spellStart"/>
+            <w:r>
+              <w:rPr>
+                <w:rFonts w:ascii="Calibri" w:eastAsia="Calibri" w:hAnsi="Calibri" w:cs="Calibri"/>
+              </w:rPr>
+              <w:t>additional_riders</w:t>
+            </w:r>
+            <w:proofErr w:type="spellEnd"/>
+            <w:r>
+              <w:rPr>
+                <w:rFonts w:ascii="Calibri" w:eastAsia="Calibri" w:hAnsi="Calibri" w:cs="Calibri"/>
+              </w:rPr>
+              <w:t xml:space="preserve"> %}</w:t>
             </w:r>
           </w:p>
         </w:tc>
@@ -557,11 +809,33 @@
                 <w:rFonts w:ascii="Calibri" w:eastAsia="Calibri" w:hAnsi="Calibri" w:cs="Calibri"/>
               </w:rPr>
             </w:pPr>
-            <w:r>
-              <w:rPr>
-                <w:rFonts w:ascii="Calibri" w:eastAsia="Calibri" w:hAnsi="Calibri" w:cs="Calibri"/>
-              </w:rPr>
-              <w:t>{{ rider.name_full() }}</w:t>
+            <w:proofErr w:type="gramStart"/>
+            <w:r>
+              <w:rPr>
+                <w:rFonts w:ascii="Calibri" w:eastAsia="Calibri" w:hAnsi="Calibri" w:cs="Calibri"/>
+              </w:rPr>
+              <w:t xml:space="preserve">{{ </w:t>
+            </w:r>
+            <w:proofErr w:type="spellStart"/>
+            <w:r>
+              <w:rPr>
+                <w:rFonts w:ascii="Calibri" w:eastAsia="Calibri" w:hAnsi="Calibri" w:cs="Calibri"/>
+              </w:rPr>
+              <w:t>rider.name</w:t>
+            </w:r>
+            <w:proofErr w:type="gramEnd"/>
+            <w:r>
+              <w:rPr>
+                <w:rFonts w:ascii="Calibri" w:eastAsia="Calibri" w:hAnsi="Calibri" w:cs="Calibri"/>
+              </w:rPr>
+              <w:t>_full</w:t>
+            </w:r>
+            <w:proofErr w:type="spellEnd"/>
+            <w:r>
+              <w:rPr>
+                <w:rFonts w:ascii="Calibri" w:eastAsia="Calibri" w:hAnsi="Calibri" w:cs="Calibri"/>
+              </w:rPr>
+              <w:t>() }}</w:t>
             </w:r>
           </w:p>
         </w:tc>
@@ -575,11 +849,33 @@
                 <w:rFonts w:ascii="Calibri" w:eastAsia="Calibri" w:hAnsi="Calibri" w:cs="Calibri"/>
               </w:rPr>
             </w:pPr>
-            <w:r>
-              <w:rPr>
-                <w:rFonts w:ascii="Calibri" w:eastAsia="Calibri" w:hAnsi="Calibri" w:cs="Calibri"/>
-              </w:rPr>
-              <w:t>{{ rider.relationship }}</w:t>
+            <w:proofErr w:type="gramStart"/>
+            <w:r>
+              <w:rPr>
+                <w:rFonts w:ascii="Calibri" w:eastAsia="Calibri" w:hAnsi="Calibri" w:cs="Calibri"/>
+              </w:rPr>
+              <w:t xml:space="preserve">{{ </w:t>
+            </w:r>
+            <w:proofErr w:type="spellStart"/>
+            <w:r>
+              <w:rPr>
+                <w:rFonts w:ascii="Calibri" w:eastAsia="Calibri" w:hAnsi="Calibri" w:cs="Calibri"/>
+              </w:rPr>
+              <w:t>rider</w:t>
+            </w:r>
+            <w:proofErr w:type="gramEnd"/>
+            <w:r>
+              <w:rPr>
+                <w:rFonts w:ascii="Calibri" w:eastAsia="Calibri" w:hAnsi="Calibri" w:cs="Calibri"/>
+              </w:rPr>
+              <w:t>.relationship</w:t>
+            </w:r>
+            <w:proofErr w:type="spellEnd"/>
+            <w:r>
+              <w:rPr>
+                <w:rFonts w:ascii="Calibri" w:eastAsia="Calibri" w:hAnsi="Calibri" w:cs="Calibri"/>
+              </w:rPr>
+              <w:t xml:space="preserve"> }}</w:t>
             </w:r>
           </w:p>
         </w:tc>
@@ -593,11 +889,33 @@
                 <w:rFonts w:ascii="Calibri" w:eastAsia="Arial" w:hAnsi="Calibri" w:cs="Calibri"/>
               </w:rPr>
             </w:pPr>
-            <w:r>
-              <w:rPr>
-                <w:rFonts w:ascii="Calibri" w:eastAsia="Calibri" w:hAnsi="Calibri" w:cs="Calibri"/>
-              </w:rPr>
-              <w:t>{{ rider.a_number }}</w:t>
+            <w:proofErr w:type="gramStart"/>
+            <w:r>
+              <w:rPr>
+                <w:rFonts w:ascii="Calibri" w:eastAsia="Calibri" w:hAnsi="Calibri" w:cs="Calibri"/>
+              </w:rPr>
+              <w:t xml:space="preserve">{{ </w:t>
+            </w:r>
+            <w:proofErr w:type="spellStart"/>
+            <w:r>
+              <w:rPr>
+                <w:rFonts w:ascii="Calibri" w:eastAsia="Calibri" w:hAnsi="Calibri" w:cs="Calibri"/>
+              </w:rPr>
+              <w:t>rider</w:t>
+            </w:r>
+            <w:proofErr w:type="gramEnd"/>
+            <w:r>
+              <w:rPr>
+                <w:rFonts w:ascii="Calibri" w:eastAsia="Calibri" w:hAnsi="Calibri" w:cs="Calibri"/>
+              </w:rPr>
+              <w:t>.a_number</w:t>
+            </w:r>
+            <w:proofErr w:type="spellEnd"/>
+            <w:r>
+              <w:rPr>
+                <w:rFonts w:ascii="Calibri" w:eastAsia="Calibri" w:hAnsi="Calibri" w:cs="Calibri"/>
+              </w:rPr>
+              <w:t xml:space="preserve"> }}</w:t>
             </w:r>
           </w:p>
         </w:tc>
@@ -620,7 +938,21 @@
               <w:rPr>
                 <w:rFonts w:ascii="Calibri" w:eastAsia="Calibri" w:hAnsi="Calibri" w:cs="Calibri"/>
               </w:rPr>
-              <w:t>{%tr endfor %}</w:t>
+              <w:t xml:space="preserve">{%tr </w:t>
+            </w:r>
+            <w:proofErr w:type="spellStart"/>
+            <w:r>
+              <w:rPr>
+                <w:rFonts w:ascii="Calibri" w:eastAsia="Calibri" w:hAnsi="Calibri" w:cs="Calibri"/>
+              </w:rPr>
+              <w:t>endfor</w:t>
+            </w:r>
+            <w:proofErr w:type="spellEnd"/>
+            <w:r>
+              <w:rPr>
+                <w:rFonts w:ascii="Calibri" w:eastAsia="Calibri" w:hAnsi="Calibri" w:cs="Calibri"/>
+              </w:rPr>
+              <w:t xml:space="preserve"> %}</w:t>
             </w:r>
           </w:p>
         </w:tc>
@@ -670,7 +1002,9 @@
         </w:rPr>
         <w:t>{%p endif %}</w:t>
       </w:r>
-      <w:r>
+    </w:p>
+    <w:p>
+      <w:pPr>
         <w:rPr>
           <w:rFonts w:ascii="Calibri" w:eastAsia="Calibri" w:hAnsi="Calibri" w:cs="Calibri"/>
           <w:b/>
@@ -678,8 +1012,7 @@
           <w:sz w:val="22"/>
           <w:szCs w:val="22"/>
         </w:rPr>
-        <w:br/>
-      </w:r>
+      </w:pPr>
     </w:p>
     <w:tbl>
       <w:tblPr>
@@ -764,11 +1097,19 @@
                 <w:rFonts w:ascii="Calibri" w:eastAsia="Calibri" w:hAnsi="Calibri" w:cs="Calibri"/>
               </w:rPr>
             </w:pPr>
-            <w:r>
-              <w:rPr>
-                <w:rFonts w:ascii="Calibri" w:eastAsia="Calibri" w:hAnsi="Calibri" w:cs="Calibri"/>
-              </w:rPr>
-              <w:t>{{ users[</w:t>
+            <w:proofErr w:type="gramStart"/>
+            <w:r>
+              <w:rPr>
+                <w:rFonts w:ascii="Calibri" w:eastAsia="Calibri" w:hAnsi="Calibri" w:cs="Calibri"/>
+              </w:rPr>
+              <w:t>{{ users</w:t>
+            </w:r>
+            <w:proofErr w:type="gramEnd"/>
+            <w:r>
+              <w:rPr>
+                <w:rFonts w:ascii="Calibri" w:eastAsia="Calibri" w:hAnsi="Calibri" w:cs="Calibri"/>
+              </w:rPr>
+              <w:t>[</w:t>
             </w:r>
             <w:r>
               <w:rPr>
@@ -780,7 +1121,21 @@
               <w:rPr>
                 <w:rFonts w:ascii="Calibri" w:eastAsia="Calibri" w:hAnsi="Calibri" w:cs="Calibri"/>
               </w:rPr>
-              <w:t>].name_full() }}</w:t>
+              <w:t>].</w:t>
+            </w:r>
+            <w:proofErr w:type="spellStart"/>
+            <w:r>
+              <w:rPr>
+                <w:rFonts w:ascii="Calibri" w:eastAsia="Calibri" w:hAnsi="Calibri" w:cs="Calibri"/>
+              </w:rPr>
+              <w:t>name_full</w:t>
+            </w:r>
+            <w:proofErr w:type="spellEnd"/>
+            <w:r>
+              <w:rPr>
+                <w:rFonts w:ascii="Calibri" w:eastAsia="Calibri" w:hAnsi="Calibri" w:cs="Calibri"/>
+              </w:rPr>
+              <w:t>() }}</w:t>
             </w:r>
           </w:p>
         </w:tc>
@@ -821,11 +1176,19 @@
                 <w:rFonts w:ascii="Calibri" w:eastAsia="Calibri" w:hAnsi="Calibri" w:cs="Calibri"/>
               </w:rPr>
             </w:pPr>
-            <w:r>
-              <w:rPr>
-                <w:rFonts w:ascii="Calibri" w:eastAsia="Calibri" w:hAnsi="Calibri" w:cs="Calibri"/>
-              </w:rPr>
-              <w:t>{{ users[</w:t>
+            <w:proofErr w:type="gramStart"/>
+            <w:r>
+              <w:rPr>
+                <w:rFonts w:ascii="Calibri" w:eastAsia="Calibri" w:hAnsi="Calibri" w:cs="Calibri"/>
+              </w:rPr>
+              <w:t>{{ users</w:t>
+            </w:r>
+            <w:proofErr w:type="gramEnd"/>
+            <w:r>
+              <w:rPr>
+                <w:rFonts w:ascii="Calibri" w:eastAsia="Calibri" w:hAnsi="Calibri" w:cs="Calibri"/>
+              </w:rPr>
+              <w:t>[</w:t>
             </w:r>
             <w:r>
               <w:rPr>
@@ -837,7 +1200,35 @@
               <w:rPr>
                 <w:rFonts w:ascii="Calibri" w:eastAsia="Calibri" w:hAnsi="Calibri" w:cs="Calibri"/>
               </w:rPr>
-              <w:t>].birthdate.format('MM/dd/yyyy') }}</w:t>
+              <w:t>].</w:t>
+            </w:r>
+            <w:proofErr w:type="spellStart"/>
+            <w:r>
+              <w:rPr>
+                <w:rFonts w:ascii="Calibri" w:eastAsia="Calibri" w:hAnsi="Calibri" w:cs="Calibri"/>
+              </w:rPr>
+              <w:t>birthdate.format</w:t>
+            </w:r>
+            <w:proofErr w:type="spellEnd"/>
+            <w:r>
+              <w:rPr>
+                <w:rFonts w:ascii="Calibri" w:eastAsia="Calibri" w:hAnsi="Calibri" w:cs="Calibri"/>
+              </w:rPr>
+              <w:t>('MM/dd/</w:t>
+            </w:r>
+            <w:proofErr w:type="spellStart"/>
+            <w:r>
+              <w:rPr>
+                <w:rFonts w:ascii="Calibri" w:eastAsia="Calibri" w:hAnsi="Calibri" w:cs="Calibri"/>
+              </w:rPr>
+              <w:t>yyyy</w:t>
+            </w:r>
+            <w:proofErr w:type="spellEnd"/>
+            <w:r>
+              <w:rPr>
+                <w:rFonts w:ascii="Calibri" w:eastAsia="Calibri" w:hAnsi="Calibri" w:cs="Calibri"/>
+              </w:rPr>
+              <w:t>') }}</w:t>
             </w:r>
           </w:p>
         </w:tc>
@@ -880,23 +1271,45 @@
                 <w:bCs/>
               </w:rPr>
             </w:pPr>
+            <w:proofErr w:type="gramStart"/>
             <w:r>
               <w:rPr>
                 <w:rFonts w:ascii="Calibri" w:eastAsia="Arial" w:hAnsi="Calibri" w:cs="Calibri"/>
               </w:rPr>
-              <w:t>{{ users[</w:t>
-            </w:r>
+              <w:t>{{ users</w:t>
+            </w:r>
+            <w:proofErr w:type="gramEnd"/>
             <w:r>
               <w:rPr>
                 <w:rFonts w:ascii="Calibri" w:eastAsia="Arial" w:hAnsi="Calibri" w:cs="Calibri"/>
               </w:rPr>
+              <w:t>[</w:t>
+            </w:r>
+            <w:r>
+              <w:rPr>
+                <w:rFonts w:ascii="Calibri" w:eastAsia="Arial" w:hAnsi="Calibri" w:cs="Calibri"/>
+              </w:rPr>
               <w:t>0</w:t>
             </w:r>
             <w:r>
               <w:rPr>
                 <w:rFonts w:ascii="Calibri" w:eastAsia="Arial" w:hAnsi="Calibri" w:cs="Calibri"/>
               </w:rPr>
-              <w:t>].a_number }}</w:t>
+              <w:t>].</w:t>
+            </w:r>
+            <w:proofErr w:type="spellStart"/>
+            <w:r>
+              <w:rPr>
+                <w:rFonts w:ascii="Calibri" w:eastAsia="Arial" w:hAnsi="Calibri" w:cs="Calibri"/>
+              </w:rPr>
+              <w:t>a_number</w:t>
+            </w:r>
+            <w:proofErr w:type="spellEnd"/>
+            <w:r>
+              <w:rPr>
+                <w:rFonts w:ascii="Calibri" w:eastAsia="Arial" w:hAnsi="Calibri" w:cs="Calibri"/>
+              </w:rPr>
+              <w:t xml:space="preserve"> }}</w:t>
             </w:r>
           </w:p>
         </w:tc>
@@ -937,17 +1350,33 @@
                 <w:rFonts w:ascii="Calibri" w:eastAsia="Calibri" w:hAnsi="Calibri" w:cs="Calibri"/>
               </w:rPr>
             </w:pPr>
+            <w:proofErr w:type="gramStart"/>
             <w:r>
               <w:rPr>
                 <w:rFonts w:ascii="Calibri" w:eastAsia="Calibri" w:hAnsi="Calibri" w:cs="Calibri"/>
               </w:rPr>
               <w:t xml:space="preserve">{{ </w:t>
             </w:r>
-            <w:r>
-              <w:rPr>
-                <w:rFonts w:ascii="Calibri" w:eastAsia="Calibri" w:hAnsi="Calibri" w:cs="Calibri"/>
-              </w:rPr>
-              <w:t>phone_number_formatted(</w:t>
+            <w:proofErr w:type="spellStart"/>
+            <w:r>
+              <w:rPr>
+                <w:rFonts w:ascii="Calibri" w:eastAsia="Calibri" w:hAnsi="Calibri" w:cs="Calibri"/>
+              </w:rPr>
+              <w:t>phone</w:t>
+            </w:r>
+            <w:proofErr w:type="gramEnd"/>
+            <w:r>
+              <w:rPr>
+                <w:rFonts w:ascii="Calibri" w:eastAsia="Calibri" w:hAnsi="Calibri" w:cs="Calibri"/>
+              </w:rPr>
+              <w:t>_number_formatted</w:t>
+            </w:r>
+            <w:proofErr w:type="spellEnd"/>
+            <w:r>
+              <w:rPr>
+                <w:rFonts w:ascii="Calibri" w:eastAsia="Calibri" w:hAnsi="Calibri" w:cs="Calibri"/>
+              </w:rPr>
+              <w:t>(</w:t>
             </w:r>
             <w:r>
               <w:rPr>
@@ -965,8 +1394,16 @@
               <w:rPr>
                 <w:rFonts w:ascii="Calibri" w:eastAsia="Calibri" w:hAnsi="Calibri" w:cs="Calibri"/>
               </w:rPr>
-              <w:t>].phone_number</w:t>
-            </w:r>
+              <w:t>].</w:t>
+            </w:r>
+            <w:proofErr w:type="spellStart"/>
+            <w:r>
+              <w:rPr>
+                <w:rFonts w:ascii="Calibri" w:eastAsia="Calibri" w:hAnsi="Calibri" w:cs="Calibri"/>
+              </w:rPr>
+              <w:t>phone_number</w:t>
+            </w:r>
+            <w:proofErr w:type="spellEnd"/>
             <w:r>
               <w:rPr>
                 <w:rFonts w:ascii="Calibri" w:eastAsia="Calibri" w:hAnsi="Calibri" w:cs="Calibri"/>
@@ -1018,11 +1455,19 @@
                 <w:rFonts w:ascii="Calibri" w:eastAsia="Calibri" w:hAnsi="Calibri" w:cs="Calibri"/>
               </w:rPr>
             </w:pPr>
-            <w:r>
-              <w:rPr>
-                <w:rFonts w:ascii="Calibri" w:eastAsia="Calibri" w:hAnsi="Calibri" w:cs="Calibri"/>
-              </w:rPr>
-              <w:t>{{ users[</w:t>
+            <w:proofErr w:type="gramStart"/>
+            <w:r>
+              <w:rPr>
+                <w:rFonts w:ascii="Calibri" w:eastAsia="Calibri" w:hAnsi="Calibri" w:cs="Calibri"/>
+              </w:rPr>
+              <w:t>{{ users</w:t>
+            </w:r>
+            <w:proofErr w:type="gramEnd"/>
+            <w:r>
+              <w:rPr>
+                <w:rFonts w:ascii="Calibri" w:eastAsia="Calibri" w:hAnsi="Calibri" w:cs="Calibri"/>
+              </w:rPr>
+              <w:t>[</w:t>
             </w:r>
             <w:r>
               <w:rPr>
@@ -1075,11 +1520,19 @@
                 <w:rFonts w:ascii="Calibri" w:eastAsia="Calibri" w:hAnsi="Calibri" w:cs="Calibri"/>
               </w:rPr>
             </w:pPr>
-            <w:r>
-              <w:rPr>
-                <w:rFonts w:ascii="Calibri" w:eastAsia="Calibri" w:hAnsi="Calibri" w:cs="Calibri"/>
-              </w:rPr>
-              <w:t>{{ users[</w:t>
+            <w:proofErr w:type="gramStart"/>
+            <w:r>
+              <w:rPr>
+                <w:rFonts w:ascii="Calibri" w:eastAsia="Calibri" w:hAnsi="Calibri" w:cs="Calibri"/>
+              </w:rPr>
+              <w:t>{{ users</w:t>
+            </w:r>
+            <w:proofErr w:type="gramEnd"/>
+            <w:r>
+              <w:rPr>
+                <w:rFonts w:ascii="Calibri" w:eastAsia="Calibri" w:hAnsi="Calibri" w:cs="Calibri"/>
+              </w:rPr>
+              <w:t>[</w:t>
             </w:r>
             <w:r>
               <w:rPr>
@@ -1091,7 +1544,21 @@
               <w:rPr>
                 <w:rFonts w:ascii="Calibri" w:eastAsia="Calibri" w:hAnsi="Calibri" w:cs="Calibri"/>
               </w:rPr>
-              <w:t>].country_of_birth }}</w:t>
+              <w:t>].</w:t>
+            </w:r>
+            <w:proofErr w:type="spellStart"/>
+            <w:r>
+              <w:rPr>
+                <w:rFonts w:ascii="Calibri" w:eastAsia="Calibri" w:hAnsi="Calibri" w:cs="Calibri"/>
+              </w:rPr>
+              <w:t>country_of_birth</w:t>
+            </w:r>
+            <w:proofErr w:type="spellEnd"/>
+            <w:r>
+              <w:rPr>
+                <w:rFonts w:ascii="Calibri" w:eastAsia="Calibri" w:hAnsi="Calibri" w:cs="Calibri"/>
+              </w:rPr>
+              <w:t xml:space="preserve"> }}</w:t>
             </w:r>
           </w:p>
         </w:tc>
@@ -1132,11 +1599,33 @@
                 <w:rFonts w:ascii="Calibri" w:eastAsia="Calibri" w:hAnsi="Calibri" w:cs="Calibri"/>
               </w:rPr>
             </w:pPr>
-            <w:r>
-              <w:rPr>
-                <w:rFonts w:ascii="Calibri" w:eastAsia="Calibri" w:hAnsi="Calibri" w:cs="Calibri"/>
-              </w:rPr>
-              <w:t>{{ comma_list(</w:t>
+            <w:proofErr w:type="gramStart"/>
+            <w:r>
+              <w:rPr>
+                <w:rFonts w:ascii="Calibri" w:eastAsia="Calibri" w:hAnsi="Calibri" w:cs="Calibri"/>
+              </w:rPr>
+              <w:t xml:space="preserve">{{ </w:t>
+            </w:r>
+            <w:proofErr w:type="spellStart"/>
+            <w:r>
+              <w:rPr>
+                <w:rFonts w:ascii="Calibri" w:eastAsia="Calibri" w:hAnsi="Calibri" w:cs="Calibri"/>
+              </w:rPr>
+              <w:t>comma</w:t>
+            </w:r>
+            <w:proofErr w:type="gramEnd"/>
+            <w:r>
+              <w:rPr>
+                <w:rFonts w:ascii="Calibri" w:eastAsia="Calibri" w:hAnsi="Calibri" w:cs="Calibri"/>
+              </w:rPr>
+              <w:t>_list</w:t>
+            </w:r>
+            <w:proofErr w:type="spellEnd"/>
+            <w:r>
+              <w:rPr>
+                <w:rFonts w:ascii="Calibri" w:eastAsia="Calibri" w:hAnsi="Calibri" w:cs="Calibri"/>
+              </w:rPr>
+              <w:t>(</w:t>
             </w:r>
             <w:r>
               <w:rPr>
@@ -1162,6 +1651,7 @@
               </w:rPr>
               <w:t>].</w:t>
             </w:r>
+            <w:proofErr w:type="spellStart"/>
             <w:r>
               <w:rPr>
                 <w:rFonts w:ascii="Calibri" w:eastAsia="Calibri" w:hAnsi="Calibri" w:cs="Calibri"/>
@@ -1174,11 +1664,26 @@
               </w:rPr>
               <w:t>_of_citizenship</w:t>
             </w:r>
-            <w:r>
-              <w:rPr>
-                <w:rFonts w:ascii="Calibri" w:eastAsia="Calibri" w:hAnsi="Calibri" w:cs="Calibri"/>
-              </w:rPr>
-              <w:t>, users[0].additional_citizenship]</w:t>
+            <w:proofErr w:type="spellEnd"/>
+            <w:r>
+              <w:rPr>
+                <w:rFonts w:ascii="Calibri" w:eastAsia="Calibri" w:hAnsi="Calibri" w:cs="Calibri"/>
+              </w:rPr>
+              <w:t>, users[0].</w:t>
+            </w:r>
+            <w:proofErr w:type="spellStart"/>
+            <w:r>
+              <w:rPr>
+                <w:rFonts w:ascii="Calibri" w:eastAsia="Calibri" w:hAnsi="Calibri" w:cs="Calibri"/>
+              </w:rPr>
+              <w:t>additional_citizenship</w:t>
+            </w:r>
+            <w:proofErr w:type="spellEnd"/>
+            <w:r>
+              <w:rPr>
+                <w:rFonts w:ascii="Calibri" w:eastAsia="Calibri" w:hAnsi="Calibri" w:cs="Calibri"/>
+              </w:rPr>
+              <w:t>]</w:t>
             </w:r>
           </w:p>
           <w:p>
@@ -1233,11 +1738,33 @@
                 <w:rFonts w:ascii="Calibri" w:eastAsia="Calibri" w:hAnsi="Calibri" w:cs="Calibri"/>
               </w:rPr>
             </w:pPr>
-            <w:r>
-              <w:rPr>
-                <w:rFonts w:ascii="Calibri" w:hAnsi="Calibri" w:cs="Calibri"/>
-              </w:rPr>
-              <w:t>{{ output_checkbox(users[</w:t>
+            <w:proofErr w:type="gramStart"/>
+            <w:r>
+              <w:rPr>
+                <w:rFonts w:ascii="Calibri" w:hAnsi="Calibri" w:cs="Calibri"/>
+              </w:rPr>
+              <w:t xml:space="preserve">{{ </w:t>
+            </w:r>
+            <w:proofErr w:type="spellStart"/>
+            <w:r>
+              <w:rPr>
+                <w:rFonts w:ascii="Calibri" w:hAnsi="Calibri" w:cs="Calibri"/>
+              </w:rPr>
+              <w:t>output</w:t>
+            </w:r>
+            <w:proofErr w:type="gramEnd"/>
+            <w:r>
+              <w:rPr>
+                <w:rFonts w:ascii="Calibri" w:hAnsi="Calibri" w:cs="Calibri"/>
+              </w:rPr>
+              <w:t>_checkbox</w:t>
+            </w:r>
+            <w:proofErr w:type="spellEnd"/>
+            <w:r>
+              <w:rPr>
+                <w:rFonts w:ascii="Calibri" w:hAnsi="Calibri" w:cs="Calibri"/>
+              </w:rPr>
+              <w:t>(users[</w:t>
             </w:r>
             <w:r>
               <w:rPr>
@@ -1251,12 +1778,14 @@
               </w:rPr>
               <w:t>].</w:t>
             </w:r>
+            <w:proofErr w:type="spellStart"/>
             <w:r>
               <w:rPr>
                 <w:rFonts w:ascii="Calibri" w:hAnsi="Calibri" w:cs="Calibri"/>
               </w:rPr>
               <w:t>fotc_first_hearing</w:t>
             </w:r>
+            <w:proofErr w:type="spellEnd"/>
             <w:r>
               <w:rPr>
                 <w:rFonts w:ascii="Calibri" w:hAnsi="Calibri" w:cs="Calibri"/>
@@ -1277,11 +1806,33 @@
                 <w:rFonts w:ascii="Calibri" w:hAnsi="Calibri" w:cs="Calibri"/>
               </w:rPr>
             </w:pPr>
-            <w:r>
-              <w:rPr>
-                <w:rFonts w:ascii="Calibri" w:hAnsi="Calibri" w:cs="Calibri"/>
-              </w:rPr>
-              <w:t>{{ output_checkbox(not users[</w:t>
+            <w:proofErr w:type="gramStart"/>
+            <w:r>
+              <w:rPr>
+                <w:rFonts w:ascii="Calibri" w:hAnsi="Calibri" w:cs="Calibri"/>
+              </w:rPr>
+              <w:t xml:space="preserve">{{ </w:t>
+            </w:r>
+            <w:proofErr w:type="spellStart"/>
+            <w:r>
+              <w:rPr>
+                <w:rFonts w:ascii="Calibri" w:hAnsi="Calibri" w:cs="Calibri"/>
+              </w:rPr>
+              <w:t>output</w:t>
+            </w:r>
+            <w:proofErr w:type="gramEnd"/>
+            <w:r>
+              <w:rPr>
+                <w:rFonts w:ascii="Calibri" w:hAnsi="Calibri" w:cs="Calibri"/>
+              </w:rPr>
+              <w:t>_checkbox</w:t>
+            </w:r>
+            <w:proofErr w:type="spellEnd"/>
+            <w:r>
+              <w:rPr>
+                <w:rFonts w:ascii="Calibri" w:hAnsi="Calibri" w:cs="Calibri"/>
+              </w:rPr>
+              <w:t>(not users[</w:t>
             </w:r>
             <w:r>
               <w:rPr>
@@ -1295,12 +1846,14 @@
               </w:rPr>
               <w:t>].</w:t>
             </w:r>
+            <w:proofErr w:type="spellStart"/>
             <w:r>
               <w:rPr>
                 <w:rFonts w:ascii="Calibri" w:hAnsi="Calibri" w:cs="Calibri"/>
               </w:rPr>
               <w:t>fotc_first_hearing</w:t>
             </w:r>
+            <w:proofErr w:type="spellEnd"/>
             <w:r>
               <w:rPr>
                 <w:rFonts w:ascii="Calibri" w:hAnsi="Calibri" w:cs="Calibri"/>
@@ -1331,6 +1884,7 @@
               </w:rPr>
               <w:t>.</w:t>
             </w:r>
+            <w:proofErr w:type="spellStart"/>
             <w:r>
               <w:rPr>
                 <w:rFonts w:ascii="Calibri" w:hAnsi="Calibri" w:cs="Calibri"/>
@@ -1341,7 +1895,28 @@
               <w:rPr>
                 <w:rFonts w:ascii="Calibri" w:hAnsi="Calibri" w:cs="Calibri"/>
               </w:rPr>
-              <w:t>.format(“MM/dd/yyyy”) }}</w:t>
+              <w:t>.format</w:t>
+            </w:r>
+            <w:proofErr w:type="spellEnd"/>
+            <w:r>
+              <w:rPr>
+                <w:rFonts w:ascii="Calibri" w:hAnsi="Calibri" w:cs="Calibri"/>
+              </w:rPr>
+              <w:t>(“MM/dd/</w:t>
+            </w:r>
+            <w:proofErr w:type="spellStart"/>
+            <w:r>
+              <w:rPr>
+                <w:rFonts w:ascii="Calibri" w:hAnsi="Calibri" w:cs="Calibri"/>
+              </w:rPr>
+              <w:t>yyyy</w:t>
+            </w:r>
+            <w:proofErr w:type="spellEnd"/>
+            <w:r>
+              <w:rPr>
+                <w:rFonts w:ascii="Calibri" w:hAnsi="Calibri" w:cs="Calibri"/>
+              </w:rPr>
+              <w:t>”) }}</w:t>
             </w:r>
           </w:p>
         </w:tc>
@@ -1397,11 +1972,19 @@
                 <w:rFonts w:ascii="Calibri" w:hAnsi="Calibri" w:cs="Calibri"/>
               </w:rPr>
             </w:pPr>
-            <w:r>
-              <w:rPr>
-                <w:rFonts w:ascii="Calibri" w:hAnsi="Calibri" w:cs="Calibri"/>
-              </w:rPr>
-              <w:t>{{ users[</w:t>
+            <w:proofErr w:type="gramStart"/>
+            <w:r>
+              <w:rPr>
+                <w:rFonts w:ascii="Calibri" w:hAnsi="Calibri" w:cs="Calibri"/>
+              </w:rPr>
+              <w:t>{{ users</w:t>
+            </w:r>
+            <w:proofErr w:type="gramEnd"/>
+            <w:r>
+              <w:rPr>
+                <w:rFonts w:ascii="Calibri" w:hAnsi="Calibri" w:cs="Calibri"/>
+              </w:rPr>
+              <w:t>[</w:t>
             </w:r>
             <w:r>
               <w:rPr>
@@ -1415,11 +1998,19 @@
               </w:rPr>
               <w:t>].</w:t>
             </w:r>
-            <w:r>
-              <w:rPr>
-                <w:rFonts w:ascii="Calibri" w:hAnsi="Calibri" w:cs="Calibri"/>
-              </w:rPr>
-              <w:t xml:space="preserve">fotc_prior_hearing_details </w:t>
+            <w:proofErr w:type="spellStart"/>
+            <w:r>
+              <w:rPr>
+                <w:rFonts w:ascii="Calibri" w:hAnsi="Calibri" w:cs="Calibri"/>
+              </w:rPr>
+              <w:t>fotc_prior_hearing_details</w:t>
+            </w:r>
+            <w:proofErr w:type="spellEnd"/>
+            <w:r>
+              <w:rPr>
+                <w:rFonts w:ascii="Calibri" w:hAnsi="Calibri" w:cs="Calibri"/>
+              </w:rPr>
+              <w:t xml:space="preserve"> </w:t>
             </w:r>
             <w:r>
               <w:rPr>
@@ -1528,11 +2119,33 @@
                 <w:rFonts w:ascii="Calibri" w:hAnsi="Calibri" w:cs="Calibri"/>
               </w:rPr>
             </w:pPr>
-            <w:r>
-              <w:rPr>
-                <w:rFonts w:ascii="Calibri" w:hAnsi="Calibri" w:cs="Calibri"/>
-              </w:rPr>
-              <w:t>{{ output_checkbox(</w:t>
+            <w:proofErr w:type="gramStart"/>
+            <w:r>
+              <w:rPr>
+                <w:rFonts w:ascii="Calibri" w:hAnsi="Calibri" w:cs="Calibri"/>
+              </w:rPr>
+              <w:t xml:space="preserve">{{ </w:t>
+            </w:r>
+            <w:proofErr w:type="spellStart"/>
+            <w:r>
+              <w:rPr>
+                <w:rFonts w:ascii="Calibri" w:hAnsi="Calibri" w:cs="Calibri"/>
+              </w:rPr>
+              <w:t>output</w:t>
+            </w:r>
+            <w:proofErr w:type="gramEnd"/>
+            <w:r>
+              <w:rPr>
+                <w:rFonts w:ascii="Calibri" w:hAnsi="Calibri" w:cs="Calibri"/>
+              </w:rPr>
+              <w:t>_checkbox</w:t>
+            </w:r>
+            <w:proofErr w:type="spellEnd"/>
+            <w:r>
+              <w:rPr>
+                <w:rFonts w:ascii="Calibri" w:hAnsi="Calibri" w:cs="Calibri"/>
+              </w:rPr>
+              <w:t>(</w:t>
             </w:r>
             <w:r>
               <w:rPr>
@@ -1544,7 +2157,21 @@
               <w:rPr>
                 <w:rFonts w:ascii="Calibri" w:hAnsi="Calibri" w:cs="Calibri"/>
               </w:rPr>
-              <w:t xml:space="preserve">.notice_to_appear) }} </w:t>
+              <w:t>.</w:t>
+            </w:r>
+            <w:proofErr w:type="spellStart"/>
+            <w:r>
+              <w:rPr>
+                <w:rFonts w:ascii="Calibri" w:hAnsi="Calibri" w:cs="Calibri"/>
+              </w:rPr>
+              <w:t>notice_to_appear</w:t>
+            </w:r>
+            <w:proofErr w:type="spellEnd"/>
+            <w:r>
+              <w:rPr>
+                <w:rFonts w:ascii="Calibri" w:hAnsi="Calibri" w:cs="Calibri"/>
+              </w:rPr>
+              <w:t xml:space="preserve">) }} </w:t>
             </w:r>
             <w:r>
               <w:rPr>
@@ -1560,11 +2187,33 @@
                 <w:rFonts w:ascii="Calibri" w:hAnsi="Calibri" w:cs="Calibri"/>
               </w:rPr>
             </w:pPr>
-            <w:r>
-              <w:rPr>
-                <w:rFonts w:ascii="Calibri" w:hAnsi="Calibri" w:cs="Calibri"/>
-              </w:rPr>
-              <w:t xml:space="preserve">{{ output_checkbox(not </w:t>
+            <w:proofErr w:type="gramStart"/>
+            <w:r>
+              <w:rPr>
+                <w:rFonts w:ascii="Calibri" w:hAnsi="Calibri" w:cs="Calibri"/>
+              </w:rPr>
+              <w:t xml:space="preserve">{{ </w:t>
+            </w:r>
+            <w:proofErr w:type="spellStart"/>
+            <w:r>
+              <w:rPr>
+                <w:rFonts w:ascii="Calibri" w:hAnsi="Calibri" w:cs="Calibri"/>
+              </w:rPr>
+              <w:t>output</w:t>
+            </w:r>
+            <w:proofErr w:type="gramEnd"/>
+            <w:r>
+              <w:rPr>
+                <w:rFonts w:ascii="Calibri" w:hAnsi="Calibri" w:cs="Calibri"/>
+              </w:rPr>
+              <w:t>_checkbox</w:t>
+            </w:r>
+            <w:proofErr w:type="spellEnd"/>
+            <w:r>
+              <w:rPr>
+                <w:rFonts w:ascii="Calibri" w:hAnsi="Calibri" w:cs="Calibri"/>
+              </w:rPr>
+              <w:t xml:space="preserve">(not </w:t>
             </w:r>
             <w:r>
               <w:rPr>
@@ -1576,7 +2225,21 @@
               <w:rPr>
                 <w:rFonts w:ascii="Calibri" w:hAnsi="Calibri" w:cs="Calibri"/>
               </w:rPr>
-              <w:t xml:space="preserve">.notice_to_appear) }} </w:t>
+              <w:t>.</w:t>
+            </w:r>
+            <w:proofErr w:type="spellStart"/>
+            <w:r>
+              <w:rPr>
+                <w:rFonts w:ascii="Calibri" w:hAnsi="Calibri" w:cs="Calibri"/>
+              </w:rPr>
+              <w:t>notice_to_appear</w:t>
+            </w:r>
+            <w:proofErr w:type="spellEnd"/>
+            <w:r>
+              <w:rPr>
+                <w:rFonts w:ascii="Calibri" w:hAnsi="Calibri" w:cs="Calibri"/>
+              </w:rPr>
+              <w:t xml:space="preserve">) }} </w:t>
             </w:r>
             <w:r>
               <w:rPr>
@@ -1609,6 +2272,7 @@
               <w:rPr>
                 <w:rFonts w:ascii="Calibri" w:eastAsia="Calibri" w:hAnsi="Calibri" w:cs="Calibri"/>
               </w:rPr>
+              <w:lastRenderedPageBreak/>
               <w:t>Is your name correct on the NTA?</w:t>
             </w:r>
           </w:p>
@@ -1624,11 +2288,33 @@
                 <w:rFonts w:ascii="Calibri" w:hAnsi="Calibri" w:cs="Calibri"/>
               </w:rPr>
             </w:pPr>
-            <w:r>
-              <w:rPr>
-                <w:rFonts w:ascii="Calibri" w:hAnsi="Calibri" w:cs="Calibri"/>
-              </w:rPr>
-              <w:t>{{ output_checkbox(</w:t>
+            <w:proofErr w:type="gramStart"/>
+            <w:r>
+              <w:rPr>
+                <w:rFonts w:ascii="Calibri" w:hAnsi="Calibri" w:cs="Calibri"/>
+              </w:rPr>
+              <w:t xml:space="preserve">{{ </w:t>
+            </w:r>
+            <w:proofErr w:type="spellStart"/>
+            <w:r>
+              <w:rPr>
+                <w:rFonts w:ascii="Calibri" w:hAnsi="Calibri" w:cs="Calibri"/>
+              </w:rPr>
+              <w:t>output</w:t>
+            </w:r>
+            <w:proofErr w:type="gramEnd"/>
+            <w:r>
+              <w:rPr>
+                <w:rFonts w:ascii="Calibri" w:hAnsi="Calibri" w:cs="Calibri"/>
+              </w:rPr>
+              <w:t>_checkbox</w:t>
+            </w:r>
+            <w:proofErr w:type="spellEnd"/>
+            <w:r>
+              <w:rPr>
+                <w:rFonts w:ascii="Calibri" w:hAnsi="Calibri" w:cs="Calibri"/>
+              </w:rPr>
+              <w:t>(</w:t>
             </w:r>
             <w:r>
               <w:rPr>
@@ -1642,12 +2328,14 @@
               </w:rPr>
               <w:t>.</w:t>
             </w:r>
+            <w:proofErr w:type="spellStart"/>
             <w:r>
               <w:rPr>
                 <w:rFonts w:ascii="Calibri" w:hAnsi="Calibri" w:cs="Calibri"/>
               </w:rPr>
               <w:t>notice_name</w:t>
             </w:r>
+            <w:proofErr w:type="spellEnd"/>
             <w:r>
               <w:rPr>
                 <w:rFonts w:ascii="Calibri" w:hAnsi="Calibri" w:cs="Calibri"/>
@@ -1668,12 +2356,33 @@
                 <w:rFonts w:ascii="Calibri" w:hAnsi="Calibri" w:cs="Calibri"/>
               </w:rPr>
             </w:pPr>
-            <w:r>
-              <w:rPr>
-                <w:rFonts w:ascii="Calibri" w:hAnsi="Calibri" w:cs="Calibri"/>
-              </w:rPr>
-              <w:lastRenderedPageBreak/>
-              <w:t xml:space="preserve">{{ output_checkbox(not </w:t>
+            <w:proofErr w:type="gramStart"/>
+            <w:r>
+              <w:rPr>
+                <w:rFonts w:ascii="Calibri" w:hAnsi="Calibri" w:cs="Calibri"/>
+              </w:rPr>
+              <w:t xml:space="preserve">{{ </w:t>
+            </w:r>
+            <w:proofErr w:type="spellStart"/>
+            <w:r>
+              <w:rPr>
+                <w:rFonts w:ascii="Calibri" w:hAnsi="Calibri" w:cs="Calibri"/>
+              </w:rPr>
+              <w:t>output</w:t>
+            </w:r>
+            <w:proofErr w:type="gramEnd"/>
+            <w:r>
+              <w:rPr>
+                <w:rFonts w:ascii="Calibri" w:hAnsi="Calibri" w:cs="Calibri"/>
+              </w:rPr>
+              <w:t>_checkbox</w:t>
+            </w:r>
+            <w:proofErr w:type="spellEnd"/>
+            <w:r>
+              <w:rPr>
+                <w:rFonts w:ascii="Calibri" w:hAnsi="Calibri" w:cs="Calibri"/>
+              </w:rPr>
+              <w:t xml:space="preserve">(not </w:t>
             </w:r>
             <w:r>
               <w:rPr>
@@ -1687,12 +2396,14 @@
               </w:rPr>
               <w:t>.</w:t>
             </w:r>
+            <w:proofErr w:type="spellStart"/>
             <w:r>
               <w:rPr>
                 <w:rFonts w:ascii="Calibri" w:hAnsi="Calibri" w:cs="Calibri"/>
               </w:rPr>
               <w:t>notice_name</w:t>
             </w:r>
+            <w:proofErr w:type="spellEnd"/>
             <w:r>
               <w:rPr>
                 <w:rFonts w:ascii="Calibri" w:hAnsi="Calibri" w:cs="Calibri"/>
@@ -1730,7 +2441,6 @@
               <w:rPr>
                 <w:rFonts w:ascii="Calibri" w:eastAsia="Calibri" w:hAnsi="Calibri" w:cs="Calibri"/>
               </w:rPr>
-              <w:lastRenderedPageBreak/>
               <w:t>Is your date of birth correct on the NTA?</w:t>
             </w:r>
           </w:p>
@@ -1746,11 +2456,33 @@
                 <w:rFonts w:ascii="Calibri" w:hAnsi="Calibri" w:cs="Calibri"/>
               </w:rPr>
             </w:pPr>
-            <w:r>
-              <w:rPr>
-                <w:rFonts w:ascii="Calibri" w:hAnsi="Calibri" w:cs="Calibri"/>
-              </w:rPr>
-              <w:t>{{ output_checkbox(</w:t>
+            <w:proofErr w:type="gramStart"/>
+            <w:r>
+              <w:rPr>
+                <w:rFonts w:ascii="Calibri" w:hAnsi="Calibri" w:cs="Calibri"/>
+              </w:rPr>
+              <w:t xml:space="preserve">{{ </w:t>
+            </w:r>
+            <w:proofErr w:type="spellStart"/>
+            <w:r>
+              <w:rPr>
+                <w:rFonts w:ascii="Calibri" w:hAnsi="Calibri" w:cs="Calibri"/>
+              </w:rPr>
+              <w:t>output</w:t>
+            </w:r>
+            <w:proofErr w:type="gramEnd"/>
+            <w:r>
+              <w:rPr>
+                <w:rFonts w:ascii="Calibri" w:hAnsi="Calibri" w:cs="Calibri"/>
+              </w:rPr>
+              <w:t>_checkbox</w:t>
+            </w:r>
+            <w:proofErr w:type="spellEnd"/>
+            <w:r>
+              <w:rPr>
+                <w:rFonts w:ascii="Calibri" w:hAnsi="Calibri" w:cs="Calibri"/>
+              </w:rPr>
+              <w:t>(</w:t>
             </w:r>
             <w:r>
               <w:rPr>
@@ -1762,7 +2494,21 @@
               <w:rPr>
                 <w:rFonts w:ascii="Calibri" w:hAnsi="Calibri" w:cs="Calibri"/>
               </w:rPr>
-              <w:t xml:space="preserve">.notice_dob) }} </w:t>
+              <w:t>.</w:t>
+            </w:r>
+            <w:proofErr w:type="spellStart"/>
+            <w:r>
+              <w:rPr>
+                <w:rFonts w:ascii="Calibri" w:hAnsi="Calibri" w:cs="Calibri"/>
+              </w:rPr>
+              <w:t>notice_dob</w:t>
+            </w:r>
+            <w:proofErr w:type="spellEnd"/>
+            <w:r>
+              <w:rPr>
+                <w:rFonts w:ascii="Calibri" w:hAnsi="Calibri" w:cs="Calibri"/>
+              </w:rPr>
+              <w:t xml:space="preserve">) }} </w:t>
             </w:r>
             <w:r>
               <w:rPr>
@@ -1778,11 +2524,33 @@
                 <w:rFonts w:ascii="Calibri" w:hAnsi="Calibri" w:cs="Calibri"/>
               </w:rPr>
             </w:pPr>
-            <w:r>
-              <w:rPr>
-                <w:rFonts w:ascii="Calibri" w:hAnsi="Calibri" w:cs="Calibri"/>
-              </w:rPr>
-              <w:t xml:space="preserve">{{ output_checkbox(not </w:t>
+            <w:proofErr w:type="gramStart"/>
+            <w:r>
+              <w:rPr>
+                <w:rFonts w:ascii="Calibri" w:hAnsi="Calibri" w:cs="Calibri"/>
+              </w:rPr>
+              <w:t xml:space="preserve">{{ </w:t>
+            </w:r>
+            <w:proofErr w:type="spellStart"/>
+            <w:r>
+              <w:rPr>
+                <w:rFonts w:ascii="Calibri" w:hAnsi="Calibri" w:cs="Calibri"/>
+              </w:rPr>
+              <w:t>output</w:t>
+            </w:r>
+            <w:proofErr w:type="gramEnd"/>
+            <w:r>
+              <w:rPr>
+                <w:rFonts w:ascii="Calibri" w:hAnsi="Calibri" w:cs="Calibri"/>
+              </w:rPr>
+              <w:t>_checkbox</w:t>
+            </w:r>
+            <w:proofErr w:type="spellEnd"/>
+            <w:r>
+              <w:rPr>
+                <w:rFonts w:ascii="Calibri" w:hAnsi="Calibri" w:cs="Calibri"/>
+              </w:rPr>
+              <w:t xml:space="preserve">(not </w:t>
             </w:r>
             <w:r>
               <w:rPr>
@@ -1794,7 +2562,21 @@
               <w:rPr>
                 <w:rFonts w:ascii="Calibri" w:hAnsi="Calibri" w:cs="Calibri"/>
               </w:rPr>
-              <w:t xml:space="preserve">.notice_dob) }} </w:t>
+              <w:t>.</w:t>
+            </w:r>
+            <w:proofErr w:type="spellStart"/>
+            <w:r>
+              <w:rPr>
+                <w:rFonts w:ascii="Calibri" w:hAnsi="Calibri" w:cs="Calibri"/>
+              </w:rPr>
+              <w:t>notice_dob</w:t>
+            </w:r>
+            <w:proofErr w:type="spellEnd"/>
+            <w:r>
+              <w:rPr>
+                <w:rFonts w:ascii="Calibri" w:hAnsi="Calibri" w:cs="Calibri"/>
+              </w:rPr>
+              <w:t xml:space="preserve">) }} </w:t>
             </w:r>
             <w:r>
               <w:rPr>
@@ -1827,7 +2609,21 @@
               <w:rPr>
                 <w:rFonts w:ascii="Calibri" w:eastAsia="Calibri" w:hAnsi="Calibri" w:cs="Calibri"/>
               </w:rPr>
-              <w:t>Are all of the allegations in the NTA true?</w:t>
+              <w:t xml:space="preserve">Are </w:t>
+            </w:r>
+            <w:proofErr w:type="gramStart"/>
+            <w:r>
+              <w:rPr>
+                <w:rFonts w:ascii="Calibri" w:eastAsia="Calibri" w:hAnsi="Calibri" w:cs="Calibri"/>
+              </w:rPr>
+              <w:t>all of</w:t>
+            </w:r>
+            <w:proofErr w:type="gramEnd"/>
+            <w:r>
+              <w:rPr>
+                <w:rFonts w:ascii="Calibri" w:eastAsia="Calibri" w:hAnsi="Calibri" w:cs="Calibri"/>
+              </w:rPr>
+              <w:t xml:space="preserve"> the allegations in the NTA true?</w:t>
             </w:r>
           </w:p>
         </w:tc>
@@ -1842,11 +2638,33 @@
                 <w:rFonts w:ascii="Calibri" w:hAnsi="Calibri" w:cs="Calibri"/>
               </w:rPr>
             </w:pPr>
-            <w:r>
-              <w:rPr>
-                <w:rFonts w:ascii="Calibri" w:hAnsi="Calibri" w:cs="Calibri"/>
-              </w:rPr>
-              <w:t>{{ output_checkbox(</w:t>
+            <w:proofErr w:type="gramStart"/>
+            <w:r>
+              <w:rPr>
+                <w:rFonts w:ascii="Calibri" w:hAnsi="Calibri" w:cs="Calibri"/>
+              </w:rPr>
+              <w:t xml:space="preserve">{{ </w:t>
+            </w:r>
+            <w:proofErr w:type="spellStart"/>
+            <w:r>
+              <w:rPr>
+                <w:rFonts w:ascii="Calibri" w:hAnsi="Calibri" w:cs="Calibri"/>
+              </w:rPr>
+              <w:t>output</w:t>
+            </w:r>
+            <w:proofErr w:type="gramEnd"/>
+            <w:r>
+              <w:rPr>
+                <w:rFonts w:ascii="Calibri" w:hAnsi="Calibri" w:cs="Calibri"/>
+              </w:rPr>
+              <w:t>_checkbox</w:t>
+            </w:r>
+            <w:proofErr w:type="spellEnd"/>
+            <w:r>
+              <w:rPr>
+                <w:rFonts w:ascii="Calibri" w:hAnsi="Calibri" w:cs="Calibri"/>
+              </w:rPr>
+              <w:t>(</w:t>
             </w:r>
             <w:r>
               <w:rPr>
@@ -1858,7 +2676,14 @@
               <w:rPr>
                 <w:rFonts w:ascii="Calibri" w:hAnsi="Calibri" w:cs="Calibri"/>
               </w:rPr>
-              <w:t>.notice_</w:t>
+              <w:t>.</w:t>
+            </w:r>
+            <w:proofErr w:type="spellStart"/>
+            <w:r>
+              <w:rPr>
+                <w:rFonts w:ascii="Calibri" w:hAnsi="Calibri" w:cs="Calibri"/>
+              </w:rPr>
+              <w:t>notice_</w:t>
             </w:r>
             <w:r>
               <w:rPr>
@@ -1866,6 +2691,7 @@
               </w:rPr>
               <w:t>allegations</w:t>
             </w:r>
+            <w:proofErr w:type="spellEnd"/>
             <w:r>
               <w:rPr>
                 <w:rFonts w:ascii="Calibri" w:hAnsi="Calibri" w:cs="Calibri"/>
@@ -1886,11 +2712,33 @@
                 <w:rFonts w:ascii="Calibri" w:hAnsi="Calibri" w:cs="Calibri"/>
               </w:rPr>
             </w:pPr>
-            <w:r>
-              <w:rPr>
-                <w:rFonts w:ascii="Calibri" w:hAnsi="Calibri" w:cs="Calibri"/>
-              </w:rPr>
-              <w:t>{{ output_checkbox(</w:t>
+            <w:proofErr w:type="gramStart"/>
+            <w:r>
+              <w:rPr>
+                <w:rFonts w:ascii="Calibri" w:hAnsi="Calibri" w:cs="Calibri"/>
+              </w:rPr>
+              <w:t xml:space="preserve">{{ </w:t>
+            </w:r>
+            <w:proofErr w:type="spellStart"/>
+            <w:r>
+              <w:rPr>
+                <w:rFonts w:ascii="Calibri" w:hAnsi="Calibri" w:cs="Calibri"/>
+              </w:rPr>
+              <w:t>output</w:t>
+            </w:r>
+            <w:proofErr w:type="gramEnd"/>
+            <w:r>
+              <w:rPr>
+                <w:rFonts w:ascii="Calibri" w:hAnsi="Calibri" w:cs="Calibri"/>
+              </w:rPr>
+              <w:t>_checkbox</w:t>
+            </w:r>
+            <w:proofErr w:type="spellEnd"/>
+            <w:r>
+              <w:rPr>
+                <w:rFonts w:ascii="Calibri" w:hAnsi="Calibri" w:cs="Calibri"/>
+              </w:rPr>
+              <w:t>(</w:t>
             </w:r>
             <w:r>
               <w:rPr>
@@ -1908,7 +2756,14 @@
               <w:rPr>
                 <w:rFonts w:ascii="Calibri" w:hAnsi="Calibri" w:cs="Calibri"/>
               </w:rPr>
-              <w:t>.notice_</w:t>
+              <w:t>.</w:t>
+            </w:r>
+            <w:proofErr w:type="spellStart"/>
+            <w:r>
+              <w:rPr>
+                <w:rFonts w:ascii="Calibri" w:hAnsi="Calibri" w:cs="Calibri"/>
+              </w:rPr>
+              <w:t>notice_</w:t>
             </w:r>
             <w:r>
               <w:rPr>
@@ -1916,6 +2771,7 @@
               </w:rPr>
               <w:t>allegations</w:t>
             </w:r>
+            <w:proofErr w:type="spellEnd"/>
             <w:r>
               <w:rPr>
                 <w:rFonts w:ascii="Calibri" w:hAnsi="Calibri" w:cs="Calibri"/>
@@ -1948,6 +2804,40 @@
               </w:rPr>
               <w:t xml:space="preserve">{% if not </w:t>
             </w:r>
+            <w:proofErr w:type="gramStart"/>
+            <w:r>
+              <w:rPr>
+                <w:rFonts w:ascii="Calibri" w:hAnsi="Calibri" w:cs="Calibri"/>
+              </w:rPr>
+              <w:t>users[</w:t>
+            </w:r>
+            <w:proofErr w:type="gramEnd"/>
+            <w:r>
+              <w:rPr>
+                <w:rFonts w:ascii="Calibri" w:hAnsi="Calibri" w:cs="Calibri"/>
+              </w:rPr>
+              <w:t>0]</w:t>
+            </w:r>
+            <w:r>
+              <w:rPr>
+                <w:rFonts w:ascii="Calibri" w:hAnsi="Calibri" w:cs="Calibri"/>
+              </w:rPr>
+              <w:t>.</w:t>
+            </w:r>
+            <w:proofErr w:type="spellStart"/>
+            <w:r>
+              <w:rPr>
+                <w:rFonts w:ascii="Calibri" w:hAnsi="Calibri" w:cs="Calibri"/>
+              </w:rPr>
+              <w:t>notice_allegations</w:t>
+            </w:r>
+            <w:proofErr w:type="spellEnd"/>
+            <w:r>
+              <w:rPr>
+                <w:rFonts w:ascii="Calibri" w:hAnsi="Calibri" w:cs="Calibri"/>
+              </w:rPr>
+              <w:t xml:space="preserve"> %}{{ </w:t>
+            </w:r>
             <w:r>
               <w:rPr>
                 <w:rFonts w:ascii="Calibri" w:hAnsi="Calibri" w:cs="Calibri"/>
@@ -1958,19 +2848,21 @@
               <w:rPr>
                 <w:rFonts w:ascii="Calibri" w:hAnsi="Calibri" w:cs="Calibri"/>
               </w:rPr>
-              <w:t xml:space="preserve">.notice_allegations %}{{ </w:t>
-            </w:r>
-            <w:r>
-              <w:rPr>
-                <w:rFonts w:ascii="Calibri" w:hAnsi="Calibri" w:cs="Calibri"/>
-              </w:rPr>
-              <w:t>users[0]</w:t>
-            </w:r>
-            <w:r>
-              <w:rPr>
-                <w:rFonts w:ascii="Calibri" w:hAnsi="Calibri" w:cs="Calibri"/>
-              </w:rPr>
-              <w:t>.notice_allegations_details }}{% endif %}</w:t>
+              <w:t>.</w:t>
+            </w:r>
+            <w:proofErr w:type="spellStart"/>
+            <w:r>
+              <w:rPr>
+                <w:rFonts w:ascii="Calibri" w:hAnsi="Calibri" w:cs="Calibri"/>
+              </w:rPr>
+              <w:t>notice_allegations_details</w:t>
+            </w:r>
+            <w:proofErr w:type="spellEnd"/>
+            <w:r>
+              <w:rPr>
+                <w:rFonts w:ascii="Calibri" w:hAnsi="Calibri" w:cs="Calibri"/>
+              </w:rPr>
+              <w:t xml:space="preserve"> }}{% endif %}</w:t>
             </w:r>
           </w:p>
         </w:tc>
@@ -2012,11 +2904,33 @@
                 <w:rFonts w:ascii="Calibri" w:hAnsi="Calibri" w:cs="Calibri"/>
               </w:rPr>
             </w:pPr>
-            <w:r>
-              <w:rPr>
-                <w:rFonts w:ascii="Calibri" w:hAnsi="Calibri" w:cs="Calibri"/>
-              </w:rPr>
-              <w:t>{{ output_checkbox(</w:t>
+            <w:proofErr w:type="gramStart"/>
+            <w:r>
+              <w:rPr>
+                <w:rFonts w:ascii="Calibri" w:hAnsi="Calibri" w:cs="Calibri"/>
+              </w:rPr>
+              <w:t xml:space="preserve">{{ </w:t>
+            </w:r>
+            <w:proofErr w:type="spellStart"/>
+            <w:r>
+              <w:rPr>
+                <w:rFonts w:ascii="Calibri" w:hAnsi="Calibri" w:cs="Calibri"/>
+              </w:rPr>
+              <w:t>output</w:t>
+            </w:r>
+            <w:proofErr w:type="gramEnd"/>
+            <w:r>
+              <w:rPr>
+                <w:rFonts w:ascii="Calibri" w:hAnsi="Calibri" w:cs="Calibri"/>
+              </w:rPr>
+              <w:t>_checkbox</w:t>
+            </w:r>
+            <w:proofErr w:type="spellEnd"/>
+            <w:r>
+              <w:rPr>
+                <w:rFonts w:ascii="Calibri" w:hAnsi="Calibri" w:cs="Calibri"/>
+              </w:rPr>
+              <w:t>(</w:t>
             </w:r>
             <w:r>
               <w:rPr>
@@ -2028,7 +2942,14 @@
               <w:rPr>
                 <w:rFonts w:ascii="Calibri" w:hAnsi="Calibri" w:cs="Calibri"/>
               </w:rPr>
-              <w:t>.notice_</w:t>
+              <w:t>.</w:t>
+            </w:r>
+            <w:proofErr w:type="spellStart"/>
+            <w:r>
+              <w:rPr>
+                <w:rFonts w:ascii="Calibri" w:hAnsi="Calibri" w:cs="Calibri"/>
+              </w:rPr>
+              <w:t>notice_</w:t>
             </w:r>
             <w:r>
               <w:rPr>
@@ -2036,6 +2957,7 @@
               </w:rPr>
               <w:t>hearing</w:t>
             </w:r>
+            <w:proofErr w:type="spellEnd"/>
             <w:r>
               <w:rPr>
                 <w:rFonts w:ascii="Calibri" w:hAnsi="Calibri" w:cs="Calibri"/>
@@ -2056,11 +2978,33 @@
                 <w:rFonts w:ascii="Calibri" w:hAnsi="Calibri" w:cs="Calibri"/>
               </w:rPr>
             </w:pPr>
-            <w:r>
-              <w:rPr>
-                <w:rFonts w:ascii="Calibri" w:hAnsi="Calibri" w:cs="Calibri"/>
-              </w:rPr>
-              <w:t>{{ output_checkbox(</w:t>
+            <w:proofErr w:type="gramStart"/>
+            <w:r>
+              <w:rPr>
+                <w:rFonts w:ascii="Calibri" w:hAnsi="Calibri" w:cs="Calibri"/>
+              </w:rPr>
+              <w:t xml:space="preserve">{{ </w:t>
+            </w:r>
+            <w:proofErr w:type="spellStart"/>
+            <w:r>
+              <w:rPr>
+                <w:rFonts w:ascii="Calibri" w:hAnsi="Calibri" w:cs="Calibri"/>
+              </w:rPr>
+              <w:t>output</w:t>
+            </w:r>
+            <w:proofErr w:type="gramEnd"/>
+            <w:r>
+              <w:rPr>
+                <w:rFonts w:ascii="Calibri" w:hAnsi="Calibri" w:cs="Calibri"/>
+              </w:rPr>
+              <w:t>_checkbox</w:t>
+            </w:r>
+            <w:proofErr w:type="spellEnd"/>
+            <w:r>
+              <w:rPr>
+                <w:rFonts w:ascii="Calibri" w:hAnsi="Calibri" w:cs="Calibri"/>
+              </w:rPr>
+              <w:t>(</w:t>
             </w:r>
             <w:r>
               <w:rPr>
@@ -2078,7 +3022,14 @@
               <w:rPr>
                 <w:rFonts w:ascii="Calibri" w:hAnsi="Calibri" w:cs="Calibri"/>
               </w:rPr>
-              <w:t>.notice_</w:t>
+              <w:t>.</w:t>
+            </w:r>
+            <w:proofErr w:type="spellStart"/>
+            <w:r>
+              <w:rPr>
+                <w:rFonts w:ascii="Calibri" w:hAnsi="Calibri" w:cs="Calibri"/>
+              </w:rPr>
+              <w:t>notice_</w:t>
             </w:r>
             <w:r>
               <w:rPr>
@@ -2086,6 +3037,7 @@
               </w:rPr>
               <w:t>hearing</w:t>
             </w:r>
+            <w:proofErr w:type="spellEnd"/>
             <w:r>
               <w:rPr>
                 <w:rFonts w:ascii="Calibri" w:hAnsi="Calibri" w:cs="Calibri"/>
@@ -2171,11 +3123,33 @@
                 <w:bCs/>
               </w:rPr>
             </w:pPr>
-            <w:r>
-              <w:rPr>
-                <w:rFonts w:ascii="Calibri" w:eastAsia="Calibri" w:hAnsi="Calibri" w:cs="Calibri"/>
-              </w:rPr>
-              <w:t>{{ users[0].address_block() }}</w:t>
+            <w:proofErr w:type="gramStart"/>
+            <w:r>
+              <w:rPr>
+                <w:rFonts w:ascii="Calibri" w:eastAsia="Calibri" w:hAnsi="Calibri" w:cs="Calibri"/>
+              </w:rPr>
+              <w:t>{{ users</w:t>
+            </w:r>
+            <w:proofErr w:type="gramEnd"/>
+            <w:r>
+              <w:rPr>
+                <w:rFonts w:ascii="Calibri" w:eastAsia="Calibri" w:hAnsi="Calibri" w:cs="Calibri"/>
+              </w:rPr>
+              <w:t>[0].</w:t>
+            </w:r>
+            <w:proofErr w:type="spellStart"/>
+            <w:r>
+              <w:rPr>
+                <w:rFonts w:ascii="Calibri" w:eastAsia="Calibri" w:hAnsi="Calibri" w:cs="Calibri"/>
+              </w:rPr>
+              <w:t>address_block</w:t>
+            </w:r>
+            <w:proofErr w:type="spellEnd"/>
+            <w:r>
+              <w:rPr>
+                <w:rFonts w:ascii="Calibri" w:eastAsia="Calibri" w:hAnsi="Calibri" w:cs="Calibri"/>
+              </w:rPr>
+              <w:t>() }}</w:t>
             </w:r>
           </w:p>
         </w:tc>
@@ -2215,11 +3189,33 @@
                 <w:rFonts w:ascii="Calibri" w:hAnsi="Calibri" w:cs="Calibri"/>
               </w:rPr>
             </w:pPr>
-            <w:r>
-              <w:rPr>
-                <w:rFonts w:ascii="Calibri" w:hAnsi="Calibri" w:cs="Calibri"/>
-              </w:rPr>
-              <w:t>{{ output_checkbox(</w:t>
+            <w:proofErr w:type="gramStart"/>
+            <w:r>
+              <w:rPr>
+                <w:rFonts w:ascii="Calibri" w:hAnsi="Calibri" w:cs="Calibri"/>
+              </w:rPr>
+              <w:t xml:space="preserve">{{ </w:t>
+            </w:r>
+            <w:proofErr w:type="spellStart"/>
+            <w:r>
+              <w:rPr>
+                <w:rFonts w:ascii="Calibri" w:hAnsi="Calibri" w:cs="Calibri"/>
+              </w:rPr>
+              <w:t>output</w:t>
+            </w:r>
+            <w:proofErr w:type="gramEnd"/>
+            <w:r>
+              <w:rPr>
+                <w:rFonts w:ascii="Calibri" w:hAnsi="Calibri" w:cs="Calibri"/>
+              </w:rPr>
+              <w:t>_checkbox</w:t>
+            </w:r>
+            <w:proofErr w:type="spellEnd"/>
+            <w:r>
+              <w:rPr>
+                <w:rFonts w:ascii="Calibri" w:hAnsi="Calibri" w:cs="Calibri"/>
+              </w:rPr>
+              <w:t>(</w:t>
             </w:r>
             <w:r>
               <w:rPr>
@@ -2233,12 +3229,14 @@
               </w:rPr>
               <w:t>.</w:t>
             </w:r>
+            <w:proofErr w:type="spellStart"/>
             <w:r>
               <w:rPr>
                 <w:rFonts w:ascii="Calibri" w:hAnsi="Calibri" w:cs="Calibri"/>
               </w:rPr>
               <w:t>moved_since</w:t>
             </w:r>
+            <w:proofErr w:type="spellEnd"/>
             <w:r>
               <w:rPr>
                 <w:rFonts w:ascii="Calibri" w:hAnsi="Calibri" w:cs="Calibri"/>
@@ -2259,11 +3257,33 @@
                 <w:rFonts w:ascii="Calibri" w:hAnsi="Calibri" w:cs="Calibri"/>
               </w:rPr>
             </w:pPr>
-            <w:r>
-              <w:rPr>
-                <w:rFonts w:ascii="Calibri" w:hAnsi="Calibri" w:cs="Calibri"/>
-              </w:rPr>
-              <w:t>{{ output_checkbox(</w:t>
+            <w:proofErr w:type="gramStart"/>
+            <w:r>
+              <w:rPr>
+                <w:rFonts w:ascii="Calibri" w:hAnsi="Calibri" w:cs="Calibri"/>
+              </w:rPr>
+              <w:t xml:space="preserve">{{ </w:t>
+            </w:r>
+            <w:proofErr w:type="spellStart"/>
+            <w:r>
+              <w:rPr>
+                <w:rFonts w:ascii="Calibri" w:hAnsi="Calibri" w:cs="Calibri"/>
+              </w:rPr>
+              <w:t>output</w:t>
+            </w:r>
+            <w:proofErr w:type="gramEnd"/>
+            <w:r>
+              <w:rPr>
+                <w:rFonts w:ascii="Calibri" w:hAnsi="Calibri" w:cs="Calibri"/>
+              </w:rPr>
+              <w:t>_checkbox</w:t>
+            </w:r>
+            <w:proofErr w:type="spellEnd"/>
+            <w:r>
+              <w:rPr>
+                <w:rFonts w:ascii="Calibri" w:hAnsi="Calibri" w:cs="Calibri"/>
+              </w:rPr>
+              <w:t>(</w:t>
             </w:r>
             <w:r>
               <w:rPr>
@@ -2283,12 +3303,14 @@
               </w:rPr>
               <w:t>.</w:t>
             </w:r>
+            <w:proofErr w:type="spellStart"/>
             <w:r>
               <w:rPr>
                 <w:rFonts w:ascii="Calibri" w:hAnsi="Calibri" w:cs="Calibri"/>
               </w:rPr>
               <w:t>moved_since</w:t>
             </w:r>
+            <w:proofErr w:type="spellEnd"/>
             <w:r>
               <w:rPr>
                 <w:rFonts w:ascii="Calibri" w:hAnsi="Calibri" w:cs="Calibri"/>
@@ -2339,11 +3361,33 @@
                 <w:rFonts w:ascii="Calibri" w:hAnsi="Calibri" w:cs="Calibri"/>
               </w:rPr>
             </w:pPr>
-            <w:r>
-              <w:rPr>
-                <w:rFonts w:ascii="Calibri" w:hAnsi="Calibri" w:cs="Calibri"/>
-              </w:rPr>
-              <w:t>{{ output_checkbox(</w:t>
+            <w:proofErr w:type="gramStart"/>
+            <w:r>
+              <w:rPr>
+                <w:rFonts w:ascii="Calibri" w:hAnsi="Calibri" w:cs="Calibri"/>
+              </w:rPr>
+              <w:t xml:space="preserve">{{ </w:t>
+            </w:r>
+            <w:proofErr w:type="spellStart"/>
+            <w:r>
+              <w:rPr>
+                <w:rFonts w:ascii="Calibri" w:hAnsi="Calibri" w:cs="Calibri"/>
+              </w:rPr>
+              <w:t>output</w:t>
+            </w:r>
+            <w:proofErr w:type="gramEnd"/>
+            <w:r>
+              <w:rPr>
+                <w:rFonts w:ascii="Calibri" w:hAnsi="Calibri" w:cs="Calibri"/>
+              </w:rPr>
+              <w:t>_checkbox</w:t>
+            </w:r>
+            <w:proofErr w:type="spellEnd"/>
+            <w:r>
+              <w:rPr>
+                <w:rFonts w:ascii="Calibri" w:hAnsi="Calibri" w:cs="Calibri"/>
+              </w:rPr>
+              <w:t>(</w:t>
             </w:r>
             <w:r>
               <w:rPr>
@@ -2357,12 +3401,14 @@
               </w:rPr>
               <w:t>.</w:t>
             </w:r>
+            <w:proofErr w:type="spellStart"/>
             <w:r>
               <w:rPr>
                 <w:rFonts w:ascii="Calibri" w:hAnsi="Calibri" w:cs="Calibri"/>
               </w:rPr>
               <w:t>immigration_application</w:t>
             </w:r>
+            <w:proofErr w:type="spellEnd"/>
             <w:r>
               <w:rPr>
                 <w:rFonts w:ascii="Calibri" w:hAnsi="Calibri" w:cs="Calibri"/>
@@ -2380,7 +3426,34 @@
                 <w:rFonts w:ascii="Calibri" w:hAnsi="Calibri" w:cs="Calibri"/>
               </w:rPr>
               <w:br/>
-              <w:t>{{ users[0].other_immigration_applications }}</w:t>
+            </w:r>
+            <w:proofErr w:type="gramStart"/>
+            <w:r>
+              <w:rPr>
+                <w:rFonts w:ascii="Calibri" w:hAnsi="Calibri" w:cs="Calibri"/>
+              </w:rPr>
+              <w:t>{{ users</w:t>
+            </w:r>
+            <w:proofErr w:type="gramEnd"/>
+            <w:r>
+              <w:rPr>
+                <w:rFonts w:ascii="Calibri" w:hAnsi="Calibri" w:cs="Calibri"/>
+              </w:rPr>
+              <w:t>[0].</w:t>
+            </w:r>
+            <w:proofErr w:type="spellStart"/>
+            <w:r>
+              <w:rPr>
+                <w:rFonts w:ascii="Calibri" w:hAnsi="Calibri" w:cs="Calibri"/>
+              </w:rPr>
+              <w:t>other_immigration_applications</w:t>
+            </w:r>
+            <w:proofErr w:type="spellEnd"/>
+            <w:r>
+              <w:rPr>
+                <w:rFonts w:ascii="Calibri" w:hAnsi="Calibri" w:cs="Calibri"/>
+              </w:rPr>
+              <w:t xml:space="preserve"> }}</w:t>
             </w:r>
           </w:p>
           <w:p>
@@ -2390,11 +3463,33 @@
                 <w:rFonts w:ascii="Calibri" w:hAnsi="Calibri" w:cs="Calibri"/>
               </w:rPr>
             </w:pPr>
-            <w:r>
-              <w:rPr>
-                <w:rFonts w:ascii="Calibri" w:hAnsi="Calibri" w:cs="Calibri"/>
-              </w:rPr>
-              <w:t>{{ output_checkbox(</w:t>
+            <w:proofErr w:type="gramStart"/>
+            <w:r>
+              <w:rPr>
+                <w:rFonts w:ascii="Calibri" w:hAnsi="Calibri" w:cs="Calibri"/>
+              </w:rPr>
+              <w:t xml:space="preserve">{{ </w:t>
+            </w:r>
+            <w:proofErr w:type="spellStart"/>
+            <w:r>
+              <w:rPr>
+                <w:rFonts w:ascii="Calibri" w:hAnsi="Calibri" w:cs="Calibri"/>
+              </w:rPr>
+              <w:t>output</w:t>
+            </w:r>
+            <w:proofErr w:type="gramEnd"/>
+            <w:r>
+              <w:rPr>
+                <w:rFonts w:ascii="Calibri" w:hAnsi="Calibri" w:cs="Calibri"/>
+              </w:rPr>
+              <w:t>_checkbox</w:t>
+            </w:r>
+            <w:proofErr w:type="spellEnd"/>
+            <w:r>
+              <w:rPr>
+                <w:rFonts w:ascii="Calibri" w:hAnsi="Calibri" w:cs="Calibri"/>
+              </w:rPr>
+              <w:t>(</w:t>
             </w:r>
             <w:r>
               <w:rPr>
@@ -2418,13 +3513,29 @@
               <w:rPr>
                 <w:rFonts w:ascii="Calibri" w:hAnsi="Calibri" w:cs="Calibri"/>
               </w:rPr>
-              <w:t xml:space="preserve"> immigration_application</w:t>
-            </w:r>
-            <w:r>
-              <w:rPr>
-                <w:rFonts w:ascii="Calibri" w:hAnsi="Calibri" w:cs="Calibri"/>
-              </w:rPr>
-              <w:t xml:space="preserve">) }} </w:t>
+              <w:t xml:space="preserve"> </w:t>
+            </w:r>
+            <w:proofErr w:type="spellStart"/>
+            <w:r>
+              <w:rPr>
+                <w:rFonts w:ascii="Calibri" w:hAnsi="Calibri" w:cs="Calibri"/>
+              </w:rPr>
+              <w:t>immigration_application</w:t>
+            </w:r>
+            <w:proofErr w:type="spellEnd"/>
+            <w:proofErr w:type="gramStart"/>
+            <w:r>
+              <w:rPr>
+                <w:rFonts w:ascii="Calibri" w:hAnsi="Calibri" w:cs="Calibri"/>
+              </w:rPr>
+              <w:t>) }</w:t>
+            </w:r>
+            <w:proofErr w:type="gramEnd"/>
+            <w:r>
+              <w:rPr>
+                <w:rFonts w:ascii="Calibri" w:hAnsi="Calibri" w:cs="Calibri"/>
+              </w:rPr>
+              <w:t xml:space="preserve">} </w:t>
             </w:r>
             <w:r>
               <w:rPr>
@@ -2470,11 +3581,33 @@
                 <w:rFonts w:ascii="Calibri" w:hAnsi="Calibri" w:cs="Calibri"/>
               </w:rPr>
             </w:pPr>
-            <w:r>
-              <w:rPr>
-                <w:rFonts w:ascii="Calibri" w:hAnsi="Calibri" w:cs="Calibri"/>
-              </w:rPr>
-              <w:t>{{ output_checkbox(</w:t>
+            <w:proofErr w:type="gramStart"/>
+            <w:r>
+              <w:rPr>
+                <w:rFonts w:ascii="Calibri" w:hAnsi="Calibri" w:cs="Calibri"/>
+              </w:rPr>
+              <w:t xml:space="preserve">{{ </w:t>
+            </w:r>
+            <w:proofErr w:type="spellStart"/>
+            <w:r>
+              <w:rPr>
+                <w:rFonts w:ascii="Calibri" w:hAnsi="Calibri" w:cs="Calibri"/>
+              </w:rPr>
+              <w:t>output</w:t>
+            </w:r>
+            <w:proofErr w:type="gramEnd"/>
+            <w:r>
+              <w:rPr>
+                <w:rFonts w:ascii="Calibri" w:hAnsi="Calibri" w:cs="Calibri"/>
+              </w:rPr>
+              <w:t>_checkbox</w:t>
+            </w:r>
+            <w:proofErr w:type="spellEnd"/>
+            <w:r>
+              <w:rPr>
+                <w:rFonts w:ascii="Calibri" w:hAnsi="Calibri" w:cs="Calibri"/>
+              </w:rPr>
+              <w:t>(</w:t>
             </w:r>
             <w:r>
               <w:rPr>
@@ -2488,12 +3621,14 @@
               </w:rPr>
               <w:t>.</w:t>
             </w:r>
+            <w:proofErr w:type="spellStart"/>
             <w:r>
               <w:rPr>
                 <w:rFonts w:ascii="Calibri" w:hAnsi="Calibri" w:cs="Calibri"/>
               </w:rPr>
               <w:t>screened_for_relief</w:t>
             </w:r>
+            <w:proofErr w:type="spellEnd"/>
             <w:r>
               <w:rPr>
                 <w:rFonts w:ascii="Calibri" w:hAnsi="Calibri" w:cs="Calibri"/>
@@ -2514,11 +3649,33 @@
                 <w:rFonts w:ascii="Calibri" w:hAnsi="Calibri" w:cs="Calibri"/>
               </w:rPr>
             </w:pPr>
-            <w:r>
-              <w:rPr>
-                <w:rFonts w:ascii="Calibri" w:hAnsi="Calibri" w:cs="Calibri"/>
-              </w:rPr>
-              <w:t>{{ output_checkbox(</w:t>
+            <w:proofErr w:type="gramStart"/>
+            <w:r>
+              <w:rPr>
+                <w:rFonts w:ascii="Calibri" w:hAnsi="Calibri" w:cs="Calibri"/>
+              </w:rPr>
+              <w:t xml:space="preserve">{{ </w:t>
+            </w:r>
+            <w:proofErr w:type="spellStart"/>
+            <w:r>
+              <w:rPr>
+                <w:rFonts w:ascii="Calibri" w:hAnsi="Calibri" w:cs="Calibri"/>
+              </w:rPr>
+              <w:t>output</w:t>
+            </w:r>
+            <w:proofErr w:type="gramEnd"/>
+            <w:r>
+              <w:rPr>
+                <w:rFonts w:ascii="Calibri" w:hAnsi="Calibri" w:cs="Calibri"/>
+              </w:rPr>
+              <w:t>_checkbox</w:t>
+            </w:r>
+            <w:proofErr w:type="spellEnd"/>
+            <w:r>
+              <w:rPr>
+                <w:rFonts w:ascii="Calibri" w:hAnsi="Calibri" w:cs="Calibri"/>
+              </w:rPr>
+              <w:t>(</w:t>
             </w:r>
             <w:r>
               <w:rPr>
@@ -2538,12 +3695,14 @@
               </w:rPr>
               <w:t>.</w:t>
             </w:r>
+            <w:proofErr w:type="spellStart"/>
             <w:r>
               <w:rPr>
                 <w:rFonts w:ascii="Calibri" w:hAnsi="Calibri" w:cs="Calibri"/>
               </w:rPr>
               <w:t>screened_for_relief</w:t>
             </w:r>
+            <w:proofErr w:type="spellEnd"/>
             <w:r>
               <w:rPr>
                 <w:rFonts w:ascii="Calibri" w:hAnsi="Calibri" w:cs="Calibri"/>
@@ -2594,11 +3753,33 @@
                 <w:rFonts w:ascii="Calibri" w:hAnsi="Calibri" w:cs="Calibri"/>
               </w:rPr>
             </w:pPr>
-            <w:r>
-              <w:rPr>
-                <w:rFonts w:ascii="Calibri" w:hAnsi="Calibri" w:cs="Calibri"/>
-              </w:rPr>
-              <w:t>{{ output_checkbox(</w:t>
+            <w:proofErr w:type="gramStart"/>
+            <w:r>
+              <w:rPr>
+                <w:rFonts w:ascii="Calibri" w:hAnsi="Calibri" w:cs="Calibri"/>
+              </w:rPr>
+              <w:t xml:space="preserve">{{ </w:t>
+            </w:r>
+            <w:proofErr w:type="spellStart"/>
+            <w:r>
+              <w:rPr>
+                <w:rFonts w:ascii="Calibri" w:hAnsi="Calibri" w:cs="Calibri"/>
+              </w:rPr>
+              <w:t>output</w:t>
+            </w:r>
+            <w:proofErr w:type="gramEnd"/>
+            <w:r>
+              <w:rPr>
+                <w:rFonts w:ascii="Calibri" w:hAnsi="Calibri" w:cs="Calibri"/>
+              </w:rPr>
+              <w:t>_checkbox</w:t>
+            </w:r>
+            <w:proofErr w:type="spellEnd"/>
+            <w:r>
+              <w:rPr>
+                <w:rFonts w:ascii="Calibri" w:hAnsi="Calibri" w:cs="Calibri"/>
+              </w:rPr>
+              <w:t>(</w:t>
             </w:r>
             <w:r>
               <w:rPr>
@@ -2612,12 +3793,14 @@
               </w:rPr>
               <w:t>.</w:t>
             </w:r>
+            <w:proofErr w:type="spellStart"/>
             <w:r>
               <w:rPr>
                 <w:rFonts w:ascii="Calibri" w:hAnsi="Calibri" w:cs="Calibri"/>
               </w:rPr>
               <w:t>application_processing</w:t>
             </w:r>
+            <w:proofErr w:type="spellEnd"/>
             <w:r>
               <w:rPr>
                 <w:rFonts w:ascii="Calibri" w:hAnsi="Calibri" w:cs="Calibri"/>
@@ -2638,11 +3821,33 @@
                 <w:rFonts w:ascii="Calibri" w:hAnsi="Calibri" w:cs="Calibri"/>
               </w:rPr>
             </w:pPr>
-            <w:r>
-              <w:rPr>
-                <w:rFonts w:ascii="Calibri" w:hAnsi="Calibri" w:cs="Calibri"/>
-              </w:rPr>
-              <w:t>{{ users[0].application_status }}</w:t>
+            <w:proofErr w:type="gramStart"/>
+            <w:r>
+              <w:rPr>
+                <w:rFonts w:ascii="Calibri" w:hAnsi="Calibri" w:cs="Calibri"/>
+              </w:rPr>
+              <w:t>{{ users</w:t>
+            </w:r>
+            <w:proofErr w:type="gramEnd"/>
+            <w:r>
+              <w:rPr>
+                <w:rFonts w:ascii="Calibri" w:hAnsi="Calibri" w:cs="Calibri"/>
+              </w:rPr>
+              <w:t>[0].</w:t>
+            </w:r>
+            <w:proofErr w:type="spellStart"/>
+            <w:r>
+              <w:rPr>
+                <w:rFonts w:ascii="Calibri" w:hAnsi="Calibri" w:cs="Calibri"/>
+              </w:rPr>
+              <w:t>application_status</w:t>
+            </w:r>
+            <w:proofErr w:type="spellEnd"/>
+            <w:r>
+              <w:rPr>
+                <w:rFonts w:ascii="Calibri" w:hAnsi="Calibri" w:cs="Calibri"/>
+              </w:rPr>
+              <w:t xml:space="preserve"> }}</w:t>
             </w:r>
           </w:p>
           <w:p>
@@ -2652,11 +3857,39 @@
                 <w:rFonts w:ascii="Calibri" w:hAnsi="Calibri" w:cs="Calibri"/>
               </w:rPr>
             </w:pPr>
-            <w:r>
-              <w:rPr>
-                <w:rFonts w:ascii="Calibri" w:hAnsi="Calibri" w:cs="Calibri"/>
-              </w:rPr>
-              <w:t>{{ output_checkbox(</w:t>
+            <w:proofErr w:type="gramStart"/>
+            <w:r>
+              <w:rPr>
+                <w:rFonts w:ascii="Calibri" w:hAnsi="Calibri" w:cs="Calibri"/>
+              </w:rPr>
+              <w:t xml:space="preserve">{{ </w:t>
+            </w:r>
+            <w:proofErr w:type="spellStart"/>
+            <w:r>
+              <w:rPr>
+                <w:rFonts w:ascii="Calibri" w:hAnsi="Calibri" w:cs="Calibri"/>
+              </w:rPr>
+              <w:t>output</w:t>
+            </w:r>
+            <w:proofErr w:type="gramEnd"/>
+            <w:r>
+              <w:rPr>
+                <w:rFonts w:ascii="Calibri" w:hAnsi="Calibri" w:cs="Calibri"/>
+              </w:rPr>
+              <w:t>_checkbox</w:t>
+            </w:r>
+            <w:proofErr w:type="spellEnd"/>
+            <w:r>
+              <w:rPr>
+                <w:rFonts w:ascii="Calibri" w:hAnsi="Calibri" w:cs="Calibri"/>
+              </w:rPr>
+              <w:t>(</w:t>
+            </w:r>
+            <w:r>
+              <w:rPr>
+                <w:rFonts w:ascii="Calibri" w:hAnsi="Calibri" w:cs="Calibri"/>
+              </w:rPr>
+              <w:t xml:space="preserve">not </w:t>
             </w:r>
             <w:r>
               <w:rPr>
@@ -2670,12 +3903,14 @@
               </w:rPr>
               <w:t>.</w:t>
             </w:r>
+            <w:proofErr w:type="spellStart"/>
             <w:r>
               <w:rPr>
                 <w:rFonts w:ascii="Calibri" w:hAnsi="Calibri" w:cs="Calibri"/>
               </w:rPr>
               <w:t>application_processing</w:t>
             </w:r>
+            <w:proofErr w:type="spellEnd"/>
             <w:r>
               <w:rPr>
                 <w:rFonts w:ascii="Calibri" w:hAnsi="Calibri" w:cs="Calibri"/>
@@ -2726,11 +3961,33 @@
                 <w:rFonts w:ascii="Calibri" w:eastAsia="Calibri" w:hAnsi="Calibri" w:cs="Calibri"/>
               </w:rPr>
             </w:pPr>
-            <w:r>
-              <w:rPr>
-                <w:rFonts w:ascii="Calibri" w:hAnsi="Calibri" w:cs="Calibri"/>
-              </w:rPr>
-              <w:t>{{ output_checkbox(</w:t>
+            <w:proofErr w:type="gramStart"/>
+            <w:r>
+              <w:rPr>
+                <w:rFonts w:ascii="Calibri" w:hAnsi="Calibri" w:cs="Calibri"/>
+              </w:rPr>
+              <w:t xml:space="preserve">{{ </w:t>
+            </w:r>
+            <w:proofErr w:type="spellStart"/>
+            <w:r>
+              <w:rPr>
+                <w:rFonts w:ascii="Calibri" w:hAnsi="Calibri" w:cs="Calibri"/>
+              </w:rPr>
+              <w:t>output</w:t>
+            </w:r>
+            <w:proofErr w:type="gramEnd"/>
+            <w:r>
+              <w:rPr>
+                <w:rFonts w:ascii="Calibri" w:hAnsi="Calibri" w:cs="Calibri"/>
+              </w:rPr>
+              <w:t>_checkbox</w:t>
+            </w:r>
+            <w:proofErr w:type="spellEnd"/>
+            <w:r>
+              <w:rPr>
+                <w:rFonts w:ascii="Calibri" w:hAnsi="Calibri" w:cs="Calibri"/>
+              </w:rPr>
+              <w:t>(</w:t>
             </w:r>
             <w:r>
               <w:rPr>
@@ -2744,12 +4001,14 @@
               </w:rPr>
               <w:t>.</w:t>
             </w:r>
+            <w:proofErr w:type="spellStart"/>
             <w:r>
               <w:rPr>
                 <w:rFonts w:ascii="Calibri" w:hAnsi="Calibri" w:cs="Calibri"/>
               </w:rPr>
               <w:t>asylum_clock_running</w:t>
             </w:r>
+            <w:proofErr w:type="spellEnd"/>
             <w:r>
               <w:rPr>
                 <w:rFonts w:ascii="Calibri" w:hAnsi="Calibri" w:cs="Calibri"/>
@@ -2770,11 +4029,33 @@
                 <w:rFonts w:ascii="Calibri" w:hAnsi="Calibri" w:cs="Calibri"/>
               </w:rPr>
             </w:pPr>
-            <w:r>
-              <w:rPr>
-                <w:rFonts w:ascii="Calibri" w:hAnsi="Calibri" w:cs="Calibri"/>
-              </w:rPr>
-              <w:t>{{ output_checkbox(</w:t>
+            <w:proofErr w:type="gramStart"/>
+            <w:r>
+              <w:rPr>
+                <w:rFonts w:ascii="Calibri" w:hAnsi="Calibri" w:cs="Calibri"/>
+              </w:rPr>
+              <w:t xml:space="preserve">{{ </w:t>
+            </w:r>
+            <w:proofErr w:type="spellStart"/>
+            <w:r>
+              <w:rPr>
+                <w:rFonts w:ascii="Calibri" w:hAnsi="Calibri" w:cs="Calibri"/>
+              </w:rPr>
+              <w:t>output</w:t>
+            </w:r>
+            <w:proofErr w:type="gramEnd"/>
+            <w:r>
+              <w:rPr>
+                <w:rFonts w:ascii="Calibri" w:hAnsi="Calibri" w:cs="Calibri"/>
+              </w:rPr>
+              <w:t>_checkbox</w:t>
+            </w:r>
+            <w:proofErr w:type="spellEnd"/>
+            <w:r>
+              <w:rPr>
+                <w:rFonts w:ascii="Calibri" w:hAnsi="Calibri" w:cs="Calibri"/>
+              </w:rPr>
+              <w:t>(</w:t>
             </w:r>
             <w:r>
               <w:rPr>
@@ -2798,13 +4079,29 @@
               <w:rPr>
                 <w:rFonts w:ascii="Calibri" w:hAnsi="Calibri" w:cs="Calibri"/>
               </w:rPr>
-              <w:t xml:space="preserve"> asylum_clock_running</w:t>
-            </w:r>
-            <w:r>
-              <w:rPr>
-                <w:rFonts w:ascii="Calibri" w:hAnsi="Calibri" w:cs="Calibri"/>
-              </w:rPr>
-              <w:t xml:space="preserve">) }} </w:t>
+              <w:t xml:space="preserve"> </w:t>
+            </w:r>
+            <w:proofErr w:type="spellStart"/>
+            <w:r>
+              <w:rPr>
+                <w:rFonts w:ascii="Calibri" w:hAnsi="Calibri" w:cs="Calibri"/>
+              </w:rPr>
+              <w:t>asylum_clock_running</w:t>
+            </w:r>
+            <w:proofErr w:type="spellEnd"/>
+            <w:proofErr w:type="gramStart"/>
+            <w:r>
+              <w:rPr>
+                <w:rFonts w:ascii="Calibri" w:hAnsi="Calibri" w:cs="Calibri"/>
+              </w:rPr>
+              <w:t>) }</w:t>
+            </w:r>
+            <w:proofErr w:type="gramEnd"/>
+            <w:r>
+              <w:rPr>
+                <w:rFonts w:ascii="Calibri" w:hAnsi="Calibri" w:cs="Calibri"/>
+              </w:rPr>
+              <w:t xml:space="preserve">} </w:t>
             </w:r>
             <w:r>
               <w:rPr>
@@ -2850,11 +4147,33 @@
                 <w:rFonts w:ascii="Calibri" w:hAnsi="Calibri" w:cs="Calibri"/>
               </w:rPr>
             </w:pPr>
-            <w:r>
-              <w:rPr>
-                <w:rFonts w:ascii="Calibri" w:hAnsi="Calibri" w:cs="Calibri"/>
-              </w:rPr>
-              <w:t>{{ output_checkbox(</w:t>
+            <w:proofErr w:type="gramStart"/>
+            <w:r>
+              <w:rPr>
+                <w:rFonts w:ascii="Calibri" w:hAnsi="Calibri" w:cs="Calibri"/>
+              </w:rPr>
+              <w:t xml:space="preserve">{{ </w:t>
+            </w:r>
+            <w:proofErr w:type="spellStart"/>
+            <w:r>
+              <w:rPr>
+                <w:rFonts w:ascii="Calibri" w:hAnsi="Calibri" w:cs="Calibri"/>
+              </w:rPr>
+              <w:t>output</w:t>
+            </w:r>
+            <w:proofErr w:type="gramEnd"/>
+            <w:r>
+              <w:rPr>
+                <w:rFonts w:ascii="Calibri" w:hAnsi="Calibri" w:cs="Calibri"/>
+              </w:rPr>
+              <w:t>_checkbox</w:t>
+            </w:r>
+            <w:proofErr w:type="spellEnd"/>
+            <w:r>
+              <w:rPr>
+                <w:rFonts w:ascii="Calibri" w:hAnsi="Calibri" w:cs="Calibri"/>
+              </w:rPr>
+              <w:t>(</w:t>
             </w:r>
             <w:r>
               <w:rPr>
@@ -2868,12 +4187,14 @@
               </w:rPr>
               <w:t>.</w:t>
             </w:r>
+            <w:proofErr w:type="spellStart"/>
             <w:r>
               <w:rPr>
                 <w:rFonts w:ascii="Calibri" w:hAnsi="Calibri" w:cs="Calibri"/>
               </w:rPr>
               <w:t>derivative_clock_running</w:t>
             </w:r>
+            <w:proofErr w:type="spellEnd"/>
           </w:p>
           <w:p>
             <w:pPr>
@@ -2882,11 +4203,19 @@
                 <w:rFonts w:ascii="Calibri" w:hAnsi="Calibri" w:cs="Calibri"/>
               </w:rPr>
             </w:pPr>
-            <w:r>
-              <w:rPr>
-                <w:rFonts w:ascii="Calibri" w:hAnsi="Calibri" w:cs="Calibri"/>
-              </w:rPr>
-              <w:t xml:space="preserve">) }} </w:t>
+            <w:proofErr w:type="gramStart"/>
+            <w:r>
+              <w:rPr>
+                <w:rFonts w:ascii="Calibri" w:hAnsi="Calibri" w:cs="Calibri"/>
+              </w:rPr>
+              <w:t>) }</w:t>
+            </w:r>
+            <w:proofErr w:type="gramEnd"/>
+            <w:r>
+              <w:rPr>
+                <w:rFonts w:ascii="Calibri" w:hAnsi="Calibri" w:cs="Calibri"/>
+              </w:rPr>
+              <w:t xml:space="preserve">} </w:t>
             </w:r>
             <w:r>
               <w:rPr>
@@ -2902,11 +4231,33 @@
                 <w:rFonts w:ascii="Calibri" w:hAnsi="Calibri" w:cs="Calibri"/>
               </w:rPr>
             </w:pPr>
-            <w:r>
-              <w:rPr>
-                <w:rFonts w:ascii="Calibri" w:hAnsi="Calibri" w:cs="Calibri"/>
-              </w:rPr>
-              <w:t>{{ output_checkbox(</w:t>
+            <w:proofErr w:type="gramStart"/>
+            <w:r>
+              <w:rPr>
+                <w:rFonts w:ascii="Calibri" w:hAnsi="Calibri" w:cs="Calibri"/>
+              </w:rPr>
+              <w:t xml:space="preserve">{{ </w:t>
+            </w:r>
+            <w:proofErr w:type="spellStart"/>
+            <w:r>
+              <w:rPr>
+                <w:rFonts w:ascii="Calibri" w:hAnsi="Calibri" w:cs="Calibri"/>
+              </w:rPr>
+              <w:t>output</w:t>
+            </w:r>
+            <w:proofErr w:type="gramEnd"/>
+            <w:r>
+              <w:rPr>
+                <w:rFonts w:ascii="Calibri" w:hAnsi="Calibri" w:cs="Calibri"/>
+              </w:rPr>
+              <w:t>_checkbox</w:t>
+            </w:r>
+            <w:proofErr w:type="spellEnd"/>
+            <w:r>
+              <w:rPr>
+                <w:rFonts w:ascii="Calibri" w:hAnsi="Calibri" w:cs="Calibri"/>
+              </w:rPr>
+              <w:t>(</w:t>
             </w:r>
             <w:r>
               <w:rPr>
@@ -2926,12 +4277,14 @@
               </w:rPr>
               <w:t>.</w:t>
             </w:r>
+            <w:proofErr w:type="spellStart"/>
             <w:r>
               <w:rPr>
                 <w:rFonts w:ascii="Calibri" w:hAnsi="Calibri" w:cs="Calibri"/>
               </w:rPr>
               <w:t>derivative_clock_running</w:t>
             </w:r>
+            <w:proofErr w:type="spellEnd"/>
           </w:p>
           <w:p>
             <w:pPr>
@@ -2940,11 +4293,19 @@
                 <w:rFonts w:ascii="Calibri" w:hAnsi="Calibri" w:cs="Calibri"/>
               </w:rPr>
             </w:pPr>
-            <w:r>
-              <w:rPr>
-                <w:rFonts w:ascii="Calibri" w:hAnsi="Calibri" w:cs="Calibri"/>
-              </w:rPr>
-              <w:t xml:space="preserve">) }} </w:t>
+            <w:proofErr w:type="gramStart"/>
+            <w:r>
+              <w:rPr>
+                <w:rFonts w:ascii="Calibri" w:hAnsi="Calibri" w:cs="Calibri"/>
+              </w:rPr>
+              <w:t>) }</w:t>
+            </w:r>
+            <w:proofErr w:type="gramEnd"/>
+            <w:r>
+              <w:rPr>
+                <w:rFonts w:ascii="Calibri" w:hAnsi="Calibri" w:cs="Calibri"/>
+              </w:rPr>
+              <w:t xml:space="preserve">} </w:t>
             </w:r>
             <w:r>
               <w:rPr>
@@ -2952,11 +4313,33 @@
               </w:rPr>
               <w:t xml:space="preserve">No – Who? </w:t>
             </w:r>
-            <w:r>
-              <w:rPr>
-                <w:rFonts w:ascii="Calibri" w:hAnsi="Calibri" w:cs="Calibri"/>
-              </w:rPr>
-              <w:t>{{ users[0].derivative_clock_who }}</w:t>
+            <w:proofErr w:type="gramStart"/>
+            <w:r>
+              <w:rPr>
+                <w:rFonts w:ascii="Calibri" w:hAnsi="Calibri" w:cs="Calibri"/>
+              </w:rPr>
+              <w:t>{{ users</w:t>
+            </w:r>
+            <w:proofErr w:type="gramEnd"/>
+            <w:r>
+              <w:rPr>
+                <w:rFonts w:ascii="Calibri" w:hAnsi="Calibri" w:cs="Calibri"/>
+              </w:rPr>
+              <w:t>[0].</w:t>
+            </w:r>
+            <w:proofErr w:type="spellStart"/>
+            <w:r>
+              <w:rPr>
+                <w:rFonts w:ascii="Calibri" w:hAnsi="Calibri" w:cs="Calibri"/>
+              </w:rPr>
+              <w:t>derivative_clock_who</w:t>
+            </w:r>
+            <w:proofErr w:type="spellEnd"/>
+            <w:r>
+              <w:rPr>
+                <w:rFonts w:ascii="Calibri" w:hAnsi="Calibri" w:cs="Calibri"/>
+              </w:rPr>
+              <w:t xml:space="preserve"> }}</w:t>
             </w:r>
           </w:p>
         </w:tc>
@@ -3020,11 +4403,33 @@
                 <w:rFonts w:ascii="Calibri" w:hAnsi="Calibri" w:cs="Calibri"/>
               </w:rPr>
             </w:pPr>
-            <w:r>
-              <w:rPr>
-                <w:rFonts w:ascii="Calibri" w:hAnsi="Calibri" w:cs="Calibri"/>
-              </w:rPr>
-              <w:t>{{ output_checkbox(</w:t>
+            <w:proofErr w:type="gramStart"/>
+            <w:r>
+              <w:rPr>
+                <w:rFonts w:ascii="Calibri" w:hAnsi="Calibri" w:cs="Calibri"/>
+              </w:rPr>
+              <w:t xml:space="preserve">{{ </w:t>
+            </w:r>
+            <w:proofErr w:type="spellStart"/>
+            <w:r>
+              <w:rPr>
+                <w:rFonts w:ascii="Calibri" w:hAnsi="Calibri" w:cs="Calibri"/>
+              </w:rPr>
+              <w:t>output</w:t>
+            </w:r>
+            <w:proofErr w:type="gramEnd"/>
+            <w:r>
+              <w:rPr>
+                <w:rFonts w:ascii="Calibri" w:hAnsi="Calibri" w:cs="Calibri"/>
+              </w:rPr>
+              <w:t>_checkbox</w:t>
+            </w:r>
+            <w:proofErr w:type="spellEnd"/>
+            <w:r>
+              <w:rPr>
+                <w:rFonts w:ascii="Calibri" w:hAnsi="Calibri" w:cs="Calibri"/>
+              </w:rPr>
+              <w:t>(</w:t>
             </w:r>
             <w:r>
               <w:rPr>
@@ -3038,12 +4443,14 @@
               </w:rPr>
               <w:t>.</w:t>
             </w:r>
+            <w:proofErr w:type="spellStart"/>
             <w:r>
               <w:rPr>
                 <w:rFonts w:ascii="Calibri" w:hAnsi="Calibri" w:cs="Calibri"/>
               </w:rPr>
               <w:t>family_has_separate_case</w:t>
             </w:r>
+            <w:proofErr w:type="spellEnd"/>
             <w:r>
               <w:rPr>
                 <w:rFonts w:ascii="Calibri" w:hAnsi="Calibri" w:cs="Calibri"/>
@@ -3090,11 +4497,33 @@
               </w:rPr>
               <w:t xml:space="preserve">          </w:t>
             </w:r>
-            <w:r>
-              <w:rPr>
-                <w:rFonts w:ascii="Calibri" w:hAnsi="Calibri" w:cs="Calibri"/>
-              </w:rPr>
-              <w:t>{{ output_checkbox(</w:t>
+            <w:proofErr w:type="gramStart"/>
+            <w:r>
+              <w:rPr>
+                <w:rFonts w:ascii="Calibri" w:hAnsi="Calibri" w:cs="Calibri"/>
+              </w:rPr>
+              <w:t xml:space="preserve">{{ </w:t>
+            </w:r>
+            <w:proofErr w:type="spellStart"/>
+            <w:r>
+              <w:rPr>
+                <w:rFonts w:ascii="Calibri" w:hAnsi="Calibri" w:cs="Calibri"/>
+              </w:rPr>
+              <w:t>output</w:t>
+            </w:r>
+            <w:proofErr w:type="gramEnd"/>
+            <w:r>
+              <w:rPr>
+                <w:rFonts w:ascii="Calibri" w:hAnsi="Calibri" w:cs="Calibri"/>
+              </w:rPr>
+              <w:t>_checkbox</w:t>
+            </w:r>
+            <w:proofErr w:type="spellEnd"/>
+            <w:r>
+              <w:rPr>
+                <w:rFonts w:ascii="Calibri" w:hAnsi="Calibri" w:cs="Calibri"/>
+              </w:rPr>
+              <w:t>(</w:t>
             </w:r>
             <w:r>
               <w:rPr>
@@ -3108,12 +4537,14 @@
               </w:rPr>
               <w:t>.</w:t>
             </w:r>
+            <w:proofErr w:type="spellStart"/>
             <w:r>
               <w:rPr>
                 <w:rFonts w:ascii="Calibri" w:hAnsi="Calibri" w:cs="Calibri"/>
               </w:rPr>
               <w:t>wants_consolidation</w:t>
             </w:r>
+            <w:proofErr w:type="spellEnd"/>
             <w:r>
               <w:rPr>
                 <w:rFonts w:ascii="Calibri" w:hAnsi="Calibri" w:cs="Calibri"/>
@@ -3142,7 +4573,21 @@
               <w:rPr>
                 <w:rFonts w:ascii="Calibri" w:hAnsi="Calibri" w:cs="Calibri"/>
               </w:rPr>
-              <w:t>{{ output_checkbox(</w:t>
+              <w:t xml:space="preserve">{{ </w:t>
+            </w:r>
+            <w:proofErr w:type="spellStart"/>
+            <w:r>
+              <w:rPr>
+                <w:rFonts w:ascii="Calibri" w:hAnsi="Calibri" w:cs="Calibri"/>
+              </w:rPr>
+              <w:t>output_checkbox</w:t>
+            </w:r>
+            <w:proofErr w:type="spellEnd"/>
+            <w:r>
+              <w:rPr>
+                <w:rFonts w:ascii="Calibri" w:hAnsi="Calibri" w:cs="Calibri"/>
+              </w:rPr>
+              <w:t>(</w:t>
             </w:r>
             <w:r>
               <w:rPr>
@@ -3166,13 +4611,29 @@
               <w:rPr>
                 <w:rFonts w:ascii="Calibri" w:hAnsi="Calibri" w:cs="Calibri"/>
               </w:rPr>
-              <w:t xml:space="preserve"> wants_consolidation</w:t>
-            </w:r>
-            <w:r>
-              <w:rPr>
-                <w:rFonts w:ascii="Calibri" w:hAnsi="Calibri" w:cs="Calibri"/>
-              </w:rPr>
-              <w:t xml:space="preserve">) }} </w:t>
+              <w:t xml:space="preserve"> </w:t>
+            </w:r>
+            <w:proofErr w:type="spellStart"/>
+            <w:r>
+              <w:rPr>
+                <w:rFonts w:ascii="Calibri" w:hAnsi="Calibri" w:cs="Calibri"/>
+              </w:rPr>
+              <w:t>wants_consolidation</w:t>
+            </w:r>
+            <w:proofErr w:type="spellEnd"/>
+            <w:proofErr w:type="gramStart"/>
+            <w:r>
+              <w:rPr>
+                <w:rFonts w:ascii="Calibri" w:hAnsi="Calibri" w:cs="Calibri"/>
+              </w:rPr>
+              <w:t>) }</w:t>
+            </w:r>
+            <w:proofErr w:type="gramEnd"/>
+            <w:r>
+              <w:rPr>
+                <w:rFonts w:ascii="Calibri" w:hAnsi="Calibri" w:cs="Calibri"/>
+              </w:rPr>
+              <w:t xml:space="preserve">} </w:t>
             </w:r>
             <w:r>
               <w:rPr>
@@ -3188,11 +4649,33 @@
                 <w:rFonts w:ascii="Calibri" w:hAnsi="Calibri" w:cs="Calibri"/>
               </w:rPr>
             </w:pPr>
-            <w:r>
-              <w:rPr>
-                <w:rFonts w:ascii="Calibri" w:hAnsi="Calibri" w:cs="Calibri"/>
-              </w:rPr>
-              <w:t>{{ output_checkbox(</w:t>
+            <w:proofErr w:type="gramStart"/>
+            <w:r>
+              <w:rPr>
+                <w:rFonts w:ascii="Calibri" w:hAnsi="Calibri" w:cs="Calibri"/>
+              </w:rPr>
+              <w:t xml:space="preserve">{{ </w:t>
+            </w:r>
+            <w:proofErr w:type="spellStart"/>
+            <w:r>
+              <w:rPr>
+                <w:rFonts w:ascii="Calibri" w:hAnsi="Calibri" w:cs="Calibri"/>
+              </w:rPr>
+              <w:t>output</w:t>
+            </w:r>
+            <w:proofErr w:type="gramEnd"/>
+            <w:r>
+              <w:rPr>
+                <w:rFonts w:ascii="Calibri" w:hAnsi="Calibri" w:cs="Calibri"/>
+              </w:rPr>
+              <w:t>_checkbox</w:t>
+            </w:r>
+            <w:proofErr w:type="spellEnd"/>
+            <w:r>
+              <w:rPr>
+                <w:rFonts w:ascii="Calibri" w:hAnsi="Calibri" w:cs="Calibri"/>
+              </w:rPr>
+              <w:t>(</w:t>
             </w:r>
             <w:r>
               <w:rPr>
@@ -3212,12 +4695,14 @@
               </w:rPr>
               <w:t>.</w:t>
             </w:r>
+            <w:proofErr w:type="spellStart"/>
             <w:r>
               <w:rPr>
                 <w:rFonts w:ascii="Calibri" w:hAnsi="Calibri" w:cs="Calibri"/>
               </w:rPr>
               <w:t>family_has_separate_case</w:t>
             </w:r>
+            <w:proofErr w:type="spellEnd"/>
             <w:r>
               <w:rPr>
                 <w:rFonts w:ascii="Calibri" w:hAnsi="Calibri" w:cs="Calibri"/>
@@ -3280,11 +4765,33 @@
                 <w:rFonts w:ascii="Calibri" w:hAnsi="Calibri" w:cs="Calibri"/>
               </w:rPr>
             </w:pPr>
-            <w:r>
-              <w:rPr>
-                <w:rFonts w:ascii="Calibri" w:hAnsi="Calibri" w:cs="Calibri"/>
-              </w:rPr>
-              <w:t>{{ output_checkbox(</w:t>
+            <w:proofErr w:type="gramStart"/>
+            <w:r>
+              <w:rPr>
+                <w:rFonts w:ascii="Calibri" w:hAnsi="Calibri" w:cs="Calibri"/>
+              </w:rPr>
+              <w:t xml:space="preserve">{{ </w:t>
+            </w:r>
+            <w:proofErr w:type="spellStart"/>
+            <w:r>
+              <w:rPr>
+                <w:rFonts w:ascii="Calibri" w:hAnsi="Calibri" w:cs="Calibri"/>
+              </w:rPr>
+              <w:t>output</w:t>
+            </w:r>
+            <w:proofErr w:type="gramEnd"/>
+            <w:r>
+              <w:rPr>
+                <w:rFonts w:ascii="Calibri" w:hAnsi="Calibri" w:cs="Calibri"/>
+              </w:rPr>
+              <w:t>_checkbox</w:t>
+            </w:r>
+            <w:proofErr w:type="spellEnd"/>
+            <w:r>
+              <w:rPr>
+                <w:rFonts w:ascii="Calibri" w:hAnsi="Calibri" w:cs="Calibri"/>
+              </w:rPr>
+              <w:t>(</w:t>
             </w:r>
             <w:r>
               <w:rPr>
@@ -3298,12 +4805,14 @@
               </w:rPr>
               <w:t>.</w:t>
             </w:r>
+            <w:proofErr w:type="spellStart"/>
             <w:r>
               <w:rPr>
                 <w:rFonts w:ascii="Calibri" w:hAnsi="Calibri" w:cs="Calibri"/>
               </w:rPr>
               <w:t>wants_separate_case</w:t>
             </w:r>
+            <w:proofErr w:type="spellEnd"/>
             <w:r>
               <w:rPr>
                 <w:rFonts w:ascii="Calibri" w:hAnsi="Calibri" w:cs="Calibri"/>
@@ -3320,7 +4829,7 @@
               <w:rPr>
                 <w:rFonts w:ascii="Calibri" w:hAnsi="Calibri" w:cs="Calibri"/>
               </w:rPr>
-              <w:t xml:space="preserve"> Who? </w:t>
+              <w:t xml:space="preserve">  </w:t>
             </w:r>
           </w:p>
           <w:p>
@@ -3334,13 +4843,35 @@
               <w:rPr>
                 <w:rFonts w:ascii="Calibri" w:hAnsi="Calibri" w:cs="Calibri"/>
               </w:rPr>
+              <w:t xml:space="preserve">Separate case from: </w:t>
+            </w:r>
+            <w:proofErr w:type="gramStart"/>
+            <w:r>
+              <w:rPr>
+                <w:rFonts w:ascii="Calibri" w:hAnsi="Calibri" w:cs="Calibri"/>
+              </w:rPr>
               <w:t xml:space="preserve">{{ </w:t>
             </w:r>
-            <w:r>
-              <w:rPr>
-                <w:rFonts w:ascii="Calibri" w:hAnsi="Calibri" w:cs="Calibri"/>
-              </w:rPr>
-              <w:t>comma_list(</w:t>
+            <w:proofErr w:type="spellStart"/>
+            <w:r>
+              <w:rPr>
+                <w:rFonts w:ascii="Calibri" w:hAnsi="Calibri" w:cs="Calibri"/>
+              </w:rPr>
+              <w:t>comma</w:t>
+            </w:r>
+            <w:proofErr w:type="gramEnd"/>
+            <w:r>
+              <w:rPr>
+                <w:rFonts w:ascii="Calibri" w:hAnsi="Calibri" w:cs="Calibri"/>
+              </w:rPr>
+              <w:t>_list</w:t>
+            </w:r>
+            <w:proofErr w:type="spellEnd"/>
+            <w:r>
+              <w:rPr>
+                <w:rFonts w:ascii="Calibri" w:hAnsi="Calibri" w:cs="Calibri"/>
+              </w:rPr>
+              <w:t>(</w:t>
             </w:r>
             <w:r>
               <w:rPr>
@@ -3354,12 +4885,14 @@
               </w:rPr>
               <w:t>.</w:t>
             </w:r>
+            <w:proofErr w:type="spellStart"/>
             <w:r>
               <w:rPr>
                 <w:rFonts w:ascii="Calibri" w:hAnsi="Calibri" w:cs="Calibri"/>
               </w:rPr>
               <w:t>separate_case_name_list</w:t>
             </w:r>
+            <w:proofErr w:type="spellEnd"/>
             <w:r>
               <w:rPr>
                 <w:rFonts w:ascii="Calibri" w:hAnsi="Calibri" w:cs="Calibri"/>
@@ -3380,11 +4913,33 @@
                 <w:rFonts w:ascii="Calibri" w:hAnsi="Calibri" w:cs="Calibri"/>
               </w:rPr>
             </w:pPr>
-            <w:r>
-              <w:rPr>
-                <w:rFonts w:ascii="Calibri" w:hAnsi="Calibri" w:cs="Calibri"/>
-              </w:rPr>
-              <w:t>{{ output_checkbox(</w:t>
+            <w:proofErr w:type="gramStart"/>
+            <w:r>
+              <w:rPr>
+                <w:rFonts w:ascii="Calibri" w:hAnsi="Calibri" w:cs="Calibri"/>
+              </w:rPr>
+              <w:t xml:space="preserve">{{ </w:t>
+            </w:r>
+            <w:proofErr w:type="spellStart"/>
+            <w:r>
+              <w:rPr>
+                <w:rFonts w:ascii="Calibri" w:hAnsi="Calibri" w:cs="Calibri"/>
+              </w:rPr>
+              <w:t>output</w:t>
+            </w:r>
+            <w:proofErr w:type="gramEnd"/>
+            <w:r>
+              <w:rPr>
+                <w:rFonts w:ascii="Calibri" w:hAnsi="Calibri" w:cs="Calibri"/>
+              </w:rPr>
+              <w:t>_checkbox</w:t>
+            </w:r>
+            <w:proofErr w:type="spellEnd"/>
+            <w:r>
+              <w:rPr>
+                <w:rFonts w:ascii="Calibri" w:hAnsi="Calibri" w:cs="Calibri"/>
+              </w:rPr>
+              <w:t>(</w:t>
             </w:r>
             <w:r>
               <w:rPr>
@@ -3416,12 +4971,14 @@
               </w:rPr>
               <w:t>.</w:t>
             </w:r>
+            <w:proofErr w:type="spellStart"/>
             <w:r>
               <w:rPr>
                 <w:rFonts w:ascii="Calibri" w:hAnsi="Calibri" w:cs="Calibri"/>
               </w:rPr>
               <w:t>wants_separate_case</w:t>
             </w:r>
+            <w:proofErr w:type="spellEnd"/>
             <w:r>
               <w:rPr>
                 <w:rFonts w:ascii="Calibri" w:hAnsi="Calibri" w:cs="Calibri"/>
@@ -3484,11 +5041,33 @@
                 <w:rFonts w:ascii="Calibri" w:hAnsi="Calibri" w:cs="Calibri"/>
               </w:rPr>
             </w:pPr>
-            <w:r>
-              <w:rPr>
-                <w:rFonts w:ascii="Calibri" w:hAnsi="Calibri" w:cs="Calibri"/>
-              </w:rPr>
-              <w:t>{{ output_checkbox(</w:t>
+            <w:proofErr w:type="gramStart"/>
+            <w:r>
+              <w:rPr>
+                <w:rFonts w:ascii="Calibri" w:hAnsi="Calibri" w:cs="Calibri"/>
+              </w:rPr>
+              <w:t xml:space="preserve">{{ </w:t>
+            </w:r>
+            <w:proofErr w:type="spellStart"/>
+            <w:r>
+              <w:rPr>
+                <w:rFonts w:ascii="Calibri" w:hAnsi="Calibri" w:cs="Calibri"/>
+              </w:rPr>
+              <w:t>output</w:t>
+            </w:r>
+            <w:proofErr w:type="gramEnd"/>
+            <w:r>
+              <w:rPr>
+                <w:rFonts w:ascii="Calibri" w:hAnsi="Calibri" w:cs="Calibri"/>
+              </w:rPr>
+              <w:t>_checkbox</w:t>
+            </w:r>
+            <w:proofErr w:type="spellEnd"/>
+            <w:r>
+              <w:rPr>
+                <w:rFonts w:ascii="Calibri" w:hAnsi="Calibri" w:cs="Calibri"/>
+              </w:rPr>
+              <w:t>(</w:t>
             </w:r>
             <w:r>
               <w:rPr>
@@ -3502,12 +5081,14 @@
               </w:rPr>
               <w:t>.</w:t>
             </w:r>
+            <w:proofErr w:type="spellStart"/>
             <w:r>
               <w:rPr>
                 <w:rFonts w:ascii="Calibri" w:hAnsi="Calibri" w:cs="Calibri"/>
               </w:rPr>
               <w:t>looked_for_attorney</w:t>
             </w:r>
+            <w:proofErr w:type="spellEnd"/>
             <w:r>
               <w:rPr>
                 <w:rFonts w:ascii="Calibri" w:hAnsi="Calibri" w:cs="Calibri"/>
@@ -3528,11 +5109,33 @@
                 <w:rFonts w:ascii="Calibri" w:hAnsi="Calibri" w:cs="Calibri"/>
               </w:rPr>
             </w:pPr>
-            <w:r>
-              <w:rPr>
-                <w:rFonts w:ascii="Calibri" w:hAnsi="Calibri" w:cs="Calibri"/>
-              </w:rPr>
-              <w:t>{{ users[0].looked_for_attorney_details}}</w:t>
+            <w:proofErr w:type="gramStart"/>
+            <w:r>
+              <w:rPr>
+                <w:rFonts w:ascii="Calibri" w:hAnsi="Calibri" w:cs="Calibri"/>
+              </w:rPr>
+              <w:t>{{ users</w:t>
+            </w:r>
+            <w:proofErr w:type="gramEnd"/>
+            <w:r>
+              <w:rPr>
+                <w:rFonts w:ascii="Calibri" w:hAnsi="Calibri" w:cs="Calibri"/>
+              </w:rPr>
+              <w:t>[0].</w:t>
+            </w:r>
+            <w:proofErr w:type="spellStart"/>
+            <w:r>
+              <w:rPr>
+                <w:rFonts w:ascii="Calibri" w:hAnsi="Calibri" w:cs="Calibri"/>
+              </w:rPr>
+              <w:t>looked_for_attorney_details</w:t>
+            </w:r>
+            <w:proofErr w:type="spellEnd"/>
+            <w:r>
+              <w:rPr>
+                <w:rFonts w:ascii="Calibri" w:hAnsi="Calibri" w:cs="Calibri"/>
+              </w:rPr>
+              <w:t>}}</w:t>
             </w:r>
           </w:p>
           <w:p>
@@ -3542,11 +5145,33 @@
                 <w:rFonts w:ascii="Calibri" w:hAnsi="Calibri" w:cs="Calibri"/>
               </w:rPr>
             </w:pPr>
-            <w:r>
-              <w:rPr>
-                <w:rFonts w:ascii="Calibri" w:hAnsi="Calibri" w:cs="Calibri"/>
-              </w:rPr>
-              <w:t>{{ output_checkbox(</w:t>
+            <w:proofErr w:type="gramStart"/>
+            <w:r>
+              <w:rPr>
+                <w:rFonts w:ascii="Calibri" w:hAnsi="Calibri" w:cs="Calibri"/>
+              </w:rPr>
+              <w:t xml:space="preserve">{{ </w:t>
+            </w:r>
+            <w:proofErr w:type="spellStart"/>
+            <w:r>
+              <w:rPr>
+                <w:rFonts w:ascii="Calibri" w:hAnsi="Calibri" w:cs="Calibri"/>
+              </w:rPr>
+              <w:t>output</w:t>
+            </w:r>
+            <w:proofErr w:type="gramEnd"/>
+            <w:r>
+              <w:rPr>
+                <w:rFonts w:ascii="Calibri" w:hAnsi="Calibri" w:cs="Calibri"/>
+              </w:rPr>
+              <w:t>_checkbox</w:t>
+            </w:r>
+            <w:proofErr w:type="spellEnd"/>
+            <w:r>
+              <w:rPr>
+                <w:rFonts w:ascii="Calibri" w:hAnsi="Calibri" w:cs="Calibri"/>
+              </w:rPr>
+              <w:t>(</w:t>
             </w:r>
             <w:r>
               <w:rPr>
@@ -3566,12 +5191,14 @@
               </w:rPr>
               <w:t>.</w:t>
             </w:r>
+            <w:proofErr w:type="spellStart"/>
             <w:r>
               <w:rPr>
                 <w:rFonts w:ascii="Calibri" w:hAnsi="Calibri" w:cs="Calibri"/>
               </w:rPr>
               <w:t>looked_for_attorney</w:t>
             </w:r>
+            <w:proofErr w:type="spellEnd"/>
             <w:r>
               <w:rPr>
                 <w:rFonts w:ascii="Calibri" w:hAnsi="Calibri" w:cs="Calibri"/>
@@ -3622,11 +5249,33 @@
                 <w:rFonts w:ascii="Calibri" w:hAnsi="Calibri" w:cs="Calibri"/>
               </w:rPr>
             </w:pPr>
-            <w:r>
-              <w:rPr>
-                <w:rFonts w:ascii="Calibri" w:hAnsi="Calibri" w:cs="Calibri"/>
-              </w:rPr>
-              <w:t>{{ users[0].additional_notes}}</w:t>
+            <w:proofErr w:type="gramStart"/>
+            <w:r>
+              <w:rPr>
+                <w:rFonts w:ascii="Calibri" w:hAnsi="Calibri" w:cs="Calibri"/>
+              </w:rPr>
+              <w:t>{{ users</w:t>
+            </w:r>
+            <w:proofErr w:type="gramEnd"/>
+            <w:r>
+              <w:rPr>
+                <w:rFonts w:ascii="Calibri" w:hAnsi="Calibri" w:cs="Calibri"/>
+              </w:rPr>
+              <w:t>[0].</w:t>
+            </w:r>
+            <w:proofErr w:type="spellStart"/>
+            <w:r>
+              <w:rPr>
+                <w:rFonts w:ascii="Calibri" w:hAnsi="Calibri" w:cs="Calibri"/>
+              </w:rPr>
+              <w:t>additional_notes</w:t>
+            </w:r>
+            <w:proofErr w:type="spellEnd"/>
+            <w:r>
+              <w:rPr>
+                <w:rFonts w:ascii="Calibri" w:hAnsi="Calibri" w:cs="Calibri"/>
+              </w:rPr>
+              <w:t>}}</w:t>
             </w:r>
           </w:p>
         </w:tc>
@@ -6334,6 +7983,7 @@
   <w:style w:type="character" w:default="1" w:styleId="DefaultParagraphFont">
     <w:name w:val="Default Paragraph Font"/>
     <w:uiPriority w:val="1"/>
+    <w:semiHidden/>
     <w:unhideWhenUsed/>
   </w:style>
   <w:style w:type="table" w:default="1" w:styleId="TableNormal">
@@ -7141,26 +8791,6 @@
 </file>
 
 <file path=customXml/item1.xml><?xml version="1.0" encoding="utf-8"?>
-<?mso-contentType ?>
-<FormTemplates xmlns="http://schemas.microsoft.com/sharepoint/v3/contenttype/forms">
-  <Display>DocumentLibraryForm</Display>
-  <Edit>DocumentLibraryForm</Edit>
-  <New>DocumentLibraryForm</New>
-</FormTemplates>
-</file>
-
-<file path=customXml/item2.xml><?xml version="1.0" encoding="utf-8"?>
-<p:properties xmlns:p="http://schemas.microsoft.com/office/2006/metadata/properties" xmlns:xsi="http://www.w3.org/2001/XMLSchema-instance" xmlns:pc="http://schemas.microsoft.com/office/infopath/2007/PartnerControls">
-  <documentManagement>
-    <TaxCatchAll xmlns="63cf8f5e-9a9d-4cda-a6f1-06d9c3ed1b56" xsi:nil="true"/>
-    <lcf76f155ced4ddcb4097134ff3c332f xmlns="80f56af5-a235-4a30-ba2c-31a6d000d72b">
-      <Terms xmlns="http://schemas.microsoft.com/office/infopath/2007/PartnerControls"/>
-    </lcf76f155ced4ddcb4097134ff3c332f>
-  </documentManagement>
-</p:properties>
-</file>
-
-<file path=customXml/item3.xml><?xml version="1.0" encoding="utf-8"?>
 <ct:contentTypeSchema xmlns:ct="http://schemas.microsoft.com/office/2006/metadata/contentType" xmlns:ma="http://schemas.microsoft.com/office/2006/metadata/properties/metaAttributes" ct:_="" ma:_="" ma:contentTypeName="Document" ma:contentTypeID="0x0101008F950FA22BD11B439EF2FCEDF7FF0976" ma:contentTypeVersion="12" ma:contentTypeDescription="Create a new document." ma:contentTypeScope="" ma:versionID="38a263841e6eb95b201700ac59630ea1">
   <xsd:schema xmlns:xsd="http://www.w3.org/2001/XMLSchema" xmlns:xs="http://www.w3.org/2001/XMLSchema" xmlns:p="http://schemas.microsoft.com/office/2006/metadata/properties" xmlns:ns2="80f56af5-a235-4a30-ba2c-31a6d000d72b" xmlns:ns3="63cf8f5e-9a9d-4cda-a6f1-06d9c3ed1b56" targetNamespace="http://schemas.microsoft.com/office/2006/metadata/properties" ma:root="true" ma:fieldsID="22a8da6c9b6d44ed7cdad6a9be670acd" ns2:_="" ns3:_="">
     <xsd:import namespace="80f56af5-a235-4a30-ba2c-31a6d000d72b"/>
@@ -7361,10 +8991,41 @@
 </ct:contentTypeSchema>
 </file>
 
+<file path=customXml/item2.xml><?xml version="1.0" encoding="utf-8"?>
+<p:properties xmlns:p="http://schemas.microsoft.com/office/2006/metadata/properties" xmlns:xsi="http://www.w3.org/2001/XMLSchema-instance" xmlns:pc="http://schemas.microsoft.com/office/infopath/2007/PartnerControls">
+  <documentManagement>
+    <TaxCatchAll xmlns="63cf8f5e-9a9d-4cda-a6f1-06d9c3ed1b56" xsi:nil="true"/>
+    <lcf76f155ced4ddcb4097134ff3c332f xmlns="80f56af5-a235-4a30-ba2c-31a6d000d72b">
+      <Terms xmlns="http://schemas.microsoft.com/office/infopath/2007/PartnerControls"/>
+    </lcf76f155ced4ddcb4097134ff3c332f>
+  </documentManagement>
+</p:properties>
+</file>
+
+<file path=customXml/item3.xml><?xml version="1.0" encoding="utf-8"?>
+<?mso-contentType ?>
+<FormTemplates xmlns="http://schemas.microsoft.com/sharepoint/v3/contenttype/forms">
+  <Display>DocumentLibraryForm</Display>
+  <Edit>DocumentLibraryForm</Edit>
+  <New>DocumentLibraryForm</New>
+</FormTemplates>
+</file>
+
 <file path=customXml/itemProps1.xml><?xml version="1.0" encoding="utf-8"?>
-<ds:datastoreItem xmlns:ds="http://schemas.openxmlformats.org/officeDocument/2006/customXml" ds:itemID="{B3360DED-8045-43BC-A3F1-77FB7861BCDC}">
+<ds:datastoreItem xmlns:ds="http://schemas.openxmlformats.org/officeDocument/2006/customXml" ds:itemID="{C2CE9F26-E80A-48F8-9E72-0BA6AFEE532E}">
   <ds:schemaRefs>
-    <ds:schemaRef ds:uri="http://schemas.microsoft.com/sharepoint/v3/contenttype/forms"/>
+    <ds:schemaRef ds:uri="http://schemas.microsoft.com/office/2006/metadata/contentType"/>
+    <ds:schemaRef ds:uri="http://schemas.microsoft.com/office/2006/metadata/properties/metaAttributes"/>
+    <ds:schemaRef ds:uri="http://www.w3.org/2001/XMLSchema"/>
+    <ds:schemaRef ds:uri="http://schemas.microsoft.com/office/2006/metadata/properties"/>
+    <ds:schemaRef ds:uri="80f56af5-a235-4a30-ba2c-31a6d000d72b"/>
+    <ds:schemaRef ds:uri="63cf8f5e-9a9d-4cda-a6f1-06d9c3ed1b56"/>
+    <ds:schemaRef ds:uri="http://schemas.microsoft.com/office/2006/documentManagement/types"/>
+    <ds:schemaRef ds:uri="http://schemas.microsoft.com/office/infopath/2007/PartnerControls"/>
+    <ds:schemaRef ds:uri="http://schemas.openxmlformats.org/package/2006/metadata/core-properties"/>
+    <ds:schemaRef ds:uri="http://purl.org/dc/elements/1.1/"/>
+    <ds:schemaRef ds:uri="http://purl.org/dc/terms/"/>
+    <ds:schemaRef ds:uri="http://schemas.microsoft.com/internal/obd"/>
   </ds:schemaRefs>
 </ds:datastoreItem>
 </file>
@@ -7381,20 +9042,9 @@
 </file>
 
 <file path=customXml/itemProps3.xml><?xml version="1.0" encoding="utf-8"?>
-<ds:datastoreItem xmlns:ds="http://schemas.openxmlformats.org/officeDocument/2006/customXml" ds:itemID="{C2CE9F26-E80A-48F8-9E72-0BA6AFEE532E}">
+<ds:datastoreItem xmlns:ds="http://schemas.openxmlformats.org/officeDocument/2006/customXml" ds:itemID="{B3360DED-8045-43BC-A3F1-77FB7861BCDC}">
   <ds:schemaRefs>
-    <ds:schemaRef ds:uri="http://schemas.microsoft.com/office/2006/metadata/contentType"/>
-    <ds:schemaRef ds:uri="http://schemas.microsoft.com/office/2006/metadata/properties/metaAttributes"/>
-    <ds:schemaRef ds:uri="http://www.w3.org/2001/XMLSchema"/>
-    <ds:schemaRef ds:uri="http://schemas.microsoft.com/office/2006/metadata/properties"/>
-    <ds:schemaRef ds:uri="80f56af5-a235-4a30-ba2c-31a6d000d72b"/>
-    <ds:schemaRef ds:uri="63cf8f5e-9a9d-4cda-a6f1-06d9c3ed1b56"/>
-    <ds:schemaRef ds:uri="http://schemas.microsoft.com/office/2006/documentManagement/types"/>
-    <ds:schemaRef ds:uri="http://schemas.microsoft.com/office/infopath/2007/PartnerControls"/>
-    <ds:schemaRef ds:uri="http://schemas.openxmlformats.org/package/2006/metadata/core-properties"/>
-    <ds:schemaRef ds:uri="http://purl.org/dc/elements/1.1/"/>
-    <ds:schemaRef ds:uri="http://purl.org/dc/terms/"/>
-    <ds:schemaRef ds:uri="http://schemas.microsoft.com/internal/obd"/>
+    <ds:schemaRef ds:uri="http://schemas.microsoft.com/sharepoint/v3/contenttype/forms"/>
   </ds:schemaRefs>
 </ds:datastoreItem>
 </file>
</xml_diff>

<commit_message>
Fixed the broken endif in DOCX.
</commit_message>
<xml_diff>
--- a/docassemble/USCISApplications/data/templates/Court_Accompaniment_Intake.docx
+++ b/docassemble/USCISApplications/data/templates/Court_Accompaniment_Intake.docx
@@ -99,6 +99,7 @@
         </w:rPr>
         <w:t xml:space="preserve">Name of volunteer/staff: </w:t>
       </w:r>
+      <w:proofErr w:type="gramStart"/>
       <w:r>
         <w:rPr>
           <w:rFonts w:ascii="Calibri" w:eastAsia="Arial" w:hAnsi="Calibri" w:cs="Calibri"/>
@@ -109,6 +110,7 @@
         </w:rPr>
         <w:t xml:space="preserve">{{ </w:t>
       </w:r>
+      <w:proofErr w:type="spellStart"/>
       <w:r>
         <w:rPr>
           <w:rFonts w:ascii="Calibri" w:eastAsia="Arial" w:hAnsi="Calibri" w:cs="Calibri"/>
@@ -117,7 +119,29 @@
           <w:sz w:val="22"/>
           <w:szCs w:val="22"/>
         </w:rPr>
-        <w:t>screener.name_full()</w:t>
+        <w:t>screener.name</w:t>
+      </w:r>
+      <w:proofErr w:type="gramEnd"/>
+      <w:r>
+        <w:rPr>
+          <w:rFonts w:ascii="Calibri" w:eastAsia="Arial" w:hAnsi="Calibri" w:cs="Calibri"/>
+          <w:b/>
+          <w:bCs/>
+          <w:sz w:val="22"/>
+          <w:szCs w:val="22"/>
+        </w:rPr>
+        <w:t>_full</w:t>
+      </w:r>
+      <w:proofErr w:type="spellEnd"/>
+      <w:r>
+        <w:rPr>
+          <w:rFonts w:ascii="Calibri" w:eastAsia="Arial" w:hAnsi="Calibri" w:cs="Calibri"/>
+          <w:b/>
+          <w:bCs/>
+          <w:sz w:val="22"/>
+          <w:szCs w:val="22"/>
+        </w:rPr>
+        <w:t>()</w:t>
       </w:r>
       <w:r>
         <w:rPr>
@@ -180,6 +204,7 @@
         </w:rPr>
         <w:t xml:space="preserve">Hearing Date: </w:t>
       </w:r>
+      <w:proofErr w:type="gramStart"/>
       <w:r>
         <w:rPr>
           <w:rFonts w:ascii="Calibri" w:eastAsia="Calibri" w:hAnsi="Calibri" w:cs="Calibri"/>
@@ -188,7 +213,62 @@
           <w:sz w:val="22"/>
           <w:szCs w:val="22"/>
         </w:rPr>
-        <w:t>{{ users[0].hearing_date.format('MM/dd/yyyy') }}</w:t>
+        <w:t>{{ users</w:t>
+      </w:r>
+      <w:proofErr w:type="gramEnd"/>
+      <w:r>
+        <w:rPr>
+          <w:rFonts w:ascii="Calibri" w:eastAsia="Calibri" w:hAnsi="Calibri" w:cs="Calibri"/>
+          <w:b/>
+          <w:bCs/>
+          <w:sz w:val="22"/>
+          <w:szCs w:val="22"/>
+        </w:rPr>
+        <w:t>[0].</w:t>
+      </w:r>
+      <w:proofErr w:type="spellStart"/>
+      <w:r>
+        <w:rPr>
+          <w:rFonts w:ascii="Calibri" w:eastAsia="Calibri" w:hAnsi="Calibri" w:cs="Calibri"/>
+          <w:b/>
+          <w:bCs/>
+          <w:sz w:val="22"/>
+          <w:szCs w:val="22"/>
+        </w:rPr>
+        <w:t>hearing_date.format</w:t>
+      </w:r>
+      <w:proofErr w:type="spellEnd"/>
+      <w:r>
+        <w:rPr>
+          <w:rFonts w:ascii="Calibri" w:eastAsia="Calibri" w:hAnsi="Calibri" w:cs="Calibri"/>
+          <w:b/>
+          <w:bCs/>
+          <w:sz w:val="22"/>
+          <w:szCs w:val="22"/>
+        </w:rPr>
+        <w:t>('MM/dd/</w:t>
+      </w:r>
+      <w:proofErr w:type="spellStart"/>
+      <w:r>
+        <w:rPr>
+          <w:rFonts w:ascii="Calibri" w:eastAsia="Calibri" w:hAnsi="Calibri" w:cs="Calibri"/>
+          <w:b/>
+          <w:bCs/>
+          <w:sz w:val="22"/>
+          <w:szCs w:val="22"/>
+        </w:rPr>
+        <w:t>yyyy</w:t>
+      </w:r>
+      <w:proofErr w:type="spellEnd"/>
+      <w:r>
+        <w:rPr>
+          <w:rFonts w:ascii="Calibri" w:eastAsia="Calibri" w:hAnsi="Calibri" w:cs="Calibri"/>
+          <w:b/>
+          <w:bCs/>
+          <w:sz w:val="22"/>
+          <w:szCs w:val="22"/>
+        </w:rPr>
+        <w:t>') }}</w:t>
       </w:r>
       <w:r>
         <w:rPr>
@@ -221,6 +301,7 @@
         </w:rPr>
         <w:t xml:space="preserve">{{ </w:t>
       </w:r>
+      <w:proofErr w:type="spellStart"/>
       <w:r>
         <w:rPr>
           <w:rFonts w:ascii="Calibri" w:eastAsia="Calibri" w:hAnsi="Calibri" w:cs="Calibri"/>
@@ -229,7 +310,18 @@
           <w:sz w:val="22"/>
           <w:szCs w:val="22"/>
         </w:rPr>
-        <w:t>format_time(</w:t>
+        <w:t>format_time</w:t>
+      </w:r>
+      <w:proofErr w:type="spellEnd"/>
+      <w:r>
+        <w:rPr>
+          <w:rFonts w:ascii="Calibri" w:eastAsia="Calibri" w:hAnsi="Calibri" w:cs="Calibri"/>
+          <w:b/>
+          <w:bCs/>
+          <w:sz w:val="22"/>
+          <w:szCs w:val="22"/>
+        </w:rPr>
+        <w:t>(</w:t>
       </w:r>
       <w:r>
         <w:rPr>
@@ -239,8 +331,9 @@
           <w:sz w:val="22"/>
           <w:szCs w:val="22"/>
         </w:rPr>
-        <w:t>users[0].hearing_time</w:t>
+        <w:t>users[0].</w:t>
       </w:r>
+      <w:proofErr w:type="spellStart"/>
       <w:r>
         <w:rPr>
           <w:rFonts w:ascii="Calibri" w:eastAsia="Calibri" w:hAnsi="Calibri" w:cs="Calibri"/>
@@ -249,7 +342,40 @@
           <w:sz w:val="22"/>
           <w:szCs w:val="22"/>
         </w:rPr>
-        <w:t>, format='h:mm a')</w:t>
+        <w:t>hearing_time</w:t>
+      </w:r>
+      <w:proofErr w:type="spellEnd"/>
+      <w:r>
+        <w:rPr>
+          <w:rFonts w:ascii="Calibri" w:eastAsia="Calibri" w:hAnsi="Calibri" w:cs="Calibri"/>
+          <w:b/>
+          <w:bCs/>
+          <w:sz w:val="22"/>
+          <w:szCs w:val="22"/>
+        </w:rPr>
+        <w:t>, format='</w:t>
+      </w:r>
+      <w:proofErr w:type="spellStart"/>
+      <w:r>
+        <w:rPr>
+          <w:rFonts w:ascii="Calibri" w:eastAsia="Calibri" w:hAnsi="Calibri" w:cs="Calibri"/>
+          <w:b/>
+          <w:bCs/>
+          <w:sz w:val="22"/>
+          <w:szCs w:val="22"/>
+        </w:rPr>
+        <w:t>h:mm</w:t>
+      </w:r>
+      <w:proofErr w:type="spellEnd"/>
+      <w:r>
+        <w:rPr>
+          <w:rFonts w:ascii="Calibri" w:eastAsia="Calibri" w:hAnsi="Calibri" w:cs="Calibri"/>
+          <w:b/>
+          <w:bCs/>
+          <w:sz w:val="22"/>
+          <w:szCs w:val="22"/>
+        </w:rPr>
+        <w:t xml:space="preserve"> a')</w:t>
       </w:r>
       <w:r>
         <w:rPr>
@@ -302,6 +428,7 @@
         </w:rPr>
         <w:t xml:space="preserve">Immigration Judge: </w:t>
       </w:r>
+      <w:proofErr w:type="gramStart"/>
       <w:r>
         <w:rPr>
           <w:rFonts w:ascii="Calibri" w:eastAsia="Calibri" w:hAnsi="Calibri" w:cs="Calibri"/>
@@ -310,7 +437,40 @@
           <w:sz w:val="22"/>
           <w:szCs w:val="22"/>
         </w:rPr>
-        <w:t>{{ immigration_judge.name_full() }}</w:t>
+        <w:t xml:space="preserve">{{ </w:t>
+      </w:r>
+      <w:proofErr w:type="spellStart"/>
+      <w:r>
+        <w:rPr>
+          <w:rFonts w:ascii="Calibri" w:eastAsia="Calibri" w:hAnsi="Calibri" w:cs="Calibri"/>
+          <w:b/>
+          <w:bCs/>
+          <w:sz w:val="22"/>
+          <w:szCs w:val="22"/>
+        </w:rPr>
+        <w:t>immigration_judge.name</w:t>
+      </w:r>
+      <w:proofErr w:type="gramEnd"/>
+      <w:r>
+        <w:rPr>
+          <w:rFonts w:ascii="Calibri" w:eastAsia="Calibri" w:hAnsi="Calibri" w:cs="Calibri"/>
+          <w:b/>
+          <w:bCs/>
+          <w:sz w:val="22"/>
+          <w:szCs w:val="22"/>
+        </w:rPr>
+        <w:t>_full</w:t>
+      </w:r>
+      <w:proofErr w:type="spellEnd"/>
+      <w:r>
+        <w:rPr>
+          <w:rFonts w:ascii="Calibri" w:eastAsia="Calibri" w:hAnsi="Calibri" w:cs="Calibri"/>
+          <w:b/>
+          <w:bCs/>
+          <w:sz w:val="22"/>
+          <w:szCs w:val="22"/>
+        </w:rPr>
+        <w:t>() }}</w:t>
       </w:r>
     </w:p>
     <w:p>
@@ -351,8 +511,63 @@
           <w:sz w:val="22"/>
           <w:szCs w:val="22"/>
         </w:rPr>
-        <w:t xml:space="preserve"> if not users[0].has_riders %}</w:t>
+        <w:t xml:space="preserve"> if not </w:t>
       </w:r>
+      <w:proofErr w:type="gramStart"/>
+      <w:r>
+        <w:rPr>
+          <w:rFonts w:ascii="Calibri" w:eastAsia="Calibri" w:hAnsi="Calibri" w:cs="Calibri"/>
+          <w:b/>
+          <w:bCs/>
+          <w:sz w:val="22"/>
+          <w:szCs w:val="22"/>
+        </w:rPr>
+        <w:t>users[</w:t>
+      </w:r>
+      <w:proofErr w:type="gramEnd"/>
+      <w:r>
+        <w:rPr>
+          <w:rFonts w:ascii="Calibri" w:eastAsia="Calibri" w:hAnsi="Calibri" w:cs="Calibri"/>
+          <w:b/>
+          <w:bCs/>
+          <w:sz w:val="22"/>
+          <w:szCs w:val="22"/>
+        </w:rPr>
+        <w:t>0].</w:t>
+      </w:r>
+      <w:proofErr w:type="spellStart"/>
+      <w:r>
+        <w:rPr>
+          <w:rFonts w:ascii="Calibri" w:eastAsia="Calibri" w:hAnsi="Calibri" w:cs="Calibri"/>
+          <w:b/>
+          <w:bCs/>
+          <w:sz w:val="22"/>
+          <w:szCs w:val="22"/>
+        </w:rPr>
+        <w:t>has_riders</w:t>
+      </w:r>
+      <w:proofErr w:type="spellEnd"/>
+      <w:r>
+        <w:rPr>
+          <w:rFonts w:ascii="Calibri" w:eastAsia="Calibri" w:hAnsi="Calibri" w:cs="Calibri"/>
+          <w:b/>
+          <w:bCs/>
+          <w:sz w:val="22"/>
+          <w:szCs w:val="22"/>
+        </w:rPr>
+        <w:t xml:space="preserve"> %}</w:t>
+      </w:r>
+    </w:p>
+    <w:p>
+      <w:pPr>
+        <w:rPr>
+          <w:rFonts w:ascii="Calibri" w:eastAsia="Calibri" w:hAnsi="Calibri" w:cs="Calibri"/>
+          <w:b/>
+          <w:bCs/>
+          <w:sz w:val="22"/>
+          <w:szCs w:val="22"/>
+        </w:rPr>
+      </w:pPr>
       <w:r>
         <w:rPr>
           <w:rFonts w:ascii="Calibri" w:eastAsia="Calibri" w:hAnsi="Calibri" w:cs="Calibri"/>
@@ -371,7 +586,48 @@
           <w:sz w:val="22"/>
           <w:szCs w:val="22"/>
         </w:rPr>
-        <w:t>N/A{% endif %}</w:t>
+        <w:t>N/A</w:t>
+      </w:r>
+    </w:p>
+    <w:p>
+      <w:pPr>
+        <w:rPr>
+          <w:rFonts w:ascii="Calibri" w:eastAsia="Calibri" w:hAnsi="Calibri" w:cs="Calibri"/>
+          <w:b/>
+          <w:bCs/>
+          <w:sz w:val="22"/>
+          <w:szCs w:val="22"/>
+        </w:rPr>
+      </w:pPr>
+      <w:r>
+        <w:rPr>
+          <w:rFonts w:ascii="Calibri" w:eastAsia="Calibri" w:hAnsi="Calibri" w:cs="Calibri"/>
+          <w:b/>
+          <w:bCs/>
+          <w:sz w:val="22"/>
+          <w:szCs w:val="22"/>
+        </w:rPr>
+        <w:t>{%</w:t>
+      </w:r>
+      <w:r>
+        <w:rPr>
+          <w:rFonts w:ascii="Calibri" w:eastAsia="Calibri" w:hAnsi="Calibri" w:cs="Calibri"/>
+          <w:b/>
+          <w:bCs/>
+          <w:sz w:val="22"/>
+          <w:szCs w:val="22"/>
+        </w:rPr>
+        <w:t>p</w:t>
+      </w:r>
+      <w:r>
+        <w:rPr>
+          <w:rFonts w:ascii="Calibri" w:eastAsia="Calibri" w:hAnsi="Calibri" w:cs="Calibri"/>
+          <w:b/>
+          <w:bCs/>
+          <w:sz w:val="22"/>
+          <w:szCs w:val="22"/>
+        </w:rPr>
+        <w:t xml:space="preserve"> endif %}</w:t>
       </w:r>
     </w:p>
     <w:p>
@@ -394,6 +650,7 @@
         </w:rPr>
         <w:t xml:space="preserve">{%p if </w:t>
       </w:r>
+      <w:proofErr w:type="gramStart"/>
       <w:r>
         <w:rPr>
           <w:rFonts w:ascii="Calibri" w:eastAsia="Calibri" w:hAnsi="Calibri" w:cs="Calibri"/>
@@ -402,8 +659,9 @@
           <w:sz w:val="22"/>
           <w:szCs w:val="22"/>
         </w:rPr>
-        <w:t>users[0].</w:t>
+        <w:t>users[</w:t>
       </w:r>
+      <w:proofErr w:type="gramEnd"/>
       <w:r>
         <w:rPr>
           <w:rFonts w:ascii="Calibri" w:eastAsia="Calibri" w:hAnsi="Calibri" w:cs="Calibri"/>
@@ -412,7 +670,29 @@
           <w:sz w:val="22"/>
           <w:szCs w:val="22"/>
         </w:rPr>
-        <w:t>has_riders %}</w:t>
+        <w:t>0].</w:t>
+      </w:r>
+      <w:proofErr w:type="spellStart"/>
+      <w:r>
+        <w:rPr>
+          <w:rFonts w:ascii="Calibri" w:eastAsia="Calibri" w:hAnsi="Calibri" w:cs="Calibri"/>
+          <w:b/>
+          <w:bCs/>
+          <w:sz w:val="22"/>
+          <w:szCs w:val="22"/>
+        </w:rPr>
+        <w:t>has_riders</w:t>
+      </w:r>
+      <w:proofErr w:type="spellEnd"/>
+      <w:r>
+        <w:rPr>
+          <w:rFonts w:ascii="Calibri" w:eastAsia="Calibri" w:hAnsi="Calibri" w:cs="Calibri"/>
+          <w:b/>
+          <w:bCs/>
+          <w:sz w:val="22"/>
+          <w:szCs w:val="22"/>
+        </w:rPr>
+        <w:t xml:space="preserve"> %}</w:t>
       </w:r>
     </w:p>
     <w:tbl>
@@ -446,13 +726,23 @@
                 <w:bCs/>
               </w:rPr>
             </w:pPr>
+            <w:proofErr w:type="spellStart"/>
             <w:r>
               <w:rPr>
                 <w:rFonts w:ascii="Calibri" w:eastAsia="Calibri" w:hAnsi="Calibri" w:cs="Calibri"/>
                 <w:b/>
                 <w:bCs/>
               </w:rPr>
-              <w:t>Additonal Riders</w:t>
+              <w:t>Additonal</w:t>
+            </w:r>
+            <w:proofErr w:type="spellEnd"/>
+            <w:r>
+              <w:rPr>
+                <w:rFonts w:ascii="Calibri" w:eastAsia="Calibri" w:hAnsi="Calibri" w:cs="Calibri"/>
+                <w:b/>
+                <w:bCs/>
+              </w:rPr>
+              <w:t xml:space="preserve"> Riders</w:t>
             </w:r>
           </w:p>
         </w:tc>
@@ -534,7 +824,21 @@
               <w:rPr>
                 <w:rFonts w:ascii="Calibri" w:eastAsia="Calibri" w:hAnsi="Calibri" w:cs="Calibri"/>
               </w:rPr>
-              <w:t>{%tr for rider in additional_riders %}</w:t>
+              <w:t xml:space="preserve">{%tr for rider in </w:t>
+            </w:r>
+            <w:proofErr w:type="spellStart"/>
+            <w:r>
+              <w:rPr>
+                <w:rFonts w:ascii="Calibri" w:eastAsia="Calibri" w:hAnsi="Calibri" w:cs="Calibri"/>
+              </w:rPr>
+              <w:t>additional_riders</w:t>
+            </w:r>
+            <w:proofErr w:type="spellEnd"/>
+            <w:r>
+              <w:rPr>
+                <w:rFonts w:ascii="Calibri" w:eastAsia="Calibri" w:hAnsi="Calibri" w:cs="Calibri"/>
+              </w:rPr>
+              <w:t xml:space="preserve"> %}</w:t>
             </w:r>
           </w:p>
         </w:tc>
@@ -577,11 +881,33 @@
                 <w:rFonts w:ascii="Calibri" w:eastAsia="Calibri" w:hAnsi="Calibri" w:cs="Calibri"/>
               </w:rPr>
             </w:pPr>
-            <w:r>
-              <w:rPr>
-                <w:rFonts w:ascii="Calibri" w:eastAsia="Calibri" w:hAnsi="Calibri" w:cs="Calibri"/>
-              </w:rPr>
-              <w:t>{{ rider.name_full() }}</w:t>
+            <w:proofErr w:type="gramStart"/>
+            <w:r>
+              <w:rPr>
+                <w:rFonts w:ascii="Calibri" w:eastAsia="Calibri" w:hAnsi="Calibri" w:cs="Calibri"/>
+              </w:rPr>
+              <w:t xml:space="preserve">{{ </w:t>
+            </w:r>
+            <w:proofErr w:type="spellStart"/>
+            <w:r>
+              <w:rPr>
+                <w:rFonts w:ascii="Calibri" w:eastAsia="Calibri" w:hAnsi="Calibri" w:cs="Calibri"/>
+              </w:rPr>
+              <w:t>rider.name</w:t>
+            </w:r>
+            <w:proofErr w:type="gramEnd"/>
+            <w:r>
+              <w:rPr>
+                <w:rFonts w:ascii="Calibri" w:eastAsia="Calibri" w:hAnsi="Calibri" w:cs="Calibri"/>
+              </w:rPr>
+              <w:t>_full</w:t>
+            </w:r>
+            <w:proofErr w:type="spellEnd"/>
+            <w:r>
+              <w:rPr>
+                <w:rFonts w:ascii="Calibri" w:eastAsia="Calibri" w:hAnsi="Calibri" w:cs="Calibri"/>
+              </w:rPr>
+              <w:t>() }}</w:t>
             </w:r>
           </w:p>
         </w:tc>
@@ -595,11 +921,33 @@
                 <w:rFonts w:ascii="Calibri" w:eastAsia="Calibri" w:hAnsi="Calibri" w:cs="Calibri"/>
               </w:rPr>
             </w:pPr>
-            <w:r>
-              <w:rPr>
-                <w:rFonts w:ascii="Calibri" w:eastAsia="Calibri" w:hAnsi="Calibri" w:cs="Calibri"/>
-              </w:rPr>
-              <w:t>{{ rider.relationship }}</w:t>
+            <w:proofErr w:type="gramStart"/>
+            <w:r>
+              <w:rPr>
+                <w:rFonts w:ascii="Calibri" w:eastAsia="Calibri" w:hAnsi="Calibri" w:cs="Calibri"/>
+              </w:rPr>
+              <w:t xml:space="preserve">{{ </w:t>
+            </w:r>
+            <w:proofErr w:type="spellStart"/>
+            <w:r>
+              <w:rPr>
+                <w:rFonts w:ascii="Calibri" w:eastAsia="Calibri" w:hAnsi="Calibri" w:cs="Calibri"/>
+              </w:rPr>
+              <w:t>rider</w:t>
+            </w:r>
+            <w:proofErr w:type="gramEnd"/>
+            <w:r>
+              <w:rPr>
+                <w:rFonts w:ascii="Calibri" w:eastAsia="Calibri" w:hAnsi="Calibri" w:cs="Calibri"/>
+              </w:rPr>
+              <w:t>.relationship</w:t>
+            </w:r>
+            <w:proofErr w:type="spellEnd"/>
+            <w:r>
+              <w:rPr>
+                <w:rFonts w:ascii="Calibri" w:eastAsia="Calibri" w:hAnsi="Calibri" w:cs="Calibri"/>
+              </w:rPr>
+              <w:t xml:space="preserve"> }}</w:t>
             </w:r>
           </w:p>
         </w:tc>
@@ -613,11 +961,33 @@
                 <w:rFonts w:ascii="Calibri" w:eastAsia="Arial" w:hAnsi="Calibri" w:cs="Calibri"/>
               </w:rPr>
             </w:pPr>
-            <w:r>
-              <w:rPr>
-                <w:rFonts w:ascii="Calibri" w:eastAsia="Calibri" w:hAnsi="Calibri" w:cs="Calibri"/>
-              </w:rPr>
-              <w:t>{{ rider.a_number }}</w:t>
+            <w:proofErr w:type="gramStart"/>
+            <w:r>
+              <w:rPr>
+                <w:rFonts w:ascii="Calibri" w:eastAsia="Calibri" w:hAnsi="Calibri" w:cs="Calibri"/>
+              </w:rPr>
+              <w:t xml:space="preserve">{{ </w:t>
+            </w:r>
+            <w:proofErr w:type="spellStart"/>
+            <w:r>
+              <w:rPr>
+                <w:rFonts w:ascii="Calibri" w:eastAsia="Calibri" w:hAnsi="Calibri" w:cs="Calibri"/>
+              </w:rPr>
+              <w:t>rider</w:t>
+            </w:r>
+            <w:proofErr w:type="gramEnd"/>
+            <w:r>
+              <w:rPr>
+                <w:rFonts w:ascii="Calibri" w:eastAsia="Calibri" w:hAnsi="Calibri" w:cs="Calibri"/>
+              </w:rPr>
+              <w:t>.a_number</w:t>
+            </w:r>
+            <w:proofErr w:type="spellEnd"/>
+            <w:r>
+              <w:rPr>
+                <w:rFonts w:ascii="Calibri" w:eastAsia="Calibri" w:hAnsi="Calibri" w:cs="Calibri"/>
+              </w:rPr>
+              <w:t xml:space="preserve"> }}</w:t>
             </w:r>
           </w:p>
         </w:tc>
@@ -640,7 +1010,21 @@
               <w:rPr>
                 <w:rFonts w:ascii="Calibri" w:eastAsia="Calibri" w:hAnsi="Calibri" w:cs="Calibri"/>
               </w:rPr>
-              <w:t>{%tr endfor %}</w:t>
+              <w:t xml:space="preserve">{%tr </w:t>
+            </w:r>
+            <w:proofErr w:type="spellStart"/>
+            <w:r>
+              <w:rPr>
+                <w:rFonts w:ascii="Calibri" w:eastAsia="Calibri" w:hAnsi="Calibri" w:cs="Calibri"/>
+              </w:rPr>
+              <w:t>endfor</w:t>
+            </w:r>
+            <w:proofErr w:type="spellEnd"/>
+            <w:r>
+              <w:rPr>
+                <w:rFonts w:ascii="Calibri" w:eastAsia="Calibri" w:hAnsi="Calibri" w:cs="Calibri"/>
+              </w:rPr>
+              <w:t xml:space="preserve"> %}</w:t>
             </w:r>
           </w:p>
         </w:tc>
@@ -775,11 +1159,19 @@
                 <w:rFonts w:ascii="Calibri" w:eastAsia="Calibri" w:hAnsi="Calibri" w:cs="Calibri"/>
               </w:rPr>
             </w:pPr>
-            <w:r>
-              <w:rPr>
-                <w:rFonts w:ascii="Calibri" w:eastAsia="Calibri" w:hAnsi="Calibri" w:cs="Calibri"/>
-              </w:rPr>
-              <w:t>{{ users[</w:t>
+            <w:proofErr w:type="gramStart"/>
+            <w:r>
+              <w:rPr>
+                <w:rFonts w:ascii="Calibri" w:eastAsia="Calibri" w:hAnsi="Calibri" w:cs="Calibri"/>
+              </w:rPr>
+              <w:t>{{ users</w:t>
+            </w:r>
+            <w:proofErr w:type="gramEnd"/>
+            <w:r>
+              <w:rPr>
+                <w:rFonts w:ascii="Calibri" w:eastAsia="Calibri" w:hAnsi="Calibri" w:cs="Calibri"/>
+              </w:rPr>
+              <w:t>[</w:t>
             </w:r>
             <w:r>
               <w:rPr>
@@ -791,7 +1183,21 @@
               <w:rPr>
                 <w:rFonts w:ascii="Calibri" w:eastAsia="Calibri" w:hAnsi="Calibri" w:cs="Calibri"/>
               </w:rPr>
-              <w:t>].name_full() }}</w:t>
+              <w:t>].</w:t>
+            </w:r>
+            <w:proofErr w:type="spellStart"/>
+            <w:r>
+              <w:rPr>
+                <w:rFonts w:ascii="Calibri" w:eastAsia="Calibri" w:hAnsi="Calibri" w:cs="Calibri"/>
+              </w:rPr>
+              <w:t>name_full</w:t>
+            </w:r>
+            <w:proofErr w:type="spellEnd"/>
+            <w:r>
+              <w:rPr>
+                <w:rFonts w:ascii="Calibri" w:eastAsia="Calibri" w:hAnsi="Calibri" w:cs="Calibri"/>
+              </w:rPr>
+              <w:t>() }}</w:t>
             </w:r>
           </w:p>
         </w:tc>
@@ -828,11 +1234,19 @@
                 <w:rFonts w:ascii="Calibri" w:eastAsia="Calibri" w:hAnsi="Calibri" w:cs="Calibri"/>
               </w:rPr>
             </w:pPr>
-            <w:r>
-              <w:rPr>
-                <w:rFonts w:ascii="Calibri" w:eastAsia="Calibri" w:hAnsi="Calibri" w:cs="Calibri"/>
-              </w:rPr>
-              <w:t>{{ users[</w:t>
+            <w:proofErr w:type="gramStart"/>
+            <w:r>
+              <w:rPr>
+                <w:rFonts w:ascii="Calibri" w:eastAsia="Calibri" w:hAnsi="Calibri" w:cs="Calibri"/>
+              </w:rPr>
+              <w:t>{{ users</w:t>
+            </w:r>
+            <w:proofErr w:type="gramEnd"/>
+            <w:r>
+              <w:rPr>
+                <w:rFonts w:ascii="Calibri" w:eastAsia="Calibri" w:hAnsi="Calibri" w:cs="Calibri"/>
+              </w:rPr>
+              <w:t>[</w:t>
             </w:r>
             <w:r>
               <w:rPr>
@@ -844,7 +1258,35 @@
               <w:rPr>
                 <w:rFonts w:ascii="Calibri" w:eastAsia="Calibri" w:hAnsi="Calibri" w:cs="Calibri"/>
               </w:rPr>
-              <w:t>].birthdate.format('MM/dd/yyyy') }}</w:t>
+              <w:t>].</w:t>
+            </w:r>
+            <w:proofErr w:type="spellStart"/>
+            <w:r>
+              <w:rPr>
+                <w:rFonts w:ascii="Calibri" w:eastAsia="Calibri" w:hAnsi="Calibri" w:cs="Calibri"/>
+              </w:rPr>
+              <w:t>birthdate.format</w:t>
+            </w:r>
+            <w:proofErr w:type="spellEnd"/>
+            <w:r>
+              <w:rPr>
+                <w:rFonts w:ascii="Calibri" w:eastAsia="Calibri" w:hAnsi="Calibri" w:cs="Calibri"/>
+              </w:rPr>
+              <w:t>('MM/dd/</w:t>
+            </w:r>
+            <w:proofErr w:type="spellStart"/>
+            <w:r>
+              <w:rPr>
+                <w:rFonts w:ascii="Calibri" w:eastAsia="Calibri" w:hAnsi="Calibri" w:cs="Calibri"/>
+              </w:rPr>
+              <w:t>yyyy</w:t>
+            </w:r>
+            <w:proofErr w:type="spellEnd"/>
+            <w:r>
+              <w:rPr>
+                <w:rFonts w:ascii="Calibri" w:eastAsia="Calibri" w:hAnsi="Calibri" w:cs="Calibri"/>
+              </w:rPr>
+              <w:t>') }}</w:t>
             </w:r>
           </w:p>
         </w:tc>
@@ -883,23 +1325,45 @@
                 <w:bCs/>
               </w:rPr>
             </w:pPr>
+            <w:proofErr w:type="gramStart"/>
             <w:r>
               <w:rPr>
                 <w:rFonts w:ascii="Calibri" w:eastAsia="Arial" w:hAnsi="Calibri" w:cs="Calibri"/>
               </w:rPr>
-              <w:t>{{ users[</w:t>
-            </w:r>
+              <w:t>{{ users</w:t>
+            </w:r>
+            <w:proofErr w:type="gramEnd"/>
             <w:r>
               <w:rPr>
                 <w:rFonts w:ascii="Calibri" w:eastAsia="Arial" w:hAnsi="Calibri" w:cs="Calibri"/>
               </w:rPr>
+              <w:t>[</w:t>
+            </w:r>
+            <w:r>
+              <w:rPr>
+                <w:rFonts w:ascii="Calibri" w:eastAsia="Arial" w:hAnsi="Calibri" w:cs="Calibri"/>
+              </w:rPr>
               <w:t>0</w:t>
             </w:r>
             <w:r>
               <w:rPr>
                 <w:rFonts w:ascii="Calibri" w:eastAsia="Arial" w:hAnsi="Calibri" w:cs="Calibri"/>
               </w:rPr>
-              <w:t>].a_number }}</w:t>
+              <w:t>].</w:t>
+            </w:r>
+            <w:proofErr w:type="spellStart"/>
+            <w:r>
+              <w:rPr>
+                <w:rFonts w:ascii="Calibri" w:eastAsia="Arial" w:hAnsi="Calibri" w:cs="Calibri"/>
+              </w:rPr>
+              <w:t>a_number</w:t>
+            </w:r>
+            <w:proofErr w:type="spellEnd"/>
+            <w:r>
+              <w:rPr>
+                <w:rFonts w:ascii="Calibri" w:eastAsia="Arial" w:hAnsi="Calibri" w:cs="Calibri"/>
+              </w:rPr>
+              <w:t xml:space="preserve"> }}</w:t>
             </w:r>
           </w:p>
         </w:tc>
@@ -936,17 +1400,33 @@
                 <w:rFonts w:ascii="Calibri" w:eastAsia="Calibri" w:hAnsi="Calibri" w:cs="Calibri"/>
               </w:rPr>
             </w:pPr>
+            <w:proofErr w:type="gramStart"/>
             <w:r>
               <w:rPr>
                 <w:rFonts w:ascii="Calibri" w:eastAsia="Calibri" w:hAnsi="Calibri" w:cs="Calibri"/>
               </w:rPr>
               <w:t xml:space="preserve">{{ </w:t>
             </w:r>
-            <w:r>
-              <w:rPr>
-                <w:rFonts w:ascii="Calibri" w:eastAsia="Calibri" w:hAnsi="Calibri" w:cs="Calibri"/>
-              </w:rPr>
-              <w:t>phone_number_formatted(</w:t>
+            <w:proofErr w:type="spellStart"/>
+            <w:r>
+              <w:rPr>
+                <w:rFonts w:ascii="Calibri" w:eastAsia="Calibri" w:hAnsi="Calibri" w:cs="Calibri"/>
+              </w:rPr>
+              <w:t>phone</w:t>
+            </w:r>
+            <w:proofErr w:type="gramEnd"/>
+            <w:r>
+              <w:rPr>
+                <w:rFonts w:ascii="Calibri" w:eastAsia="Calibri" w:hAnsi="Calibri" w:cs="Calibri"/>
+              </w:rPr>
+              <w:t>_number_formatted</w:t>
+            </w:r>
+            <w:proofErr w:type="spellEnd"/>
+            <w:r>
+              <w:rPr>
+                <w:rFonts w:ascii="Calibri" w:eastAsia="Calibri" w:hAnsi="Calibri" w:cs="Calibri"/>
+              </w:rPr>
+              <w:t>(</w:t>
             </w:r>
             <w:r>
               <w:rPr>
@@ -964,8 +1444,16 @@
               <w:rPr>
                 <w:rFonts w:ascii="Calibri" w:eastAsia="Calibri" w:hAnsi="Calibri" w:cs="Calibri"/>
               </w:rPr>
-              <w:t>].phone_number</w:t>
-            </w:r>
+              <w:t>].</w:t>
+            </w:r>
+            <w:proofErr w:type="spellStart"/>
+            <w:r>
+              <w:rPr>
+                <w:rFonts w:ascii="Calibri" w:eastAsia="Calibri" w:hAnsi="Calibri" w:cs="Calibri"/>
+              </w:rPr>
+              <w:t>phone_number</w:t>
+            </w:r>
+            <w:proofErr w:type="spellEnd"/>
             <w:r>
               <w:rPr>
                 <w:rFonts w:ascii="Calibri" w:eastAsia="Calibri" w:hAnsi="Calibri" w:cs="Calibri"/>
@@ -988,8 +1476,23 @@
               <w:rPr>
                 <w:rFonts w:ascii="Calibri" w:eastAsia="Calibri" w:hAnsi="Calibri" w:cs="Calibri"/>
               </w:rPr>
-              <w:t>{{ phone_number_formatted(users[0].</w:t>
-            </w:r>
+              <w:t xml:space="preserve">{{ </w:t>
+            </w:r>
+            <w:proofErr w:type="spellStart"/>
+            <w:r>
+              <w:rPr>
+                <w:rFonts w:ascii="Calibri" w:eastAsia="Calibri" w:hAnsi="Calibri" w:cs="Calibri"/>
+              </w:rPr>
+              <w:t>phone_number_formatted</w:t>
+            </w:r>
+            <w:proofErr w:type="spellEnd"/>
+            <w:r>
+              <w:rPr>
+                <w:rFonts w:ascii="Calibri" w:eastAsia="Calibri" w:hAnsi="Calibri" w:cs="Calibri"/>
+              </w:rPr>
+              <w:t>(users[0].</w:t>
+            </w:r>
+            <w:proofErr w:type="spellStart"/>
             <w:r>
               <w:rPr>
                 <w:rFonts w:ascii="Calibri" w:eastAsia="Calibri" w:hAnsi="Calibri" w:cs="Calibri"/>
@@ -1000,7 +1503,14 @@
               <w:rPr>
                 <w:rFonts w:ascii="Calibri" w:eastAsia="Calibri" w:hAnsi="Calibri" w:cs="Calibri"/>
               </w:rPr>
-              <w:t>_number) }}</w:t>
+              <w:t>_number</w:t>
+            </w:r>
+            <w:proofErr w:type="spellEnd"/>
+            <w:r>
+              <w:rPr>
+                <w:rFonts w:ascii="Calibri" w:eastAsia="Calibri" w:hAnsi="Calibri" w:cs="Calibri"/>
+              </w:rPr>
+              <w:t>) }}</w:t>
             </w:r>
           </w:p>
         </w:tc>
@@ -1037,11 +1547,19 @@
                 <w:rFonts w:ascii="Calibri" w:eastAsia="Calibri" w:hAnsi="Calibri" w:cs="Calibri"/>
               </w:rPr>
             </w:pPr>
-            <w:r>
-              <w:rPr>
-                <w:rFonts w:ascii="Calibri" w:eastAsia="Calibri" w:hAnsi="Calibri" w:cs="Calibri"/>
-              </w:rPr>
-              <w:t>{{ users[</w:t>
+            <w:proofErr w:type="gramStart"/>
+            <w:r>
+              <w:rPr>
+                <w:rFonts w:ascii="Calibri" w:eastAsia="Calibri" w:hAnsi="Calibri" w:cs="Calibri"/>
+              </w:rPr>
+              <w:t>{{ users</w:t>
+            </w:r>
+            <w:proofErr w:type="gramEnd"/>
+            <w:r>
+              <w:rPr>
+                <w:rFonts w:ascii="Calibri" w:eastAsia="Calibri" w:hAnsi="Calibri" w:cs="Calibri"/>
+              </w:rPr>
+              <w:t>[</w:t>
             </w:r>
             <w:r>
               <w:rPr>
@@ -1090,11 +1608,19 @@
                 <w:rFonts w:ascii="Calibri" w:eastAsia="Calibri" w:hAnsi="Calibri" w:cs="Calibri"/>
               </w:rPr>
             </w:pPr>
-            <w:r>
-              <w:rPr>
-                <w:rFonts w:ascii="Calibri" w:eastAsia="Calibri" w:hAnsi="Calibri" w:cs="Calibri"/>
-              </w:rPr>
-              <w:t>{{ users[</w:t>
+            <w:proofErr w:type="gramStart"/>
+            <w:r>
+              <w:rPr>
+                <w:rFonts w:ascii="Calibri" w:eastAsia="Calibri" w:hAnsi="Calibri" w:cs="Calibri"/>
+              </w:rPr>
+              <w:t>{{ users</w:t>
+            </w:r>
+            <w:proofErr w:type="gramEnd"/>
+            <w:r>
+              <w:rPr>
+                <w:rFonts w:ascii="Calibri" w:eastAsia="Calibri" w:hAnsi="Calibri" w:cs="Calibri"/>
+              </w:rPr>
+              <w:t>[</w:t>
             </w:r>
             <w:r>
               <w:rPr>
@@ -1106,7 +1632,21 @@
               <w:rPr>
                 <w:rFonts w:ascii="Calibri" w:eastAsia="Calibri" w:hAnsi="Calibri" w:cs="Calibri"/>
               </w:rPr>
-              <w:t>].country_of_birth }}</w:t>
+              <w:t>].</w:t>
+            </w:r>
+            <w:proofErr w:type="spellStart"/>
+            <w:r>
+              <w:rPr>
+                <w:rFonts w:ascii="Calibri" w:eastAsia="Calibri" w:hAnsi="Calibri" w:cs="Calibri"/>
+              </w:rPr>
+              <w:t>country_of_birth</w:t>
+            </w:r>
+            <w:proofErr w:type="spellEnd"/>
+            <w:r>
+              <w:rPr>
+                <w:rFonts w:ascii="Calibri" w:eastAsia="Calibri" w:hAnsi="Calibri" w:cs="Calibri"/>
+              </w:rPr>
+              <w:t xml:space="preserve"> }}</w:t>
             </w:r>
           </w:p>
         </w:tc>
@@ -1143,11 +1683,33 @@
                 <w:rFonts w:ascii="Calibri" w:eastAsia="Calibri" w:hAnsi="Calibri" w:cs="Calibri"/>
               </w:rPr>
             </w:pPr>
-            <w:r>
-              <w:rPr>
-                <w:rFonts w:ascii="Calibri" w:eastAsia="Calibri" w:hAnsi="Calibri" w:cs="Calibri"/>
-              </w:rPr>
-              <w:t>{{ comma_list(</w:t>
+            <w:proofErr w:type="gramStart"/>
+            <w:r>
+              <w:rPr>
+                <w:rFonts w:ascii="Calibri" w:eastAsia="Calibri" w:hAnsi="Calibri" w:cs="Calibri"/>
+              </w:rPr>
+              <w:t xml:space="preserve">{{ </w:t>
+            </w:r>
+            <w:proofErr w:type="spellStart"/>
+            <w:r>
+              <w:rPr>
+                <w:rFonts w:ascii="Calibri" w:eastAsia="Calibri" w:hAnsi="Calibri" w:cs="Calibri"/>
+              </w:rPr>
+              <w:t>comma</w:t>
+            </w:r>
+            <w:proofErr w:type="gramEnd"/>
+            <w:r>
+              <w:rPr>
+                <w:rFonts w:ascii="Calibri" w:eastAsia="Calibri" w:hAnsi="Calibri" w:cs="Calibri"/>
+              </w:rPr>
+              <w:t>_list</w:t>
+            </w:r>
+            <w:proofErr w:type="spellEnd"/>
+            <w:r>
+              <w:rPr>
+                <w:rFonts w:ascii="Calibri" w:eastAsia="Calibri" w:hAnsi="Calibri" w:cs="Calibri"/>
+              </w:rPr>
+              <w:t>(</w:t>
             </w:r>
             <w:r>
               <w:rPr>
@@ -1173,6 +1735,7 @@
               </w:rPr>
               <w:t>].</w:t>
             </w:r>
+            <w:proofErr w:type="spellStart"/>
             <w:r>
               <w:rPr>
                 <w:rFonts w:ascii="Calibri" w:eastAsia="Calibri" w:hAnsi="Calibri" w:cs="Calibri"/>
@@ -1185,11 +1748,26 @@
               </w:rPr>
               <w:t>_of_citizenship</w:t>
             </w:r>
-            <w:r>
-              <w:rPr>
-                <w:rFonts w:ascii="Calibri" w:eastAsia="Calibri" w:hAnsi="Calibri" w:cs="Calibri"/>
-              </w:rPr>
-              <w:t>, users[0].additional_citizenship]</w:t>
+            <w:proofErr w:type="spellEnd"/>
+            <w:r>
+              <w:rPr>
+                <w:rFonts w:ascii="Calibri" w:eastAsia="Calibri" w:hAnsi="Calibri" w:cs="Calibri"/>
+              </w:rPr>
+              <w:t>, users[0].</w:t>
+            </w:r>
+            <w:proofErr w:type="spellStart"/>
+            <w:r>
+              <w:rPr>
+                <w:rFonts w:ascii="Calibri" w:eastAsia="Calibri" w:hAnsi="Calibri" w:cs="Calibri"/>
+              </w:rPr>
+              <w:t>additional_citizenship</w:t>
+            </w:r>
+            <w:proofErr w:type="spellEnd"/>
+            <w:r>
+              <w:rPr>
+                <w:rFonts w:ascii="Calibri" w:eastAsia="Calibri" w:hAnsi="Calibri" w:cs="Calibri"/>
+              </w:rPr>
+              <w:t>]</w:t>
             </w:r>
           </w:p>
           <w:p>
@@ -1240,11 +1818,33 @@
                 <w:rFonts w:ascii="Calibri" w:eastAsia="Calibri" w:hAnsi="Calibri" w:cs="Calibri"/>
               </w:rPr>
             </w:pPr>
-            <w:r>
-              <w:rPr>
-                <w:rFonts w:ascii="Calibri" w:hAnsi="Calibri" w:cs="Calibri"/>
-              </w:rPr>
-              <w:t>{{ output_checkbox(users[</w:t>
+            <w:proofErr w:type="gramStart"/>
+            <w:r>
+              <w:rPr>
+                <w:rFonts w:ascii="Calibri" w:hAnsi="Calibri" w:cs="Calibri"/>
+              </w:rPr>
+              <w:t xml:space="preserve">{{ </w:t>
+            </w:r>
+            <w:proofErr w:type="spellStart"/>
+            <w:r>
+              <w:rPr>
+                <w:rFonts w:ascii="Calibri" w:hAnsi="Calibri" w:cs="Calibri"/>
+              </w:rPr>
+              <w:t>output</w:t>
+            </w:r>
+            <w:proofErr w:type="gramEnd"/>
+            <w:r>
+              <w:rPr>
+                <w:rFonts w:ascii="Calibri" w:hAnsi="Calibri" w:cs="Calibri"/>
+              </w:rPr>
+              <w:t>_checkbox</w:t>
+            </w:r>
+            <w:proofErr w:type="spellEnd"/>
+            <w:r>
+              <w:rPr>
+                <w:rFonts w:ascii="Calibri" w:hAnsi="Calibri" w:cs="Calibri"/>
+              </w:rPr>
+              <w:t>(users[</w:t>
             </w:r>
             <w:r>
               <w:rPr>
@@ -1258,12 +1858,14 @@
               </w:rPr>
               <w:t>].</w:t>
             </w:r>
+            <w:proofErr w:type="spellStart"/>
             <w:r>
               <w:rPr>
                 <w:rFonts w:ascii="Calibri" w:hAnsi="Calibri" w:cs="Calibri"/>
               </w:rPr>
               <w:t>fotc_first_hearing</w:t>
             </w:r>
+            <w:proofErr w:type="spellEnd"/>
             <w:r>
               <w:rPr>
                 <w:rFonts w:ascii="Calibri" w:hAnsi="Calibri" w:cs="Calibri"/>
@@ -1284,11 +1886,33 @@
                 <w:rFonts w:ascii="Calibri" w:hAnsi="Calibri" w:cs="Calibri"/>
               </w:rPr>
             </w:pPr>
-            <w:r>
-              <w:rPr>
-                <w:rFonts w:ascii="Calibri" w:hAnsi="Calibri" w:cs="Calibri"/>
-              </w:rPr>
-              <w:t>{{ output_checkbox(not users[</w:t>
+            <w:proofErr w:type="gramStart"/>
+            <w:r>
+              <w:rPr>
+                <w:rFonts w:ascii="Calibri" w:hAnsi="Calibri" w:cs="Calibri"/>
+              </w:rPr>
+              <w:t xml:space="preserve">{{ </w:t>
+            </w:r>
+            <w:proofErr w:type="spellStart"/>
+            <w:r>
+              <w:rPr>
+                <w:rFonts w:ascii="Calibri" w:hAnsi="Calibri" w:cs="Calibri"/>
+              </w:rPr>
+              <w:t>output</w:t>
+            </w:r>
+            <w:proofErr w:type="gramEnd"/>
+            <w:r>
+              <w:rPr>
+                <w:rFonts w:ascii="Calibri" w:hAnsi="Calibri" w:cs="Calibri"/>
+              </w:rPr>
+              <w:t>_checkbox</w:t>
+            </w:r>
+            <w:proofErr w:type="spellEnd"/>
+            <w:r>
+              <w:rPr>
+                <w:rFonts w:ascii="Calibri" w:hAnsi="Calibri" w:cs="Calibri"/>
+              </w:rPr>
+              <w:t>(not users[</w:t>
             </w:r>
             <w:r>
               <w:rPr>
@@ -1302,12 +1926,14 @@
               </w:rPr>
               <w:t>].</w:t>
             </w:r>
+            <w:proofErr w:type="spellStart"/>
             <w:r>
               <w:rPr>
                 <w:rFonts w:ascii="Calibri" w:hAnsi="Calibri" w:cs="Calibri"/>
               </w:rPr>
               <w:t>fotc_first_hearing</w:t>
             </w:r>
+            <w:proofErr w:type="spellEnd"/>
             <w:r>
               <w:rPr>
                 <w:rFonts w:ascii="Calibri" w:hAnsi="Calibri" w:cs="Calibri"/>
@@ -1338,6 +1964,7 @@
               </w:rPr>
               <w:t>.</w:t>
             </w:r>
+            <w:proofErr w:type="spellStart"/>
             <w:r>
               <w:rPr>
                 <w:rFonts w:ascii="Calibri" w:hAnsi="Calibri" w:cs="Calibri"/>
@@ -1348,7 +1975,28 @@
               <w:rPr>
                 <w:rFonts w:ascii="Calibri" w:hAnsi="Calibri" w:cs="Calibri"/>
               </w:rPr>
-              <w:t>.format(“MM/dd/yyyy”) }}</w:t>
+              <w:t>.format</w:t>
+            </w:r>
+            <w:proofErr w:type="spellEnd"/>
+            <w:r>
+              <w:rPr>
+                <w:rFonts w:ascii="Calibri" w:hAnsi="Calibri" w:cs="Calibri"/>
+              </w:rPr>
+              <w:t>(“MM/dd/</w:t>
+            </w:r>
+            <w:proofErr w:type="spellStart"/>
+            <w:r>
+              <w:rPr>
+                <w:rFonts w:ascii="Calibri" w:hAnsi="Calibri" w:cs="Calibri"/>
+              </w:rPr>
+              <w:t>yyyy</w:t>
+            </w:r>
+            <w:proofErr w:type="spellEnd"/>
+            <w:r>
+              <w:rPr>
+                <w:rFonts w:ascii="Calibri" w:hAnsi="Calibri" w:cs="Calibri"/>
+              </w:rPr>
+              <w:t>”) }}</w:t>
             </w:r>
           </w:p>
         </w:tc>
@@ -1400,11 +2048,19 @@
                 <w:rFonts w:ascii="Calibri" w:hAnsi="Calibri" w:cs="Calibri"/>
               </w:rPr>
             </w:pPr>
-            <w:r>
-              <w:rPr>
-                <w:rFonts w:ascii="Calibri" w:hAnsi="Calibri" w:cs="Calibri"/>
-              </w:rPr>
-              <w:t>{{ users[</w:t>
+            <w:proofErr w:type="gramStart"/>
+            <w:r>
+              <w:rPr>
+                <w:rFonts w:ascii="Calibri" w:hAnsi="Calibri" w:cs="Calibri"/>
+              </w:rPr>
+              <w:t>{{ users</w:t>
+            </w:r>
+            <w:proofErr w:type="gramEnd"/>
+            <w:r>
+              <w:rPr>
+                <w:rFonts w:ascii="Calibri" w:hAnsi="Calibri" w:cs="Calibri"/>
+              </w:rPr>
+              <w:t>[</w:t>
             </w:r>
             <w:r>
               <w:rPr>
@@ -1418,11 +2074,19 @@
               </w:rPr>
               <w:t>].</w:t>
             </w:r>
-            <w:r>
-              <w:rPr>
-                <w:rFonts w:ascii="Calibri" w:hAnsi="Calibri" w:cs="Calibri"/>
-              </w:rPr>
-              <w:t xml:space="preserve">fotc_prior_hearing_details </w:t>
+            <w:proofErr w:type="spellStart"/>
+            <w:r>
+              <w:rPr>
+                <w:rFonts w:ascii="Calibri" w:hAnsi="Calibri" w:cs="Calibri"/>
+              </w:rPr>
+              <w:t>fotc_prior_hearing_details</w:t>
+            </w:r>
+            <w:proofErr w:type="spellEnd"/>
+            <w:r>
+              <w:rPr>
+                <w:rFonts w:ascii="Calibri" w:hAnsi="Calibri" w:cs="Calibri"/>
+              </w:rPr>
+              <w:t xml:space="preserve"> </w:t>
             </w:r>
             <w:r>
               <w:rPr>
@@ -1482,6 +2146,7 @@
               <w:rPr>
                 <w:rFonts w:ascii="Calibri" w:eastAsia="Calibri" w:hAnsi="Calibri" w:cs="Calibri"/>
               </w:rPr>
+              <w:lastRenderedPageBreak/>
               <w:t>Do you have a Notice to Appear (NTA)?</w:t>
             </w:r>
           </w:p>
@@ -1497,11 +2162,33 @@
                 <w:rFonts w:ascii="Calibri" w:hAnsi="Calibri" w:cs="Calibri"/>
               </w:rPr>
             </w:pPr>
-            <w:r>
-              <w:rPr>
-                <w:rFonts w:ascii="Calibri" w:hAnsi="Calibri" w:cs="Calibri"/>
-              </w:rPr>
-              <w:t>{{ output_checkbox(</w:t>
+            <w:proofErr w:type="gramStart"/>
+            <w:r>
+              <w:rPr>
+                <w:rFonts w:ascii="Calibri" w:hAnsi="Calibri" w:cs="Calibri"/>
+              </w:rPr>
+              <w:t xml:space="preserve">{{ </w:t>
+            </w:r>
+            <w:proofErr w:type="spellStart"/>
+            <w:r>
+              <w:rPr>
+                <w:rFonts w:ascii="Calibri" w:hAnsi="Calibri" w:cs="Calibri"/>
+              </w:rPr>
+              <w:t>output</w:t>
+            </w:r>
+            <w:proofErr w:type="gramEnd"/>
+            <w:r>
+              <w:rPr>
+                <w:rFonts w:ascii="Calibri" w:hAnsi="Calibri" w:cs="Calibri"/>
+              </w:rPr>
+              <w:t>_checkbox</w:t>
+            </w:r>
+            <w:proofErr w:type="spellEnd"/>
+            <w:r>
+              <w:rPr>
+                <w:rFonts w:ascii="Calibri" w:hAnsi="Calibri" w:cs="Calibri"/>
+              </w:rPr>
+              <w:t>(</w:t>
             </w:r>
             <w:r>
               <w:rPr>
@@ -1513,7 +2200,21 @@
               <w:rPr>
                 <w:rFonts w:ascii="Calibri" w:hAnsi="Calibri" w:cs="Calibri"/>
               </w:rPr>
-              <w:t xml:space="preserve">.notice_to_appear) }} </w:t>
+              <w:t>.</w:t>
+            </w:r>
+            <w:proofErr w:type="spellStart"/>
+            <w:r>
+              <w:rPr>
+                <w:rFonts w:ascii="Calibri" w:hAnsi="Calibri" w:cs="Calibri"/>
+              </w:rPr>
+              <w:t>notice_to_appear</w:t>
+            </w:r>
+            <w:proofErr w:type="spellEnd"/>
+            <w:r>
+              <w:rPr>
+                <w:rFonts w:ascii="Calibri" w:hAnsi="Calibri" w:cs="Calibri"/>
+              </w:rPr>
+              <w:t xml:space="preserve">) }} </w:t>
             </w:r>
             <w:r>
               <w:rPr>
@@ -1529,11 +2230,33 @@
                 <w:rFonts w:ascii="Calibri" w:hAnsi="Calibri" w:cs="Calibri"/>
               </w:rPr>
             </w:pPr>
-            <w:r>
-              <w:rPr>
-                <w:rFonts w:ascii="Calibri" w:hAnsi="Calibri" w:cs="Calibri"/>
-              </w:rPr>
-              <w:t xml:space="preserve">{{ output_checkbox(not </w:t>
+            <w:proofErr w:type="gramStart"/>
+            <w:r>
+              <w:rPr>
+                <w:rFonts w:ascii="Calibri" w:hAnsi="Calibri" w:cs="Calibri"/>
+              </w:rPr>
+              <w:t xml:space="preserve">{{ </w:t>
+            </w:r>
+            <w:proofErr w:type="spellStart"/>
+            <w:r>
+              <w:rPr>
+                <w:rFonts w:ascii="Calibri" w:hAnsi="Calibri" w:cs="Calibri"/>
+              </w:rPr>
+              <w:t>output</w:t>
+            </w:r>
+            <w:proofErr w:type="gramEnd"/>
+            <w:r>
+              <w:rPr>
+                <w:rFonts w:ascii="Calibri" w:hAnsi="Calibri" w:cs="Calibri"/>
+              </w:rPr>
+              <w:t>_checkbox</w:t>
+            </w:r>
+            <w:proofErr w:type="spellEnd"/>
+            <w:r>
+              <w:rPr>
+                <w:rFonts w:ascii="Calibri" w:hAnsi="Calibri" w:cs="Calibri"/>
+              </w:rPr>
+              <w:t xml:space="preserve">(not </w:t>
             </w:r>
             <w:r>
               <w:rPr>
@@ -1545,7 +2268,21 @@
               <w:rPr>
                 <w:rFonts w:ascii="Calibri" w:hAnsi="Calibri" w:cs="Calibri"/>
               </w:rPr>
-              <w:t xml:space="preserve">.notice_to_appear) }} </w:t>
+              <w:t>.</w:t>
+            </w:r>
+            <w:proofErr w:type="spellStart"/>
+            <w:r>
+              <w:rPr>
+                <w:rFonts w:ascii="Calibri" w:hAnsi="Calibri" w:cs="Calibri"/>
+              </w:rPr>
+              <w:t>notice_to_appear</w:t>
+            </w:r>
+            <w:proofErr w:type="spellEnd"/>
+            <w:r>
+              <w:rPr>
+                <w:rFonts w:ascii="Calibri" w:hAnsi="Calibri" w:cs="Calibri"/>
+              </w:rPr>
+              <w:t xml:space="preserve">) }} </w:t>
             </w:r>
             <w:r>
               <w:rPr>
@@ -1589,11 +2326,33 @@
                 <w:rFonts w:ascii="Calibri" w:hAnsi="Calibri" w:cs="Calibri"/>
               </w:rPr>
             </w:pPr>
-            <w:r>
-              <w:rPr>
-                <w:rFonts w:ascii="Calibri" w:hAnsi="Calibri" w:cs="Calibri"/>
-              </w:rPr>
-              <w:t>{{ output_checkbox(</w:t>
+            <w:proofErr w:type="gramStart"/>
+            <w:r>
+              <w:rPr>
+                <w:rFonts w:ascii="Calibri" w:hAnsi="Calibri" w:cs="Calibri"/>
+              </w:rPr>
+              <w:t xml:space="preserve">{{ </w:t>
+            </w:r>
+            <w:proofErr w:type="spellStart"/>
+            <w:r>
+              <w:rPr>
+                <w:rFonts w:ascii="Calibri" w:hAnsi="Calibri" w:cs="Calibri"/>
+              </w:rPr>
+              <w:t>output</w:t>
+            </w:r>
+            <w:proofErr w:type="gramEnd"/>
+            <w:r>
+              <w:rPr>
+                <w:rFonts w:ascii="Calibri" w:hAnsi="Calibri" w:cs="Calibri"/>
+              </w:rPr>
+              <w:t>_checkbox</w:t>
+            </w:r>
+            <w:proofErr w:type="spellEnd"/>
+            <w:r>
+              <w:rPr>
+                <w:rFonts w:ascii="Calibri" w:hAnsi="Calibri" w:cs="Calibri"/>
+              </w:rPr>
+              <w:t>(</w:t>
             </w:r>
             <w:r>
               <w:rPr>
@@ -1607,12 +2366,14 @@
               </w:rPr>
               <w:t>.</w:t>
             </w:r>
+            <w:proofErr w:type="spellStart"/>
             <w:r>
               <w:rPr>
                 <w:rFonts w:ascii="Calibri" w:hAnsi="Calibri" w:cs="Calibri"/>
               </w:rPr>
               <w:t>notice_name</w:t>
             </w:r>
+            <w:proofErr w:type="spellEnd"/>
             <w:r>
               <w:rPr>
                 <w:rFonts w:ascii="Calibri" w:hAnsi="Calibri" w:cs="Calibri"/>
@@ -1633,11 +2394,33 @@
                 <w:rFonts w:ascii="Calibri" w:hAnsi="Calibri" w:cs="Calibri"/>
               </w:rPr>
             </w:pPr>
-            <w:r>
-              <w:rPr>
-                <w:rFonts w:ascii="Calibri" w:hAnsi="Calibri" w:cs="Calibri"/>
-              </w:rPr>
-              <w:t xml:space="preserve">{{ output_checkbox(not </w:t>
+            <w:proofErr w:type="gramStart"/>
+            <w:r>
+              <w:rPr>
+                <w:rFonts w:ascii="Calibri" w:hAnsi="Calibri" w:cs="Calibri"/>
+              </w:rPr>
+              <w:t xml:space="preserve">{{ </w:t>
+            </w:r>
+            <w:proofErr w:type="spellStart"/>
+            <w:r>
+              <w:rPr>
+                <w:rFonts w:ascii="Calibri" w:hAnsi="Calibri" w:cs="Calibri"/>
+              </w:rPr>
+              <w:t>output</w:t>
+            </w:r>
+            <w:proofErr w:type="gramEnd"/>
+            <w:r>
+              <w:rPr>
+                <w:rFonts w:ascii="Calibri" w:hAnsi="Calibri" w:cs="Calibri"/>
+              </w:rPr>
+              <w:t>_checkbox</w:t>
+            </w:r>
+            <w:proofErr w:type="spellEnd"/>
+            <w:r>
+              <w:rPr>
+                <w:rFonts w:ascii="Calibri" w:hAnsi="Calibri" w:cs="Calibri"/>
+              </w:rPr>
+              <w:t xml:space="preserve">(not </w:t>
             </w:r>
             <w:r>
               <w:rPr>
@@ -1651,12 +2434,14 @@
               </w:rPr>
               <w:t>.</w:t>
             </w:r>
+            <w:proofErr w:type="spellStart"/>
             <w:r>
               <w:rPr>
                 <w:rFonts w:ascii="Calibri" w:hAnsi="Calibri" w:cs="Calibri"/>
               </w:rPr>
               <w:t>notice_name</w:t>
             </w:r>
+            <w:proofErr w:type="spellEnd"/>
             <w:r>
               <w:rPr>
                 <w:rFonts w:ascii="Calibri" w:hAnsi="Calibri" w:cs="Calibri"/>
@@ -1690,7 +2475,6 @@
               <w:rPr>
                 <w:rFonts w:ascii="Calibri" w:eastAsia="Calibri" w:hAnsi="Calibri" w:cs="Calibri"/>
               </w:rPr>
-              <w:lastRenderedPageBreak/>
               <w:t>Is your date of birth correct on the NTA?</w:t>
             </w:r>
           </w:p>
@@ -1706,11 +2490,33 @@
                 <w:rFonts w:ascii="Calibri" w:hAnsi="Calibri" w:cs="Calibri"/>
               </w:rPr>
             </w:pPr>
-            <w:r>
-              <w:rPr>
-                <w:rFonts w:ascii="Calibri" w:hAnsi="Calibri" w:cs="Calibri"/>
-              </w:rPr>
-              <w:t>{{ output_checkbox(</w:t>
+            <w:proofErr w:type="gramStart"/>
+            <w:r>
+              <w:rPr>
+                <w:rFonts w:ascii="Calibri" w:hAnsi="Calibri" w:cs="Calibri"/>
+              </w:rPr>
+              <w:t xml:space="preserve">{{ </w:t>
+            </w:r>
+            <w:proofErr w:type="spellStart"/>
+            <w:r>
+              <w:rPr>
+                <w:rFonts w:ascii="Calibri" w:hAnsi="Calibri" w:cs="Calibri"/>
+              </w:rPr>
+              <w:t>output</w:t>
+            </w:r>
+            <w:proofErr w:type="gramEnd"/>
+            <w:r>
+              <w:rPr>
+                <w:rFonts w:ascii="Calibri" w:hAnsi="Calibri" w:cs="Calibri"/>
+              </w:rPr>
+              <w:t>_checkbox</w:t>
+            </w:r>
+            <w:proofErr w:type="spellEnd"/>
+            <w:r>
+              <w:rPr>
+                <w:rFonts w:ascii="Calibri" w:hAnsi="Calibri" w:cs="Calibri"/>
+              </w:rPr>
+              <w:t>(</w:t>
             </w:r>
             <w:r>
               <w:rPr>
@@ -1722,7 +2528,21 @@
               <w:rPr>
                 <w:rFonts w:ascii="Calibri" w:hAnsi="Calibri" w:cs="Calibri"/>
               </w:rPr>
-              <w:t xml:space="preserve">.notice_dob) }} </w:t>
+              <w:t>.</w:t>
+            </w:r>
+            <w:proofErr w:type="spellStart"/>
+            <w:r>
+              <w:rPr>
+                <w:rFonts w:ascii="Calibri" w:hAnsi="Calibri" w:cs="Calibri"/>
+              </w:rPr>
+              <w:t>notice_dob</w:t>
+            </w:r>
+            <w:proofErr w:type="spellEnd"/>
+            <w:r>
+              <w:rPr>
+                <w:rFonts w:ascii="Calibri" w:hAnsi="Calibri" w:cs="Calibri"/>
+              </w:rPr>
+              <w:t xml:space="preserve">) }} </w:t>
             </w:r>
             <w:r>
               <w:rPr>
@@ -1738,11 +2558,33 @@
                 <w:rFonts w:ascii="Calibri" w:hAnsi="Calibri" w:cs="Calibri"/>
               </w:rPr>
             </w:pPr>
-            <w:r>
-              <w:rPr>
-                <w:rFonts w:ascii="Calibri" w:hAnsi="Calibri" w:cs="Calibri"/>
-              </w:rPr>
-              <w:t xml:space="preserve">{{ output_checkbox(not </w:t>
+            <w:proofErr w:type="gramStart"/>
+            <w:r>
+              <w:rPr>
+                <w:rFonts w:ascii="Calibri" w:hAnsi="Calibri" w:cs="Calibri"/>
+              </w:rPr>
+              <w:t xml:space="preserve">{{ </w:t>
+            </w:r>
+            <w:proofErr w:type="spellStart"/>
+            <w:r>
+              <w:rPr>
+                <w:rFonts w:ascii="Calibri" w:hAnsi="Calibri" w:cs="Calibri"/>
+              </w:rPr>
+              <w:t>output</w:t>
+            </w:r>
+            <w:proofErr w:type="gramEnd"/>
+            <w:r>
+              <w:rPr>
+                <w:rFonts w:ascii="Calibri" w:hAnsi="Calibri" w:cs="Calibri"/>
+              </w:rPr>
+              <w:t>_checkbox</w:t>
+            </w:r>
+            <w:proofErr w:type="spellEnd"/>
+            <w:r>
+              <w:rPr>
+                <w:rFonts w:ascii="Calibri" w:hAnsi="Calibri" w:cs="Calibri"/>
+              </w:rPr>
+              <w:t xml:space="preserve">(not </w:t>
             </w:r>
             <w:r>
               <w:rPr>
@@ -1754,7 +2596,21 @@
               <w:rPr>
                 <w:rFonts w:ascii="Calibri" w:hAnsi="Calibri" w:cs="Calibri"/>
               </w:rPr>
-              <w:t xml:space="preserve">.notice_dob) }} </w:t>
+              <w:t>.</w:t>
+            </w:r>
+            <w:proofErr w:type="spellStart"/>
+            <w:r>
+              <w:rPr>
+                <w:rFonts w:ascii="Calibri" w:hAnsi="Calibri" w:cs="Calibri"/>
+              </w:rPr>
+              <w:t>notice_dob</w:t>
+            </w:r>
+            <w:proofErr w:type="spellEnd"/>
+            <w:r>
+              <w:rPr>
+                <w:rFonts w:ascii="Calibri" w:hAnsi="Calibri" w:cs="Calibri"/>
+              </w:rPr>
+              <w:t xml:space="preserve">) }} </w:t>
             </w:r>
             <w:r>
               <w:rPr>
@@ -1783,7 +2639,21 @@
               <w:rPr>
                 <w:rFonts w:ascii="Calibri" w:eastAsia="Calibri" w:hAnsi="Calibri" w:cs="Calibri"/>
               </w:rPr>
-              <w:t>Are all of the allegations in the NTA true?</w:t>
+              <w:t xml:space="preserve">Are </w:t>
+            </w:r>
+            <w:proofErr w:type="gramStart"/>
+            <w:r>
+              <w:rPr>
+                <w:rFonts w:ascii="Calibri" w:eastAsia="Calibri" w:hAnsi="Calibri" w:cs="Calibri"/>
+              </w:rPr>
+              <w:t>all of</w:t>
+            </w:r>
+            <w:proofErr w:type="gramEnd"/>
+            <w:r>
+              <w:rPr>
+                <w:rFonts w:ascii="Calibri" w:eastAsia="Calibri" w:hAnsi="Calibri" w:cs="Calibri"/>
+              </w:rPr>
+              <w:t xml:space="preserve"> the allegations in the NTA true?</w:t>
             </w:r>
           </w:p>
         </w:tc>
@@ -1798,11 +2668,33 @@
                 <w:rFonts w:ascii="Calibri" w:hAnsi="Calibri" w:cs="Calibri"/>
               </w:rPr>
             </w:pPr>
-            <w:r>
-              <w:rPr>
-                <w:rFonts w:ascii="Calibri" w:hAnsi="Calibri" w:cs="Calibri"/>
-              </w:rPr>
-              <w:t>{{ output_checkbox(</w:t>
+            <w:proofErr w:type="gramStart"/>
+            <w:r>
+              <w:rPr>
+                <w:rFonts w:ascii="Calibri" w:hAnsi="Calibri" w:cs="Calibri"/>
+              </w:rPr>
+              <w:t xml:space="preserve">{{ </w:t>
+            </w:r>
+            <w:proofErr w:type="spellStart"/>
+            <w:r>
+              <w:rPr>
+                <w:rFonts w:ascii="Calibri" w:hAnsi="Calibri" w:cs="Calibri"/>
+              </w:rPr>
+              <w:t>output</w:t>
+            </w:r>
+            <w:proofErr w:type="gramEnd"/>
+            <w:r>
+              <w:rPr>
+                <w:rFonts w:ascii="Calibri" w:hAnsi="Calibri" w:cs="Calibri"/>
+              </w:rPr>
+              <w:t>_checkbox</w:t>
+            </w:r>
+            <w:proofErr w:type="spellEnd"/>
+            <w:r>
+              <w:rPr>
+                <w:rFonts w:ascii="Calibri" w:hAnsi="Calibri" w:cs="Calibri"/>
+              </w:rPr>
+              <w:t>(</w:t>
             </w:r>
             <w:r>
               <w:rPr>
@@ -1814,7 +2706,14 @@
               <w:rPr>
                 <w:rFonts w:ascii="Calibri" w:hAnsi="Calibri" w:cs="Calibri"/>
               </w:rPr>
-              <w:t>.notice_</w:t>
+              <w:t>.</w:t>
+            </w:r>
+            <w:proofErr w:type="spellStart"/>
+            <w:r>
+              <w:rPr>
+                <w:rFonts w:ascii="Calibri" w:hAnsi="Calibri" w:cs="Calibri"/>
+              </w:rPr>
+              <w:t>notice_</w:t>
             </w:r>
             <w:r>
               <w:rPr>
@@ -1822,6 +2721,7 @@
               </w:rPr>
               <w:t>allegations</w:t>
             </w:r>
+            <w:proofErr w:type="spellEnd"/>
             <w:r>
               <w:rPr>
                 <w:rFonts w:ascii="Calibri" w:hAnsi="Calibri" w:cs="Calibri"/>
@@ -1842,11 +2742,33 @@
                 <w:rFonts w:ascii="Calibri" w:hAnsi="Calibri" w:cs="Calibri"/>
               </w:rPr>
             </w:pPr>
-            <w:r>
-              <w:rPr>
-                <w:rFonts w:ascii="Calibri" w:hAnsi="Calibri" w:cs="Calibri"/>
-              </w:rPr>
-              <w:t>{{ output_checkbox(</w:t>
+            <w:proofErr w:type="gramStart"/>
+            <w:r>
+              <w:rPr>
+                <w:rFonts w:ascii="Calibri" w:hAnsi="Calibri" w:cs="Calibri"/>
+              </w:rPr>
+              <w:t xml:space="preserve">{{ </w:t>
+            </w:r>
+            <w:proofErr w:type="spellStart"/>
+            <w:r>
+              <w:rPr>
+                <w:rFonts w:ascii="Calibri" w:hAnsi="Calibri" w:cs="Calibri"/>
+              </w:rPr>
+              <w:t>output</w:t>
+            </w:r>
+            <w:proofErr w:type="gramEnd"/>
+            <w:r>
+              <w:rPr>
+                <w:rFonts w:ascii="Calibri" w:hAnsi="Calibri" w:cs="Calibri"/>
+              </w:rPr>
+              <w:t>_checkbox</w:t>
+            </w:r>
+            <w:proofErr w:type="spellEnd"/>
+            <w:r>
+              <w:rPr>
+                <w:rFonts w:ascii="Calibri" w:hAnsi="Calibri" w:cs="Calibri"/>
+              </w:rPr>
+              <w:t>(</w:t>
             </w:r>
             <w:r>
               <w:rPr>
@@ -1864,7 +2786,14 @@
               <w:rPr>
                 <w:rFonts w:ascii="Calibri" w:hAnsi="Calibri" w:cs="Calibri"/>
               </w:rPr>
-              <w:t>.notice_</w:t>
+              <w:t>.</w:t>
+            </w:r>
+            <w:proofErr w:type="spellStart"/>
+            <w:r>
+              <w:rPr>
+                <w:rFonts w:ascii="Calibri" w:hAnsi="Calibri" w:cs="Calibri"/>
+              </w:rPr>
+              <w:t>notice_</w:t>
             </w:r>
             <w:r>
               <w:rPr>
@@ -1872,6 +2801,7 @@
               </w:rPr>
               <w:t>allegations</w:t>
             </w:r>
+            <w:proofErr w:type="spellEnd"/>
             <w:r>
               <w:rPr>
                 <w:rFonts w:ascii="Calibri" w:hAnsi="Calibri" w:cs="Calibri"/>
@@ -1904,6 +2834,40 @@
               </w:rPr>
               <w:t xml:space="preserve">{% if not </w:t>
             </w:r>
+            <w:proofErr w:type="gramStart"/>
+            <w:r>
+              <w:rPr>
+                <w:rFonts w:ascii="Calibri" w:hAnsi="Calibri" w:cs="Calibri"/>
+              </w:rPr>
+              <w:t>users[</w:t>
+            </w:r>
+            <w:proofErr w:type="gramEnd"/>
+            <w:r>
+              <w:rPr>
+                <w:rFonts w:ascii="Calibri" w:hAnsi="Calibri" w:cs="Calibri"/>
+              </w:rPr>
+              <w:t>0]</w:t>
+            </w:r>
+            <w:r>
+              <w:rPr>
+                <w:rFonts w:ascii="Calibri" w:hAnsi="Calibri" w:cs="Calibri"/>
+              </w:rPr>
+              <w:t>.</w:t>
+            </w:r>
+            <w:proofErr w:type="spellStart"/>
+            <w:r>
+              <w:rPr>
+                <w:rFonts w:ascii="Calibri" w:hAnsi="Calibri" w:cs="Calibri"/>
+              </w:rPr>
+              <w:t>notice_allegations</w:t>
+            </w:r>
+            <w:proofErr w:type="spellEnd"/>
+            <w:r>
+              <w:rPr>
+                <w:rFonts w:ascii="Calibri" w:hAnsi="Calibri" w:cs="Calibri"/>
+              </w:rPr>
+              <w:t xml:space="preserve"> %}{{ </w:t>
+            </w:r>
             <w:r>
               <w:rPr>
                 <w:rFonts w:ascii="Calibri" w:hAnsi="Calibri" w:cs="Calibri"/>
@@ -1914,19 +2878,21 @@
               <w:rPr>
                 <w:rFonts w:ascii="Calibri" w:hAnsi="Calibri" w:cs="Calibri"/>
               </w:rPr>
-              <w:t xml:space="preserve">.notice_allegations %}{{ </w:t>
-            </w:r>
-            <w:r>
-              <w:rPr>
-                <w:rFonts w:ascii="Calibri" w:hAnsi="Calibri" w:cs="Calibri"/>
-              </w:rPr>
-              <w:t>users[0]</w:t>
-            </w:r>
-            <w:r>
-              <w:rPr>
-                <w:rFonts w:ascii="Calibri" w:hAnsi="Calibri" w:cs="Calibri"/>
-              </w:rPr>
-              <w:t>.notice_allegations_details }}{% endif %}</w:t>
+              <w:t>.</w:t>
+            </w:r>
+            <w:proofErr w:type="spellStart"/>
+            <w:r>
+              <w:rPr>
+                <w:rFonts w:ascii="Calibri" w:hAnsi="Calibri" w:cs="Calibri"/>
+              </w:rPr>
+              <w:t>notice_allegations_details</w:t>
+            </w:r>
+            <w:proofErr w:type="spellEnd"/>
+            <w:r>
+              <w:rPr>
+                <w:rFonts w:ascii="Calibri" w:hAnsi="Calibri" w:cs="Calibri"/>
+              </w:rPr>
+              <w:t xml:space="preserve"> }}{% endif %}</w:t>
             </w:r>
           </w:p>
         </w:tc>
@@ -1964,11 +2930,33 @@
                 <w:rFonts w:ascii="Calibri" w:hAnsi="Calibri" w:cs="Calibri"/>
               </w:rPr>
             </w:pPr>
-            <w:r>
-              <w:rPr>
-                <w:rFonts w:ascii="Calibri" w:hAnsi="Calibri" w:cs="Calibri"/>
-              </w:rPr>
-              <w:t>{{ output_checkbox(</w:t>
+            <w:proofErr w:type="gramStart"/>
+            <w:r>
+              <w:rPr>
+                <w:rFonts w:ascii="Calibri" w:hAnsi="Calibri" w:cs="Calibri"/>
+              </w:rPr>
+              <w:t xml:space="preserve">{{ </w:t>
+            </w:r>
+            <w:proofErr w:type="spellStart"/>
+            <w:r>
+              <w:rPr>
+                <w:rFonts w:ascii="Calibri" w:hAnsi="Calibri" w:cs="Calibri"/>
+              </w:rPr>
+              <w:t>output</w:t>
+            </w:r>
+            <w:proofErr w:type="gramEnd"/>
+            <w:r>
+              <w:rPr>
+                <w:rFonts w:ascii="Calibri" w:hAnsi="Calibri" w:cs="Calibri"/>
+              </w:rPr>
+              <w:t>_checkbox</w:t>
+            </w:r>
+            <w:proofErr w:type="spellEnd"/>
+            <w:r>
+              <w:rPr>
+                <w:rFonts w:ascii="Calibri" w:hAnsi="Calibri" w:cs="Calibri"/>
+              </w:rPr>
+              <w:t>(</w:t>
             </w:r>
             <w:r>
               <w:rPr>
@@ -1980,7 +2968,14 @@
               <w:rPr>
                 <w:rFonts w:ascii="Calibri" w:hAnsi="Calibri" w:cs="Calibri"/>
               </w:rPr>
-              <w:t>.notice_</w:t>
+              <w:t>.</w:t>
+            </w:r>
+            <w:proofErr w:type="spellStart"/>
+            <w:r>
+              <w:rPr>
+                <w:rFonts w:ascii="Calibri" w:hAnsi="Calibri" w:cs="Calibri"/>
+              </w:rPr>
+              <w:t>notice_</w:t>
             </w:r>
             <w:r>
               <w:rPr>
@@ -1988,6 +2983,7 @@
               </w:rPr>
               <w:t>hearing</w:t>
             </w:r>
+            <w:proofErr w:type="spellEnd"/>
             <w:r>
               <w:rPr>
                 <w:rFonts w:ascii="Calibri" w:hAnsi="Calibri" w:cs="Calibri"/>
@@ -2008,11 +3004,33 @@
                 <w:rFonts w:ascii="Calibri" w:hAnsi="Calibri" w:cs="Calibri"/>
               </w:rPr>
             </w:pPr>
-            <w:r>
-              <w:rPr>
-                <w:rFonts w:ascii="Calibri" w:hAnsi="Calibri" w:cs="Calibri"/>
-              </w:rPr>
-              <w:t>{{ output_checkbox(</w:t>
+            <w:proofErr w:type="gramStart"/>
+            <w:r>
+              <w:rPr>
+                <w:rFonts w:ascii="Calibri" w:hAnsi="Calibri" w:cs="Calibri"/>
+              </w:rPr>
+              <w:t xml:space="preserve">{{ </w:t>
+            </w:r>
+            <w:proofErr w:type="spellStart"/>
+            <w:r>
+              <w:rPr>
+                <w:rFonts w:ascii="Calibri" w:hAnsi="Calibri" w:cs="Calibri"/>
+              </w:rPr>
+              <w:t>output</w:t>
+            </w:r>
+            <w:proofErr w:type="gramEnd"/>
+            <w:r>
+              <w:rPr>
+                <w:rFonts w:ascii="Calibri" w:hAnsi="Calibri" w:cs="Calibri"/>
+              </w:rPr>
+              <w:t>_checkbox</w:t>
+            </w:r>
+            <w:proofErr w:type="spellEnd"/>
+            <w:r>
+              <w:rPr>
+                <w:rFonts w:ascii="Calibri" w:hAnsi="Calibri" w:cs="Calibri"/>
+              </w:rPr>
+              <w:t>(</w:t>
             </w:r>
             <w:r>
               <w:rPr>
@@ -2030,7 +3048,14 @@
               <w:rPr>
                 <w:rFonts w:ascii="Calibri" w:hAnsi="Calibri" w:cs="Calibri"/>
               </w:rPr>
-              <w:t>.notice_</w:t>
+              <w:t>.</w:t>
+            </w:r>
+            <w:proofErr w:type="spellStart"/>
+            <w:r>
+              <w:rPr>
+                <w:rFonts w:ascii="Calibri" w:hAnsi="Calibri" w:cs="Calibri"/>
+              </w:rPr>
+              <w:t>notice_</w:t>
             </w:r>
             <w:r>
               <w:rPr>
@@ -2038,6 +3063,7 @@
               </w:rPr>
               <w:t>hearing</w:t>
             </w:r>
+            <w:proofErr w:type="spellEnd"/>
             <w:r>
               <w:rPr>
                 <w:rFonts w:ascii="Calibri" w:hAnsi="Calibri" w:cs="Calibri"/>
@@ -2117,11 +3143,33 @@
                 <w:bCs/>
               </w:rPr>
             </w:pPr>
-            <w:r>
-              <w:rPr>
-                <w:rFonts w:ascii="Calibri" w:eastAsia="Calibri" w:hAnsi="Calibri" w:cs="Calibri"/>
-              </w:rPr>
-              <w:t>{{ users[0].address_block() }}</w:t>
+            <w:proofErr w:type="gramStart"/>
+            <w:r>
+              <w:rPr>
+                <w:rFonts w:ascii="Calibri" w:eastAsia="Calibri" w:hAnsi="Calibri" w:cs="Calibri"/>
+              </w:rPr>
+              <w:t>{{ users</w:t>
+            </w:r>
+            <w:proofErr w:type="gramEnd"/>
+            <w:r>
+              <w:rPr>
+                <w:rFonts w:ascii="Calibri" w:eastAsia="Calibri" w:hAnsi="Calibri" w:cs="Calibri"/>
+              </w:rPr>
+              <w:t>[0].</w:t>
+            </w:r>
+            <w:proofErr w:type="spellStart"/>
+            <w:r>
+              <w:rPr>
+                <w:rFonts w:ascii="Calibri" w:eastAsia="Calibri" w:hAnsi="Calibri" w:cs="Calibri"/>
+              </w:rPr>
+              <w:t>address_block</w:t>
+            </w:r>
+            <w:proofErr w:type="spellEnd"/>
+            <w:r>
+              <w:rPr>
+                <w:rFonts w:ascii="Calibri" w:eastAsia="Calibri" w:hAnsi="Calibri" w:cs="Calibri"/>
+              </w:rPr>
+              <w:t>() }}</w:t>
             </w:r>
           </w:p>
         </w:tc>
@@ -2159,11 +3207,33 @@
                 <w:rFonts w:ascii="Calibri" w:hAnsi="Calibri" w:cs="Calibri"/>
               </w:rPr>
             </w:pPr>
-            <w:r>
-              <w:rPr>
-                <w:rFonts w:ascii="Calibri" w:hAnsi="Calibri" w:cs="Calibri"/>
-              </w:rPr>
-              <w:t>{{ output_checkbox(</w:t>
+            <w:proofErr w:type="gramStart"/>
+            <w:r>
+              <w:rPr>
+                <w:rFonts w:ascii="Calibri" w:hAnsi="Calibri" w:cs="Calibri"/>
+              </w:rPr>
+              <w:t xml:space="preserve">{{ </w:t>
+            </w:r>
+            <w:proofErr w:type="spellStart"/>
+            <w:r>
+              <w:rPr>
+                <w:rFonts w:ascii="Calibri" w:hAnsi="Calibri" w:cs="Calibri"/>
+              </w:rPr>
+              <w:t>output</w:t>
+            </w:r>
+            <w:proofErr w:type="gramEnd"/>
+            <w:r>
+              <w:rPr>
+                <w:rFonts w:ascii="Calibri" w:hAnsi="Calibri" w:cs="Calibri"/>
+              </w:rPr>
+              <w:t>_checkbox</w:t>
+            </w:r>
+            <w:proofErr w:type="spellEnd"/>
+            <w:r>
+              <w:rPr>
+                <w:rFonts w:ascii="Calibri" w:hAnsi="Calibri" w:cs="Calibri"/>
+              </w:rPr>
+              <w:t>(</w:t>
             </w:r>
             <w:r>
               <w:rPr>
@@ -2177,12 +3247,14 @@
               </w:rPr>
               <w:t>.</w:t>
             </w:r>
+            <w:proofErr w:type="spellStart"/>
             <w:r>
               <w:rPr>
                 <w:rFonts w:ascii="Calibri" w:hAnsi="Calibri" w:cs="Calibri"/>
               </w:rPr>
               <w:t>moved_since</w:t>
             </w:r>
+            <w:proofErr w:type="spellEnd"/>
             <w:r>
               <w:rPr>
                 <w:rFonts w:ascii="Calibri" w:hAnsi="Calibri" w:cs="Calibri"/>
@@ -2203,11 +3275,33 @@
                 <w:rFonts w:ascii="Calibri" w:hAnsi="Calibri" w:cs="Calibri"/>
               </w:rPr>
             </w:pPr>
-            <w:r>
-              <w:rPr>
-                <w:rFonts w:ascii="Calibri" w:hAnsi="Calibri" w:cs="Calibri"/>
-              </w:rPr>
-              <w:t>{{ output_checkbox(</w:t>
+            <w:proofErr w:type="gramStart"/>
+            <w:r>
+              <w:rPr>
+                <w:rFonts w:ascii="Calibri" w:hAnsi="Calibri" w:cs="Calibri"/>
+              </w:rPr>
+              <w:t xml:space="preserve">{{ </w:t>
+            </w:r>
+            <w:proofErr w:type="spellStart"/>
+            <w:r>
+              <w:rPr>
+                <w:rFonts w:ascii="Calibri" w:hAnsi="Calibri" w:cs="Calibri"/>
+              </w:rPr>
+              <w:t>output</w:t>
+            </w:r>
+            <w:proofErr w:type="gramEnd"/>
+            <w:r>
+              <w:rPr>
+                <w:rFonts w:ascii="Calibri" w:hAnsi="Calibri" w:cs="Calibri"/>
+              </w:rPr>
+              <w:t>_checkbox</w:t>
+            </w:r>
+            <w:proofErr w:type="spellEnd"/>
+            <w:r>
+              <w:rPr>
+                <w:rFonts w:ascii="Calibri" w:hAnsi="Calibri" w:cs="Calibri"/>
+              </w:rPr>
+              <w:t>(</w:t>
             </w:r>
             <w:r>
               <w:rPr>
@@ -2227,12 +3321,14 @@
               </w:rPr>
               <w:t>.</w:t>
             </w:r>
+            <w:proofErr w:type="spellStart"/>
             <w:r>
               <w:rPr>
                 <w:rFonts w:ascii="Calibri" w:hAnsi="Calibri" w:cs="Calibri"/>
               </w:rPr>
               <w:t>moved_since</w:t>
             </w:r>
+            <w:proofErr w:type="spellEnd"/>
             <w:r>
               <w:rPr>
                 <w:rFonts w:ascii="Calibri" w:hAnsi="Calibri" w:cs="Calibri"/>
@@ -2281,11 +3377,33 @@
                 <w:rFonts w:ascii="Calibri" w:hAnsi="Calibri" w:cs="Calibri"/>
               </w:rPr>
             </w:pPr>
-            <w:r>
-              <w:rPr>
-                <w:rFonts w:ascii="Calibri" w:hAnsi="Calibri" w:cs="Calibri"/>
-              </w:rPr>
-              <w:t>{{ output_checkbox(</w:t>
+            <w:proofErr w:type="gramStart"/>
+            <w:r>
+              <w:rPr>
+                <w:rFonts w:ascii="Calibri" w:hAnsi="Calibri" w:cs="Calibri"/>
+              </w:rPr>
+              <w:t xml:space="preserve">{{ </w:t>
+            </w:r>
+            <w:proofErr w:type="spellStart"/>
+            <w:r>
+              <w:rPr>
+                <w:rFonts w:ascii="Calibri" w:hAnsi="Calibri" w:cs="Calibri"/>
+              </w:rPr>
+              <w:t>output</w:t>
+            </w:r>
+            <w:proofErr w:type="gramEnd"/>
+            <w:r>
+              <w:rPr>
+                <w:rFonts w:ascii="Calibri" w:hAnsi="Calibri" w:cs="Calibri"/>
+              </w:rPr>
+              <w:t>_checkbox</w:t>
+            </w:r>
+            <w:proofErr w:type="spellEnd"/>
+            <w:r>
+              <w:rPr>
+                <w:rFonts w:ascii="Calibri" w:hAnsi="Calibri" w:cs="Calibri"/>
+              </w:rPr>
+              <w:t>(</w:t>
             </w:r>
             <w:r>
               <w:rPr>
@@ -2299,12 +3417,14 @@
               </w:rPr>
               <w:t>.</w:t>
             </w:r>
+            <w:proofErr w:type="spellStart"/>
             <w:r>
               <w:rPr>
                 <w:rFonts w:ascii="Calibri" w:hAnsi="Calibri" w:cs="Calibri"/>
               </w:rPr>
               <w:t>immigration_application</w:t>
             </w:r>
+            <w:proofErr w:type="spellEnd"/>
             <w:r>
               <w:rPr>
                 <w:rFonts w:ascii="Calibri" w:hAnsi="Calibri" w:cs="Calibri"/>
@@ -2322,7 +3442,34 @@
                 <w:rFonts w:ascii="Calibri" w:hAnsi="Calibri" w:cs="Calibri"/>
               </w:rPr>
               <w:br/>
-              <w:t>{{ users[0].other_immigration_applications }}</w:t>
+            </w:r>
+            <w:proofErr w:type="gramStart"/>
+            <w:r>
+              <w:rPr>
+                <w:rFonts w:ascii="Calibri" w:hAnsi="Calibri" w:cs="Calibri"/>
+              </w:rPr>
+              <w:t>{{ users</w:t>
+            </w:r>
+            <w:proofErr w:type="gramEnd"/>
+            <w:r>
+              <w:rPr>
+                <w:rFonts w:ascii="Calibri" w:hAnsi="Calibri" w:cs="Calibri"/>
+              </w:rPr>
+              <w:t>[0].</w:t>
+            </w:r>
+            <w:proofErr w:type="spellStart"/>
+            <w:r>
+              <w:rPr>
+                <w:rFonts w:ascii="Calibri" w:hAnsi="Calibri" w:cs="Calibri"/>
+              </w:rPr>
+              <w:t>other_immigration_applications</w:t>
+            </w:r>
+            <w:proofErr w:type="spellEnd"/>
+            <w:r>
+              <w:rPr>
+                <w:rFonts w:ascii="Calibri" w:hAnsi="Calibri" w:cs="Calibri"/>
+              </w:rPr>
+              <w:t xml:space="preserve"> }}</w:t>
             </w:r>
           </w:p>
           <w:p>
@@ -2332,11 +3479,33 @@
                 <w:rFonts w:ascii="Calibri" w:hAnsi="Calibri" w:cs="Calibri"/>
               </w:rPr>
             </w:pPr>
-            <w:r>
-              <w:rPr>
-                <w:rFonts w:ascii="Calibri" w:hAnsi="Calibri" w:cs="Calibri"/>
-              </w:rPr>
-              <w:t>{{ output_checkbox(</w:t>
+            <w:proofErr w:type="gramStart"/>
+            <w:r>
+              <w:rPr>
+                <w:rFonts w:ascii="Calibri" w:hAnsi="Calibri" w:cs="Calibri"/>
+              </w:rPr>
+              <w:t xml:space="preserve">{{ </w:t>
+            </w:r>
+            <w:proofErr w:type="spellStart"/>
+            <w:r>
+              <w:rPr>
+                <w:rFonts w:ascii="Calibri" w:hAnsi="Calibri" w:cs="Calibri"/>
+              </w:rPr>
+              <w:t>output</w:t>
+            </w:r>
+            <w:proofErr w:type="gramEnd"/>
+            <w:r>
+              <w:rPr>
+                <w:rFonts w:ascii="Calibri" w:hAnsi="Calibri" w:cs="Calibri"/>
+              </w:rPr>
+              <w:t>_checkbox</w:t>
+            </w:r>
+            <w:proofErr w:type="spellEnd"/>
+            <w:r>
+              <w:rPr>
+                <w:rFonts w:ascii="Calibri" w:hAnsi="Calibri" w:cs="Calibri"/>
+              </w:rPr>
+              <w:t>(</w:t>
             </w:r>
             <w:r>
               <w:rPr>
@@ -2360,13 +3529,29 @@
               <w:rPr>
                 <w:rFonts w:ascii="Calibri" w:hAnsi="Calibri" w:cs="Calibri"/>
               </w:rPr>
-              <w:t xml:space="preserve"> immigration_application</w:t>
-            </w:r>
-            <w:r>
-              <w:rPr>
-                <w:rFonts w:ascii="Calibri" w:hAnsi="Calibri" w:cs="Calibri"/>
-              </w:rPr>
-              <w:t xml:space="preserve">) }} </w:t>
+              <w:t xml:space="preserve"> </w:t>
+            </w:r>
+            <w:proofErr w:type="spellStart"/>
+            <w:r>
+              <w:rPr>
+                <w:rFonts w:ascii="Calibri" w:hAnsi="Calibri" w:cs="Calibri"/>
+              </w:rPr>
+              <w:t>immigration_application</w:t>
+            </w:r>
+            <w:proofErr w:type="spellEnd"/>
+            <w:proofErr w:type="gramStart"/>
+            <w:r>
+              <w:rPr>
+                <w:rFonts w:ascii="Calibri" w:hAnsi="Calibri" w:cs="Calibri"/>
+              </w:rPr>
+              <w:t>) }</w:t>
+            </w:r>
+            <w:proofErr w:type="gramEnd"/>
+            <w:r>
+              <w:rPr>
+                <w:rFonts w:ascii="Calibri" w:hAnsi="Calibri" w:cs="Calibri"/>
+              </w:rPr>
+              <w:t xml:space="preserve">} </w:t>
             </w:r>
             <w:r>
               <w:rPr>
@@ -2410,11 +3595,33 @@
                 <w:rFonts w:ascii="Calibri" w:hAnsi="Calibri" w:cs="Calibri"/>
               </w:rPr>
             </w:pPr>
-            <w:r>
-              <w:rPr>
-                <w:rFonts w:ascii="Calibri" w:hAnsi="Calibri" w:cs="Calibri"/>
-              </w:rPr>
-              <w:t>{{ output_checkbox(</w:t>
+            <w:proofErr w:type="gramStart"/>
+            <w:r>
+              <w:rPr>
+                <w:rFonts w:ascii="Calibri" w:hAnsi="Calibri" w:cs="Calibri"/>
+              </w:rPr>
+              <w:t xml:space="preserve">{{ </w:t>
+            </w:r>
+            <w:proofErr w:type="spellStart"/>
+            <w:r>
+              <w:rPr>
+                <w:rFonts w:ascii="Calibri" w:hAnsi="Calibri" w:cs="Calibri"/>
+              </w:rPr>
+              <w:t>output</w:t>
+            </w:r>
+            <w:proofErr w:type="gramEnd"/>
+            <w:r>
+              <w:rPr>
+                <w:rFonts w:ascii="Calibri" w:hAnsi="Calibri" w:cs="Calibri"/>
+              </w:rPr>
+              <w:t>_checkbox</w:t>
+            </w:r>
+            <w:proofErr w:type="spellEnd"/>
+            <w:r>
+              <w:rPr>
+                <w:rFonts w:ascii="Calibri" w:hAnsi="Calibri" w:cs="Calibri"/>
+              </w:rPr>
+              <w:t>(</w:t>
             </w:r>
             <w:r>
               <w:rPr>
@@ -2428,12 +3635,14 @@
               </w:rPr>
               <w:t>.</w:t>
             </w:r>
+            <w:proofErr w:type="spellStart"/>
             <w:r>
               <w:rPr>
                 <w:rFonts w:ascii="Calibri" w:hAnsi="Calibri" w:cs="Calibri"/>
               </w:rPr>
               <w:t>screened_for_relief</w:t>
             </w:r>
+            <w:proofErr w:type="spellEnd"/>
             <w:r>
               <w:rPr>
                 <w:rFonts w:ascii="Calibri" w:hAnsi="Calibri" w:cs="Calibri"/>
@@ -2454,11 +3663,33 @@
                 <w:rFonts w:ascii="Calibri" w:hAnsi="Calibri" w:cs="Calibri"/>
               </w:rPr>
             </w:pPr>
-            <w:r>
-              <w:rPr>
-                <w:rFonts w:ascii="Calibri" w:hAnsi="Calibri" w:cs="Calibri"/>
-              </w:rPr>
-              <w:t>{{ output_checkbox(</w:t>
+            <w:proofErr w:type="gramStart"/>
+            <w:r>
+              <w:rPr>
+                <w:rFonts w:ascii="Calibri" w:hAnsi="Calibri" w:cs="Calibri"/>
+              </w:rPr>
+              <w:t xml:space="preserve">{{ </w:t>
+            </w:r>
+            <w:proofErr w:type="spellStart"/>
+            <w:r>
+              <w:rPr>
+                <w:rFonts w:ascii="Calibri" w:hAnsi="Calibri" w:cs="Calibri"/>
+              </w:rPr>
+              <w:t>output</w:t>
+            </w:r>
+            <w:proofErr w:type="gramEnd"/>
+            <w:r>
+              <w:rPr>
+                <w:rFonts w:ascii="Calibri" w:hAnsi="Calibri" w:cs="Calibri"/>
+              </w:rPr>
+              <w:t>_checkbox</w:t>
+            </w:r>
+            <w:proofErr w:type="spellEnd"/>
+            <w:r>
+              <w:rPr>
+                <w:rFonts w:ascii="Calibri" w:hAnsi="Calibri" w:cs="Calibri"/>
+              </w:rPr>
+              <w:t>(</w:t>
             </w:r>
             <w:r>
               <w:rPr>
@@ -2478,12 +3709,14 @@
               </w:rPr>
               <w:t>.</w:t>
             </w:r>
+            <w:proofErr w:type="spellStart"/>
             <w:r>
               <w:rPr>
                 <w:rFonts w:ascii="Calibri" w:hAnsi="Calibri" w:cs="Calibri"/>
               </w:rPr>
               <w:t>screened_for_relief</w:t>
             </w:r>
+            <w:proofErr w:type="spellEnd"/>
             <w:r>
               <w:rPr>
                 <w:rFonts w:ascii="Calibri" w:hAnsi="Calibri" w:cs="Calibri"/>
@@ -2532,11 +3765,33 @@
                 <w:rFonts w:ascii="Calibri" w:hAnsi="Calibri" w:cs="Calibri"/>
               </w:rPr>
             </w:pPr>
-            <w:r>
-              <w:rPr>
-                <w:rFonts w:ascii="Calibri" w:hAnsi="Calibri" w:cs="Calibri"/>
-              </w:rPr>
-              <w:t>{{ output_checkbox(</w:t>
+            <w:proofErr w:type="gramStart"/>
+            <w:r>
+              <w:rPr>
+                <w:rFonts w:ascii="Calibri" w:hAnsi="Calibri" w:cs="Calibri"/>
+              </w:rPr>
+              <w:t xml:space="preserve">{{ </w:t>
+            </w:r>
+            <w:proofErr w:type="spellStart"/>
+            <w:r>
+              <w:rPr>
+                <w:rFonts w:ascii="Calibri" w:hAnsi="Calibri" w:cs="Calibri"/>
+              </w:rPr>
+              <w:t>output</w:t>
+            </w:r>
+            <w:proofErr w:type="gramEnd"/>
+            <w:r>
+              <w:rPr>
+                <w:rFonts w:ascii="Calibri" w:hAnsi="Calibri" w:cs="Calibri"/>
+              </w:rPr>
+              <w:t>_checkbox</w:t>
+            </w:r>
+            <w:proofErr w:type="spellEnd"/>
+            <w:r>
+              <w:rPr>
+                <w:rFonts w:ascii="Calibri" w:hAnsi="Calibri" w:cs="Calibri"/>
+              </w:rPr>
+              <w:t>(</w:t>
             </w:r>
             <w:r>
               <w:rPr>
@@ -2550,12 +3805,14 @@
               </w:rPr>
               <w:t>.</w:t>
             </w:r>
+            <w:proofErr w:type="spellStart"/>
             <w:r>
               <w:rPr>
                 <w:rFonts w:ascii="Calibri" w:hAnsi="Calibri" w:cs="Calibri"/>
               </w:rPr>
               <w:t>application_processing</w:t>
             </w:r>
+            <w:proofErr w:type="spellEnd"/>
             <w:r>
               <w:rPr>
                 <w:rFonts w:ascii="Calibri" w:hAnsi="Calibri" w:cs="Calibri"/>
@@ -2576,11 +3833,33 @@
                 <w:rFonts w:ascii="Calibri" w:hAnsi="Calibri" w:cs="Calibri"/>
               </w:rPr>
             </w:pPr>
-            <w:r>
-              <w:rPr>
-                <w:rFonts w:ascii="Calibri" w:hAnsi="Calibri" w:cs="Calibri"/>
-              </w:rPr>
-              <w:t>{{ users[0].application_status }}</w:t>
+            <w:proofErr w:type="gramStart"/>
+            <w:r>
+              <w:rPr>
+                <w:rFonts w:ascii="Calibri" w:hAnsi="Calibri" w:cs="Calibri"/>
+              </w:rPr>
+              <w:t>{{ users</w:t>
+            </w:r>
+            <w:proofErr w:type="gramEnd"/>
+            <w:r>
+              <w:rPr>
+                <w:rFonts w:ascii="Calibri" w:hAnsi="Calibri" w:cs="Calibri"/>
+              </w:rPr>
+              <w:t>[0].</w:t>
+            </w:r>
+            <w:proofErr w:type="spellStart"/>
+            <w:r>
+              <w:rPr>
+                <w:rFonts w:ascii="Calibri" w:hAnsi="Calibri" w:cs="Calibri"/>
+              </w:rPr>
+              <w:t>application_status</w:t>
+            </w:r>
+            <w:proofErr w:type="spellEnd"/>
+            <w:r>
+              <w:rPr>
+                <w:rFonts w:ascii="Calibri" w:hAnsi="Calibri" w:cs="Calibri"/>
+              </w:rPr>
+              <w:t xml:space="preserve"> }}</w:t>
             </w:r>
           </w:p>
           <w:p>
@@ -2590,11 +3869,33 @@
                 <w:rFonts w:ascii="Calibri" w:hAnsi="Calibri" w:cs="Calibri"/>
               </w:rPr>
             </w:pPr>
-            <w:r>
-              <w:rPr>
-                <w:rFonts w:ascii="Calibri" w:hAnsi="Calibri" w:cs="Calibri"/>
-              </w:rPr>
-              <w:t>{{ output_checkbox(</w:t>
+            <w:proofErr w:type="gramStart"/>
+            <w:r>
+              <w:rPr>
+                <w:rFonts w:ascii="Calibri" w:hAnsi="Calibri" w:cs="Calibri"/>
+              </w:rPr>
+              <w:t xml:space="preserve">{{ </w:t>
+            </w:r>
+            <w:proofErr w:type="spellStart"/>
+            <w:r>
+              <w:rPr>
+                <w:rFonts w:ascii="Calibri" w:hAnsi="Calibri" w:cs="Calibri"/>
+              </w:rPr>
+              <w:t>output</w:t>
+            </w:r>
+            <w:proofErr w:type="gramEnd"/>
+            <w:r>
+              <w:rPr>
+                <w:rFonts w:ascii="Calibri" w:hAnsi="Calibri" w:cs="Calibri"/>
+              </w:rPr>
+              <w:t>_checkbox</w:t>
+            </w:r>
+            <w:proofErr w:type="spellEnd"/>
+            <w:r>
+              <w:rPr>
+                <w:rFonts w:ascii="Calibri" w:hAnsi="Calibri" w:cs="Calibri"/>
+              </w:rPr>
+              <w:t>(</w:t>
             </w:r>
             <w:r>
               <w:rPr>
@@ -2614,12 +3915,14 @@
               </w:rPr>
               <w:t>.</w:t>
             </w:r>
+            <w:proofErr w:type="spellStart"/>
             <w:r>
               <w:rPr>
                 <w:rFonts w:ascii="Calibri" w:hAnsi="Calibri" w:cs="Calibri"/>
               </w:rPr>
               <w:t>application_processing</w:t>
             </w:r>
+            <w:proofErr w:type="spellEnd"/>
             <w:r>
               <w:rPr>
                 <w:rFonts w:ascii="Calibri" w:hAnsi="Calibri" w:cs="Calibri"/>
@@ -2668,11 +3971,33 @@
                 <w:rFonts w:ascii="Calibri" w:eastAsia="Calibri" w:hAnsi="Calibri" w:cs="Calibri"/>
               </w:rPr>
             </w:pPr>
-            <w:r>
-              <w:rPr>
-                <w:rFonts w:ascii="Calibri" w:hAnsi="Calibri" w:cs="Calibri"/>
-              </w:rPr>
-              <w:t>{{ output_checkbox(</w:t>
+            <w:proofErr w:type="gramStart"/>
+            <w:r>
+              <w:rPr>
+                <w:rFonts w:ascii="Calibri" w:hAnsi="Calibri" w:cs="Calibri"/>
+              </w:rPr>
+              <w:t xml:space="preserve">{{ </w:t>
+            </w:r>
+            <w:proofErr w:type="spellStart"/>
+            <w:r>
+              <w:rPr>
+                <w:rFonts w:ascii="Calibri" w:hAnsi="Calibri" w:cs="Calibri"/>
+              </w:rPr>
+              <w:t>output</w:t>
+            </w:r>
+            <w:proofErr w:type="gramEnd"/>
+            <w:r>
+              <w:rPr>
+                <w:rFonts w:ascii="Calibri" w:hAnsi="Calibri" w:cs="Calibri"/>
+              </w:rPr>
+              <w:t>_checkbox</w:t>
+            </w:r>
+            <w:proofErr w:type="spellEnd"/>
+            <w:r>
+              <w:rPr>
+                <w:rFonts w:ascii="Calibri" w:hAnsi="Calibri" w:cs="Calibri"/>
+              </w:rPr>
+              <w:t>(</w:t>
             </w:r>
             <w:r>
               <w:rPr>
@@ -2686,12 +4011,14 @@
               </w:rPr>
               <w:t>.</w:t>
             </w:r>
+            <w:proofErr w:type="spellStart"/>
             <w:r>
               <w:rPr>
                 <w:rFonts w:ascii="Calibri" w:hAnsi="Calibri" w:cs="Calibri"/>
               </w:rPr>
               <w:t>asylum_clock_running</w:t>
             </w:r>
+            <w:proofErr w:type="spellEnd"/>
             <w:r>
               <w:rPr>
                 <w:rFonts w:ascii="Calibri" w:hAnsi="Calibri" w:cs="Calibri"/>
@@ -2712,11 +4039,33 @@
                 <w:rFonts w:ascii="Calibri" w:hAnsi="Calibri" w:cs="Calibri"/>
               </w:rPr>
             </w:pPr>
-            <w:r>
-              <w:rPr>
-                <w:rFonts w:ascii="Calibri" w:hAnsi="Calibri" w:cs="Calibri"/>
-              </w:rPr>
-              <w:t>{{ output_checkbox(</w:t>
+            <w:proofErr w:type="gramStart"/>
+            <w:r>
+              <w:rPr>
+                <w:rFonts w:ascii="Calibri" w:hAnsi="Calibri" w:cs="Calibri"/>
+              </w:rPr>
+              <w:t xml:space="preserve">{{ </w:t>
+            </w:r>
+            <w:proofErr w:type="spellStart"/>
+            <w:r>
+              <w:rPr>
+                <w:rFonts w:ascii="Calibri" w:hAnsi="Calibri" w:cs="Calibri"/>
+              </w:rPr>
+              <w:t>output</w:t>
+            </w:r>
+            <w:proofErr w:type="gramEnd"/>
+            <w:r>
+              <w:rPr>
+                <w:rFonts w:ascii="Calibri" w:hAnsi="Calibri" w:cs="Calibri"/>
+              </w:rPr>
+              <w:t>_checkbox</w:t>
+            </w:r>
+            <w:proofErr w:type="spellEnd"/>
+            <w:r>
+              <w:rPr>
+                <w:rFonts w:ascii="Calibri" w:hAnsi="Calibri" w:cs="Calibri"/>
+              </w:rPr>
+              <w:t>(</w:t>
             </w:r>
             <w:r>
               <w:rPr>
@@ -2740,13 +4089,29 @@
               <w:rPr>
                 <w:rFonts w:ascii="Calibri" w:hAnsi="Calibri" w:cs="Calibri"/>
               </w:rPr>
-              <w:t xml:space="preserve"> asylum_clock_running</w:t>
-            </w:r>
-            <w:r>
-              <w:rPr>
-                <w:rFonts w:ascii="Calibri" w:hAnsi="Calibri" w:cs="Calibri"/>
-              </w:rPr>
-              <w:t xml:space="preserve">) }} </w:t>
+              <w:t xml:space="preserve"> </w:t>
+            </w:r>
+            <w:proofErr w:type="spellStart"/>
+            <w:r>
+              <w:rPr>
+                <w:rFonts w:ascii="Calibri" w:hAnsi="Calibri" w:cs="Calibri"/>
+              </w:rPr>
+              <w:t>asylum_clock_running</w:t>
+            </w:r>
+            <w:proofErr w:type="spellEnd"/>
+            <w:proofErr w:type="gramStart"/>
+            <w:r>
+              <w:rPr>
+                <w:rFonts w:ascii="Calibri" w:hAnsi="Calibri" w:cs="Calibri"/>
+              </w:rPr>
+              <w:t>) }</w:t>
+            </w:r>
+            <w:proofErr w:type="gramEnd"/>
+            <w:r>
+              <w:rPr>
+                <w:rFonts w:ascii="Calibri" w:hAnsi="Calibri" w:cs="Calibri"/>
+              </w:rPr>
+              <w:t xml:space="preserve">} </w:t>
             </w:r>
             <w:r>
               <w:rPr>
@@ -2790,11 +4155,33 @@
                 <w:rFonts w:ascii="Calibri" w:hAnsi="Calibri" w:cs="Calibri"/>
               </w:rPr>
             </w:pPr>
-            <w:r>
-              <w:rPr>
-                <w:rFonts w:ascii="Calibri" w:hAnsi="Calibri" w:cs="Calibri"/>
-              </w:rPr>
-              <w:t>{{ output_checkbox(</w:t>
+            <w:proofErr w:type="gramStart"/>
+            <w:r>
+              <w:rPr>
+                <w:rFonts w:ascii="Calibri" w:hAnsi="Calibri" w:cs="Calibri"/>
+              </w:rPr>
+              <w:t xml:space="preserve">{{ </w:t>
+            </w:r>
+            <w:proofErr w:type="spellStart"/>
+            <w:r>
+              <w:rPr>
+                <w:rFonts w:ascii="Calibri" w:hAnsi="Calibri" w:cs="Calibri"/>
+              </w:rPr>
+              <w:t>output</w:t>
+            </w:r>
+            <w:proofErr w:type="gramEnd"/>
+            <w:r>
+              <w:rPr>
+                <w:rFonts w:ascii="Calibri" w:hAnsi="Calibri" w:cs="Calibri"/>
+              </w:rPr>
+              <w:t>_checkbox</w:t>
+            </w:r>
+            <w:proofErr w:type="spellEnd"/>
+            <w:r>
+              <w:rPr>
+                <w:rFonts w:ascii="Calibri" w:hAnsi="Calibri" w:cs="Calibri"/>
+              </w:rPr>
+              <w:t>(</w:t>
             </w:r>
             <w:r>
               <w:rPr>
@@ -2808,12 +4195,14 @@
               </w:rPr>
               <w:t>.</w:t>
             </w:r>
+            <w:proofErr w:type="spellStart"/>
             <w:r>
               <w:rPr>
                 <w:rFonts w:ascii="Calibri" w:hAnsi="Calibri" w:cs="Calibri"/>
               </w:rPr>
               <w:t>derivative_clock_running</w:t>
             </w:r>
+            <w:proofErr w:type="spellEnd"/>
           </w:p>
           <w:p>
             <w:pPr>
@@ -2822,11 +4211,19 @@
                 <w:rFonts w:ascii="Calibri" w:hAnsi="Calibri" w:cs="Calibri"/>
               </w:rPr>
             </w:pPr>
-            <w:r>
-              <w:rPr>
-                <w:rFonts w:ascii="Calibri" w:hAnsi="Calibri" w:cs="Calibri"/>
-              </w:rPr>
-              <w:t xml:space="preserve">) }} </w:t>
+            <w:proofErr w:type="gramStart"/>
+            <w:r>
+              <w:rPr>
+                <w:rFonts w:ascii="Calibri" w:hAnsi="Calibri" w:cs="Calibri"/>
+              </w:rPr>
+              <w:t>) }</w:t>
+            </w:r>
+            <w:proofErr w:type="gramEnd"/>
+            <w:r>
+              <w:rPr>
+                <w:rFonts w:ascii="Calibri" w:hAnsi="Calibri" w:cs="Calibri"/>
+              </w:rPr>
+              <w:t xml:space="preserve">} </w:t>
             </w:r>
             <w:r>
               <w:rPr>
@@ -2842,11 +4239,33 @@
                 <w:rFonts w:ascii="Calibri" w:hAnsi="Calibri" w:cs="Calibri"/>
               </w:rPr>
             </w:pPr>
-            <w:r>
-              <w:rPr>
-                <w:rFonts w:ascii="Calibri" w:hAnsi="Calibri" w:cs="Calibri"/>
-              </w:rPr>
-              <w:t>{{ output_checkbox(</w:t>
+            <w:proofErr w:type="gramStart"/>
+            <w:r>
+              <w:rPr>
+                <w:rFonts w:ascii="Calibri" w:hAnsi="Calibri" w:cs="Calibri"/>
+              </w:rPr>
+              <w:t xml:space="preserve">{{ </w:t>
+            </w:r>
+            <w:proofErr w:type="spellStart"/>
+            <w:r>
+              <w:rPr>
+                <w:rFonts w:ascii="Calibri" w:hAnsi="Calibri" w:cs="Calibri"/>
+              </w:rPr>
+              <w:t>output</w:t>
+            </w:r>
+            <w:proofErr w:type="gramEnd"/>
+            <w:r>
+              <w:rPr>
+                <w:rFonts w:ascii="Calibri" w:hAnsi="Calibri" w:cs="Calibri"/>
+              </w:rPr>
+              <w:t>_checkbox</w:t>
+            </w:r>
+            <w:proofErr w:type="spellEnd"/>
+            <w:r>
+              <w:rPr>
+                <w:rFonts w:ascii="Calibri" w:hAnsi="Calibri" w:cs="Calibri"/>
+              </w:rPr>
+              <w:t>(</w:t>
             </w:r>
             <w:r>
               <w:rPr>
@@ -2866,12 +4285,14 @@
               </w:rPr>
               <w:t>.</w:t>
             </w:r>
+            <w:proofErr w:type="spellStart"/>
             <w:r>
               <w:rPr>
                 <w:rFonts w:ascii="Calibri" w:hAnsi="Calibri" w:cs="Calibri"/>
               </w:rPr>
               <w:t>derivative_clock_running</w:t>
             </w:r>
+            <w:proofErr w:type="spellEnd"/>
           </w:p>
           <w:p>
             <w:pPr>
@@ -2880,11 +4301,19 @@
                 <w:rFonts w:ascii="Calibri" w:hAnsi="Calibri" w:cs="Calibri"/>
               </w:rPr>
             </w:pPr>
-            <w:r>
-              <w:rPr>
-                <w:rFonts w:ascii="Calibri" w:hAnsi="Calibri" w:cs="Calibri"/>
-              </w:rPr>
-              <w:t xml:space="preserve">) }} </w:t>
+            <w:proofErr w:type="gramStart"/>
+            <w:r>
+              <w:rPr>
+                <w:rFonts w:ascii="Calibri" w:hAnsi="Calibri" w:cs="Calibri"/>
+              </w:rPr>
+              <w:t>) }</w:t>
+            </w:r>
+            <w:proofErr w:type="gramEnd"/>
+            <w:r>
+              <w:rPr>
+                <w:rFonts w:ascii="Calibri" w:hAnsi="Calibri" w:cs="Calibri"/>
+              </w:rPr>
+              <w:t xml:space="preserve">} </w:t>
             </w:r>
             <w:r>
               <w:rPr>
@@ -2892,11 +4321,33 @@
               </w:rPr>
               <w:t xml:space="preserve">No – Who? </w:t>
             </w:r>
-            <w:r>
-              <w:rPr>
-                <w:rFonts w:ascii="Calibri" w:hAnsi="Calibri" w:cs="Calibri"/>
-              </w:rPr>
-              <w:t>{{ users[0].derivative_clock_who }}</w:t>
+            <w:proofErr w:type="gramStart"/>
+            <w:r>
+              <w:rPr>
+                <w:rFonts w:ascii="Calibri" w:hAnsi="Calibri" w:cs="Calibri"/>
+              </w:rPr>
+              <w:t>{{ users</w:t>
+            </w:r>
+            <w:proofErr w:type="gramEnd"/>
+            <w:r>
+              <w:rPr>
+                <w:rFonts w:ascii="Calibri" w:hAnsi="Calibri" w:cs="Calibri"/>
+              </w:rPr>
+              <w:t>[0].</w:t>
+            </w:r>
+            <w:proofErr w:type="spellStart"/>
+            <w:r>
+              <w:rPr>
+                <w:rFonts w:ascii="Calibri" w:hAnsi="Calibri" w:cs="Calibri"/>
+              </w:rPr>
+              <w:t>derivative_clock_who</w:t>
+            </w:r>
+            <w:proofErr w:type="spellEnd"/>
+            <w:r>
+              <w:rPr>
+                <w:rFonts w:ascii="Calibri" w:hAnsi="Calibri" w:cs="Calibri"/>
+              </w:rPr>
+              <w:t xml:space="preserve"> }}</w:t>
             </w:r>
           </w:p>
         </w:tc>
@@ -2958,11 +4409,33 @@
                 <w:rFonts w:ascii="Calibri" w:hAnsi="Calibri" w:cs="Calibri"/>
               </w:rPr>
             </w:pPr>
-            <w:r>
-              <w:rPr>
-                <w:rFonts w:ascii="Calibri" w:hAnsi="Calibri" w:cs="Calibri"/>
-              </w:rPr>
-              <w:t>{{ output_checkbox(</w:t>
+            <w:proofErr w:type="gramStart"/>
+            <w:r>
+              <w:rPr>
+                <w:rFonts w:ascii="Calibri" w:hAnsi="Calibri" w:cs="Calibri"/>
+              </w:rPr>
+              <w:t xml:space="preserve">{{ </w:t>
+            </w:r>
+            <w:proofErr w:type="spellStart"/>
+            <w:r>
+              <w:rPr>
+                <w:rFonts w:ascii="Calibri" w:hAnsi="Calibri" w:cs="Calibri"/>
+              </w:rPr>
+              <w:t>output</w:t>
+            </w:r>
+            <w:proofErr w:type="gramEnd"/>
+            <w:r>
+              <w:rPr>
+                <w:rFonts w:ascii="Calibri" w:hAnsi="Calibri" w:cs="Calibri"/>
+              </w:rPr>
+              <w:t>_checkbox</w:t>
+            </w:r>
+            <w:proofErr w:type="spellEnd"/>
+            <w:r>
+              <w:rPr>
+                <w:rFonts w:ascii="Calibri" w:hAnsi="Calibri" w:cs="Calibri"/>
+              </w:rPr>
+              <w:t>(</w:t>
             </w:r>
             <w:r>
               <w:rPr>
@@ -2976,12 +4449,14 @@
               </w:rPr>
               <w:t>.</w:t>
             </w:r>
+            <w:proofErr w:type="spellStart"/>
             <w:r>
               <w:rPr>
                 <w:rFonts w:ascii="Calibri" w:hAnsi="Calibri" w:cs="Calibri"/>
               </w:rPr>
               <w:t>family_has_separate_case</w:t>
             </w:r>
+            <w:proofErr w:type="spellEnd"/>
             <w:r>
               <w:rPr>
                 <w:rFonts w:ascii="Calibri" w:hAnsi="Calibri" w:cs="Calibri"/>
@@ -3028,11 +4503,33 @@
               </w:rPr>
               <w:t xml:space="preserve">          </w:t>
             </w:r>
-            <w:r>
-              <w:rPr>
-                <w:rFonts w:ascii="Calibri" w:hAnsi="Calibri" w:cs="Calibri"/>
-              </w:rPr>
-              <w:t>{{ output_checkbox(</w:t>
+            <w:proofErr w:type="gramStart"/>
+            <w:r>
+              <w:rPr>
+                <w:rFonts w:ascii="Calibri" w:hAnsi="Calibri" w:cs="Calibri"/>
+              </w:rPr>
+              <w:t xml:space="preserve">{{ </w:t>
+            </w:r>
+            <w:proofErr w:type="spellStart"/>
+            <w:r>
+              <w:rPr>
+                <w:rFonts w:ascii="Calibri" w:hAnsi="Calibri" w:cs="Calibri"/>
+              </w:rPr>
+              <w:t>output</w:t>
+            </w:r>
+            <w:proofErr w:type="gramEnd"/>
+            <w:r>
+              <w:rPr>
+                <w:rFonts w:ascii="Calibri" w:hAnsi="Calibri" w:cs="Calibri"/>
+              </w:rPr>
+              <w:t>_checkbox</w:t>
+            </w:r>
+            <w:proofErr w:type="spellEnd"/>
+            <w:r>
+              <w:rPr>
+                <w:rFonts w:ascii="Calibri" w:hAnsi="Calibri" w:cs="Calibri"/>
+              </w:rPr>
+              <w:t>(</w:t>
             </w:r>
             <w:r>
               <w:rPr>
@@ -3046,12 +4543,14 @@
               </w:rPr>
               <w:t>.</w:t>
             </w:r>
+            <w:proofErr w:type="spellStart"/>
             <w:r>
               <w:rPr>
                 <w:rFonts w:ascii="Calibri" w:hAnsi="Calibri" w:cs="Calibri"/>
               </w:rPr>
               <w:t>wants_consolidation</w:t>
             </w:r>
+            <w:proofErr w:type="spellEnd"/>
             <w:r>
               <w:rPr>
                 <w:rFonts w:ascii="Calibri" w:hAnsi="Calibri" w:cs="Calibri"/>
@@ -3080,7 +4579,21 @@
               <w:rPr>
                 <w:rFonts w:ascii="Calibri" w:hAnsi="Calibri" w:cs="Calibri"/>
               </w:rPr>
-              <w:t>{{ output_checkbox(</w:t>
+              <w:t xml:space="preserve">{{ </w:t>
+            </w:r>
+            <w:proofErr w:type="spellStart"/>
+            <w:r>
+              <w:rPr>
+                <w:rFonts w:ascii="Calibri" w:hAnsi="Calibri" w:cs="Calibri"/>
+              </w:rPr>
+              <w:t>output_checkbox</w:t>
+            </w:r>
+            <w:proofErr w:type="spellEnd"/>
+            <w:r>
+              <w:rPr>
+                <w:rFonts w:ascii="Calibri" w:hAnsi="Calibri" w:cs="Calibri"/>
+              </w:rPr>
+              <w:t>(</w:t>
             </w:r>
             <w:r>
               <w:rPr>
@@ -3104,13 +4617,29 @@
               <w:rPr>
                 <w:rFonts w:ascii="Calibri" w:hAnsi="Calibri" w:cs="Calibri"/>
               </w:rPr>
-              <w:t xml:space="preserve"> wants_consolidation</w:t>
-            </w:r>
-            <w:r>
-              <w:rPr>
-                <w:rFonts w:ascii="Calibri" w:hAnsi="Calibri" w:cs="Calibri"/>
-              </w:rPr>
-              <w:t xml:space="preserve">) }} </w:t>
+              <w:t xml:space="preserve"> </w:t>
+            </w:r>
+            <w:proofErr w:type="spellStart"/>
+            <w:r>
+              <w:rPr>
+                <w:rFonts w:ascii="Calibri" w:hAnsi="Calibri" w:cs="Calibri"/>
+              </w:rPr>
+              <w:t>wants_consolidation</w:t>
+            </w:r>
+            <w:proofErr w:type="spellEnd"/>
+            <w:proofErr w:type="gramStart"/>
+            <w:r>
+              <w:rPr>
+                <w:rFonts w:ascii="Calibri" w:hAnsi="Calibri" w:cs="Calibri"/>
+              </w:rPr>
+              <w:t>) }</w:t>
+            </w:r>
+            <w:proofErr w:type="gramEnd"/>
+            <w:r>
+              <w:rPr>
+                <w:rFonts w:ascii="Calibri" w:hAnsi="Calibri" w:cs="Calibri"/>
+              </w:rPr>
+              <w:t xml:space="preserve">} </w:t>
             </w:r>
             <w:r>
               <w:rPr>
@@ -3126,11 +4655,33 @@
                 <w:rFonts w:ascii="Calibri" w:hAnsi="Calibri" w:cs="Calibri"/>
               </w:rPr>
             </w:pPr>
-            <w:r>
-              <w:rPr>
-                <w:rFonts w:ascii="Calibri" w:hAnsi="Calibri" w:cs="Calibri"/>
-              </w:rPr>
-              <w:t>{{ output_checkbox(</w:t>
+            <w:proofErr w:type="gramStart"/>
+            <w:r>
+              <w:rPr>
+                <w:rFonts w:ascii="Calibri" w:hAnsi="Calibri" w:cs="Calibri"/>
+              </w:rPr>
+              <w:t xml:space="preserve">{{ </w:t>
+            </w:r>
+            <w:proofErr w:type="spellStart"/>
+            <w:r>
+              <w:rPr>
+                <w:rFonts w:ascii="Calibri" w:hAnsi="Calibri" w:cs="Calibri"/>
+              </w:rPr>
+              <w:t>output</w:t>
+            </w:r>
+            <w:proofErr w:type="gramEnd"/>
+            <w:r>
+              <w:rPr>
+                <w:rFonts w:ascii="Calibri" w:hAnsi="Calibri" w:cs="Calibri"/>
+              </w:rPr>
+              <w:t>_checkbox</w:t>
+            </w:r>
+            <w:proofErr w:type="spellEnd"/>
+            <w:r>
+              <w:rPr>
+                <w:rFonts w:ascii="Calibri" w:hAnsi="Calibri" w:cs="Calibri"/>
+              </w:rPr>
+              <w:t>(</w:t>
             </w:r>
             <w:r>
               <w:rPr>
@@ -3150,12 +4701,14 @@
               </w:rPr>
               <w:t>.</w:t>
             </w:r>
+            <w:proofErr w:type="spellStart"/>
             <w:r>
               <w:rPr>
                 <w:rFonts w:ascii="Calibri" w:hAnsi="Calibri" w:cs="Calibri"/>
               </w:rPr>
               <w:t>family_has_separate_case</w:t>
             </w:r>
+            <w:proofErr w:type="spellEnd"/>
             <w:r>
               <w:rPr>
                 <w:rFonts w:ascii="Calibri" w:hAnsi="Calibri" w:cs="Calibri"/>
@@ -3216,11 +4769,33 @@
                 <w:rFonts w:ascii="Calibri" w:hAnsi="Calibri" w:cs="Calibri"/>
               </w:rPr>
             </w:pPr>
-            <w:r>
-              <w:rPr>
-                <w:rFonts w:ascii="Calibri" w:hAnsi="Calibri" w:cs="Calibri"/>
-              </w:rPr>
-              <w:t>{{ output_checkbox(</w:t>
+            <w:proofErr w:type="gramStart"/>
+            <w:r>
+              <w:rPr>
+                <w:rFonts w:ascii="Calibri" w:hAnsi="Calibri" w:cs="Calibri"/>
+              </w:rPr>
+              <w:t xml:space="preserve">{{ </w:t>
+            </w:r>
+            <w:proofErr w:type="spellStart"/>
+            <w:r>
+              <w:rPr>
+                <w:rFonts w:ascii="Calibri" w:hAnsi="Calibri" w:cs="Calibri"/>
+              </w:rPr>
+              <w:t>output</w:t>
+            </w:r>
+            <w:proofErr w:type="gramEnd"/>
+            <w:r>
+              <w:rPr>
+                <w:rFonts w:ascii="Calibri" w:hAnsi="Calibri" w:cs="Calibri"/>
+              </w:rPr>
+              <w:t>_checkbox</w:t>
+            </w:r>
+            <w:proofErr w:type="spellEnd"/>
+            <w:r>
+              <w:rPr>
+                <w:rFonts w:ascii="Calibri" w:hAnsi="Calibri" w:cs="Calibri"/>
+              </w:rPr>
+              <w:t>(</w:t>
             </w:r>
             <w:r>
               <w:rPr>
@@ -3234,12 +4809,14 @@
               </w:rPr>
               <w:t>.</w:t>
             </w:r>
+            <w:proofErr w:type="spellStart"/>
             <w:r>
               <w:rPr>
                 <w:rFonts w:ascii="Calibri" w:hAnsi="Calibri" w:cs="Calibri"/>
               </w:rPr>
               <w:t>wants_separate_case</w:t>
             </w:r>
+            <w:proofErr w:type="spellEnd"/>
             <w:r>
               <w:rPr>
                 <w:rFonts w:ascii="Calibri" w:hAnsi="Calibri" w:cs="Calibri"/>
@@ -3272,17 +4849,33 @@
               </w:rPr>
               <w:t xml:space="preserve">Separate case from: </w:t>
             </w:r>
+            <w:proofErr w:type="gramStart"/>
             <w:r>
               <w:rPr>
                 <w:rFonts w:ascii="Calibri" w:hAnsi="Calibri" w:cs="Calibri"/>
               </w:rPr>
               <w:t xml:space="preserve">{{ </w:t>
             </w:r>
-            <w:r>
-              <w:rPr>
-                <w:rFonts w:ascii="Calibri" w:hAnsi="Calibri" w:cs="Calibri"/>
-              </w:rPr>
-              <w:t>comma_list(</w:t>
+            <w:proofErr w:type="spellStart"/>
+            <w:r>
+              <w:rPr>
+                <w:rFonts w:ascii="Calibri" w:hAnsi="Calibri" w:cs="Calibri"/>
+              </w:rPr>
+              <w:t>comma</w:t>
+            </w:r>
+            <w:proofErr w:type="gramEnd"/>
+            <w:r>
+              <w:rPr>
+                <w:rFonts w:ascii="Calibri" w:hAnsi="Calibri" w:cs="Calibri"/>
+              </w:rPr>
+              <w:t>_list</w:t>
+            </w:r>
+            <w:proofErr w:type="spellEnd"/>
+            <w:r>
+              <w:rPr>
+                <w:rFonts w:ascii="Calibri" w:hAnsi="Calibri" w:cs="Calibri"/>
+              </w:rPr>
+              <w:t>(</w:t>
             </w:r>
             <w:r>
               <w:rPr>
@@ -3294,8 +4887,16 @@
               <w:rPr>
                 <w:rFonts w:ascii="Calibri" w:hAnsi="Calibri" w:cs="Calibri"/>
               </w:rPr>
-              <w:t>.separate_case_name_list</w:t>
-            </w:r>
+              <w:t>.</w:t>
+            </w:r>
+            <w:proofErr w:type="spellStart"/>
+            <w:r>
+              <w:rPr>
+                <w:rFonts w:ascii="Calibri" w:hAnsi="Calibri" w:cs="Calibri"/>
+              </w:rPr>
+              <w:t>separate_case_name_list</w:t>
+            </w:r>
+            <w:proofErr w:type="spellEnd"/>
             <w:r>
               <w:rPr>
                 <w:rFonts w:ascii="Calibri" w:hAnsi="Calibri" w:cs="Calibri"/>
@@ -3316,11 +4917,33 @@
                 <w:rFonts w:ascii="Calibri" w:hAnsi="Calibri" w:cs="Calibri"/>
               </w:rPr>
             </w:pPr>
-            <w:r>
-              <w:rPr>
-                <w:rFonts w:ascii="Calibri" w:hAnsi="Calibri" w:cs="Calibri"/>
-              </w:rPr>
-              <w:t>{{ output_checkbox(</w:t>
+            <w:proofErr w:type="gramStart"/>
+            <w:r>
+              <w:rPr>
+                <w:rFonts w:ascii="Calibri" w:hAnsi="Calibri" w:cs="Calibri"/>
+              </w:rPr>
+              <w:t xml:space="preserve">{{ </w:t>
+            </w:r>
+            <w:proofErr w:type="spellStart"/>
+            <w:r>
+              <w:rPr>
+                <w:rFonts w:ascii="Calibri" w:hAnsi="Calibri" w:cs="Calibri"/>
+              </w:rPr>
+              <w:t>output</w:t>
+            </w:r>
+            <w:proofErr w:type="gramEnd"/>
+            <w:r>
+              <w:rPr>
+                <w:rFonts w:ascii="Calibri" w:hAnsi="Calibri" w:cs="Calibri"/>
+              </w:rPr>
+              <w:t>_checkbox</w:t>
+            </w:r>
+            <w:proofErr w:type="spellEnd"/>
+            <w:r>
+              <w:rPr>
+                <w:rFonts w:ascii="Calibri" w:hAnsi="Calibri" w:cs="Calibri"/>
+              </w:rPr>
+              <w:t>(</w:t>
             </w:r>
             <w:r>
               <w:rPr>
@@ -3352,12 +4975,14 @@
               </w:rPr>
               <w:t>.</w:t>
             </w:r>
+            <w:proofErr w:type="spellStart"/>
             <w:r>
               <w:rPr>
                 <w:rFonts w:ascii="Calibri" w:hAnsi="Calibri" w:cs="Calibri"/>
               </w:rPr>
               <w:t>wants_separate_case</w:t>
             </w:r>
+            <w:proofErr w:type="spellEnd"/>
             <w:r>
               <w:rPr>
                 <w:rFonts w:ascii="Calibri" w:hAnsi="Calibri" w:cs="Calibri"/>
@@ -3418,11 +5043,33 @@
                 <w:rFonts w:ascii="Calibri" w:hAnsi="Calibri" w:cs="Calibri"/>
               </w:rPr>
             </w:pPr>
-            <w:r>
-              <w:rPr>
-                <w:rFonts w:ascii="Calibri" w:hAnsi="Calibri" w:cs="Calibri"/>
-              </w:rPr>
-              <w:t>{{ output_checkbox(</w:t>
+            <w:proofErr w:type="gramStart"/>
+            <w:r>
+              <w:rPr>
+                <w:rFonts w:ascii="Calibri" w:hAnsi="Calibri" w:cs="Calibri"/>
+              </w:rPr>
+              <w:t xml:space="preserve">{{ </w:t>
+            </w:r>
+            <w:proofErr w:type="spellStart"/>
+            <w:r>
+              <w:rPr>
+                <w:rFonts w:ascii="Calibri" w:hAnsi="Calibri" w:cs="Calibri"/>
+              </w:rPr>
+              <w:t>output</w:t>
+            </w:r>
+            <w:proofErr w:type="gramEnd"/>
+            <w:r>
+              <w:rPr>
+                <w:rFonts w:ascii="Calibri" w:hAnsi="Calibri" w:cs="Calibri"/>
+              </w:rPr>
+              <w:t>_checkbox</w:t>
+            </w:r>
+            <w:proofErr w:type="spellEnd"/>
+            <w:r>
+              <w:rPr>
+                <w:rFonts w:ascii="Calibri" w:hAnsi="Calibri" w:cs="Calibri"/>
+              </w:rPr>
+              <w:t>(</w:t>
             </w:r>
             <w:r>
               <w:rPr>
@@ -3436,12 +5083,14 @@
               </w:rPr>
               <w:t>.</w:t>
             </w:r>
+            <w:proofErr w:type="spellStart"/>
             <w:r>
               <w:rPr>
                 <w:rFonts w:ascii="Calibri" w:hAnsi="Calibri" w:cs="Calibri"/>
               </w:rPr>
               <w:t>looked_for_attorney</w:t>
             </w:r>
+            <w:proofErr w:type="spellEnd"/>
             <w:r>
               <w:rPr>
                 <w:rFonts w:ascii="Calibri" w:hAnsi="Calibri" w:cs="Calibri"/>
@@ -3462,11 +5111,33 @@
                 <w:rFonts w:ascii="Calibri" w:hAnsi="Calibri" w:cs="Calibri"/>
               </w:rPr>
             </w:pPr>
-            <w:r>
-              <w:rPr>
-                <w:rFonts w:ascii="Calibri" w:hAnsi="Calibri" w:cs="Calibri"/>
-              </w:rPr>
-              <w:t>{{ users[0].looked_for_attorney_details}}</w:t>
+            <w:proofErr w:type="gramStart"/>
+            <w:r>
+              <w:rPr>
+                <w:rFonts w:ascii="Calibri" w:hAnsi="Calibri" w:cs="Calibri"/>
+              </w:rPr>
+              <w:t>{{ users</w:t>
+            </w:r>
+            <w:proofErr w:type="gramEnd"/>
+            <w:r>
+              <w:rPr>
+                <w:rFonts w:ascii="Calibri" w:hAnsi="Calibri" w:cs="Calibri"/>
+              </w:rPr>
+              <w:t>[0].</w:t>
+            </w:r>
+            <w:proofErr w:type="spellStart"/>
+            <w:r>
+              <w:rPr>
+                <w:rFonts w:ascii="Calibri" w:hAnsi="Calibri" w:cs="Calibri"/>
+              </w:rPr>
+              <w:t>looked_for_attorney_details</w:t>
+            </w:r>
+            <w:proofErr w:type="spellEnd"/>
+            <w:r>
+              <w:rPr>
+                <w:rFonts w:ascii="Calibri" w:hAnsi="Calibri" w:cs="Calibri"/>
+              </w:rPr>
+              <w:t>}}</w:t>
             </w:r>
           </w:p>
           <w:p>
@@ -3476,11 +5147,33 @@
                 <w:rFonts w:ascii="Calibri" w:hAnsi="Calibri" w:cs="Calibri"/>
               </w:rPr>
             </w:pPr>
-            <w:r>
-              <w:rPr>
-                <w:rFonts w:ascii="Calibri" w:hAnsi="Calibri" w:cs="Calibri"/>
-              </w:rPr>
-              <w:t>{{ output_checkbox(</w:t>
+            <w:proofErr w:type="gramStart"/>
+            <w:r>
+              <w:rPr>
+                <w:rFonts w:ascii="Calibri" w:hAnsi="Calibri" w:cs="Calibri"/>
+              </w:rPr>
+              <w:t xml:space="preserve">{{ </w:t>
+            </w:r>
+            <w:proofErr w:type="spellStart"/>
+            <w:r>
+              <w:rPr>
+                <w:rFonts w:ascii="Calibri" w:hAnsi="Calibri" w:cs="Calibri"/>
+              </w:rPr>
+              <w:t>output</w:t>
+            </w:r>
+            <w:proofErr w:type="gramEnd"/>
+            <w:r>
+              <w:rPr>
+                <w:rFonts w:ascii="Calibri" w:hAnsi="Calibri" w:cs="Calibri"/>
+              </w:rPr>
+              <w:t>_checkbox</w:t>
+            </w:r>
+            <w:proofErr w:type="spellEnd"/>
+            <w:r>
+              <w:rPr>
+                <w:rFonts w:ascii="Calibri" w:hAnsi="Calibri" w:cs="Calibri"/>
+              </w:rPr>
+              <w:t>(</w:t>
             </w:r>
             <w:r>
               <w:rPr>
@@ -3500,12 +5193,14 @@
               </w:rPr>
               <w:t>.</w:t>
             </w:r>
+            <w:proofErr w:type="spellStart"/>
             <w:r>
               <w:rPr>
                 <w:rFonts w:ascii="Calibri" w:hAnsi="Calibri" w:cs="Calibri"/>
               </w:rPr>
               <w:t>looked_for_attorney</w:t>
             </w:r>
+            <w:proofErr w:type="spellEnd"/>
             <w:r>
               <w:rPr>
                 <w:rFonts w:ascii="Calibri" w:hAnsi="Calibri" w:cs="Calibri"/>
@@ -3554,11 +5249,33 @@
                 <w:rFonts w:ascii="Calibri" w:hAnsi="Calibri" w:cs="Calibri"/>
               </w:rPr>
             </w:pPr>
-            <w:r>
-              <w:rPr>
-                <w:rFonts w:ascii="Calibri" w:hAnsi="Calibri" w:cs="Calibri"/>
-              </w:rPr>
-              <w:t>{{ users[0].additional_notes}}</w:t>
+            <w:proofErr w:type="gramStart"/>
+            <w:r>
+              <w:rPr>
+                <w:rFonts w:ascii="Calibri" w:hAnsi="Calibri" w:cs="Calibri"/>
+              </w:rPr>
+              <w:t>{{ users</w:t>
+            </w:r>
+            <w:proofErr w:type="gramEnd"/>
+            <w:r>
+              <w:rPr>
+                <w:rFonts w:ascii="Calibri" w:hAnsi="Calibri" w:cs="Calibri"/>
+              </w:rPr>
+              <w:t>[0].</w:t>
+            </w:r>
+            <w:proofErr w:type="spellStart"/>
+            <w:r>
+              <w:rPr>
+                <w:rFonts w:ascii="Calibri" w:hAnsi="Calibri" w:cs="Calibri"/>
+              </w:rPr>
+              <w:t>additional_notes</w:t>
+            </w:r>
+            <w:proofErr w:type="spellEnd"/>
+            <w:r>
+              <w:rPr>
+                <w:rFonts w:ascii="Calibri" w:hAnsi="Calibri" w:cs="Calibri"/>
+              </w:rPr>
+              <w:t>}}</w:t>
             </w:r>
           </w:p>
         </w:tc>

</xml_diff>